<commit_message>
docs: update manual to v2.1.0 with v1.3 corrections and reorganize docs folder
</commit_message>
<xml_diff>
--- a/docs/user/archive/Tausand Tempico Software Manual 2.1.0.docx
+++ b/docs/user/archive/Tausand Tempico Software Manual 2.1.0.docx
@@ -203,7 +203,10 @@
         <w:t xml:space="preserve"> </w:t>
       </w:r>
       <w:r>
-        <w:t>20</w:t>
+        <w:t>2</w:t>
+      </w:r>
+      <w:r>
+        <w:t>1</w:t>
       </w:r>
       <w:r>
         <w:rPr>
@@ -323,7 +326,7 @@
             </w:rPr>
             <w:fldChar w:fldCharType="separate"/>
           </w:r>
-          <w:hyperlink w:anchor="_Toc238078882" w:history="1">
+          <w:hyperlink w:anchor="_Toc238168356" w:history="1">
             <w:r>
               <w:rPr>
                 <w:rStyle w:val="Hipervnculo"/>
@@ -369,7 +372,7 @@
                 <w:noProof/>
                 <w:webHidden/>
               </w:rPr>
-              <w:instrText xml:space="preserve"> PAGEREF _Toc238078882 \h </w:instrText>
+              <w:instrText xml:space="preserve"> PAGEREF _Toc238168356 \h </w:instrText>
             </w:r>
             <w:r>
               <w:rPr>
@@ -415,7 +418,7 @@
               <w:lang w:val="es-CO" w:eastAsia="ja-JP"/>
             </w:rPr>
           </w:pPr>
-          <w:hyperlink w:anchor="_Toc238078883" w:history="1">
+          <w:hyperlink w:anchor="_Toc238168357" w:history="1">
             <w:r>
               <w:rPr>
                 <w:rStyle w:val="Hipervnculo"/>
@@ -461,7 +464,7 @@
                 <w:noProof/>
                 <w:webHidden/>
               </w:rPr>
-              <w:instrText xml:space="preserve"> PAGEREF _Toc238078883 \h </w:instrText>
+              <w:instrText xml:space="preserve"> PAGEREF _Toc238168357 \h </w:instrText>
             </w:r>
             <w:r>
               <w:rPr>
@@ -507,7 +510,7 @@
               <w:lang w:val="es-CO" w:eastAsia="ja-JP"/>
             </w:rPr>
           </w:pPr>
-          <w:hyperlink w:anchor="_Toc238078884" w:history="1">
+          <w:hyperlink w:anchor="_Toc238168358" w:history="1">
             <w:r>
               <w:rPr>
                 <w:rStyle w:val="Hipervnculo"/>
@@ -553,7 +556,7 @@
                 <w:noProof/>
                 <w:webHidden/>
               </w:rPr>
-              <w:instrText xml:space="preserve"> PAGEREF _Toc238078884 \h </w:instrText>
+              <w:instrText xml:space="preserve"> PAGEREF _Toc238168358 \h </w:instrText>
             </w:r>
             <w:r>
               <w:rPr>
@@ -599,7 +602,7 @@
               <w:lang w:val="es-CO" w:eastAsia="ja-JP"/>
             </w:rPr>
           </w:pPr>
-          <w:hyperlink w:anchor="_Toc238078885" w:history="1">
+          <w:hyperlink w:anchor="_Toc238168359" w:history="1">
             <w:r>
               <w:rPr>
                 <w:rStyle w:val="Hipervnculo"/>
@@ -645,7 +648,7 @@
                 <w:noProof/>
                 <w:webHidden/>
               </w:rPr>
-              <w:instrText xml:space="preserve"> PAGEREF _Toc238078885 \h </w:instrText>
+              <w:instrText xml:space="preserve"> PAGEREF _Toc238168359 \h </w:instrText>
             </w:r>
             <w:r>
               <w:rPr>
@@ -691,7 +694,7 @@
               <w:lang w:val="es-CO" w:eastAsia="ja-JP"/>
             </w:rPr>
           </w:pPr>
-          <w:hyperlink w:anchor="_Toc238078886" w:history="1">
+          <w:hyperlink w:anchor="_Toc238168360" w:history="1">
             <w:r>
               <w:rPr>
                 <w:rStyle w:val="Hipervnculo"/>
@@ -735,7 +738,7 @@
                 <w:noProof/>
                 <w:webHidden/>
               </w:rPr>
-              <w:instrText xml:space="preserve"> PAGEREF _Toc238078886 \h </w:instrText>
+              <w:instrText xml:space="preserve"> PAGEREF _Toc238168360 \h </w:instrText>
             </w:r>
             <w:r>
               <w:rPr>
@@ -781,7 +784,7 @@
               <w:lang w:val="es-CO" w:eastAsia="ja-JP"/>
             </w:rPr>
           </w:pPr>
-          <w:hyperlink w:anchor="_Toc238078887" w:history="1">
+          <w:hyperlink w:anchor="_Toc238168361" w:history="1">
             <w:r>
               <w:rPr>
                 <w:rStyle w:val="Hipervnculo"/>
@@ -827,7 +830,7 @@
                 <w:noProof/>
                 <w:webHidden/>
               </w:rPr>
-              <w:instrText xml:space="preserve"> PAGEREF _Toc238078887 \h </w:instrText>
+              <w:instrText xml:space="preserve"> PAGEREF _Toc238168361 \h </w:instrText>
             </w:r>
             <w:r>
               <w:rPr>
@@ -873,7 +876,7 @@
               <w:lang w:val="es-CO" w:eastAsia="ja-JP"/>
             </w:rPr>
           </w:pPr>
-          <w:hyperlink w:anchor="_Toc238078888" w:history="1">
+          <w:hyperlink w:anchor="_Toc238168362" w:history="1">
             <w:r>
               <w:rPr>
                 <w:rStyle w:val="Hipervnculo"/>
@@ -919,7 +922,7 @@
                 <w:noProof/>
                 <w:webHidden/>
               </w:rPr>
-              <w:instrText xml:space="preserve"> PAGEREF _Toc238078888 \h </w:instrText>
+              <w:instrText xml:space="preserve"> PAGEREF _Toc238168362 \h </w:instrText>
             </w:r>
             <w:r>
               <w:rPr>
@@ -965,7 +968,7 @@
               <w:lang w:val="es-CO" w:eastAsia="ja-JP"/>
             </w:rPr>
           </w:pPr>
-          <w:hyperlink w:anchor="_Toc238078889" w:history="1">
+          <w:hyperlink w:anchor="_Toc238168363" w:history="1">
             <w:r>
               <w:rPr>
                 <w:rStyle w:val="Hipervnculo"/>
@@ -1011,7 +1014,7 @@
                 <w:noProof/>
                 <w:webHidden/>
               </w:rPr>
-              <w:instrText xml:space="preserve"> PAGEREF _Toc238078889 \h </w:instrText>
+              <w:instrText xml:space="preserve"> PAGEREF _Toc238168363 \h </w:instrText>
             </w:r>
             <w:r>
               <w:rPr>
@@ -1057,7 +1060,7 @@
               <w:lang w:val="es-CO" w:eastAsia="ja-JP"/>
             </w:rPr>
           </w:pPr>
-          <w:hyperlink w:anchor="_Toc238078890" w:history="1">
+          <w:hyperlink w:anchor="_Toc238168364" w:history="1">
             <w:r>
               <w:rPr>
                 <w:rStyle w:val="Hipervnculo"/>
@@ -1103,7 +1106,7 @@
                 <w:noProof/>
                 <w:webHidden/>
               </w:rPr>
-              <w:instrText xml:space="preserve"> PAGEREF _Toc238078890 \h </w:instrText>
+              <w:instrText xml:space="preserve"> PAGEREF _Toc238168364 \h </w:instrText>
             </w:r>
             <w:r>
               <w:rPr>
@@ -1149,7 +1152,7 @@
               <w:lang w:val="es-CO" w:eastAsia="ja-JP"/>
             </w:rPr>
           </w:pPr>
-          <w:hyperlink w:anchor="_Toc238078891" w:history="1">
+          <w:hyperlink w:anchor="_Toc238168365" w:history="1">
             <w:r>
               <w:rPr>
                 <w:rStyle w:val="Hipervnculo"/>
@@ -1195,7 +1198,7 @@
                 <w:noProof/>
                 <w:webHidden/>
               </w:rPr>
-              <w:instrText xml:space="preserve"> PAGEREF _Toc238078891 \h </w:instrText>
+              <w:instrText xml:space="preserve"> PAGEREF _Toc238168365 \h </w:instrText>
             </w:r>
             <w:r>
               <w:rPr>
@@ -1241,7 +1244,7 @@
               <w:lang w:val="es-CO" w:eastAsia="ja-JP"/>
             </w:rPr>
           </w:pPr>
-          <w:hyperlink w:anchor="_Toc238078892" w:history="1">
+          <w:hyperlink w:anchor="_Toc238168366" w:history="1">
             <w:r>
               <w:rPr>
                 <w:rStyle w:val="Hipervnculo"/>
@@ -1287,7 +1290,7 @@
                 <w:noProof/>
                 <w:webHidden/>
               </w:rPr>
-              <w:instrText xml:space="preserve"> PAGEREF _Toc238078892 \h </w:instrText>
+              <w:instrText xml:space="preserve"> PAGEREF _Toc238168366 \h </w:instrText>
             </w:r>
             <w:r>
               <w:rPr>
@@ -1333,7 +1336,7 @@
               <w:lang w:val="es-CO" w:eastAsia="ja-JP"/>
             </w:rPr>
           </w:pPr>
-          <w:hyperlink w:anchor="_Toc238078893" w:history="1">
+          <w:hyperlink w:anchor="_Toc238168367" w:history="1">
             <w:r>
               <w:rPr>
                 <w:rStyle w:val="Hipervnculo"/>
@@ -1379,7 +1382,7 @@
                 <w:noProof/>
                 <w:webHidden/>
               </w:rPr>
-              <w:instrText xml:space="preserve"> PAGEREF _Toc238078893 \h </w:instrText>
+              <w:instrText xml:space="preserve"> PAGEREF _Toc238168367 \h </w:instrText>
             </w:r>
             <w:r>
               <w:rPr>
@@ -1425,7 +1428,7 @@
               <w:lang w:val="es-CO" w:eastAsia="ja-JP"/>
             </w:rPr>
           </w:pPr>
-          <w:hyperlink w:anchor="_Toc238078894" w:history="1">
+          <w:hyperlink w:anchor="_Toc238168368" w:history="1">
             <w:r>
               <w:rPr>
                 <w:rStyle w:val="Hipervnculo"/>
@@ -1471,7 +1474,7 @@
                 <w:noProof/>
                 <w:webHidden/>
               </w:rPr>
-              <w:instrText xml:space="preserve"> PAGEREF _Toc238078894 \h </w:instrText>
+              <w:instrText xml:space="preserve"> PAGEREF _Toc238168368 \h </w:instrText>
             </w:r>
             <w:r>
               <w:rPr>
@@ -1517,7 +1520,7 @@
               <w:lang w:val="es-CO" w:eastAsia="ja-JP"/>
             </w:rPr>
           </w:pPr>
-          <w:hyperlink w:anchor="_Toc238078895" w:history="1">
+          <w:hyperlink w:anchor="_Toc238168369" w:history="1">
             <w:r>
               <w:rPr>
                 <w:rStyle w:val="Hipervnculo"/>
@@ -1561,7 +1564,7 @@
                 <w:noProof/>
                 <w:webHidden/>
               </w:rPr>
-              <w:instrText xml:space="preserve"> PAGEREF _Toc238078895 \h </w:instrText>
+              <w:instrText xml:space="preserve"> PAGEREF _Toc238168369 \h </w:instrText>
             </w:r>
             <w:r>
               <w:rPr>
@@ -1607,7 +1610,7 @@
               <w:lang w:val="es-CO" w:eastAsia="ja-JP"/>
             </w:rPr>
           </w:pPr>
-          <w:hyperlink w:anchor="_Toc238078896" w:history="1">
+          <w:hyperlink w:anchor="_Toc238168370" w:history="1">
             <w:r>
               <w:rPr>
                 <w:rStyle w:val="Hipervnculo"/>
@@ -1651,7 +1654,7 @@
                 <w:noProof/>
                 <w:webHidden/>
               </w:rPr>
-              <w:instrText xml:space="preserve"> PAGEREF _Toc238078896 \h </w:instrText>
+              <w:instrText xml:space="preserve"> PAGEREF _Toc238168370 \h </w:instrText>
             </w:r>
             <w:r>
               <w:rPr>
@@ -1697,7 +1700,7 @@
               <w:lang w:val="es-CO" w:eastAsia="ja-JP"/>
             </w:rPr>
           </w:pPr>
-          <w:hyperlink w:anchor="_Toc238078897" w:history="1">
+          <w:hyperlink w:anchor="_Toc238168371" w:history="1">
             <w:r>
               <w:rPr>
                 <w:rStyle w:val="Hipervnculo"/>
@@ -1741,7 +1744,7 @@
                 <w:noProof/>
                 <w:webHidden/>
               </w:rPr>
-              <w:instrText xml:space="preserve"> PAGEREF _Toc238078897 \h </w:instrText>
+              <w:instrText xml:space="preserve"> PAGEREF _Toc238168371 \h </w:instrText>
             </w:r>
             <w:r>
               <w:rPr>
@@ -1787,7 +1790,7 @@
               <w:lang w:val="es-CO" w:eastAsia="ja-JP"/>
             </w:rPr>
           </w:pPr>
-          <w:hyperlink w:anchor="_Toc238078898" w:history="1">
+          <w:hyperlink w:anchor="_Toc238168372" w:history="1">
             <w:r>
               <w:rPr>
                 <w:rStyle w:val="Hipervnculo"/>
@@ -1833,7 +1836,7 @@
                 <w:noProof/>
                 <w:webHidden/>
               </w:rPr>
-              <w:instrText xml:space="preserve"> PAGEREF _Toc238078898 \h </w:instrText>
+              <w:instrText xml:space="preserve"> PAGEREF _Toc238168372 \h </w:instrText>
             </w:r>
             <w:r>
               <w:rPr>
@@ -1879,7 +1882,7 @@
               <w:lang w:val="es-CO" w:eastAsia="ja-JP"/>
             </w:rPr>
           </w:pPr>
-          <w:hyperlink w:anchor="_Toc238078899" w:history="1">
+          <w:hyperlink w:anchor="_Toc238168373" w:history="1">
             <w:r>
               <w:rPr>
                 <w:rStyle w:val="Hipervnculo"/>
@@ -1925,7 +1928,7 @@
                 <w:noProof/>
                 <w:webHidden/>
               </w:rPr>
-              <w:instrText xml:space="preserve"> PAGEREF _Toc238078899 \h </w:instrText>
+              <w:instrText xml:space="preserve"> PAGEREF _Toc238168373 \h </w:instrText>
             </w:r>
             <w:r>
               <w:rPr>
@@ -1971,7 +1974,7 @@
               <w:lang w:val="es-CO" w:eastAsia="ja-JP"/>
             </w:rPr>
           </w:pPr>
-          <w:hyperlink w:anchor="_Toc238078900" w:history="1">
+          <w:hyperlink w:anchor="_Toc238168374" w:history="1">
             <w:r>
               <w:rPr>
                 <w:rStyle w:val="Hipervnculo"/>
@@ -2017,7 +2020,7 @@
                 <w:noProof/>
                 <w:webHidden/>
               </w:rPr>
-              <w:instrText xml:space="preserve"> PAGEREF _Toc238078900 \h </w:instrText>
+              <w:instrText xml:space="preserve"> PAGEREF _Toc238168374 \h </w:instrText>
             </w:r>
             <w:r>
               <w:rPr>
@@ -2063,7 +2066,7 @@
               <w:lang w:val="es-CO" w:eastAsia="ja-JP"/>
             </w:rPr>
           </w:pPr>
-          <w:hyperlink w:anchor="_Toc238078901" w:history="1">
+          <w:hyperlink w:anchor="_Toc238168375" w:history="1">
             <w:r>
               <w:rPr>
                 <w:rStyle w:val="Hipervnculo"/>
@@ -2109,7 +2112,7 @@
                 <w:noProof/>
                 <w:webHidden/>
               </w:rPr>
-              <w:instrText xml:space="preserve"> PAGEREF _Toc238078901 \h </w:instrText>
+              <w:instrText xml:space="preserve"> PAGEREF _Toc238168375 \h </w:instrText>
             </w:r>
             <w:r>
               <w:rPr>
@@ -2155,7 +2158,7 @@
               <w:lang w:val="es-CO" w:eastAsia="ja-JP"/>
             </w:rPr>
           </w:pPr>
-          <w:hyperlink w:anchor="_Toc238078902" w:history="1">
+          <w:hyperlink w:anchor="_Toc238168376" w:history="1">
             <w:r>
               <w:rPr>
                 <w:rStyle w:val="Hipervnculo"/>
@@ -2201,7 +2204,7 @@
                 <w:noProof/>
                 <w:webHidden/>
               </w:rPr>
-              <w:instrText xml:space="preserve"> PAGEREF _Toc238078902 \h </w:instrText>
+              <w:instrText xml:space="preserve"> PAGEREF _Toc238168376 \h </w:instrText>
             </w:r>
             <w:r>
               <w:rPr>
@@ -2247,7 +2250,7 @@
               <w:lang w:val="es-CO" w:eastAsia="ja-JP"/>
             </w:rPr>
           </w:pPr>
-          <w:hyperlink w:anchor="_Toc238078903" w:history="1">
+          <w:hyperlink w:anchor="_Toc238168377" w:history="1">
             <w:r>
               <w:rPr>
                 <w:rStyle w:val="Hipervnculo"/>
@@ -2293,7 +2296,7 @@
                 <w:noProof/>
                 <w:webHidden/>
               </w:rPr>
-              <w:instrText xml:space="preserve"> PAGEREF _Toc238078903 \h </w:instrText>
+              <w:instrText xml:space="preserve"> PAGEREF _Toc238168377 \h </w:instrText>
             </w:r>
             <w:r>
               <w:rPr>
@@ -2339,7 +2342,7 @@
               <w:lang w:val="es-CO" w:eastAsia="ja-JP"/>
             </w:rPr>
           </w:pPr>
-          <w:hyperlink w:anchor="_Toc238078904" w:history="1">
+          <w:hyperlink w:anchor="_Toc238168378" w:history="1">
             <w:r>
               <w:rPr>
                 <w:rStyle w:val="Hipervnculo"/>
@@ -2383,7 +2386,7 @@
                 <w:noProof/>
                 <w:webHidden/>
               </w:rPr>
-              <w:instrText xml:space="preserve"> PAGEREF _Toc238078904 \h </w:instrText>
+              <w:instrText xml:space="preserve"> PAGEREF _Toc238168378 \h </w:instrText>
             </w:r>
             <w:r>
               <w:rPr>
@@ -2429,7 +2432,7 @@
               <w:lang w:val="es-CO" w:eastAsia="ja-JP"/>
             </w:rPr>
           </w:pPr>
-          <w:hyperlink w:anchor="_Toc238078905" w:history="1">
+          <w:hyperlink w:anchor="_Toc238168379" w:history="1">
             <w:r>
               <w:rPr>
                 <w:rStyle w:val="Hipervnculo"/>
@@ -2473,7 +2476,7 @@
                 <w:noProof/>
                 <w:webHidden/>
               </w:rPr>
-              <w:instrText xml:space="preserve"> PAGEREF _Toc238078905 \h </w:instrText>
+              <w:instrText xml:space="preserve"> PAGEREF _Toc238168379 \h </w:instrText>
             </w:r>
             <w:r>
               <w:rPr>
@@ -2519,7 +2522,7 @@
               <w:lang w:val="es-CO" w:eastAsia="ja-JP"/>
             </w:rPr>
           </w:pPr>
-          <w:hyperlink w:anchor="_Toc238078906" w:history="1">
+          <w:hyperlink w:anchor="_Toc238168380" w:history="1">
             <w:r>
               <w:rPr>
                 <w:rStyle w:val="Hipervnculo"/>
@@ -2563,7 +2566,7 @@
                 <w:noProof/>
                 <w:webHidden/>
               </w:rPr>
-              <w:instrText xml:space="preserve"> PAGEREF _Toc238078906 \h </w:instrText>
+              <w:instrText xml:space="preserve"> PAGEREF _Toc238168380 \h </w:instrText>
             </w:r>
             <w:r>
               <w:rPr>
@@ -2609,7 +2612,7 @@
               <w:lang w:val="es-CO" w:eastAsia="ja-JP"/>
             </w:rPr>
           </w:pPr>
-          <w:hyperlink w:anchor="_Toc238078907" w:history="1">
+          <w:hyperlink w:anchor="_Toc238168381" w:history="1">
             <w:r>
               <w:rPr>
                 <w:rStyle w:val="Hipervnculo"/>
@@ -2653,7 +2656,7 @@
                 <w:noProof/>
                 <w:webHidden/>
               </w:rPr>
-              <w:instrText xml:space="preserve"> PAGEREF _Toc238078907 \h </w:instrText>
+              <w:instrText xml:space="preserve"> PAGEREF _Toc238168381 \h </w:instrText>
             </w:r>
             <w:r>
               <w:rPr>
@@ -2699,7 +2702,7 @@
               <w:lang w:val="es-CO" w:eastAsia="ja-JP"/>
             </w:rPr>
           </w:pPr>
-          <w:hyperlink w:anchor="_Toc238078908" w:history="1">
+          <w:hyperlink w:anchor="_Toc238168382" w:history="1">
             <w:r>
               <w:rPr>
                 <w:rStyle w:val="Hipervnculo"/>
@@ -2743,7 +2746,7 @@
                 <w:noProof/>
                 <w:webHidden/>
               </w:rPr>
-              <w:instrText xml:space="preserve"> PAGEREF _Toc238078908 \h </w:instrText>
+              <w:instrText xml:space="preserve"> PAGEREF _Toc238168382 \h </w:instrText>
             </w:r>
             <w:r>
               <w:rPr>
@@ -2789,7 +2792,7 @@
               <w:lang w:val="es-CO" w:eastAsia="ja-JP"/>
             </w:rPr>
           </w:pPr>
-          <w:hyperlink w:anchor="_Toc238078909" w:history="1">
+          <w:hyperlink w:anchor="_Toc238168383" w:history="1">
             <w:r>
               <w:rPr>
                 <w:rStyle w:val="Hipervnculo"/>
@@ -2835,7 +2838,7 @@
                 <w:noProof/>
                 <w:webHidden/>
               </w:rPr>
-              <w:instrText xml:space="preserve"> PAGEREF _Toc238078909 \h </w:instrText>
+              <w:instrText xml:space="preserve"> PAGEREF _Toc238168383 \h </w:instrText>
             </w:r>
             <w:r>
               <w:rPr>
@@ -2881,7 +2884,7 @@
               <w:lang w:val="es-CO" w:eastAsia="ja-JP"/>
             </w:rPr>
           </w:pPr>
-          <w:hyperlink w:anchor="_Toc238078910" w:history="1">
+          <w:hyperlink w:anchor="_Toc238168384" w:history="1">
             <w:r>
               <w:rPr>
                 <w:rStyle w:val="Hipervnculo"/>
@@ -2925,7 +2928,7 @@
                 <w:noProof/>
                 <w:webHidden/>
               </w:rPr>
-              <w:instrText xml:space="preserve"> PAGEREF _Toc238078910 \h </w:instrText>
+              <w:instrText xml:space="preserve"> PAGEREF _Toc238168384 \h </w:instrText>
             </w:r>
             <w:r>
               <w:rPr>
@@ -2971,7 +2974,7 @@
               <w:lang w:val="es-CO" w:eastAsia="ja-JP"/>
             </w:rPr>
           </w:pPr>
-          <w:hyperlink w:anchor="_Toc238078911" w:history="1">
+          <w:hyperlink w:anchor="_Toc238168385" w:history="1">
             <w:r>
               <w:rPr>
                 <w:rStyle w:val="Hipervnculo"/>
@@ -3015,7 +3018,7 @@
                 <w:noProof/>
                 <w:webHidden/>
               </w:rPr>
-              <w:instrText xml:space="preserve"> PAGEREF _Toc238078911 \h </w:instrText>
+              <w:instrText xml:space="preserve"> PAGEREF _Toc238168385 \h </w:instrText>
             </w:r>
             <w:r>
               <w:rPr>
@@ -3035,7 +3038,7 @@
                 <w:noProof/>
                 <w:webHidden/>
               </w:rPr>
-              <w:t>23</w:t>
+              <w:t>22</w:t>
             </w:r>
             <w:r>
               <w:rPr>
@@ -3061,7 +3064,7 @@
               <w:lang w:val="es-CO" w:eastAsia="ja-JP"/>
             </w:rPr>
           </w:pPr>
-          <w:hyperlink w:anchor="_Toc238078912" w:history="1">
+          <w:hyperlink w:anchor="_Toc238168386" w:history="1">
             <w:r>
               <w:rPr>
                 <w:rStyle w:val="Hipervnculo"/>
@@ -3107,7 +3110,7 @@
                 <w:noProof/>
                 <w:webHidden/>
               </w:rPr>
-              <w:instrText xml:space="preserve"> PAGEREF _Toc238078912 \h </w:instrText>
+              <w:instrText xml:space="preserve"> PAGEREF _Toc238168386 \h </w:instrText>
             </w:r>
             <w:r>
               <w:rPr>
@@ -3127,7 +3130,7 @@
                 <w:noProof/>
                 <w:webHidden/>
               </w:rPr>
-              <w:t>25</w:t>
+              <w:t>24</w:t>
             </w:r>
             <w:r>
               <w:rPr>
@@ -3153,7 +3156,7 @@
               <w:lang w:val="es-CO" w:eastAsia="ja-JP"/>
             </w:rPr>
           </w:pPr>
-          <w:hyperlink w:anchor="_Toc238078913" w:history="1">
+          <w:hyperlink w:anchor="_Toc238168387" w:history="1">
             <w:r>
               <w:rPr>
                 <w:rStyle w:val="Hipervnculo"/>
@@ -3197,7 +3200,7 @@
                 <w:noProof/>
                 <w:webHidden/>
               </w:rPr>
-              <w:instrText xml:space="preserve"> PAGEREF _Toc238078913 \h </w:instrText>
+              <w:instrText xml:space="preserve"> PAGEREF _Toc238168387 \h </w:instrText>
             </w:r>
             <w:r>
               <w:rPr>
@@ -3217,7 +3220,7 @@
                 <w:noProof/>
                 <w:webHidden/>
               </w:rPr>
-              <w:t>25</w:t>
+              <w:t>24</w:t>
             </w:r>
             <w:r>
               <w:rPr>
@@ -3243,7 +3246,7 @@
               <w:lang w:val="es-CO" w:eastAsia="ja-JP"/>
             </w:rPr>
           </w:pPr>
-          <w:hyperlink w:anchor="_Toc238078914" w:history="1">
+          <w:hyperlink w:anchor="_Toc238168388" w:history="1">
             <w:r>
               <w:rPr>
                 <w:rStyle w:val="Hipervnculo"/>
@@ -3287,7 +3290,7 @@
                 <w:noProof/>
                 <w:webHidden/>
               </w:rPr>
-              <w:instrText xml:space="preserve"> PAGEREF _Toc238078914 \h </w:instrText>
+              <w:instrText xml:space="preserve"> PAGEREF _Toc238168388 \h </w:instrText>
             </w:r>
             <w:r>
               <w:rPr>
@@ -3307,7 +3310,7 @@
                 <w:noProof/>
                 <w:webHidden/>
               </w:rPr>
-              <w:t>26</w:t>
+              <w:t>25</w:t>
             </w:r>
             <w:r>
               <w:rPr>
@@ -3333,7 +3336,7 @@
               <w:lang w:val="es-CO" w:eastAsia="ja-JP"/>
             </w:rPr>
           </w:pPr>
-          <w:hyperlink w:anchor="_Toc238078915" w:history="1">
+          <w:hyperlink w:anchor="_Toc238168389" w:history="1">
             <w:r>
               <w:rPr>
                 <w:rStyle w:val="Hipervnculo"/>
@@ -3377,7 +3380,7 @@
                 <w:noProof/>
                 <w:webHidden/>
               </w:rPr>
-              <w:instrText xml:space="preserve"> PAGEREF _Toc238078915 \h </w:instrText>
+              <w:instrText xml:space="preserve"> PAGEREF _Toc238168389 \h </w:instrText>
             </w:r>
             <w:r>
               <w:rPr>
@@ -3397,7 +3400,7 @@
                 <w:noProof/>
                 <w:webHidden/>
               </w:rPr>
-              <w:t>27</w:t>
+              <w:t>26</w:t>
             </w:r>
             <w:r>
               <w:rPr>
@@ -3423,7 +3426,7 @@
               <w:lang w:val="es-CO" w:eastAsia="ja-JP"/>
             </w:rPr>
           </w:pPr>
-          <w:hyperlink w:anchor="_Toc238078916" w:history="1">
+          <w:hyperlink w:anchor="_Toc238168390" w:history="1">
             <w:r>
               <w:rPr>
                 <w:rStyle w:val="Hipervnculo"/>
@@ -3467,7 +3470,7 @@
                 <w:noProof/>
                 <w:webHidden/>
               </w:rPr>
-              <w:instrText xml:space="preserve"> PAGEREF _Toc238078916 \h </w:instrText>
+              <w:instrText xml:space="preserve"> PAGEREF _Toc238168390 \h </w:instrText>
             </w:r>
             <w:r>
               <w:rPr>
@@ -3487,7 +3490,7 @@
                 <w:noProof/>
                 <w:webHidden/>
               </w:rPr>
-              <w:t>29</w:t>
+              <w:t>28</w:t>
             </w:r>
             <w:r>
               <w:rPr>
@@ -3513,7 +3516,7 @@
               <w:lang w:val="es-CO" w:eastAsia="ja-JP"/>
             </w:rPr>
           </w:pPr>
-          <w:hyperlink w:anchor="_Toc238078917" w:history="1">
+          <w:hyperlink w:anchor="_Toc238168391" w:history="1">
             <w:r>
               <w:rPr>
                 <w:rStyle w:val="Hipervnculo"/>
@@ -3559,7 +3562,7 @@
                 <w:noProof/>
                 <w:webHidden/>
               </w:rPr>
-              <w:instrText xml:space="preserve"> PAGEREF _Toc238078917 \h </w:instrText>
+              <w:instrText xml:space="preserve"> PAGEREF _Toc238168391 \h </w:instrText>
             </w:r>
             <w:r>
               <w:rPr>
@@ -3579,7 +3582,7 @@
                 <w:noProof/>
                 <w:webHidden/>
               </w:rPr>
-              <w:t>31</w:t>
+              <w:t>29</w:t>
             </w:r>
             <w:r>
               <w:rPr>
@@ -3605,7 +3608,7 @@
               <w:lang w:val="es-CO" w:eastAsia="ja-JP"/>
             </w:rPr>
           </w:pPr>
-          <w:hyperlink w:anchor="_Toc238078918" w:history="1">
+          <w:hyperlink w:anchor="_Toc238168392" w:history="1">
             <w:r>
               <w:rPr>
                 <w:rStyle w:val="Hipervnculo"/>
@@ -3649,7 +3652,7 @@
                 <w:noProof/>
                 <w:webHidden/>
               </w:rPr>
-              <w:instrText xml:space="preserve"> PAGEREF _Toc238078918 \h </w:instrText>
+              <w:instrText xml:space="preserve"> PAGEREF _Toc238168392 \h </w:instrText>
             </w:r>
             <w:r>
               <w:rPr>
@@ -3669,7 +3672,7 @@
                 <w:noProof/>
                 <w:webHidden/>
               </w:rPr>
-              <w:t>31</w:t>
+              <w:t>30</w:t>
             </w:r>
             <w:r>
               <w:rPr>
@@ -3695,7 +3698,7 @@
               <w:lang w:val="es-CO" w:eastAsia="ja-JP"/>
             </w:rPr>
           </w:pPr>
-          <w:hyperlink w:anchor="_Toc238078919" w:history="1">
+          <w:hyperlink w:anchor="_Toc238168393" w:history="1">
             <w:r>
               <w:rPr>
                 <w:rStyle w:val="Hipervnculo"/>
@@ -3739,7 +3742,7 @@
                 <w:noProof/>
                 <w:webHidden/>
               </w:rPr>
-              <w:instrText xml:space="preserve"> PAGEREF _Toc238078919 \h </w:instrText>
+              <w:instrText xml:space="preserve"> PAGEREF _Toc238168393 \h </w:instrText>
             </w:r>
             <w:r>
               <w:rPr>
@@ -3759,7 +3762,7 @@
                 <w:noProof/>
                 <w:webHidden/>
               </w:rPr>
-              <w:t>32</w:t>
+              <w:t>30</w:t>
             </w:r>
             <w:r>
               <w:rPr>
@@ -3785,7 +3788,7 @@
               <w:lang w:val="es-CO" w:eastAsia="ja-JP"/>
             </w:rPr>
           </w:pPr>
-          <w:hyperlink w:anchor="_Toc238078920" w:history="1">
+          <w:hyperlink w:anchor="_Toc238168394" w:history="1">
             <w:r>
               <w:rPr>
                 <w:rStyle w:val="Hipervnculo"/>
@@ -3829,7 +3832,7 @@
                 <w:noProof/>
                 <w:webHidden/>
               </w:rPr>
-              <w:instrText xml:space="preserve"> PAGEREF _Toc238078920 \h </w:instrText>
+              <w:instrText xml:space="preserve"> PAGEREF _Toc238168394 \h </w:instrText>
             </w:r>
             <w:r>
               <w:rPr>
@@ -3849,7 +3852,7 @@
                 <w:noProof/>
                 <w:webHidden/>
               </w:rPr>
-              <w:t>35</w:t>
+              <w:t>33</w:t>
             </w:r>
             <w:r>
               <w:rPr>
@@ -3875,7 +3878,7 @@
               <w:lang w:val="es-CO" w:eastAsia="ja-JP"/>
             </w:rPr>
           </w:pPr>
-          <w:hyperlink w:anchor="_Toc238078921" w:history="1">
+          <w:hyperlink w:anchor="_Toc238168395" w:history="1">
             <w:r>
               <w:rPr>
                 <w:rStyle w:val="Hipervnculo"/>
@@ -3919,7 +3922,7 @@
                 <w:noProof/>
                 <w:webHidden/>
               </w:rPr>
-              <w:instrText xml:space="preserve"> PAGEREF _Toc238078921 \h </w:instrText>
+              <w:instrText xml:space="preserve"> PAGEREF _Toc238168395 \h </w:instrText>
             </w:r>
             <w:r>
               <w:rPr>
@@ -3939,7 +3942,7 @@
                 <w:noProof/>
                 <w:webHidden/>
               </w:rPr>
-              <w:t>40</w:t>
+              <w:t>37</w:t>
             </w:r>
             <w:r>
               <w:rPr>
@@ -3965,7 +3968,7 @@
               <w:lang w:val="es-CO" w:eastAsia="ja-JP"/>
             </w:rPr>
           </w:pPr>
-          <w:hyperlink w:anchor="_Toc238078922" w:history="1">
+          <w:hyperlink w:anchor="_Toc238168396" w:history="1">
             <w:r>
               <w:rPr>
                 <w:rStyle w:val="Hipervnculo"/>
@@ -4009,7 +4012,7 @@
                 <w:noProof/>
                 <w:webHidden/>
               </w:rPr>
-              <w:instrText xml:space="preserve"> PAGEREF _Toc238078922 \h </w:instrText>
+              <w:instrText xml:space="preserve"> PAGEREF _Toc238168396 \h </w:instrText>
             </w:r>
             <w:r>
               <w:rPr>
@@ -4029,7 +4032,7 @@
                 <w:noProof/>
                 <w:webHidden/>
               </w:rPr>
-              <w:t>41</w:t>
+              <w:t>38</w:t>
             </w:r>
             <w:r>
               <w:rPr>
@@ -4055,7 +4058,7 @@
               <w:lang w:val="es-CO" w:eastAsia="ja-JP"/>
             </w:rPr>
           </w:pPr>
-          <w:hyperlink w:anchor="_Toc238078923" w:history="1">
+          <w:hyperlink w:anchor="_Toc238168397" w:history="1">
             <w:r>
               <w:rPr>
                 <w:rStyle w:val="Hipervnculo"/>
@@ -4101,7 +4104,7 @@
                 <w:noProof/>
                 <w:webHidden/>
               </w:rPr>
-              <w:instrText xml:space="preserve"> PAGEREF _Toc238078923 \h </w:instrText>
+              <w:instrText xml:space="preserve"> PAGEREF _Toc238168397 \h </w:instrText>
             </w:r>
             <w:r>
               <w:rPr>
@@ -4121,7 +4124,7 @@
                 <w:noProof/>
                 <w:webHidden/>
               </w:rPr>
-              <w:t>42</w:t>
+              <w:t>39</w:t>
             </w:r>
             <w:r>
               <w:rPr>
@@ -4147,7 +4150,7 @@
               <w:lang w:val="es-CO" w:eastAsia="ja-JP"/>
             </w:rPr>
           </w:pPr>
-          <w:hyperlink w:anchor="_Toc238078924" w:history="1">
+          <w:hyperlink w:anchor="_Toc238168398" w:history="1">
             <w:r>
               <w:rPr>
                 <w:rStyle w:val="Hipervnculo"/>
@@ -4191,7 +4194,7 @@
                 <w:noProof/>
                 <w:webHidden/>
               </w:rPr>
-              <w:instrText xml:space="preserve"> PAGEREF _Toc238078924 \h </w:instrText>
+              <w:instrText xml:space="preserve"> PAGEREF _Toc238168398 \h </w:instrText>
             </w:r>
             <w:r>
               <w:rPr>
@@ -4211,7 +4214,7 @@
                 <w:noProof/>
                 <w:webHidden/>
               </w:rPr>
-              <w:t>42</w:t>
+              <w:t>39</w:t>
             </w:r>
             <w:r>
               <w:rPr>
@@ -4237,7 +4240,7 @@
               <w:lang w:val="es-CO" w:eastAsia="ja-JP"/>
             </w:rPr>
           </w:pPr>
-          <w:hyperlink w:anchor="_Toc238078925" w:history="1">
+          <w:hyperlink w:anchor="_Toc238168399" w:history="1">
             <w:r>
               <w:rPr>
                 <w:rStyle w:val="Hipervnculo"/>
@@ -4281,7 +4284,7 @@
                 <w:noProof/>
                 <w:webHidden/>
               </w:rPr>
-              <w:instrText xml:space="preserve"> PAGEREF _Toc238078925 \h </w:instrText>
+              <w:instrText xml:space="preserve"> PAGEREF _Toc238168399 \h </w:instrText>
             </w:r>
             <w:r>
               <w:rPr>
@@ -4301,7 +4304,7 @@
                 <w:noProof/>
                 <w:webHidden/>
               </w:rPr>
-              <w:t>44</w:t>
+              <w:t>41</w:t>
             </w:r>
             <w:r>
               <w:rPr>
@@ -4327,7 +4330,7 @@
               <w:lang w:val="es-CO" w:eastAsia="ja-JP"/>
             </w:rPr>
           </w:pPr>
-          <w:hyperlink w:anchor="_Toc238078926" w:history="1">
+          <w:hyperlink w:anchor="_Toc238168400" w:history="1">
             <w:r>
               <w:rPr>
                 <w:rStyle w:val="Hipervnculo"/>
@@ -4371,7 +4374,7 @@
                 <w:noProof/>
                 <w:webHidden/>
               </w:rPr>
-              <w:instrText xml:space="preserve"> PAGEREF _Toc238078926 \h </w:instrText>
+              <w:instrText xml:space="preserve"> PAGEREF _Toc238168400 \h </w:instrText>
             </w:r>
             <w:r>
               <w:rPr>
@@ -4391,7 +4394,7 @@
                 <w:noProof/>
                 <w:webHidden/>
               </w:rPr>
-              <w:t>48</w:t>
+              <w:t>44</w:t>
             </w:r>
             <w:r>
               <w:rPr>
@@ -4417,7 +4420,7 @@
               <w:lang w:val="es-CO" w:eastAsia="ja-JP"/>
             </w:rPr>
           </w:pPr>
-          <w:hyperlink w:anchor="_Toc238078927" w:history="1">
+          <w:hyperlink w:anchor="_Toc238168401" w:history="1">
             <w:r>
               <w:rPr>
                 <w:rStyle w:val="Hipervnculo"/>
@@ -4463,7 +4466,7 @@
                 <w:noProof/>
                 <w:webHidden/>
               </w:rPr>
-              <w:instrText xml:space="preserve"> PAGEREF _Toc238078927 \h </w:instrText>
+              <w:instrText xml:space="preserve"> PAGEREF _Toc238168401 \h </w:instrText>
             </w:r>
             <w:r>
               <w:rPr>
@@ -4483,7 +4486,7 @@
                 <w:noProof/>
                 <w:webHidden/>
               </w:rPr>
-              <w:t>49</w:t>
+              <w:t>45</w:t>
             </w:r>
             <w:r>
               <w:rPr>
@@ -4509,7 +4512,7 @@
               <w:lang w:val="es-CO" w:eastAsia="ja-JP"/>
             </w:rPr>
           </w:pPr>
-          <w:hyperlink w:anchor="_Toc238078928" w:history="1">
+          <w:hyperlink w:anchor="_Toc238168402" w:history="1">
             <w:r>
               <w:rPr>
                 <w:rStyle w:val="Hipervnculo"/>
@@ -4553,7 +4556,7 @@
                 <w:noProof/>
                 <w:webHidden/>
               </w:rPr>
-              <w:instrText xml:space="preserve"> PAGEREF _Toc238078928 \h </w:instrText>
+              <w:instrText xml:space="preserve"> PAGEREF _Toc238168402 \h </w:instrText>
             </w:r>
             <w:r>
               <w:rPr>
@@ -4573,7 +4576,7 @@
                 <w:noProof/>
                 <w:webHidden/>
               </w:rPr>
-              <w:t>49</w:t>
+              <w:t>46</w:t>
             </w:r>
             <w:r>
               <w:rPr>
@@ -4599,7 +4602,7 @@
               <w:lang w:val="es-CO" w:eastAsia="ja-JP"/>
             </w:rPr>
           </w:pPr>
-          <w:hyperlink w:anchor="_Toc238078929" w:history="1">
+          <w:hyperlink w:anchor="_Toc238168403" w:history="1">
             <w:r>
               <w:rPr>
                 <w:rStyle w:val="Hipervnculo"/>
@@ -4643,7 +4646,7 @@
                 <w:noProof/>
                 <w:webHidden/>
               </w:rPr>
-              <w:instrText xml:space="preserve"> PAGEREF _Toc238078929 \h </w:instrText>
+              <w:instrText xml:space="preserve"> PAGEREF _Toc238168403 \h </w:instrText>
             </w:r>
             <w:r>
               <w:rPr>
@@ -4663,7 +4666,7 @@
                 <w:noProof/>
                 <w:webHidden/>
               </w:rPr>
-              <w:t>51</w:t>
+              <w:t>47</w:t>
             </w:r>
             <w:r>
               <w:rPr>
@@ -4689,7 +4692,7 @@
               <w:lang w:val="es-CO" w:eastAsia="ja-JP"/>
             </w:rPr>
           </w:pPr>
-          <w:hyperlink w:anchor="_Toc238078930" w:history="1">
+          <w:hyperlink w:anchor="_Toc238168404" w:history="1">
             <w:r>
               <w:rPr>
                 <w:rStyle w:val="Hipervnculo"/>
@@ -4733,7 +4736,7 @@
                 <w:noProof/>
                 <w:webHidden/>
               </w:rPr>
-              <w:instrText xml:space="preserve"> PAGEREF _Toc238078930 \h </w:instrText>
+              <w:instrText xml:space="preserve"> PAGEREF _Toc238168404 \h </w:instrText>
             </w:r>
             <w:r>
               <w:rPr>
@@ -4753,7 +4756,7 @@
                 <w:noProof/>
                 <w:webHidden/>
               </w:rPr>
-              <w:t>53</w:t>
+              <w:t>48</w:t>
             </w:r>
             <w:r>
               <w:rPr>
@@ -4779,7 +4782,7 @@
               <w:lang w:val="es-CO" w:eastAsia="ja-JP"/>
             </w:rPr>
           </w:pPr>
-          <w:hyperlink w:anchor="_Toc238078931" w:history="1">
+          <w:hyperlink w:anchor="_Toc238168405" w:history="1">
             <w:r>
               <w:rPr>
                 <w:rStyle w:val="Hipervnculo"/>
@@ -4823,7 +4826,7 @@
                 <w:noProof/>
                 <w:webHidden/>
               </w:rPr>
-              <w:instrText xml:space="preserve"> PAGEREF _Toc238078931 \h </w:instrText>
+              <w:instrText xml:space="preserve"> PAGEREF _Toc238168405 \h </w:instrText>
             </w:r>
             <w:r>
               <w:rPr>
@@ -4843,7 +4846,7 @@
                 <w:noProof/>
                 <w:webHidden/>
               </w:rPr>
-              <w:t>53</w:t>
+              <w:t>48</w:t>
             </w:r>
             <w:r>
               <w:rPr>
@@ -4869,7 +4872,7 @@
               <w:lang w:val="es-CO" w:eastAsia="ja-JP"/>
             </w:rPr>
           </w:pPr>
-          <w:hyperlink w:anchor="_Toc238078932" w:history="1">
+          <w:hyperlink w:anchor="_Toc238168406" w:history="1">
             <w:r>
               <w:rPr>
                 <w:rStyle w:val="Hipervnculo"/>
@@ -4913,7 +4916,7 @@
                 <w:noProof/>
                 <w:webHidden/>
               </w:rPr>
-              <w:instrText xml:space="preserve"> PAGEREF _Toc238078932 \h </w:instrText>
+              <w:instrText xml:space="preserve"> PAGEREF _Toc238168406 \h </w:instrText>
             </w:r>
             <w:r>
               <w:rPr>
@@ -4933,7 +4936,7 @@
                 <w:noProof/>
                 <w:webHidden/>
               </w:rPr>
-              <w:t>54</w:t>
+              <w:t>49</w:t>
             </w:r>
             <w:r>
               <w:rPr>
@@ -4959,7 +4962,7 @@
               <w:lang w:val="es-CO" w:eastAsia="ja-JP"/>
             </w:rPr>
           </w:pPr>
-          <w:hyperlink w:anchor="_Toc238078933" w:history="1">
+          <w:hyperlink w:anchor="_Toc238168407" w:history="1">
             <w:r>
               <w:rPr>
                 <w:rStyle w:val="Hipervnculo"/>
@@ -5003,7 +5006,7 @@
                 <w:noProof/>
                 <w:webHidden/>
               </w:rPr>
-              <w:instrText xml:space="preserve"> PAGEREF _Toc238078933 \h </w:instrText>
+              <w:instrText xml:space="preserve"> PAGEREF _Toc238168407 \h </w:instrText>
             </w:r>
             <w:r>
               <w:rPr>
@@ -5023,7 +5026,7 @@
                 <w:noProof/>
                 <w:webHidden/>
               </w:rPr>
-              <w:t>54</w:t>
+              <w:t>49</w:t>
             </w:r>
             <w:r>
               <w:rPr>
@@ -5049,7 +5052,7 @@
               <w:lang w:val="es-CO" w:eastAsia="ja-JP"/>
             </w:rPr>
           </w:pPr>
-          <w:hyperlink w:anchor="_Toc238078934" w:history="1">
+          <w:hyperlink w:anchor="_Toc238168408" w:history="1">
             <w:r>
               <w:rPr>
                 <w:rStyle w:val="Hipervnculo"/>
@@ -5093,7 +5096,7 @@
                 <w:noProof/>
                 <w:webHidden/>
               </w:rPr>
-              <w:instrText xml:space="preserve"> PAGEREF _Toc238078934 \h </w:instrText>
+              <w:instrText xml:space="preserve"> PAGEREF _Toc238168408 \h </w:instrText>
             </w:r>
             <w:r>
               <w:rPr>
@@ -5113,7 +5116,7 @@
                 <w:noProof/>
                 <w:webHidden/>
               </w:rPr>
-              <w:t>54</w:t>
+              <w:t>50</w:t>
             </w:r>
             <w:r>
               <w:rPr>
@@ -5139,7 +5142,7 @@
               <w:lang w:val="es-CO" w:eastAsia="ja-JP"/>
             </w:rPr>
           </w:pPr>
-          <w:hyperlink w:anchor="_Toc238078935" w:history="1">
+          <w:hyperlink w:anchor="_Toc238168409" w:history="1">
             <w:r>
               <w:rPr>
                 <w:rStyle w:val="Hipervnculo"/>
@@ -5183,7 +5186,7 @@
                 <w:noProof/>
                 <w:webHidden/>
               </w:rPr>
-              <w:instrText xml:space="preserve"> PAGEREF _Toc238078935 \h </w:instrText>
+              <w:instrText xml:space="preserve"> PAGEREF _Toc238168409 \h </w:instrText>
             </w:r>
             <w:r>
               <w:rPr>
@@ -5203,7 +5206,7 @@
                 <w:noProof/>
                 <w:webHidden/>
               </w:rPr>
-              <w:t>54</w:t>
+              <w:t>50</w:t>
             </w:r>
             <w:r>
               <w:rPr>
@@ -5229,7 +5232,7 @@
               <w:lang w:val="es-CO" w:eastAsia="ja-JP"/>
             </w:rPr>
           </w:pPr>
-          <w:hyperlink w:anchor="_Toc238078936" w:history="1">
+          <w:hyperlink w:anchor="_Toc238168410" w:history="1">
             <w:r>
               <w:rPr>
                 <w:rStyle w:val="Hipervnculo"/>
@@ -5273,7 +5276,7 @@
                 <w:noProof/>
                 <w:webHidden/>
               </w:rPr>
-              <w:instrText xml:space="preserve"> PAGEREF _Toc238078936 \h </w:instrText>
+              <w:instrText xml:space="preserve"> PAGEREF _Toc238168410 \h </w:instrText>
             </w:r>
             <w:r>
               <w:rPr>
@@ -5293,7 +5296,7 @@
                 <w:noProof/>
                 <w:webHidden/>
               </w:rPr>
-              <w:t>54</w:t>
+              <w:t>50</w:t>
             </w:r>
             <w:r>
               <w:rPr>
@@ -5319,7 +5322,7 @@
               <w:lang w:val="es-CO" w:eastAsia="ja-JP"/>
             </w:rPr>
           </w:pPr>
-          <w:hyperlink w:anchor="_Toc238078937" w:history="1">
+          <w:hyperlink w:anchor="_Toc238168411" w:history="1">
             <w:r>
               <w:rPr>
                 <w:rStyle w:val="Hipervnculo"/>
@@ -5363,7 +5366,7 @@
                 <w:noProof/>
                 <w:webHidden/>
               </w:rPr>
-              <w:instrText xml:space="preserve"> PAGEREF _Toc238078937 \h </w:instrText>
+              <w:instrText xml:space="preserve"> PAGEREF _Toc238168411 \h </w:instrText>
             </w:r>
             <w:r>
               <w:rPr>
@@ -5383,7 +5386,7 @@
                 <w:noProof/>
                 <w:webHidden/>
               </w:rPr>
-              <w:t>55</w:t>
+              <w:t>50</w:t>
             </w:r>
             <w:r>
               <w:rPr>
@@ -5409,7 +5412,7 @@
               <w:lang w:val="es-CO" w:eastAsia="ja-JP"/>
             </w:rPr>
           </w:pPr>
-          <w:hyperlink w:anchor="_Toc238078938" w:history="1">
+          <w:hyperlink w:anchor="_Toc238168412" w:history="1">
             <w:r>
               <w:rPr>
                 <w:rStyle w:val="Hipervnculo"/>
@@ -5453,7 +5456,7 @@
                 <w:noProof/>
                 <w:webHidden/>
               </w:rPr>
-              <w:instrText xml:space="preserve"> PAGEREF _Toc238078938 \h </w:instrText>
+              <w:instrText xml:space="preserve"> PAGEREF _Toc238168412 \h </w:instrText>
             </w:r>
             <w:r>
               <w:rPr>
@@ -5473,7 +5476,7 @@
                 <w:noProof/>
                 <w:webHidden/>
               </w:rPr>
-              <w:t>55</w:t>
+              <w:t>50</w:t>
             </w:r>
             <w:r>
               <w:rPr>
@@ -5499,7 +5502,7 @@
               <w:lang w:val="es-CO" w:eastAsia="ja-JP"/>
             </w:rPr>
           </w:pPr>
-          <w:hyperlink w:anchor="_Toc238078939" w:history="1">
+          <w:hyperlink w:anchor="_Toc238168413" w:history="1">
             <w:r>
               <w:rPr>
                 <w:rStyle w:val="Hipervnculo"/>
@@ -5563,7 +5566,7 @@
                 <w:noProof/>
                 <w:webHidden/>
               </w:rPr>
-              <w:instrText xml:space="preserve"> PAGEREF _Toc238078939 \h </w:instrText>
+              <w:instrText xml:space="preserve"> PAGEREF _Toc238168413 \h </w:instrText>
             </w:r>
             <w:r>
               <w:rPr>
@@ -5583,7 +5586,7 @@
                 <w:noProof/>
                 <w:webHidden/>
               </w:rPr>
-              <w:t>57</w:t>
+              <w:t>53</w:t>
             </w:r>
             <w:r>
               <w:rPr>
@@ -5609,7 +5612,7 @@
               <w:lang w:val="es-CO" w:eastAsia="ja-JP"/>
             </w:rPr>
           </w:pPr>
-          <w:hyperlink w:anchor="_Toc238078940" w:history="1">
+          <w:hyperlink w:anchor="_Toc238168414" w:history="1">
             <w:r>
               <w:rPr>
                 <w:rStyle w:val="Hipervnculo"/>
@@ -5653,7 +5656,7 @@
                 <w:noProof/>
                 <w:webHidden/>
               </w:rPr>
-              <w:instrText xml:space="preserve"> PAGEREF _Toc238078940 \h </w:instrText>
+              <w:instrText xml:space="preserve"> PAGEREF _Toc238168414 \h </w:instrText>
             </w:r>
             <w:r>
               <w:rPr>
@@ -5673,7 +5676,7 @@
                 <w:noProof/>
                 <w:webHidden/>
               </w:rPr>
-              <w:t>57</w:t>
+              <w:t>53</w:t>
             </w:r>
             <w:r>
               <w:rPr>
@@ -5699,7 +5702,7 @@
               <w:lang w:val="es-CO" w:eastAsia="ja-JP"/>
             </w:rPr>
           </w:pPr>
-          <w:hyperlink w:anchor="_Toc238078941" w:history="1">
+          <w:hyperlink w:anchor="_Toc238168415" w:history="1">
             <w:r>
               <w:rPr>
                 <w:rStyle w:val="Hipervnculo"/>
@@ -5743,7 +5746,7 @@
                 <w:noProof/>
                 <w:webHidden/>
               </w:rPr>
-              <w:instrText xml:space="preserve"> PAGEREF _Toc238078941 \h </w:instrText>
+              <w:instrText xml:space="preserve"> PAGEREF _Toc238168415 \h </w:instrText>
             </w:r>
             <w:r>
               <w:rPr>
@@ -5763,7 +5766,7 @@
                 <w:noProof/>
                 <w:webHidden/>
               </w:rPr>
-              <w:t>59</w:t>
+              <w:t>54</w:t>
             </w:r>
             <w:r>
               <w:rPr>
@@ -5789,7 +5792,7 @@
               <w:lang w:val="es-CO" w:eastAsia="ja-JP"/>
             </w:rPr>
           </w:pPr>
-          <w:hyperlink w:anchor="_Toc238078942" w:history="1">
+          <w:hyperlink w:anchor="_Toc238168416" w:history="1">
             <w:r>
               <w:rPr>
                 <w:rStyle w:val="Hipervnculo"/>
@@ -5833,7 +5836,7 @@
                 <w:noProof/>
                 <w:webHidden/>
               </w:rPr>
-              <w:instrText xml:space="preserve"> PAGEREF _Toc238078942 \h </w:instrText>
+              <w:instrText xml:space="preserve"> PAGEREF _Toc238168416 \h </w:instrText>
             </w:r>
             <w:r>
               <w:rPr>
@@ -5853,7 +5856,7 @@
                 <w:noProof/>
                 <w:webHidden/>
               </w:rPr>
-              <w:t>60</w:t>
+              <w:t>55</w:t>
             </w:r>
             <w:r>
               <w:rPr>
@@ -5879,7 +5882,7 @@
               <w:lang w:val="es-CO" w:eastAsia="ja-JP"/>
             </w:rPr>
           </w:pPr>
-          <w:hyperlink w:anchor="_Toc238078943" w:history="1">
+          <w:hyperlink w:anchor="_Toc238168417" w:history="1">
             <w:r>
               <w:rPr>
                 <w:rStyle w:val="Hipervnculo"/>
@@ -5923,7 +5926,7 @@
                 <w:noProof/>
                 <w:webHidden/>
               </w:rPr>
-              <w:instrText xml:space="preserve"> PAGEREF _Toc238078943 \h </w:instrText>
+              <w:instrText xml:space="preserve"> PAGEREF _Toc238168417 \h </w:instrText>
             </w:r>
             <w:r>
               <w:rPr>
@@ -5943,7 +5946,7 @@
                 <w:noProof/>
                 <w:webHidden/>
               </w:rPr>
-              <w:t>60</w:t>
+              <w:t>55</w:t>
             </w:r>
             <w:r>
               <w:rPr>
@@ -5969,7 +5972,7 @@
               <w:lang w:val="es-CO" w:eastAsia="ja-JP"/>
             </w:rPr>
           </w:pPr>
-          <w:hyperlink w:anchor="_Toc238078944" w:history="1">
+          <w:hyperlink w:anchor="_Toc238168418" w:history="1">
             <w:r>
               <w:rPr>
                 <w:rStyle w:val="Hipervnculo"/>
@@ -6013,7 +6016,7 @@
                 <w:noProof/>
                 <w:webHidden/>
               </w:rPr>
-              <w:instrText xml:space="preserve"> PAGEREF _Toc238078944 \h </w:instrText>
+              <w:instrText xml:space="preserve"> PAGEREF _Toc238168418 \h </w:instrText>
             </w:r>
             <w:r>
               <w:rPr>
@@ -6033,7 +6036,7 @@
                 <w:noProof/>
                 <w:webHidden/>
               </w:rPr>
-              <w:t>61</w:t>
+              <w:t>56</w:t>
             </w:r>
             <w:r>
               <w:rPr>
@@ -6059,7 +6062,7 @@
               <w:lang w:val="es-CO" w:eastAsia="ja-JP"/>
             </w:rPr>
           </w:pPr>
-          <w:hyperlink w:anchor="_Toc238078945" w:history="1">
+          <w:hyperlink w:anchor="_Toc238168419" w:history="1">
             <w:r>
               <w:rPr>
                 <w:rStyle w:val="Hipervnculo"/>
@@ -6103,7 +6106,7 @@
                 <w:noProof/>
                 <w:webHidden/>
               </w:rPr>
-              <w:instrText xml:space="preserve"> PAGEREF _Toc238078945 \h </w:instrText>
+              <w:instrText xml:space="preserve"> PAGEREF _Toc238168419 \h </w:instrText>
             </w:r>
             <w:r>
               <w:rPr>
@@ -6123,7 +6126,7 @@
                 <w:noProof/>
                 <w:webHidden/>
               </w:rPr>
-              <w:t>61</w:t>
+              <w:t>56</w:t>
             </w:r>
             <w:r>
               <w:rPr>
@@ -6149,7 +6152,7 @@
               <w:lang w:val="es-CO" w:eastAsia="ja-JP"/>
             </w:rPr>
           </w:pPr>
-          <w:hyperlink w:anchor="_Toc238078946" w:history="1">
+          <w:hyperlink w:anchor="_Toc238168420" w:history="1">
             <w:r>
               <w:rPr>
                 <w:rStyle w:val="Hipervnculo"/>
@@ -6193,7 +6196,7 @@
                 <w:noProof/>
                 <w:webHidden/>
               </w:rPr>
-              <w:instrText xml:space="preserve"> PAGEREF _Toc238078946 \h </w:instrText>
+              <w:instrText xml:space="preserve"> PAGEREF _Toc238168420 \h </w:instrText>
             </w:r>
             <w:r>
               <w:rPr>
@@ -6213,7 +6216,7 @@
                 <w:noProof/>
                 <w:webHidden/>
               </w:rPr>
-              <w:t>61</w:t>
+              <w:t>57</w:t>
             </w:r>
             <w:r>
               <w:rPr>
@@ -6239,7 +6242,7 @@
               <w:lang w:val="es-CO" w:eastAsia="ja-JP"/>
             </w:rPr>
           </w:pPr>
-          <w:hyperlink w:anchor="_Toc238078947" w:history="1">
+          <w:hyperlink w:anchor="_Toc238168421" w:history="1">
             <w:r>
               <w:rPr>
                 <w:rStyle w:val="Hipervnculo"/>
@@ -6283,7 +6286,7 @@
                 <w:noProof/>
                 <w:webHidden/>
               </w:rPr>
-              <w:instrText xml:space="preserve"> PAGEREF _Toc238078947 \h </w:instrText>
+              <w:instrText xml:space="preserve"> PAGEREF _Toc238168421 \h </w:instrText>
             </w:r>
             <w:r>
               <w:rPr>
@@ -6303,7 +6306,7 @@
                 <w:noProof/>
                 <w:webHidden/>
               </w:rPr>
-              <w:t>62</w:t>
+              <w:t>57</w:t>
             </w:r>
             <w:r>
               <w:rPr>
@@ -6329,7 +6332,7 @@
               <w:lang w:val="es-CO" w:eastAsia="ja-JP"/>
             </w:rPr>
           </w:pPr>
-          <w:hyperlink w:anchor="_Toc238078948" w:history="1">
+          <w:hyperlink w:anchor="_Toc238168422" w:history="1">
             <w:r>
               <w:rPr>
                 <w:rStyle w:val="Hipervnculo"/>
@@ -6373,7 +6376,7 @@
                 <w:noProof/>
                 <w:webHidden/>
               </w:rPr>
-              <w:instrText xml:space="preserve"> PAGEREF _Toc238078948 \h </w:instrText>
+              <w:instrText xml:space="preserve"> PAGEREF _Toc238168422 \h </w:instrText>
             </w:r>
             <w:r>
               <w:rPr>
@@ -6393,7 +6396,7 @@
                 <w:noProof/>
                 <w:webHidden/>
               </w:rPr>
-              <w:t>62</w:t>
+              <w:t>57</w:t>
             </w:r>
             <w:r>
               <w:rPr>
@@ -6419,7 +6422,7 @@
               <w:lang w:val="es-CO" w:eastAsia="ja-JP"/>
             </w:rPr>
           </w:pPr>
-          <w:hyperlink w:anchor="_Toc238078949" w:history="1">
+          <w:hyperlink w:anchor="_Toc238168423" w:history="1">
             <w:r>
               <w:rPr>
                 <w:rStyle w:val="Hipervnculo"/>
@@ -6463,7 +6466,7 @@
                 <w:noProof/>
                 <w:webHidden/>
               </w:rPr>
-              <w:instrText xml:space="preserve"> PAGEREF _Toc238078949 \h </w:instrText>
+              <w:instrText xml:space="preserve"> PAGEREF _Toc238168423 \h </w:instrText>
             </w:r>
             <w:r>
               <w:rPr>
@@ -6483,7 +6486,7 @@
                 <w:noProof/>
                 <w:webHidden/>
               </w:rPr>
-              <w:t>62</w:t>
+              <w:t>57</w:t>
             </w:r>
             <w:r>
               <w:rPr>
@@ -6509,7 +6512,7 @@
               <w:lang w:val="es-CO" w:eastAsia="ja-JP"/>
             </w:rPr>
           </w:pPr>
-          <w:hyperlink w:anchor="_Toc238078950" w:history="1">
+          <w:hyperlink w:anchor="_Toc238168424" w:history="1">
             <w:r>
               <w:rPr>
                 <w:rStyle w:val="Hipervnculo"/>
@@ -6555,7 +6558,7 @@
                 <w:noProof/>
                 <w:webHidden/>
               </w:rPr>
-              <w:instrText xml:space="preserve"> PAGEREF _Toc238078950 \h </w:instrText>
+              <w:instrText xml:space="preserve"> PAGEREF _Toc238168424 \h </w:instrText>
             </w:r>
             <w:r>
               <w:rPr>
@@ -6575,7 +6578,7 @@
                 <w:noProof/>
                 <w:webHidden/>
               </w:rPr>
-              <w:t>64</w:t>
+              <w:t>60</w:t>
             </w:r>
             <w:r>
               <w:rPr>
@@ -6601,7 +6604,7 @@
               <w:lang w:val="es-CO" w:eastAsia="ja-JP"/>
             </w:rPr>
           </w:pPr>
-          <w:hyperlink w:anchor="_Toc238078951" w:history="1">
+          <w:hyperlink w:anchor="_Toc238168425" w:history="1">
             <w:r>
               <w:rPr>
                 <w:rStyle w:val="Hipervnculo"/>
@@ -6647,7 +6650,7 @@
                 <w:noProof/>
                 <w:webHidden/>
               </w:rPr>
-              <w:instrText xml:space="preserve"> PAGEREF _Toc238078951 \h </w:instrText>
+              <w:instrText xml:space="preserve"> PAGEREF _Toc238168425 \h </w:instrText>
             </w:r>
             <w:r>
               <w:rPr>
@@ -6667,7 +6670,7 @@
                 <w:noProof/>
                 <w:webHidden/>
               </w:rPr>
-              <w:t>65</w:t>
+              <w:t>60</w:t>
             </w:r>
             <w:r>
               <w:rPr>
@@ -6693,7 +6696,7 @@
               <w:lang w:val="es-CO" w:eastAsia="ja-JP"/>
             </w:rPr>
           </w:pPr>
-          <w:hyperlink w:anchor="_Toc238078952" w:history="1">
+          <w:hyperlink w:anchor="_Toc238168426" w:history="1">
             <w:r>
               <w:rPr>
                 <w:rStyle w:val="Hipervnculo"/>
@@ -6739,7 +6742,7 @@
                 <w:noProof/>
                 <w:webHidden/>
               </w:rPr>
-              <w:instrText xml:space="preserve"> PAGEREF _Toc238078952 \h </w:instrText>
+              <w:instrText xml:space="preserve"> PAGEREF _Toc238168426 \h </w:instrText>
             </w:r>
             <w:r>
               <w:rPr>
@@ -6759,7 +6762,7 @@
                 <w:noProof/>
                 <w:webHidden/>
               </w:rPr>
-              <w:t>65</w:t>
+              <w:t>60</w:t>
             </w:r>
             <w:r>
               <w:rPr>
@@ -6803,7 +6806,7 @@
           <w:szCs w:val="28"/>
         </w:rPr>
       </w:pPr>
-      <w:bookmarkStart w:id="2" w:name="_Toc238078882"/>
+      <w:bookmarkStart w:id="2" w:name="_Toc238168356"/>
       <w:r>
         <w:rPr>
           <w:rFonts w:ascii="Arial" w:hAnsi="Arial" w:cs="Arial"/>
@@ -6846,7 +6849,7 @@
       </w:pPr>
       <w:bookmarkStart w:id="3" w:name="_Toc126421849"/>
       <w:bookmarkStart w:id="4" w:name="_Toc186930415"/>
-      <w:bookmarkStart w:id="5" w:name="_Toc238078883"/>
+      <w:bookmarkStart w:id="5" w:name="_Toc238168357"/>
       <w:r>
         <w:rPr>
           <w:rFonts w:ascii="Arial" w:hAnsi="Arial" w:cs="Arial"/>
@@ -6890,7 +6893,7 @@
         </w:rPr>
       </w:pPr>
       <w:bookmarkStart w:id="6" w:name="_Toc186930422"/>
-      <w:bookmarkStart w:id="7" w:name="_Toc238078884"/>
+      <w:bookmarkStart w:id="7" w:name="_Toc238168358"/>
       <w:r>
         <w:rPr>
           <w:rFonts w:ascii="Arial" w:hAnsi="Arial" w:cs="Arial"/>
@@ -7009,7 +7012,7 @@
           <w:szCs w:val="28"/>
         </w:rPr>
       </w:pPr>
-      <w:bookmarkStart w:id="8" w:name="_Toc238078885"/>
+      <w:bookmarkStart w:id="8" w:name="_Toc238168359"/>
       <w:r>
         <w:rPr>
           <w:rFonts w:ascii="Arial" w:hAnsi="Arial" w:cs="Arial"/>
@@ -7096,7 +7099,7 @@
           <w:numId w:val="1"/>
         </w:numPr>
       </w:pPr>
-      <w:bookmarkStart w:id="9" w:name="_Toc238078886"/>
+      <w:bookmarkStart w:id="9" w:name="_Toc238168360"/>
       <w:r>
         <w:t xml:space="preserve">Fluorescence </w:t>
       </w:r>
@@ -7138,7 +7141,7 @@
           <w:szCs w:val="32"/>
         </w:rPr>
       </w:pPr>
-      <w:bookmarkStart w:id="10" w:name="_Toc238078887"/>
+      <w:bookmarkStart w:id="10" w:name="_Toc238168361"/>
       <w:r>
         <w:rPr>
           <w:rFonts w:ascii="Arial" w:hAnsi="Arial" w:cs="Arial"/>
@@ -7253,7 +7256,7 @@
           <w:szCs w:val="32"/>
         </w:rPr>
       </w:pPr>
-      <w:bookmarkStart w:id="11" w:name="_Toc238078888"/>
+      <w:bookmarkStart w:id="11" w:name="_Toc238168362"/>
       <w:r>
         <w:rPr>
           <w:rFonts w:ascii="Arial" w:hAnsi="Arial" w:cs="Arial"/>
@@ -7446,7 +7449,7 @@
           <w:szCs w:val="32"/>
         </w:rPr>
       </w:pPr>
-      <w:bookmarkStart w:id="12" w:name="_Toc238078889"/>
+      <w:bookmarkStart w:id="12" w:name="_Toc238168363"/>
       <w:r>
         <w:rPr>
           <w:rFonts w:ascii="Arial" w:hAnsi="Arial" w:cs="Arial"/>
@@ -7470,7 +7473,7 @@
           <w:szCs w:val="28"/>
         </w:rPr>
       </w:pPr>
-      <w:bookmarkStart w:id="13" w:name="_Toc238078890"/>
+      <w:bookmarkStart w:id="13" w:name="_Toc238168364"/>
       <w:r>
         <w:rPr>
           <w:rFonts w:ascii="Arial" w:hAnsi="Arial" w:cs="Arial"/>
@@ -7783,7 +7786,7 @@
           <w:szCs w:val="28"/>
         </w:rPr>
       </w:pPr>
-      <w:bookmarkStart w:id="14" w:name="_Toc238078891"/>
+      <w:bookmarkStart w:id="14" w:name="_Toc238168365"/>
       <w:r>
         <w:rPr>
           <w:rFonts w:ascii="Arial" w:hAnsi="Arial" w:cs="Arial"/>
@@ -7796,15 +7799,7 @@
     </w:p>
     <w:p>
       <w:r>
-        <w:t xml:space="preserve">On Ubuntu, you only need to download the compressed (.zip) file from the official page. Once downloaded, extract its contents and run the </w:t>
-      </w:r>
-      <w:proofErr w:type="spellStart"/>
-      <w:r>
-        <w:t>AppImage</w:t>
-      </w:r>
-      <w:proofErr w:type="spellEnd"/>
-      <w:r>
-        <w:t xml:space="preserve"> file found inside. With this process, Tempico Software will be ready to use on your system.</w:t>
+        <w:t>On Ubuntu, you only need to download the compressed (.zip) file from the official page. Once downloaded, extract its contents and run the AppImage file found inside. With this process, Tempico Software will be ready to use on your system.</w:t>
       </w:r>
     </w:p>
     <w:p>
@@ -7905,7 +7900,7 @@
           <w:szCs w:val="28"/>
         </w:rPr>
       </w:pPr>
-      <w:bookmarkStart w:id="15" w:name="_Toc238078892"/>
+      <w:bookmarkStart w:id="15" w:name="_Toc238168366"/>
       <w:r>
         <w:rPr>
           <w:rFonts w:ascii="Arial" w:hAnsi="Arial" w:cs="Arial"/>
@@ -8003,7 +7998,7 @@
           <w:szCs w:val="32"/>
         </w:rPr>
       </w:pPr>
-      <w:bookmarkStart w:id="16" w:name="_Toc238078893"/>
+      <w:bookmarkStart w:id="16" w:name="_Toc238168367"/>
       <w:r>
         <w:rPr>
           <w:rFonts w:ascii="Arial" w:hAnsi="Arial" w:cs="Arial"/>
@@ -8044,7 +8039,7 @@
           <w:szCs w:val="28"/>
         </w:rPr>
       </w:pPr>
-      <w:bookmarkStart w:id="17" w:name="_Toc238078894"/>
+      <w:bookmarkStart w:id="17" w:name="_Toc238168368"/>
       <w:r>
         <w:rPr>
           <w:rFonts w:ascii="Arial" w:hAnsi="Arial" w:cs="Arial"/>
@@ -8080,7 +8075,7 @@
           <w:numId w:val="1"/>
         </w:numPr>
       </w:pPr>
-      <w:bookmarkStart w:id="18" w:name="_Toc238078895"/>
+      <w:bookmarkStart w:id="18" w:name="_Toc238168369"/>
       <w:r>
         <w:t>Windows</w:t>
       </w:r>
@@ -8111,7 +8106,7 @@
           <w:numId w:val="1"/>
         </w:numPr>
       </w:pPr>
-      <w:bookmarkStart w:id="19" w:name="_Toc238078896"/>
+      <w:bookmarkStart w:id="19" w:name="_Toc238168370"/>
       <w:r>
         <w:t>Ubuntu</w:t>
       </w:r>
@@ -8136,10 +8131,29 @@
           <w:sz w:val="20"/>
           <w:szCs w:val="20"/>
         </w:rPr>
-        <w:t>ls /dev/</w:t>
-      </w:r>
-      <w:proofErr w:type="spellStart"/>
-      <w:r>
+        <w:t>ls /dev/tty*</w:t>
+      </w:r>
+    </w:p>
+    <w:p>
+      <w:pPr>
+        <w:rPr>
+          <w:rFonts w:ascii="Arial" w:hAnsi="Arial" w:cs="Arial"/>
+          <w:sz w:val="20"/>
+          <w:szCs w:val="20"/>
+        </w:rPr>
+      </w:pPr>
+      <w:r>
+        <w:rPr>
+          <w:rFonts w:ascii="Arial" w:hAnsi="Arial" w:cs="Arial"/>
+          <w:sz w:val="20"/>
+          <w:szCs w:val="20"/>
+        </w:rPr>
+        <w:t>In this case, it is also necessary to verify that the ports are correctly detecting the device. To do this, we will use the command above, which lists the devices connected to the serial ports. First, we will run this command without the Tempico device connected and then run it again with the device connected. We will observe which new device has been detected</w:t>
+      </w:r>
+    </w:p>
+    <w:p>
+      <w:pPr>
+        <w:jc w:val="center"/>
         <w:rPr>
           <w:rFonts w:ascii="Arial" w:hAnsi="Arial" w:cs="Arial"/>
           <w:b/>
@@ -8147,9 +8161,7 @@
           <w:sz w:val="20"/>
           <w:szCs w:val="20"/>
         </w:rPr>
-        <w:t>tty</w:t>
-      </w:r>
-      <w:proofErr w:type="spellEnd"/>
+      </w:pPr>
       <w:r>
         <w:rPr>
           <w:rFonts w:ascii="Arial" w:hAnsi="Arial" w:cs="Arial"/>
@@ -8158,24 +8170,42 @@
           <w:sz w:val="20"/>
           <w:szCs w:val="20"/>
         </w:rPr>
-        <w:t>*</w:t>
-      </w:r>
-    </w:p>
-    <w:p>
-      <w:pPr>
-        <w:rPr>
-          <w:rFonts w:ascii="Arial" w:hAnsi="Arial" w:cs="Arial"/>
-          <w:sz w:val="20"/>
-          <w:szCs w:val="20"/>
-        </w:rPr>
-      </w:pPr>
-      <w:r>
-        <w:rPr>
-          <w:rFonts w:ascii="Arial" w:hAnsi="Arial" w:cs="Arial"/>
-          <w:sz w:val="20"/>
-          <w:szCs w:val="20"/>
-        </w:rPr>
-        <w:t>In this case, it is also necessary to verify that the ports are correctly detecting the device. To do this, we will use the command above, which lists the devices connected to the serial ports. First, we will run this command without the Tempico device connected and then run it again with the device connected. We will observe which new device has been detected</w:t>
+        <w:t>sudo adduser "username" dialout</w:t>
+      </w:r>
+    </w:p>
+    <w:p>
+      <w:pPr>
+        <w:rPr>
+          <w:rFonts w:ascii="Arial" w:hAnsi="Arial" w:cs="Arial"/>
+          <w:sz w:val="20"/>
+          <w:szCs w:val="20"/>
+        </w:rPr>
+      </w:pPr>
+      <w:r>
+        <w:rPr>
+          <w:rFonts w:ascii="Arial" w:hAnsi="Arial" w:cs="Arial"/>
+          <w:sz w:val="20"/>
+          <w:szCs w:val="20"/>
+        </w:rPr>
+        <w:t>If an error occurs indicating that the serial port could not be opened, it is possible that the user does not belong to the dialout group. To resolve this, we will execute the command above. This will allow us to access the system's serial ports.</w:t>
+      </w:r>
+    </w:p>
+    <w:p>
+      <w:pPr>
+        <w:rPr>
+          <w:rFonts w:ascii="Arial" w:hAnsi="Arial" w:cs="Arial"/>
+          <w:sz w:val="20"/>
+          <w:szCs w:val="20"/>
+        </w:rPr>
+      </w:pPr>
+      <w:r>
+        <w:rPr>
+          <w:rFonts w:ascii="Arial" w:hAnsi="Arial" w:cs="Arial"/>
+          <w:sz w:val="20"/>
+          <w:szCs w:val="20"/>
+        </w:rPr>
+        <w:lastRenderedPageBreak/>
+        <w:t>If the previous command does not solve the issue, after identifying the serial tty port in use by the Tempico device, run the following command:</w:t>
       </w:r>
     </w:p>
     <w:p>
@@ -8189,7 +8219,6 @@
           <w:szCs w:val="20"/>
         </w:rPr>
       </w:pPr>
-      <w:proofErr w:type="spellStart"/>
       <w:r>
         <w:rPr>
           <w:rFonts w:ascii="Arial" w:hAnsi="Arial" w:cs="Arial"/>
@@ -8198,205 +8227,7 @@
           <w:sz w:val="20"/>
           <w:szCs w:val="20"/>
         </w:rPr>
-        <w:t>sudo</w:t>
-      </w:r>
-      <w:proofErr w:type="spellEnd"/>
-      <w:r>
-        <w:rPr>
-          <w:rFonts w:ascii="Arial" w:hAnsi="Arial" w:cs="Arial"/>
-          <w:b/>
-          <w:bCs/>
-          <w:sz w:val="20"/>
-          <w:szCs w:val="20"/>
-        </w:rPr>
-        <w:t xml:space="preserve"> </w:t>
-      </w:r>
-      <w:proofErr w:type="spellStart"/>
-      <w:r>
-        <w:rPr>
-          <w:rFonts w:ascii="Arial" w:hAnsi="Arial" w:cs="Arial"/>
-          <w:b/>
-          <w:bCs/>
-          <w:sz w:val="20"/>
-          <w:szCs w:val="20"/>
-        </w:rPr>
-        <w:t>adduser</w:t>
-      </w:r>
-      <w:proofErr w:type="spellEnd"/>
-      <w:r>
-        <w:rPr>
-          <w:rFonts w:ascii="Arial" w:hAnsi="Arial" w:cs="Arial"/>
-          <w:b/>
-          <w:bCs/>
-          <w:sz w:val="20"/>
-          <w:szCs w:val="20"/>
-        </w:rPr>
-        <w:t xml:space="preserve"> "username" </w:t>
-      </w:r>
-      <w:proofErr w:type="spellStart"/>
-      <w:r>
-        <w:rPr>
-          <w:rFonts w:ascii="Arial" w:hAnsi="Arial" w:cs="Arial"/>
-          <w:b/>
-          <w:bCs/>
-          <w:sz w:val="20"/>
-          <w:szCs w:val="20"/>
-        </w:rPr>
-        <w:t>dialout</w:t>
-      </w:r>
-      <w:proofErr w:type="spellEnd"/>
-    </w:p>
-    <w:p>
-      <w:pPr>
-        <w:rPr>
-          <w:rFonts w:ascii="Arial" w:hAnsi="Arial" w:cs="Arial"/>
-          <w:sz w:val="20"/>
-          <w:szCs w:val="20"/>
-        </w:rPr>
-      </w:pPr>
-      <w:r>
-        <w:rPr>
-          <w:rFonts w:ascii="Arial" w:hAnsi="Arial" w:cs="Arial"/>
-          <w:sz w:val="20"/>
-          <w:szCs w:val="20"/>
-        </w:rPr>
-        <w:t xml:space="preserve">If an error occurs indicating that the serial port could not be opened, it is possible that the user does not belong to the </w:t>
-      </w:r>
-      <w:proofErr w:type="spellStart"/>
-      <w:r>
-        <w:rPr>
-          <w:rFonts w:ascii="Arial" w:hAnsi="Arial" w:cs="Arial"/>
-          <w:sz w:val="20"/>
-          <w:szCs w:val="20"/>
-        </w:rPr>
-        <w:t>dialout</w:t>
-      </w:r>
-      <w:proofErr w:type="spellEnd"/>
-      <w:r>
-        <w:rPr>
-          <w:rFonts w:ascii="Arial" w:hAnsi="Arial" w:cs="Arial"/>
-          <w:sz w:val="20"/>
-          <w:szCs w:val="20"/>
-        </w:rPr>
-        <w:t xml:space="preserve"> group. To resolve this, we will execute the command above. This will allow us to access the system's serial ports.</w:t>
-      </w:r>
-    </w:p>
-    <w:p>
-      <w:pPr>
-        <w:rPr>
-          <w:rFonts w:ascii="Arial" w:hAnsi="Arial" w:cs="Arial"/>
-          <w:sz w:val="20"/>
-          <w:szCs w:val="20"/>
-          <w:lang w:val="es-CO"/>
-        </w:rPr>
-      </w:pPr>
-      <w:r>
-        <w:rPr>
-          <w:rFonts w:ascii="Arial" w:hAnsi="Arial" w:cs="Arial"/>
-          <w:sz w:val="20"/>
-          <w:szCs w:val="20"/>
-          <w:lang w:val="es-CO"/>
-        </w:rPr>
-        <w:lastRenderedPageBreak/>
-        <w:t xml:space="preserve">Si el comando no es suficiente y el software sigue lanzando errores debe verificarse cual es el puerto </w:t>
-      </w:r>
-      <w:proofErr w:type="spellStart"/>
-      <w:r>
-        <w:rPr>
-          <w:rFonts w:ascii="Arial" w:hAnsi="Arial" w:cs="Arial"/>
-          <w:sz w:val="20"/>
-          <w:szCs w:val="20"/>
-          <w:lang w:val="es-CO"/>
-        </w:rPr>
-        <w:t>tty</w:t>
-      </w:r>
-      <w:proofErr w:type="spellEnd"/>
-      <w:r>
-        <w:rPr>
-          <w:rFonts w:ascii="Arial" w:hAnsi="Arial" w:cs="Arial"/>
-          <w:sz w:val="20"/>
-          <w:szCs w:val="20"/>
-          <w:lang w:val="es-CO"/>
-        </w:rPr>
-        <w:t xml:space="preserve"> que se esta usando y debe ejecutarse lo siguiente:</w:t>
-      </w:r>
-    </w:p>
-    <w:p>
-      <w:pPr>
-        <w:jc w:val="center"/>
-        <w:rPr>
-          <w:rFonts w:ascii="Arial" w:hAnsi="Arial" w:cs="Arial"/>
-          <w:b/>
-          <w:bCs/>
-          <w:sz w:val="20"/>
-          <w:szCs w:val="20"/>
-        </w:rPr>
-      </w:pPr>
-      <w:proofErr w:type="spellStart"/>
-      <w:r>
-        <w:rPr>
-          <w:rFonts w:ascii="Arial" w:hAnsi="Arial" w:cs="Arial"/>
-          <w:b/>
-          <w:bCs/>
-          <w:sz w:val="20"/>
-          <w:szCs w:val="20"/>
-        </w:rPr>
-        <w:t>sudo</w:t>
-      </w:r>
-      <w:proofErr w:type="spellEnd"/>
-      <w:r>
-        <w:rPr>
-          <w:rFonts w:ascii="Arial" w:hAnsi="Arial" w:cs="Arial"/>
-          <w:b/>
-          <w:bCs/>
-          <w:sz w:val="20"/>
-          <w:szCs w:val="20"/>
-        </w:rPr>
-        <w:t xml:space="preserve"> </w:t>
-      </w:r>
-      <w:proofErr w:type="spellStart"/>
-      <w:r>
-        <w:rPr>
-          <w:rFonts w:ascii="Arial" w:hAnsi="Arial" w:cs="Arial"/>
-          <w:b/>
-          <w:bCs/>
-          <w:sz w:val="20"/>
-          <w:szCs w:val="20"/>
-        </w:rPr>
-        <w:t>chmod</w:t>
-      </w:r>
-      <w:proofErr w:type="spellEnd"/>
-      <w:r>
-        <w:rPr>
-          <w:rFonts w:ascii="Arial" w:hAnsi="Arial" w:cs="Arial"/>
-          <w:b/>
-          <w:bCs/>
-          <w:sz w:val="20"/>
-          <w:szCs w:val="20"/>
-        </w:rPr>
-        <w:t xml:space="preserve"> 666 /dev/</w:t>
-      </w:r>
-      <w:proofErr w:type="spellStart"/>
-      <w:r>
-        <w:rPr>
-          <w:rFonts w:ascii="Arial" w:hAnsi="Arial" w:cs="Arial"/>
-          <w:b/>
-          <w:bCs/>
-          <w:sz w:val="20"/>
-          <w:szCs w:val="20"/>
-        </w:rPr>
-        <w:t>tty"port</w:t>
-      </w:r>
-      <w:proofErr w:type="spellEnd"/>
-      <w:r>
-        <w:rPr>
-          <w:rFonts w:ascii="Arial" w:hAnsi="Arial" w:cs="Arial"/>
-          <w:b/>
-          <w:bCs/>
-          <w:sz w:val="20"/>
-          <w:szCs w:val="20"/>
-        </w:rPr>
-        <w:t>"</w:t>
+        <w:t>sudo chmod 666 /dev/tty"port"</w:t>
       </w:r>
     </w:p>
     <w:p>
@@ -8416,7 +8247,7 @@
           <w:numId w:val="1"/>
         </w:numPr>
       </w:pPr>
-      <w:bookmarkStart w:id="20" w:name="_Toc238078897"/>
+      <w:bookmarkStart w:id="20" w:name="_Toc238168371"/>
       <w:r>
         <w:t>Mac</w:t>
       </w:r>
@@ -8441,20 +8272,8 @@
           <w:sz w:val="20"/>
           <w:szCs w:val="20"/>
         </w:rPr>
-        <w:t>ls /dev/</w:t>
-      </w:r>
-      <w:proofErr w:type="gramStart"/>
-      <w:r>
-        <w:rPr>
-          <w:rFonts w:ascii="Arial" w:hAnsi="Arial" w:cs="Arial"/>
-          <w:b/>
-          <w:bCs/>
-          <w:sz w:val="20"/>
-          <w:szCs w:val="20"/>
-        </w:rPr>
-        <w:t>tty.*</w:t>
-      </w:r>
-      <w:proofErr w:type="gramEnd"/>
+        <w:t>ls /dev/tty.*</w:t>
+      </w:r>
     </w:p>
     <w:p>
       <w:pPr>
@@ -8503,7 +8322,7 @@
           <w:szCs w:val="28"/>
         </w:rPr>
       </w:pPr>
-      <w:bookmarkStart w:id="21" w:name="_Toc238078898"/>
+      <w:bookmarkStart w:id="21" w:name="_Toc238168372"/>
       <w:r>
         <w:rPr>
           <w:rFonts w:ascii="Arial" w:hAnsi="Arial" w:cs="Arial"/>
@@ -8939,7 +8758,7 @@
           <w:szCs w:val="28"/>
         </w:rPr>
       </w:pPr>
-      <w:bookmarkStart w:id="22" w:name="_Toc238078899"/>
+      <w:bookmarkStart w:id="22" w:name="_Toc238168373"/>
       <w:r>
         <w:rPr>
           <w:rFonts w:ascii="Arial" w:hAnsi="Arial" w:cs="Arial"/>
@@ -9303,7 +9122,7 @@
           <w:szCs w:val="28"/>
         </w:rPr>
       </w:pPr>
-      <w:bookmarkStart w:id="23" w:name="_Toc238078900"/>
+      <w:bookmarkStart w:id="23" w:name="_Toc238168374"/>
       <w:r>
         <w:rPr>
           <w:rFonts w:ascii="Arial" w:hAnsi="Arial" w:cs="Arial"/>
@@ -9406,7 +9225,7 @@
           <w:szCs w:val="28"/>
         </w:rPr>
       </w:pPr>
-      <w:bookmarkStart w:id="24" w:name="_Toc238078901"/>
+      <w:bookmarkStart w:id="24" w:name="_Toc238168375"/>
       <w:r>
         <w:rPr>
           <w:rFonts w:ascii="Arial" w:hAnsi="Arial" w:cs="Arial"/>
@@ -9517,7 +9336,7 @@
           <w:szCs w:val="28"/>
         </w:rPr>
       </w:pPr>
-      <w:bookmarkStart w:id="25" w:name="_Toc238078902"/>
+      <w:bookmarkStart w:id="25" w:name="_Toc238168376"/>
       <w:r>
         <w:rPr>
           <w:rFonts w:ascii="Arial" w:hAnsi="Arial" w:cs="Arial"/>
@@ -9542,18 +9361,8 @@
           <w:sz w:val="20"/>
           <w:szCs w:val="20"/>
         </w:rPr>
-        <w:t xml:space="preserve">In this dialog window, it is possible to modify the path where the data is stored, as well as the prefixes used to save the files from each tab. Each file is saved with the defined prefix followed by the date it was generated, ensuring an organized and easily traceable naming scheme. Within this window, three options are available: Apply </w:t>
-      </w:r>
-      <w:proofErr w:type="gramStart"/>
-      <w:r>
-        <w:rPr>
-          <w:rFonts w:ascii="Arial" w:hAnsi="Arial" w:cs="Arial"/>
-          <w:sz w:val="20"/>
-          <w:szCs w:val="20"/>
-        </w:rPr>
-        <w:t>Changes(</w:t>
-      </w:r>
-      <w:proofErr w:type="gramEnd"/>
+        <w:t>In this dialog window, it is possible to modify the path where the data is stored, as well as the prefixes used to save the files from each tab. Each file is saved with the defined prefix followed by the date it was generated, ensuring an organized and easily traceable naming scheme. Within this window, three options are available: Apply Changes(</w:t>
+      </w:r>
       <w:r>
         <w:rPr>
           <w:rFonts w:ascii="Arial" w:hAnsi="Arial" w:cs="Arial"/>
@@ -9603,18 +9412,8 @@
           <w:sz w:val="20"/>
           <w:szCs w:val="20"/>
         </w:rPr>
-        <w:t xml:space="preserve">), which updates the configuration according to the entered values; </w:t>
-      </w:r>
-      <w:proofErr w:type="gramStart"/>
-      <w:r>
-        <w:rPr>
-          <w:rFonts w:ascii="Arial" w:hAnsi="Arial" w:cs="Arial"/>
-          <w:sz w:val="20"/>
-          <w:szCs w:val="20"/>
-        </w:rPr>
-        <w:t>Cancel(</w:t>
-      </w:r>
-      <w:proofErr w:type="gramEnd"/>
+        <w:t>), which updates the configuration according to the entered values; Cancel(</w:t>
+      </w:r>
       <w:r>
         <w:rPr>
           <w:rFonts w:ascii="Arial" w:hAnsi="Arial" w:cs="Arial"/>
@@ -9664,18 +9463,8 @@
           <w:sz w:val="20"/>
           <w:szCs w:val="20"/>
         </w:rPr>
-        <w:t xml:space="preserve">), which closes the window without applying any changes; and Default </w:t>
-      </w:r>
-      <w:proofErr w:type="gramStart"/>
-      <w:r>
-        <w:rPr>
-          <w:rFonts w:ascii="Arial" w:hAnsi="Arial" w:cs="Arial"/>
-          <w:sz w:val="20"/>
-          <w:szCs w:val="20"/>
-        </w:rPr>
-        <w:t>Settings(</w:t>
-      </w:r>
-      <w:proofErr w:type="gramEnd"/>
+        <w:t>), which closes the window without applying any changes; and Default Settings(</w:t>
+      </w:r>
       <w:r>
         <w:rPr>
           <w:rFonts w:ascii="Arial" w:hAnsi="Arial" w:cs="Arial"/>
@@ -9786,22 +9575,22 @@
           <w:szCs w:val="28"/>
         </w:rPr>
       </w:pPr>
-      <w:bookmarkStart w:id="26" w:name="_Toc9501"/>
-      <w:bookmarkStart w:id="27" w:name="_Toc238078903"/>
-      <w:bookmarkStart w:id="28" w:name="Statusbar"/>
-      <w:bookmarkStart w:id="29" w:name="_Status_bar"/>
+      <w:bookmarkStart w:id="26" w:name="Statusbar"/>
+      <w:bookmarkStart w:id="27" w:name="_Status_bar"/>
+      <w:bookmarkStart w:id="28" w:name="_Toc9501"/>
+      <w:bookmarkStart w:id="29" w:name="_Toc238168377"/>
+      <w:bookmarkEnd w:id="26"/>
+      <w:bookmarkEnd w:id="27"/>
+      <w:r>
+        <w:rPr>
+          <w:rFonts w:ascii="Arial" w:hAnsi="Arial" w:cs="Arial"/>
+          <w:sz w:val="28"/>
+          <w:szCs w:val="28"/>
+        </w:rPr>
+        <w:t>Status bar</w:t>
+      </w:r>
       <w:bookmarkEnd w:id="28"/>
       <w:bookmarkEnd w:id="29"/>
-      <w:r>
-        <w:rPr>
-          <w:rFonts w:ascii="Arial" w:hAnsi="Arial" w:cs="Arial"/>
-          <w:sz w:val="28"/>
-          <w:szCs w:val="28"/>
-        </w:rPr>
-        <w:t>Status bar</w:t>
-      </w:r>
-      <w:bookmarkEnd w:id="26"/>
-      <w:bookmarkEnd w:id="27"/>
     </w:p>
     <w:p>
       <w:pPr>
@@ -9826,25 +9615,7 @@
           <w:szCs w:val="20"/>
         </w:rPr>
         <w:lastRenderedPageBreak/>
-        <w:t xml:space="preserve">Counts estimation, Autocorrelation (FCS), and </w:t>
-      </w:r>
-      <w:proofErr w:type="gramStart"/>
-      <w:r>
-        <w:rPr>
-          <w:rFonts w:ascii="Arial" w:hAnsi="Arial" w:cs="Arial"/>
-          <w:sz w:val="20"/>
-          <w:szCs w:val="20"/>
-        </w:rPr>
-        <w:t>g(</w:t>
-      </w:r>
-      <w:proofErr w:type="gramEnd"/>
-      <w:r>
-        <w:rPr>
-          <w:rFonts w:ascii="Arial" w:hAnsi="Arial" w:cs="Arial"/>
-          <w:sz w:val="20"/>
-          <w:szCs w:val="20"/>
-        </w:rPr>
-        <w:t xml:space="preserve">2) (HBT) tabs all drive this bar from a pair of signals emitted by their respective acquisition threads, one carrying the status text and the other carrying an integer code that selects the color of the small dot shown next to that text; the dot itself is drawn directly by each tab's interface and starts out grey </w:t>
+        <w:t xml:space="preserve">Counts estimation, Autocorrelation (FCS), and g(2) (HBT) tabs all drive this bar from a pair of signals emitted by their respective acquisition threads, one carrying the status text and the other carrying an integer code that selects the color of the small dot shown next to that text; the dot itself is drawn directly by each tab's interface and starts out grey </w:t>
       </w:r>
       <w:r>
         <w:rPr>
@@ -9857,6 +9628,7 @@
       <w:r>
         <w:rPr>
           <w:rFonts w:ascii="Arial" w:hAnsi="Arial" w:cs="Arial"/>
+          <w:noProof/>
           <w:sz w:val="20"/>
           <w:szCs w:val="20"/>
         </w:rPr>
@@ -9922,7 +9694,7 @@
         </w:numPr>
       </w:pPr>
       <w:bookmarkStart w:id="30" w:name="_Toc9502"/>
-      <w:bookmarkStart w:id="31" w:name="_Toc238078904"/>
+      <w:bookmarkStart w:id="31" w:name="_Toc238168378"/>
       <w:r>
         <w:t>Idle state</w:t>
       </w:r>
@@ -9956,6 +9728,7 @@
       <w:r>
         <w:rPr>
           <w:rFonts w:ascii="Arial" w:hAnsi="Arial" w:cs="Arial"/>
+          <w:noProof/>
           <w:sz w:val="20"/>
           <w:szCs w:val="20"/>
         </w:rPr>
@@ -10022,6 +9795,7 @@
       <w:r>
         <w:rPr>
           <w:rFonts w:ascii="Arial" w:hAnsi="Arial" w:cs="Arial"/>
+          <w:noProof/>
           <w:sz w:val="20"/>
           <w:szCs w:val="20"/>
         </w:rPr>
@@ -10087,6 +9861,9 @@
         </w:rPr>
       </w:pPr>
       <w:r>
+        <w:rPr>
+          <w:noProof/>
+        </w:rPr>
         <w:drawing>
           <wp:inline distT="0" distB="0" distL="0" distR="0" wp14:anchorId="7FED4DEC" wp14:editId="4DD350CB">
             <wp:extent cx="5276190" cy="704762"/>
@@ -10133,7 +9910,7 @@
         </w:numPr>
       </w:pPr>
       <w:bookmarkStart w:id="32" w:name="_Toc9503"/>
-      <w:bookmarkStart w:id="33" w:name="_Toc238078905"/>
+      <w:bookmarkStart w:id="33" w:name="_Toc238168379"/>
       <w:r>
         <w:t>Active measurement</w:t>
       </w:r>
@@ -10167,6 +9944,7 @@
       <w:r>
         <w:rPr>
           <w:rFonts w:ascii="Arial" w:hAnsi="Arial" w:cs="Arial"/>
+          <w:noProof/>
           <w:sz w:val="20"/>
           <w:szCs w:val="20"/>
         </w:rPr>
@@ -10232,6 +10010,9 @@
         </w:rPr>
       </w:pPr>
       <w:r>
+        <w:rPr>
+          <w:noProof/>
+        </w:rPr>
         <w:drawing>
           <wp:inline distT="0" distB="0" distL="0" distR="0" wp14:anchorId="7E352891" wp14:editId="7E8BFA2E">
             <wp:extent cx="5612130" cy="560070"/>
@@ -10296,6 +10077,7 @@
       <w:r>
         <w:rPr>
           <w:rFonts w:ascii="Arial" w:hAnsi="Arial" w:cs="Arial"/>
+          <w:noProof/>
           <w:sz w:val="20"/>
           <w:szCs w:val="20"/>
         </w:rPr>
@@ -10362,6 +10144,9 @@
         </w:rPr>
       </w:pPr>
       <w:r>
+        <w:rPr>
+          <w:noProof/>
+        </w:rPr>
         <w:drawing>
           <wp:inline distT="0" distB="0" distL="0" distR="0" wp14:anchorId="7230D940" wp14:editId="2953B40A">
             <wp:extent cx="5534025" cy="2432016"/>
@@ -10434,6 +10219,9 @@
         </w:rPr>
       </w:pPr>
       <w:r>
+        <w:rPr>
+          <w:noProof/>
+        </w:rPr>
         <w:drawing>
           <wp:inline distT="0" distB="0" distL="0" distR="0" wp14:anchorId="18910B55" wp14:editId="1C7F6159">
             <wp:extent cx="5612130" cy="584200"/>
@@ -10480,6 +10268,9 @@
         </w:rPr>
       </w:pPr>
       <w:r>
+        <w:rPr>
+          <w:noProof/>
+        </w:rPr>
         <w:drawing>
           <wp:inline distT="0" distB="0" distL="0" distR="0" wp14:anchorId="19103A47" wp14:editId="68CD7B24">
             <wp:extent cx="5612130" cy="581660"/>
@@ -10544,6 +10335,7 @@
       <w:r>
         <w:rPr>
           <w:rFonts w:ascii="Arial" w:hAnsi="Arial" w:cs="Arial"/>
+          <w:noProof/>
           <w:sz w:val="20"/>
           <w:szCs w:val="20"/>
         </w:rPr>
@@ -10610,6 +10402,7 @@
       <w:r>
         <w:rPr>
           <w:rFonts w:ascii="Arial" w:hAnsi="Arial" w:cs="Arial"/>
+          <w:noProof/>
           <w:sz w:val="20"/>
           <w:szCs w:val="20"/>
         </w:rPr>
@@ -10675,6 +10468,9 @@
         </w:rPr>
       </w:pPr>
       <w:r>
+        <w:rPr>
+          <w:noProof/>
+        </w:rPr>
         <w:drawing>
           <wp:inline distT="0" distB="0" distL="0" distR="0" wp14:anchorId="23F17E1C" wp14:editId="441922F9">
             <wp:extent cx="5612130" cy="506730"/>
@@ -10722,7 +10518,7 @@
         <w:ind w:left="1416" w:hanging="1416"/>
       </w:pPr>
       <w:bookmarkStart w:id="34" w:name="_Toc9504"/>
-      <w:bookmarkStart w:id="35" w:name="_Toc238078906"/>
+      <w:bookmarkStart w:id="35" w:name="_Toc238168380"/>
       <w:r>
         <w:t>Missing channel pulses</w:t>
       </w:r>
@@ -10752,23 +10548,13 @@
         </w:rPr>
         <w:t xml:space="preserve">When a required channel stops receiving valid pulses, the Start-stop histogram, Lifetime histograms, Time stamping, Autocorrelation (FCS), and </w:t>
       </w:r>
-      <w:proofErr w:type="gramStart"/>
-      <w:r>
-        <w:rPr>
-          <w:rFonts w:ascii="Arial" w:hAnsi="Arial" w:cs="Arial"/>
-          <w:sz w:val="20"/>
-          <w:szCs w:val="20"/>
-        </w:rPr>
-        <w:t>g(</w:t>
-      </w:r>
-      <w:proofErr w:type="gramEnd"/>
-      <w:r>
-        <w:rPr>
-          <w:rFonts w:ascii="Arial" w:hAnsi="Arial" w:cs="Arial"/>
-          <w:sz w:val="20"/>
-          <w:szCs w:val="20"/>
-        </w:rPr>
-        <w:t>2) (HBT)</w:t>
+      <w:r>
+        <w:rPr>
+          <w:rFonts w:ascii="Arial" w:hAnsi="Arial" w:cs="Arial"/>
+          <w:sz w:val="20"/>
+          <w:szCs w:val="20"/>
+        </w:rPr>
+        <w:t>g(2) (HBT)</w:t>
       </w:r>
       <w:r>
         <w:rPr>
@@ -10795,6 +10581,7 @@
       <w:r>
         <w:rPr>
           <w:rFonts w:ascii="Arial" w:hAnsi="Arial" w:cs="Arial"/>
+          <w:noProof/>
           <w:sz w:val="20"/>
           <w:szCs w:val="20"/>
         </w:rPr>
@@ -10928,6 +10715,9 @@
         </w:rPr>
       </w:pPr>
       <w:r>
+        <w:rPr>
+          <w:noProof/>
+        </w:rPr>
         <w:drawing>
           <wp:inline distT="0" distB="0" distL="0" distR="0" wp14:anchorId="5507B746" wp14:editId="62365E26">
             <wp:extent cx="5612130" cy="525145"/>
@@ -10965,6 +10755,9 @@
         </w:drawing>
       </w:r>
       <w:r>
+        <w:rPr>
+          <w:noProof/>
+        </w:rPr>
         <w:drawing>
           <wp:inline distT="0" distB="0" distL="0" distR="0" wp14:anchorId="78188BF8" wp14:editId="11FD9204">
             <wp:extent cx="5612130" cy="485140"/>
@@ -11037,6 +10830,9 @@
         </w:rPr>
       </w:pPr>
       <w:r>
+        <w:rPr>
+          <w:noProof/>
+        </w:rPr>
         <w:drawing>
           <wp:inline distT="0" distB="0" distL="0" distR="0" wp14:anchorId="61946117" wp14:editId="004763E9">
             <wp:extent cx="5612130" cy="1310640"/>
@@ -11084,6 +10880,9 @@
         </w:rPr>
       </w:pPr>
       <w:r>
+        <w:rPr>
+          <w:noProof/>
+        </w:rPr>
         <w:drawing>
           <wp:inline distT="0" distB="0" distL="0" distR="0" wp14:anchorId="500B60B1" wp14:editId="796CBD61">
             <wp:extent cx="5372100" cy="1977307"/>
@@ -11130,7 +10929,7 @@
         </w:numPr>
       </w:pPr>
       <w:bookmarkStart w:id="36" w:name="_Toc9505"/>
-      <w:bookmarkStart w:id="37" w:name="_Toc238078907"/>
+      <w:bookmarkStart w:id="37" w:name="_Toc238168381"/>
       <w:r>
         <w:t>Paused and processing states</w:t>
       </w:r>
@@ -11164,6 +10963,7 @@
       <w:r>
         <w:rPr>
           <w:rFonts w:ascii="Arial" w:hAnsi="Arial" w:cs="Arial"/>
+          <w:noProof/>
           <w:sz w:val="20"/>
           <w:szCs w:val="20"/>
         </w:rPr>
@@ -11230,6 +11030,7 @@
       <w:r>
         <w:rPr>
           <w:rFonts w:ascii="Arial" w:hAnsi="Arial" w:cs="Arial"/>
+          <w:noProof/>
           <w:sz w:val="20"/>
           <w:szCs w:val="20"/>
         </w:rPr>
@@ -11283,36 +11084,21 @@
           <w:sz w:val="20"/>
           <w:szCs w:val="20"/>
         </w:rPr>
-        <w:t xml:space="preserve">, the Time stamping and Lifetime histograms tabs share a third, distinct status color reserved for transitional states in which the device is not actively acquiring new pulses but the measurement has not finished either. This third code does not appear in the Start-stop histogram, Counts estimation, Autocorrelation (FCS), or </w:t>
-      </w:r>
-      <w:proofErr w:type="gramStart"/>
-      <w:r>
-        <w:rPr>
-          <w:rFonts w:ascii="Arial" w:hAnsi="Arial" w:cs="Arial"/>
-          <w:sz w:val="20"/>
-          <w:szCs w:val="20"/>
-        </w:rPr>
-        <w:t>g(</w:t>
-      </w:r>
-      <w:proofErr w:type="gramEnd"/>
-      <w:r>
-        <w:rPr>
-          <w:rFonts w:ascii="Arial" w:hAnsi="Arial" w:cs="Arial"/>
-          <w:sz w:val="20"/>
-          <w:szCs w:val="20"/>
-        </w:rPr>
-        <w:t>2) (HBT) tabs. In the Time stamping tab, this state covers three situations: while the measurement is paused by the user, the status bar shows "Paused measurement", with the completion percentage appended when the tab is running in sample-size mode; while autosave is writing accumulated data to disk, it shows "Processing data"; and once the user stops the measurement, it shows the same "Processing data" message, followed by an explicit percentage, while the recorded entries are sorted and written to their final path.</w:t>
-      </w:r>
-    </w:p>
-    <w:p>
-      <w:pPr>
-        <w:rPr>
-          <w:rFonts w:ascii="Arial" w:hAnsi="Arial" w:cs="Arial"/>
-          <w:sz w:val="20"/>
-          <w:szCs w:val="20"/>
-        </w:rPr>
-      </w:pPr>
-      <w:r>
+        <w:t>, the Time stamping and Lifetime histograms tabs share a third, distinct status color reserved for transitional states in which the device is not actively acquiring new pulses but the measurement has not finished either. This third code does not appear in the Start-stop histogram, Counts estimation, Autocorrelation (FCS), or g(2) (HBT) tabs. In the Time stamping tab, this state covers three situations: while the measurement is paused by the user, the status bar shows "Paused measurement", with the completion percentage appended when the tab is running in sample-size mode; while autosave is writing accumulated data to disk, it shows "Processing data"; and once the user stops the measurement, it shows the same "Processing data" message, followed by an explicit percentage, while the recorded entries are sorted and written to their final path.</w:t>
+      </w:r>
+    </w:p>
+    <w:p>
+      <w:pPr>
+        <w:rPr>
+          <w:rFonts w:ascii="Arial" w:hAnsi="Arial" w:cs="Arial"/>
+          <w:sz w:val="20"/>
+          <w:szCs w:val="20"/>
+        </w:rPr>
+      </w:pPr>
+      <w:r>
+        <w:rPr>
+          <w:noProof/>
+        </w:rPr>
         <w:drawing>
           <wp:inline distT="0" distB="0" distL="0" distR="0" wp14:anchorId="73230DCC" wp14:editId="22D54B9D">
             <wp:extent cx="5561905" cy="580952"/>
@@ -11359,6 +11145,9 @@
         </w:rPr>
       </w:pPr>
       <w:r>
+        <w:rPr>
+          <w:noProof/>
+        </w:rPr>
         <w:drawing>
           <wp:inline distT="0" distB="0" distL="0" distR="0" wp14:anchorId="2773372A" wp14:editId="1599D423">
             <wp:extent cx="5612130" cy="595630"/>
@@ -11422,7 +11211,7 @@
         </w:numPr>
       </w:pPr>
       <w:bookmarkStart w:id="38" w:name="_Toc9506"/>
-      <w:bookmarkStart w:id="39" w:name="_Toc238078908"/>
+      <w:bookmarkStart w:id="39" w:name="_Toc238168382"/>
       <w:r>
         <w:lastRenderedPageBreak/>
         <w:t>Module-specific configuration warnings</w:t>
@@ -11457,6 +11246,7 @@
       <w:r>
         <w:rPr>
           <w:rFonts w:ascii="Arial" w:hAnsi="Arial" w:cs="Arial"/>
+          <w:noProof/>
           <w:sz w:val="20"/>
           <w:szCs w:val="20"/>
         </w:rPr>
@@ -11518,6 +11308,9 @@
         <w:jc w:val="center"/>
       </w:pPr>
       <w:r>
+        <w:rPr>
+          <w:noProof/>
+        </w:rPr>
         <w:drawing>
           <wp:inline distT="0" distB="0" distL="0" distR="0" wp14:anchorId="05848B28" wp14:editId="20C4CFAC">
             <wp:extent cx="5612130" cy="597535"/>
@@ -11573,7 +11366,7 @@
           <w:szCs w:val="28"/>
         </w:rPr>
       </w:pPr>
-      <w:bookmarkStart w:id="40" w:name="_Toc238078909"/>
+      <w:bookmarkStart w:id="40" w:name="_Toc238168383"/>
       <w:r>
         <w:rPr>
           <w:rFonts w:ascii="Arial" w:hAnsi="Arial" w:cs="Arial"/>
@@ -11641,7 +11434,7 @@
           <w:numId w:val="1"/>
         </w:numPr>
       </w:pPr>
-      <w:bookmarkStart w:id="41" w:name="_Toc238078910"/>
+      <w:bookmarkStart w:id="41" w:name="_Toc238168384"/>
       <w:r>
         <w:t>Perform a measurement</w:t>
       </w:r>
@@ -12462,7 +12255,7 @@
           <w:numId w:val="1"/>
         </w:numPr>
       </w:pPr>
-      <w:bookmarkStart w:id="42" w:name="_Toc238078911"/>
+      <w:bookmarkStart w:id="42" w:name="_Toc238168385"/>
       <w:r>
         <w:t>Save data and plots</w:t>
       </w:r>
@@ -12709,25 +12502,7 @@
           <w:sz w:val="20"/>
           <w:szCs w:val="20"/>
         </w:rPr>
-        <w:t>Files are saved in all operating systems in the "</w:t>
-      </w:r>
-      <w:proofErr w:type="spellStart"/>
-      <w:r>
-        <w:rPr>
-          <w:rFonts w:ascii="Arial" w:hAnsi="Arial" w:cs="Arial"/>
-          <w:sz w:val="20"/>
-          <w:szCs w:val="20"/>
-        </w:rPr>
-        <w:t>TempicoSoftwareData</w:t>
-      </w:r>
-      <w:proofErr w:type="spellEnd"/>
-      <w:r>
-        <w:rPr>
-          <w:rFonts w:ascii="Arial" w:hAnsi="Arial" w:cs="Arial"/>
-          <w:sz w:val="20"/>
-          <w:szCs w:val="20"/>
-        </w:rPr>
-        <w:t>" folder within "Documents." By default, this folder is automatically created when the program is opened for the first time.</w:t>
+        <w:t>Files are saved in all operating systems in the "TempicoSoftwareData" folder within "Documents." By default, this folder is automatically created when the program is opened for the first time.</w:t>
       </w:r>
     </w:p>
     <w:p>
@@ -13104,7 +12879,7 @@
           <w:szCs w:val="28"/>
         </w:rPr>
       </w:pPr>
-      <w:bookmarkStart w:id="43" w:name="_Toc238078912"/>
+      <w:bookmarkStart w:id="43" w:name="_Toc238168386"/>
       <w:r>
         <w:rPr>
           <w:rFonts w:ascii="Arial" w:hAnsi="Arial" w:cs="Arial"/>
@@ -13140,7 +12915,7 @@
           <w:numId w:val="1"/>
         </w:numPr>
       </w:pPr>
-      <w:bookmarkStart w:id="44" w:name="_Toc238078913"/>
+      <w:bookmarkStart w:id="44" w:name="_Toc238168387"/>
       <w:r>
         <w:t>Settings before a measurement</w:t>
       </w:r>
@@ -13194,25 +12969,7 @@
           <w:sz w:val="20"/>
           <w:szCs w:val="20"/>
         </w:rPr>
-        <w:t xml:space="preserve">After selecting the channel, the bin width must be chosen, representing the histogram's bar width. For example, with a bin width of 12 ns, if there are two measurements at 1 ns and 5 ns, both will contribute to the same histogram bar's frequency. The number of bins prevents histogram saturation and usually limits the time axis range. For instance, selecting a bin width of 480 </w:t>
-      </w:r>
-      <w:proofErr w:type="spellStart"/>
-      <w:r>
-        <w:rPr>
-          <w:rFonts w:ascii="Arial" w:hAnsi="Arial" w:cs="Arial"/>
-          <w:sz w:val="20"/>
-          <w:szCs w:val="20"/>
-        </w:rPr>
-        <w:t>ps</w:t>
-      </w:r>
-      <w:proofErr w:type="spellEnd"/>
-      <w:r>
-        <w:rPr>
-          <w:rFonts w:ascii="Arial" w:hAnsi="Arial" w:cs="Arial"/>
-          <w:sz w:val="20"/>
-          <w:szCs w:val="20"/>
-        </w:rPr>
-        <w:t xml:space="preserve"> and 50 bins results in a 24 ns range. Unlike start-stop histograms, lifetime measurements are designed with a </w:t>
+        <w:t xml:space="preserve">After selecting the channel, the bin width must be chosen, representing the histogram's bar width. For example, with a bin width of 12 ns, if there are two measurements at 1 ns and 5 ns, both will contribute to the same histogram bar's frequency. The number of bins prevents histogram saturation and usually limits the time axis range. For instance, selecting a bin width of 480 ps and 50 bins results in a 24 ns range. Unlike start-stop histograms, lifetime measurements are designed with a </w:t>
       </w:r>
       <w:r>
         <w:rPr>
@@ -13294,7 +13051,7 @@
           <w:numId w:val="1"/>
         </w:numPr>
       </w:pPr>
-      <w:bookmarkStart w:id="45" w:name="_Toc238078914"/>
+      <w:bookmarkStart w:id="45" w:name="_Toc238168388"/>
       <w:r>
         <w:t>Perform a measurement</w:t>
       </w:r>
@@ -13409,25 +13166,7 @@
           <w:sz w:val="20"/>
           <w:szCs w:val="20"/>
         </w:rPr>
-        <w:t>The program also provides additional information about the measurement status, including the total number of starts, the total number of complete measurements (i.e., start and stop), and the total elapsed time in HH:</w:t>
-      </w:r>
-      <w:proofErr w:type="gramStart"/>
-      <w:r>
-        <w:rPr>
-          <w:rFonts w:ascii="Arial" w:hAnsi="Arial" w:cs="Arial"/>
-          <w:sz w:val="20"/>
-          <w:szCs w:val="20"/>
-        </w:rPr>
-        <w:t>MM:SS</w:t>
-      </w:r>
-      <w:proofErr w:type="gramEnd"/>
-      <w:r>
-        <w:rPr>
-          <w:rFonts w:ascii="Arial" w:hAnsi="Arial" w:cs="Arial"/>
-          <w:sz w:val="20"/>
-          <w:szCs w:val="20"/>
-        </w:rPr>
-        <w:t xml:space="preserve"> format.</w:t>
+        <w:t>The program also provides additional information about the measurement status, including the total number of starts, the total number of complete measurements (i.e., start and stop), and the total elapsed time in HH:MM:SS format.</w:t>
       </w:r>
     </w:p>
     <w:p>
@@ -13484,7 +13223,7 @@
           <w:numId w:val="1"/>
         </w:numPr>
       </w:pPr>
-      <w:bookmarkStart w:id="46" w:name="_Toc238078915"/>
+      <w:bookmarkStart w:id="46" w:name="_Toc238168389"/>
       <w:r>
         <w:t>Fitting</w:t>
       </w:r>
@@ -13493,16 +13232,18 @@
     <w:p>
       <w:pPr>
         <w:rPr>
-          <w:lang w:val="es-CO"/>
-        </w:rPr>
-      </w:pPr>
-      <w:r>
-        <w:rPr>
-          <w:rFonts w:ascii="Arial" w:hAnsi="Arial" w:cs="Arial"/>
-          <w:sz w:val="20"/>
-          <w:szCs w:val="20"/>
-        </w:rPr>
-        <w:t>To obtain more information about a measurement, the user can perform a fit on the graph. By performing the fit, they obtain more detailed information about the parameters of the equation to be fitted in the table at the top right corner. This provides their values, standard deviation, and respective units.</w:t>
+          <w:rFonts w:ascii="Arial" w:hAnsi="Arial" w:cs="Arial"/>
+          <w:sz w:val="20"/>
+          <w:szCs w:val="20"/>
+        </w:rPr>
+      </w:pPr>
+      <w:r>
+        <w:rPr>
+          <w:rFonts w:ascii="Arial" w:hAnsi="Arial" w:cs="Arial"/>
+          <w:sz w:val="20"/>
+          <w:szCs w:val="20"/>
+        </w:rPr>
+        <w:t>To obtain more information about a measurement, the user can make a fit on the graph. When performing a fit, you get more detailed information about the parameters of the equation to be adjusted in the table in the upper right corner. It obtains their values, their standard deviation and their respective units.</w:t>
       </w:r>
     </w:p>
     <w:p>
@@ -14969,7 +14710,7 @@
           <w:numId w:val="1"/>
         </w:numPr>
       </w:pPr>
-      <w:bookmarkStart w:id="47" w:name="_Toc238078916"/>
+      <w:bookmarkStart w:id="47" w:name="_Toc238168390"/>
       <w:r>
         <w:t>Save data and plots</w:t>
       </w:r>
@@ -15058,25 +14799,7 @@
           <w:sz w:val="20"/>
           <w:szCs w:val="20"/>
         </w:rPr>
-        <w:t xml:space="preserve">), a window will appear to select the desired format for saving the data. The user can choose between txt, csv, or </w:t>
-      </w:r>
-      <w:proofErr w:type="spellStart"/>
-      <w:r>
-        <w:rPr>
-          <w:rFonts w:ascii="Arial" w:hAnsi="Arial" w:cs="Arial"/>
-          <w:sz w:val="20"/>
-          <w:szCs w:val="20"/>
-        </w:rPr>
-        <w:t>dat</w:t>
-      </w:r>
-      <w:proofErr w:type="spellEnd"/>
-      <w:r>
-        <w:rPr>
-          <w:rFonts w:ascii="Arial" w:hAnsi="Arial" w:cs="Arial"/>
-          <w:sz w:val="20"/>
-          <w:szCs w:val="20"/>
-        </w:rPr>
-        <w:t xml:space="preserve"> formats.</w:t>
+        <w:t>), a window will appear to select the desired format for saving the data. The user can choose between txt, csv, or dat formats.</w:t>
       </w:r>
     </w:p>
     <w:p>
@@ -15533,7 +15256,7 @@
           <w:szCs w:val="28"/>
         </w:rPr>
       </w:pPr>
-      <w:bookmarkStart w:id="48" w:name="_Toc238078917"/>
+      <w:bookmarkStart w:id="48" w:name="_Toc238168391"/>
       <w:r>
         <w:rPr>
           <w:rFonts w:ascii="Arial" w:hAnsi="Arial" w:cs="Arial"/>
@@ -15565,7 +15288,7 @@
           <w:numId w:val="1"/>
         </w:numPr>
       </w:pPr>
-      <w:bookmarkStart w:id="49" w:name="_Toc238078918"/>
+      <w:bookmarkStart w:id="49" w:name="_Toc238168392"/>
       <w:r>
         <w:lastRenderedPageBreak/>
         <w:t>Settings for signal measurement</w:t>
@@ -15584,15 +15307,18 @@
       </w:r>
     </w:p>
     <w:p>
+      <w:pPr>
+        <w:jc w:val="center"/>
+      </w:pPr>
       <w:r>
         <w:rPr>
           <w:noProof/>
         </w:rPr>
         <w:drawing>
-          <wp:inline distT="0" distB="0" distL="0" distR="0" wp14:anchorId="75D5B727" wp14:editId="64484E08">
-            <wp:extent cx="5659497" cy="1381125"/>
-            <wp:effectExtent l="0" t="0" r="0" b="0"/>
-            <wp:docPr id="1421860668" name="Imagen 1" descr="Diagrama&#10;&#10;El contenido generado por IA puede ser incorrecto."/>
+          <wp:inline distT="0" distB="0" distL="0" distR="0" wp14:anchorId="203C7294" wp14:editId="43A0678E">
+            <wp:extent cx="5505450" cy="1121654"/>
+            <wp:effectExtent l="0" t="0" r="0" b="2540"/>
+            <wp:docPr id="1597523865" name="Imagen 2"/>
             <wp:cNvGraphicFramePr>
               <a:graphicFrameLocks xmlns:a="http://schemas.openxmlformats.org/drawingml/2006/main" noChangeAspect="1"/>
             </wp:cNvGraphicFramePr>
@@ -15600,12 +15326,20 @@
               <a:graphicData uri="http://schemas.openxmlformats.org/drawingml/2006/picture">
                 <pic:pic xmlns:pic="http://schemas.openxmlformats.org/drawingml/2006/picture">
                   <pic:nvPicPr>
-                    <pic:cNvPr id="1421860668" name="Imagen 1" descr="Diagrama&#10;&#10;El contenido generado por IA puede ser incorrecto."/>
-                    <pic:cNvPicPr/>
+                    <pic:cNvPr id="0" name="Picture 2"/>
+                    <pic:cNvPicPr>
+                      <a:picLocks noChangeAspect="1" noChangeArrowheads="1"/>
+                    </pic:cNvPicPr>
                   </pic:nvPicPr>
-                  <pic:blipFill rotWithShape="1">
-                    <a:blip r:embed="rId88"/>
-                    <a:srcRect l="1697" t="-752" r="5804" b="752"/>
+                  <pic:blipFill>
+                    <a:blip r:embed="rId88">
+                      <a:extLst>
+                        <a:ext uri="{28A0092B-C50C-407E-A947-70E740481C1C}">
+                          <a14:useLocalDpi xmlns:a14="http://schemas.microsoft.com/office/drawing/2010/main" val="0"/>
+                        </a:ext>
+                      </a:extLst>
+                    </a:blip>
+                    <a:srcRect/>
                     <a:stretch>
                       <a:fillRect/>
                     </a:stretch>
@@ -15613,19 +15347,15 @@
                   <pic:spPr bwMode="auto">
                     <a:xfrm>
                       <a:off x="0" y="0"/>
-                      <a:ext cx="5696864" cy="1390244"/>
+                      <a:ext cx="5517434" cy="1124096"/>
                     </a:xfrm>
                     <a:prstGeom prst="rect">
                       <a:avLst/>
                     </a:prstGeom>
+                    <a:noFill/>
                     <a:ln>
                       <a:noFill/>
                     </a:ln>
-                    <a:extLst>
-                      <a:ext uri="{53640926-AAD7-44D8-BBD7-CCE9431645EC}">
-                        <a14:shadowObscured xmlns:a14="http://schemas.microsoft.com/office/drawing/2010/main"/>
-                      </a:ext>
-                    </a:extLst>
                   </pic:spPr>
                 </pic:pic>
               </a:graphicData>
@@ -15658,7 +15388,7 @@
           <w:numId w:val="1"/>
         </w:numPr>
       </w:pPr>
-      <w:bookmarkStart w:id="50" w:name="_Toc238078919"/>
+      <w:bookmarkStart w:id="50" w:name="_Toc238168393"/>
       <w:r>
         <w:t>Settings before measurement</w:t>
       </w:r>
@@ -15725,19 +15455,7 @@
         <w:t>Once the user starts the measurement, the system automatically determines the number of stops required to begin count estimation. This step is critical, as configuring the Tempico device with several stops greater than the actual number of pulses received after a start pulse would result in no valid measurements being detected. To prevent this issue, the software analyzes the incoming signal behavior and automatically adjusts the appropriate number of stops before starting the counting process</w:t>
       </w:r>
       <w:r>
-        <w:t xml:space="preserve">, </w:t>
-      </w:r>
-      <w:r>
-        <w:t>reporting the calibration progress through the</w:t>
-      </w:r>
-      <w:r>
-        <w:t xml:space="preserve"> </w:t>
-      </w:r>
-      <w:r>
-        <w:t>status bar as described in Section</w:t>
-      </w:r>
-      <w:r>
-        <w:t xml:space="preserve"> </w:t>
+        <w:t xml:space="preserve">, reporting the calibration progress through the status bar as described in Section </w:t>
       </w:r>
       <w:hyperlink w:anchor="Statusbar" w:history="1">
         <w:r>
@@ -15868,7 +15586,7 @@
           <w:numId w:val="1"/>
         </w:numPr>
       </w:pPr>
-      <w:bookmarkStart w:id="51" w:name="_Toc238078920"/>
+      <w:bookmarkStart w:id="51" w:name="_Toc238168394"/>
       <w:r>
         <w:t>Perform a measurement</w:t>
       </w:r>
@@ -16634,7 +16352,7 @@
           <w:numId w:val="1"/>
         </w:numPr>
       </w:pPr>
-      <w:bookmarkStart w:id="52" w:name="_Toc238078921"/>
+      <w:bookmarkStart w:id="52" w:name="_Toc238168395"/>
       <w:r>
         <w:lastRenderedPageBreak/>
         <w:t>Save data</w:t>
@@ -16686,15 +16404,7 @@
         </w:drawing>
       </w:r>
       <w:r>
-        <w:t xml:space="preserve"> ) button. After this, the Save Data              </w:t>
-      </w:r>
-      <w:proofErr w:type="gramStart"/>
-      <w:r>
-        <w:t xml:space="preserve">   (</w:t>
-      </w:r>
-      <w:proofErr w:type="gramEnd"/>
-      <w:r>
-        <w:t xml:space="preserve"> </w:t>
+        <w:t xml:space="preserve"> ) button. After this, the Save Data                 ( </w:t>
       </w:r>
       <w:r>
         <w:rPr>
@@ -16893,7 +16603,7 @@
           <w:numId w:val="1"/>
         </w:numPr>
       </w:pPr>
-      <w:bookmarkStart w:id="53" w:name="_Toc238078922"/>
+      <w:bookmarkStart w:id="53" w:name="_Toc238168396"/>
       <w:r>
         <w:lastRenderedPageBreak/>
         <w:t>Save plot</w:t>
@@ -17108,7 +16818,7 @@
         </w:rPr>
       </w:pPr>
       <w:bookmarkStart w:id="54" w:name="_Toc186930452"/>
-      <w:bookmarkStart w:id="55" w:name="_Toc238078923"/>
+      <w:bookmarkStart w:id="55" w:name="_Toc238168397"/>
       <w:r>
         <w:rPr>
           <w:rFonts w:ascii="Arial" w:hAnsi="Arial" w:cs="Arial"/>
@@ -17145,7 +16855,7 @@
           <w:numId w:val="1"/>
         </w:numPr>
       </w:pPr>
-      <w:bookmarkStart w:id="56" w:name="_Toc238078924"/>
+      <w:bookmarkStart w:id="56" w:name="_Toc238168398"/>
       <w:r>
         <w:t>Settings before measurements</w:t>
       </w:r>
@@ -17182,7 +16892,23 @@
           <w:sz w:val="20"/>
           <w:szCs w:val="20"/>
         </w:rPr>
-        <w:t>Before starting a measurement, users can select the channels on which data will be recorded—options include channels A, B, C, or D.</w:t>
+        <w:t>Before starting a measurement, users can select the channels on which data will be recorded</w:t>
+      </w:r>
+      <w:r>
+        <w:rPr>
+          <w:rFonts w:ascii="Arial" w:hAnsi="Arial" w:cs="Arial"/>
+          <w:sz w:val="20"/>
+          <w:szCs w:val="20"/>
+        </w:rPr>
+        <w:t>. O</w:t>
+      </w:r>
+      <w:r>
+        <w:rPr>
+          <w:rFonts w:ascii="Arial" w:hAnsi="Arial" w:cs="Arial"/>
+          <w:sz w:val="20"/>
+          <w:szCs w:val="20"/>
+        </w:rPr>
+        <w:t>ptions include channels A, B, C, or D.</w:t>
       </w:r>
     </w:p>
     <w:p>
@@ -17309,6 +17035,21 @@
         </w:numPr>
       </w:pPr>
       <w:r>
+        <w:t>Type of</w:t>
+      </w:r>
+      <w:r>
+        <w:t xml:space="preserve"> measurement</w:t>
+      </w:r>
+    </w:p>
+    <w:p>
+      <w:pPr>
+        <w:pStyle w:val="Ttulo4"/>
+        <w:numPr>
+          <w:ilvl w:val="4"/>
+          <w:numId w:val="1"/>
+        </w:numPr>
+      </w:pPr>
+      <w:r>
         <w:t>Manual measurement</w:t>
       </w:r>
     </w:p>
@@ -17378,7 +17119,7 @@
       <w:pPr>
         <w:pStyle w:val="Ttulo4"/>
         <w:numPr>
-          <w:ilvl w:val="3"/>
+          <w:ilvl w:val="4"/>
           <w:numId w:val="1"/>
         </w:numPr>
       </w:pPr>
@@ -17400,7 +17141,16 @@
           <w:sz w:val="20"/>
           <w:szCs w:val="20"/>
         </w:rPr>
-        <w:t>In this mode, the user specifies both the start time and the stop time of the measurement. These values must be consistent with the system’s date and time settings. For instance, if a start date and time are set in the past when the measurement begins, the program will display an alert requesting the user to adjust the values. Similarly, if the stop time is set earlier than the start time, a similar alert will be generated.</w:t>
+        <w:t xml:space="preserve">In this mode, the user specifies both the start time and the stop time of the measurement. These values must be consistent with the system’s date and time settings. For instance, if a start date and time are set in the past when the measurement begins, the program will display an alert requesting </w:t>
+      </w:r>
+      <w:r>
+        <w:rPr>
+          <w:rFonts w:ascii="Arial" w:hAnsi="Arial" w:cs="Arial"/>
+          <w:sz w:val="20"/>
+          <w:szCs w:val="20"/>
+        </w:rPr>
+        <w:lastRenderedPageBreak/>
+        <w:t>the user to adjust the values. Similarly, if the stop time is set earlier than the start time, a similar alert will be generated.</w:t>
       </w:r>
     </w:p>
     <w:p>
@@ -17411,7 +17161,6 @@
         <w:rPr>
           <w:noProof/>
         </w:rPr>
-        <w:lastRenderedPageBreak/>
         <w:drawing>
           <wp:inline distT="0" distB="0" distL="0" distR="0" wp14:anchorId="6252F7BF" wp14:editId="343426C2">
             <wp:extent cx="3324689" cy="2048161"/>
@@ -17468,7 +17217,7 @@
       <w:pPr>
         <w:pStyle w:val="Ttulo4"/>
         <w:numPr>
-          <w:ilvl w:val="3"/>
+          <w:ilvl w:val="4"/>
           <w:numId w:val="1"/>
         </w:numPr>
       </w:pPr>
@@ -17588,7 +17337,7 @@
       <w:pPr>
         <w:pStyle w:val="Ttulo4"/>
         <w:numPr>
-          <w:ilvl w:val="3"/>
+          <w:ilvl w:val="4"/>
           <w:numId w:val="1"/>
         </w:numPr>
       </w:pPr>
@@ -17698,25 +17447,7 @@
           <w:sz w:val="20"/>
           <w:szCs w:val="20"/>
         </w:rPr>
-        <w:t xml:space="preserve">If an unexpected error occurs—such as an operating system failure, hardware malfunction, or sudden shutdown/restart—data can be recovered from the installation root directory of Tempico Software, inside the </w:t>
-      </w:r>
-      <w:proofErr w:type="spellStart"/>
-      <w:r>
-        <w:rPr>
-          <w:rFonts w:ascii="Arial" w:hAnsi="Arial" w:cs="Arial"/>
-          <w:sz w:val="20"/>
-          <w:szCs w:val="20"/>
-        </w:rPr>
-        <w:t>TempData</w:t>
-      </w:r>
-      <w:proofErr w:type="spellEnd"/>
-      <w:r>
-        <w:rPr>
-          <w:rFonts w:ascii="Arial" w:hAnsi="Arial" w:cs="Arial"/>
-          <w:sz w:val="20"/>
-          <w:szCs w:val="20"/>
-        </w:rPr>
-        <w:t xml:space="preserve"> folder. This directory contains the file AutoSaveData.txt, which stores all data recorded up to the last autosave. Although it is not recommended to open this file directly, it can be used as a recovery resource if necessary.</w:t>
+        <w:t>If an unexpected error occurs—such as an operating system failure, hardware malfunction, or sudden shutdown/restart—data can be recovered from the installation root directory of Tempico Software, inside the TempData folder. This directory contains the file AutoSaveData.txt, which stores all data recorded up to the last autosave. Although it is not recommended to open this file directly, it can be used as a recovery resource if necessary.</w:t>
       </w:r>
     </w:p>
     <w:p>
@@ -17839,7 +17570,7 @@
           <w:numId w:val="1"/>
         </w:numPr>
       </w:pPr>
-      <w:bookmarkStart w:id="57" w:name="_Toc238078925"/>
+      <w:bookmarkStart w:id="57" w:name="_Toc238168399"/>
       <w:r>
         <w:t>Perform a measurement</w:t>
       </w:r>
@@ -18911,7 +18642,7 @@
           <w:numId w:val="1"/>
         </w:numPr>
       </w:pPr>
-      <w:bookmarkStart w:id="58" w:name="_Toc238078926"/>
+      <w:bookmarkStart w:id="58" w:name="_Toc238168400"/>
       <w:r>
         <w:t>Save data</w:t>
       </w:r>
@@ -19380,7 +19111,7 @@
           <w:szCs w:val="28"/>
         </w:rPr>
       </w:pPr>
-      <w:bookmarkStart w:id="59" w:name="_Toc238078927"/>
+      <w:bookmarkStart w:id="59" w:name="_Toc238168401"/>
       <w:r>
         <w:rPr>
           <w:rFonts w:ascii="Arial" w:hAnsi="Arial" w:cs="Arial"/>
@@ -19408,7 +19139,7 @@
           <w:numId w:val="1"/>
         </w:numPr>
       </w:pPr>
-      <w:bookmarkStart w:id="60" w:name="_Toc238078928"/>
+      <w:bookmarkStart w:id="60" w:name="_Toc238168402"/>
       <w:r>
         <w:t>Settings before measurements</w:t>
       </w:r>
@@ -19557,7 +19288,7 @@
           <w:numId w:val="1"/>
         </w:numPr>
       </w:pPr>
-      <w:bookmarkStart w:id="61" w:name="_Toc238078929"/>
+      <w:bookmarkStart w:id="61" w:name="_Toc238168403"/>
       <w:r>
         <w:t>Perform a measurement</w:t>
       </w:r>
@@ -19610,23 +19341,7 @@
           <w:rFonts w:eastAsiaTheme="minorEastAsia"/>
           <w:iCs/>
         </w:rPr>
-        <w:t xml:space="preserve">τ) is plotted live against τ on a logarithmic time axis as new data arrives. At any point the user can press Clear to reset the curve, or </w:t>
-      </w:r>
-      <w:proofErr w:type="gramStart"/>
-      <w:r>
-        <w:rPr>
-          <w:rFonts w:eastAsiaTheme="minorEastAsia"/>
-          <w:iCs/>
-        </w:rPr>
-        <w:t>Stop</w:t>
-      </w:r>
-      <w:proofErr w:type="gramEnd"/>
-      <w:r>
-        <w:rPr>
-          <w:rFonts w:eastAsiaTheme="minorEastAsia"/>
-          <w:iCs/>
-        </w:rPr>
-        <w:t xml:space="preserve"> to end the measurement before the configured duration elapses.</w:t>
+        <w:t>τ) is plotted live against τ on a logarithmic time axis as new data arrives. At any point the user can press Clear to reset the curve, or Stop to end the measurement before the configured duration elapses.</w:t>
       </w:r>
     </w:p>
     <w:p>
@@ -19708,10 +19423,7 @@
         <w:t xml:space="preserve"> duration.</w:t>
       </w:r>
       <w:r>
-        <w:t xml:space="preserve"> Alongside this panel, the status </w:t>
-      </w:r>
-      <w:r>
-        <w:t xml:space="preserve">bar reports the acquisition state as described in Section </w:t>
+        <w:t xml:space="preserve"> Alongside this panel, the status bar reports the acquisition state as described in Section </w:t>
       </w:r>
       <w:hyperlink w:anchor="Statusbar" w:history="1">
         <w:r>
@@ -19722,19 +19434,7 @@
         </w:r>
       </w:hyperlink>
       <w:r>
-        <w:t>; if</w:t>
-      </w:r>
-      <w:r>
-        <w:t xml:space="preserve"> </w:t>
-      </w:r>
-      <w:r>
-        <w:t>a warning persists, the user should check the corresponding cable connections and the signal levels before</w:t>
-      </w:r>
-      <w:r>
-        <w:t xml:space="preserve"> </w:t>
-      </w:r>
-      <w:r>
-        <w:t>continuing the measurement</w:t>
+        <w:t>; if a warning persists, the user should check the corresponding cable connections and the signal levels before continuing the measurement</w:t>
       </w:r>
       <w:r>
         <w:t>.</w:t>
@@ -19806,7 +19506,7 @@
           <w:numId w:val="1"/>
         </w:numPr>
       </w:pPr>
-      <w:bookmarkStart w:id="62" w:name="_Toc238078930"/>
+      <w:bookmarkStart w:id="62" w:name="_Toc238168404"/>
       <w:r>
         <w:t>Post-measurement</w:t>
       </w:r>
@@ -19821,7 +19521,7 @@
         </w:numPr>
         <w:ind w:left="720"/>
       </w:pPr>
-      <w:bookmarkStart w:id="63" w:name="_Toc238078931"/>
+      <w:bookmarkStart w:id="63" w:name="_Toc238168405"/>
       <w:r>
         <w:t>Fitting</w:t>
       </w:r>
@@ -19842,15 +19542,7 @@
         <w:t xml:space="preserve">automatically </w:t>
       </w:r>
       <w:r>
-        <w:t xml:space="preserve">suggested by the software for the selected model, and the </w:t>
-      </w:r>
-      <w:proofErr w:type="gramStart"/>
-      <w:r>
-        <w:t>G(</w:t>
-      </w:r>
-      <w:proofErr w:type="gramEnd"/>
-      <w:r>
-        <w:t xml:space="preserve">∞) offset checkbox adds a constant baseline term to the fitted equation of any model. </w:t>
+        <w:t xml:space="preserve">suggested by the software for the selected model, and the G(∞) offset checkbox adds a constant baseline term to the fitted equation of any model. </w:t>
       </w:r>
     </w:p>
     <w:p>
@@ -19929,7 +19621,7 @@
           <w:numId w:val="1"/>
         </w:numPr>
       </w:pPr>
-      <w:bookmarkStart w:id="64" w:name="_Toc238078932"/>
+      <w:bookmarkStart w:id="64" w:name="_Toc238168406"/>
       <w:r>
         <w:t>Gaussian diffusion</w:t>
       </w:r>
@@ -20346,23 +20038,7 @@
           <w:rFonts w:eastAsiaTheme="minorEastAsia"/>
           <w:iCs/>
         </w:rPr>
-        <w:t xml:space="preserve">, the diffusion time, in </w:t>
-      </w:r>
-      <w:proofErr w:type="spellStart"/>
-      <w:r>
-        <w:rPr>
-          <w:rFonts w:eastAsiaTheme="minorEastAsia"/>
-          <w:iCs/>
-        </w:rPr>
-        <w:t>ms</w:t>
-      </w:r>
-      <w:proofErr w:type="spellEnd"/>
-      <w:r>
-        <w:rPr>
-          <w:rFonts w:eastAsiaTheme="minorEastAsia"/>
-          <w:iCs/>
-        </w:rPr>
-        <w:t xml:space="preserve">; and a, the structure parameter, defined as the ratio between the axial and lateral radii of the observation volume. </w:t>
+        <w:t xml:space="preserve">, the diffusion time, in ms; and a, the structure parameter, defined as the ratio between the axial and lateral radii of the observation volume. </w:t>
       </w:r>
     </w:p>
     <w:p>
@@ -20373,7 +20049,7 @@
           <w:numId w:val="1"/>
         </w:numPr>
       </w:pPr>
-      <w:bookmarkStart w:id="65" w:name="_Toc238078933"/>
+      <w:bookmarkStart w:id="65" w:name="_Toc238168407"/>
       <w:r>
         <w:t>Anomalous diffusion</w:t>
       </w:r>
@@ -20829,7 +20505,6 @@
         <w:lastRenderedPageBreak/>
         <w:t xml:space="preserve">Extends the 3D Gaussian diffusion model to account for non-Brownian, anomalous transport. In addition to N, </w:t>
       </w:r>
-      <w:proofErr w:type="spellStart"/>
       <w:r>
         <w:rPr>
           <w:iCs/>
@@ -20843,26 +20518,11 @@
         </w:rPr>
         <w:t>D</w:t>
       </w:r>
-      <w:proofErr w:type="spellEnd"/>
       <w:r>
         <w:rPr>
           <w:iCs/>
         </w:rPr>
-        <w:t xml:space="preserve"> (</w:t>
-      </w:r>
-      <w:proofErr w:type="spellStart"/>
-      <w:r>
-        <w:rPr>
-          <w:iCs/>
-        </w:rPr>
-        <w:t>ms</w:t>
-      </w:r>
-      <w:proofErr w:type="spellEnd"/>
-      <w:r>
-        <w:rPr>
-          <w:iCs/>
-        </w:rPr>
-        <w:t xml:space="preserve">), and </w:t>
+        <w:t xml:space="preserve"> (ms), and </w:t>
       </w:r>
       <w:r>
         <w:rPr>
@@ -20891,7 +20551,7 @@
           <w:numId w:val="1"/>
         </w:numPr>
       </w:pPr>
-      <w:bookmarkStart w:id="66" w:name="_Toc238078934"/>
+      <w:bookmarkStart w:id="66" w:name="_Toc238168408"/>
       <w:r>
         <w:t>Chemical relaxation</w:t>
       </w:r>
@@ -21095,7 +20755,6 @@
       <w:r>
         <w:t xml:space="preserve">Describes a two-state chemical equilibrium, such as binding/unbinding or blinking, rather than diffusion. The fitted parameters are N, the relaxation time </w:t>
       </w:r>
-      <w:proofErr w:type="spellStart"/>
       <w:r>
         <w:rPr>
           <w:iCs/>
@@ -21109,45 +20768,23 @@
         </w:rPr>
         <w:t>B</w:t>
       </w:r>
-      <w:proofErr w:type="spellEnd"/>
       <w:r>
         <w:rPr>
           <w:iCs/>
         </w:rPr>
-        <w:t xml:space="preserve">, in </w:t>
-      </w:r>
-      <w:proofErr w:type="spellStart"/>
+        <w:t>, in ms, and K, the ratio between the on- and off-rate constants of the reaction</w:t>
+      </w:r>
       <w:r>
         <w:rPr>
           <w:iCs/>
         </w:rPr>
-        <w:t>ms</w:t>
-      </w:r>
-      <w:proofErr w:type="spellEnd"/>
+        <w:t xml:space="preserve">, </w:t>
+      </w:r>
       <w:r>
         <w:rPr>
           <w:iCs/>
         </w:rPr>
-        <w:t>, and K, the ratio between the on- and off-rate constants of the reaction</w:t>
-      </w:r>
-      <w:r>
-        <w:rPr>
-          <w:iCs/>
-        </w:rPr>
-        <w:t xml:space="preserve">, </w:t>
-      </w:r>
-      <w:r>
-        <w:rPr>
-          <w:iCs/>
-        </w:rPr>
-        <w:t xml:space="preserve">K = </w:t>
-      </w:r>
-      <w:proofErr w:type="spellStart"/>
-      <w:r>
-        <w:rPr>
-          <w:iCs/>
-        </w:rPr>
-        <w:t>k</w:t>
+        <w:t>K = k</w:t>
       </w:r>
       <w:r>
         <w:rPr>
@@ -21156,19 +20793,11 @@
         </w:rPr>
         <w:t>on</w:t>
       </w:r>
-      <w:proofErr w:type="spellEnd"/>
       <w:r>
         <w:rPr>
           <w:iCs/>
         </w:rPr>
-        <w:t>/</w:t>
-      </w:r>
-      <w:proofErr w:type="spellStart"/>
-      <w:r>
-        <w:rPr>
-          <w:iCs/>
-        </w:rPr>
-        <w:t>k</w:t>
+        <w:t>/k</w:t>
       </w:r>
       <w:r>
         <w:rPr>
@@ -21177,7 +20806,6 @@
         </w:rPr>
         <w:t>off</w:t>
       </w:r>
-      <w:proofErr w:type="spellEnd"/>
       <w:r>
         <w:rPr>
           <w:iCs/>
@@ -21263,7 +20891,7 @@
           <w:numId w:val="1"/>
         </w:numPr>
       </w:pPr>
-      <w:bookmarkStart w:id="67" w:name="_Toc238078935"/>
+      <w:bookmarkStart w:id="67" w:name="_Toc238168409"/>
       <w:r>
         <w:t>Diffusion with flow</w:t>
       </w:r>
@@ -21867,7 +21495,6 @@
       <w:r>
         <w:t xml:space="preserve"> subject to a net drift, such as in a microfluidic channel. The fitted parameters are N, </w:t>
       </w:r>
-      <w:proofErr w:type="spellStart"/>
       <w:r>
         <w:rPr>
           <w:iCs/>
@@ -21881,28 +21508,12 @@
         </w:rPr>
         <w:t>D</w:t>
       </w:r>
-      <w:proofErr w:type="spellEnd"/>
       <w:r>
         <w:rPr>
           <w:iCs/>
         </w:rPr>
-        <w:t xml:space="preserve"> (</w:t>
-      </w:r>
-      <w:proofErr w:type="spellStart"/>
-      <w:r>
-        <w:rPr>
-          <w:iCs/>
-        </w:rPr>
-        <w:t>ms</w:t>
-      </w:r>
-      <w:proofErr w:type="spellEnd"/>
-      <w:r>
-        <w:rPr>
-          <w:iCs/>
-        </w:rPr>
-        <w:t xml:space="preserve">). The structure parameter a, and the flow time </w:t>
-      </w:r>
-      <w:proofErr w:type="spellStart"/>
+        <w:t xml:space="preserve"> (ms). The structure parameter a, and the flow time </w:t>
+      </w:r>
       <w:r>
         <w:rPr>
           <w:iCs/>
@@ -21916,26 +21527,11 @@
         </w:rPr>
         <w:t>v</w:t>
       </w:r>
-      <w:proofErr w:type="spellEnd"/>
       <w:r>
         <w:rPr>
           <w:iCs/>
         </w:rPr>
-        <w:t xml:space="preserve">, in </w:t>
-      </w:r>
-      <w:proofErr w:type="spellStart"/>
-      <w:r>
-        <w:rPr>
-          <w:iCs/>
-        </w:rPr>
-        <w:t>ms</w:t>
-      </w:r>
-      <w:proofErr w:type="spellEnd"/>
-      <w:r>
-        <w:rPr>
-          <w:iCs/>
-        </w:rPr>
-        <w:t>, which represents the average transit time of a particle across the observation volume due to flow.</w:t>
+        <w:t>, in ms, which represents the average transit time of a particle across the observation volume due to flow.</w:t>
       </w:r>
     </w:p>
     <w:p>
@@ -21946,7 +21542,7 @@
           <w:numId w:val="1"/>
         </w:numPr>
       </w:pPr>
-      <w:bookmarkStart w:id="68" w:name="_Toc238078936"/>
+      <w:bookmarkStart w:id="68" w:name="_Toc238168410"/>
       <w:r>
         <w:t>Triplet state correction</w:t>
       </w:r>
@@ -22449,7 +22045,6 @@
       <w:r>
         <w:t xml:space="preserve">Adds a photophysical blinking term to the 3D Gaussian diffusion model, accounting for fluorophores transiently entering a non-fluorescent triplet state. The fitted parameters are N, </w:t>
       </w:r>
-      <w:proofErr w:type="spellStart"/>
       <w:r>
         <w:rPr>
           <w:iCs/>
@@ -22463,28 +22058,12 @@
         </w:rPr>
         <w:t>D</w:t>
       </w:r>
-      <w:proofErr w:type="spellEnd"/>
       <w:r>
         <w:rPr>
           <w:iCs/>
         </w:rPr>
-        <w:t xml:space="preserve"> (</w:t>
-      </w:r>
-      <w:proofErr w:type="spellStart"/>
-      <w:r>
-        <w:rPr>
-          <w:iCs/>
-        </w:rPr>
-        <w:t>ms</w:t>
-      </w:r>
-      <w:proofErr w:type="spellEnd"/>
-      <w:r>
-        <w:rPr>
-          <w:iCs/>
-        </w:rPr>
-        <w:t xml:space="preserve">), the structure parameter a, the triplet fraction F, which represents the proportion of molecules in the triplet state, and the triplet relaxation time </w:t>
-      </w:r>
-      <w:proofErr w:type="spellStart"/>
+        <w:t xml:space="preserve"> (ms), the structure parameter a, the triplet fraction F, which represents the proportion of molecules in the triplet state, and the triplet relaxation time </w:t>
+      </w:r>
       <w:r>
         <w:rPr>
           <w:iCs/>
@@ -22498,7 +22077,6 @@
         </w:rPr>
         <w:t>F</w:t>
       </w:r>
-      <w:proofErr w:type="spellEnd"/>
       <w:r>
         <w:rPr>
           <w:iCs/>
@@ -22514,7 +22092,7 @@
           <w:numId w:val="1"/>
         </w:numPr>
       </w:pPr>
-      <w:bookmarkStart w:id="69" w:name="_Toc238078937"/>
+      <w:bookmarkStart w:id="69" w:name="_Toc238168411"/>
       <w:r>
         <w:t>Two-component diffusion</w:t>
       </w:r>
@@ -23283,21 +22861,7 @@
         <w:rPr>
           <w:iCs/>
         </w:rPr>
-        <w:t xml:space="preserve">, in </w:t>
-      </w:r>
-      <w:proofErr w:type="spellStart"/>
-      <w:r>
-        <w:rPr>
-          <w:iCs/>
-        </w:rPr>
-        <w:t>ms</w:t>
-      </w:r>
-      <w:proofErr w:type="spellEnd"/>
-      <w:r>
-        <w:rPr>
-          <w:iCs/>
-        </w:rPr>
-        <w:t>, the amplitude fraction of the first species α</w:t>
+        <w:t>, in ms, the amplitude fraction of the first species α</w:t>
       </w:r>
       <w:r>
         <w:rPr>
@@ -23322,7 +22886,7 @@
         </w:numPr>
         <w:ind w:left="720"/>
       </w:pPr>
-      <w:bookmarkStart w:id="70" w:name="_Toc238078938"/>
+      <w:bookmarkStart w:id="70" w:name="_Toc238168412"/>
       <w:r>
         <w:t>Save data</w:t>
       </w:r>
@@ -23594,21 +23158,7 @@
         <w:rPr>
           <w:iCs/>
         </w:rPr>
-        <w:t>Likewise, the Save Plot button exports the graph exactly as it appears in screen, including the fitted curve if one was calculated. The available formats are .</w:t>
-      </w:r>
-      <w:proofErr w:type="spellStart"/>
-      <w:r>
-        <w:rPr>
-          <w:iCs/>
-        </w:rPr>
-        <w:t>png</w:t>
-      </w:r>
-      <w:proofErr w:type="spellEnd"/>
-      <w:r>
-        <w:rPr>
-          <w:iCs/>
-        </w:rPr>
-        <w:t>, .tiff</w:t>
+        <w:t>Likewise, the Save Plot button exports the graph exactly as it appears in screen, including the fitted curve if one was calculated. The available formats are .png, .tiff</w:t>
       </w:r>
       <w:r>
         <w:rPr>
@@ -23806,7 +23356,7 @@
           <w:szCs w:val="28"/>
         </w:rPr>
       </w:pPr>
-      <w:bookmarkStart w:id="71" w:name="_Toc238078939"/>
+      <w:bookmarkStart w:id="71" w:name="_Toc238168413"/>
       <w:r>
         <w:rPr>
           <w:rFonts w:ascii="Arial" w:hAnsi="Arial" w:cs="Arial"/>
@@ -23905,21 +23455,10 @@
         <w:rPr>
           <w:vertAlign w:val="superscript"/>
         </w:rPr>
-        <w:t>(</w:t>
-      </w:r>
-      <w:proofErr w:type="gramStart"/>
-      <w:r>
-        <w:rPr>
-          <w:vertAlign w:val="superscript"/>
-        </w:rPr>
-        <w:t>2)</w:t>
-      </w:r>
-      <w:r>
-        <w:t>(</w:t>
-      </w:r>
-      <w:proofErr w:type="gramEnd"/>
-      <w:r>
-        <w:t>HBT) tab allows the user to compute the second-order intensity correlation function g</w:t>
+        <w:t>(2)</w:t>
+      </w:r>
+      <w:r>
+        <w:t>(HBT) tab allows the user to compute the second-order intensity correlation function g</w:t>
       </w:r>
       <w:r>
         <w:rPr>
@@ -23951,7 +23490,7 @@
           <w:numId w:val="1"/>
         </w:numPr>
       </w:pPr>
-      <w:bookmarkStart w:id="72" w:name="_Toc238078940"/>
+      <w:bookmarkStart w:id="72" w:name="_Toc238168414"/>
       <w:r>
         <w:t>Settings before measurements</w:t>
       </w:r>
@@ -24102,7 +23641,7 @@
           <w:numId w:val="1"/>
         </w:numPr>
       </w:pPr>
-      <w:bookmarkStart w:id="73" w:name="_Toc238078941"/>
+      <w:bookmarkStart w:id="73" w:name="_Toc238168415"/>
       <w:r>
         <w:t>Perform a measurement</w:t>
       </w:r>
@@ -24131,15 +23670,7 @@
         <w:t xml:space="preserve"> (2) </w:t>
       </w:r>
       <w:r>
-        <w:t xml:space="preserve">=1. At any point the user can press Clear to reset the histogram, or </w:t>
-      </w:r>
-      <w:proofErr w:type="gramStart"/>
-      <w:r>
-        <w:t>Stop</w:t>
-      </w:r>
-      <w:proofErr w:type="gramEnd"/>
-      <w:r>
-        <w:t xml:space="preserve"> to end the measurement before the configured duration elapses.</w:t>
+        <w:t>=1. At any point the user can press Clear to reset the histogram, or Stop to end the measurement before the configured duration elapses.</w:t>
       </w:r>
     </w:p>
     <w:p>
@@ -24204,10 +23735,7 @@
         <w:t>The panel below the settings reports the acquisition progress through two values: Events, which indicates the number of valid stop events detected on the selected channel since the measurement started, and Elapsed, which indicates the elapsed time since the measurement started, shown in seconds and, if applicable, against the total configured duration. If Count Estimation was enabled before starting, this panel also shows the estimated rate, in counts per second.</w:t>
       </w:r>
       <w:r>
-        <w:t xml:space="preserve"> </w:t>
-      </w:r>
-      <w:r>
-        <w:t xml:space="preserve">Alongside this panel, the status bar reports the acquisition state as described in Section </w:t>
+        <w:t xml:space="preserve"> Alongside this panel, the status bar reports the acquisition state as described in Section </w:t>
       </w:r>
       <w:hyperlink w:anchor="Statusbar" w:history="1">
         <w:r>
@@ -24218,10 +23746,7 @@
         </w:r>
       </w:hyperlink>
       <w:r>
-        <w:t>; if a warning persists, the user should check the corresponding cable connections and the signal levels before continuing the measurement</w:t>
-      </w:r>
-      <w:r>
-        <w:t>.</w:t>
+        <w:t>; if a warning persists, the user should check the corresponding cable connections and the signal levels before continuing the measurement.</w:t>
       </w:r>
     </w:p>
     <w:p>
@@ -24290,7 +23815,7 @@
           <w:numId w:val="1"/>
         </w:numPr>
       </w:pPr>
-      <w:bookmarkStart w:id="74" w:name="_Toc238078942"/>
+      <w:bookmarkStart w:id="74" w:name="_Toc238168416"/>
       <w:r>
         <w:t>Post-measurement</w:t>
       </w:r>
@@ -24305,7 +23830,7 @@
         </w:numPr>
         <w:ind w:left="720"/>
       </w:pPr>
-      <w:bookmarkStart w:id="75" w:name="_Toc238078943"/>
+      <w:bookmarkStart w:id="75" w:name="_Toc238168417"/>
       <w:r>
         <w:t>Fitting</w:t>
       </w:r>
@@ -24400,7 +23925,7 @@
           <w:numId w:val="1"/>
         </w:numPr>
       </w:pPr>
-      <w:bookmarkStart w:id="76" w:name="_Toc238078944"/>
+      <w:bookmarkStart w:id="76" w:name="_Toc238168418"/>
       <w:r>
         <w:t>Antibunched Gaussian</w:t>
       </w:r>
@@ -24657,7 +24182,7 @@
           <w:numId w:val="1"/>
         </w:numPr>
       </w:pPr>
-      <w:bookmarkStart w:id="77" w:name="_Toc238078945"/>
+      <w:bookmarkStart w:id="77" w:name="_Toc238168419"/>
       <w:r>
         <w:t>Antibunched Lorentzian</w:t>
       </w:r>
@@ -24969,7 +24494,7 @@
           <w:numId w:val="1"/>
         </w:numPr>
       </w:pPr>
-      <w:bookmarkStart w:id="78" w:name="_Toc238078946"/>
+      <w:bookmarkStart w:id="78" w:name="_Toc238168420"/>
       <w:r>
         <w:t>Bunched Gaussian</w:t>
       </w:r>
@@ -25012,13 +24537,7 @@
             <w:rPr>
               <w:rFonts w:ascii="Cambria Math" w:hAnsi="Cambria Math"/>
             </w:rPr>
-            <m:t>+</m:t>
-          </m:r>
-          <m:r>
-            <w:rPr>
-              <w:rFonts w:ascii="Cambria Math" w:hAnsi="Cambria Math"/>
-            </w:rPr>
-            <m:t>a∙</m:t>
+            <m:t>+a∙</m:t>
           </m:r>
           <m:func>
             <m:funcPr>
@@ -25219,11 +24738,7 @@
         <w:t>0</w:t>
       </w:r>
       <w:r>
-        <w:t xml:space="preserve">, the position of the peak, in ns; and </w:t>
-      </w:r>
-      <w:proofErr w:type="spellStart"/>
-      <w:r>
-        <w:t>τ</w:t>
+        <w:t>, the position of the peak, in ns; and τ</w:t>
       </w:r>
       <w:r>
         <w:rPr>
@@ -25231,7 +24746,6 @@
         </w:rPr>
         <w:t>c</w:t>
       </w:r>
-      <w:proofErr w:type="spellEnd"/>
       <w:r>
         <w:t>, the coherence time governing the width of the Gaussian peak, in ns.</w:t>
       </w:r>
@@ -25244,7 +24758,7 @@
           <w:numId w:val="1"/>
         </w:numPr>
       </w:pPr>
-      <w:bookmarkStart w:id="79" w:name="_Toc238078947"/>
+      <w:bookmarkStart w:id="79" w:name="_Toc238168421"/>
       <w:r>
         <w:t>Bunched Lorentzian</w:t>
       </w:r>
@@ -25287,13 +24801,7 @@
             <w:rPr>
               <w:rFonts w:ascii="Cambria Math" w:hAnsi="Cambria Math"/>
             </w:rPr>
-            <m:t>+</m:t>
-          </m:r>
-          <m:r>
-            <w:rPr>
-              <w:rFonts w:ascii="Cambria Math" w:hAnsi="Cambria Math"/>
-            </w:rPr>
-            <m:t>a∙</m:t>
+            <m:t>+a∙</m:t>
           </m:r>
           <m:func>
             <m:funcPr>
@@ -25462,11 +24970,7 @@
         <w:t>0</w:t>
       </w:r>
       <w:r>
-        <w:t xml:space="preserve">, the position of the peak, in ns; and </w:t>
-      </w:r>
-      <w:proofErr w:type="spellStart"/>
-      <w:r>
-        <w:t>τ</w:t>
+        <w:t>, the position of the peak, in ns; and τ</w:t>
       </w:r>
       <w:r>
         <w:rPr>
@@ -25474,7 +24978,6 @@
         </w:rPr>
         <w:t>c</w:t>
       </w:r>
-      <w:proofErr w:type="spellEnd"/>
       <w:r>
         <w:t>, the coherence time governing the decay of the peak, in ns.</w:t>
       </w:r>
@@ -25487,7 +24990,7 @@
           <w:numId w:val="1"/>
         </w:numPr>
       </w:pPr>
-      <w:bookmarkStart w:id="80" w:name="_Toc238078948"/>
+      <w:bookmarkStart w:id="80" w:name="_Toc238168422"/>
       <w:r>
         <w:t>Three-level system</w:t>
       </w:r>
@@ -25875,7 +25378,7 @@
         </w:numPr>
         <w:ind w:left="720"/>
       </w:pPr>
-      <w:bookmarkStart w:id="81" w:name="_Toc238078949"/>
+      <w:bookmarkStart w:id="81" w:name="_Toc238168423"/>
       <w:r>
         <w:t>Save data</w:t>
       </w:r>
@@ -26098,15 +25601,7 @@
     </w:p>
     <w:p>
       <w:r>
-        <w:t>Likewise, the Save Plot button exports the graph exactly as it appears on screen, including the fitted curve if one was calculated. The available formats are .</w:t>
-      </w:r>
-      <w:proofErr w:type="spellStart"/>
-      <w:r>
-        <w:t>png</w:t>
-      </w:r>
-      <w:proofErr w:type="spellEnd"/>
-      <w:r>
-        <w:t>, .tiff, and .jpg. In both cases, once the user selects the desired format and confirms, a confirmation window appears indicating that the file was saved successfully and displaying the path where it was stored.</w:t>
+        <w:t>Likewise, the Save Plot button exports the graph exactly as it appears on screen, including the fitted curve if one was calculated. The available formats are .png, .tiff, and .jpg. In both cases, once the user selects the desired format and confirms, a confirmation window appears indicating that the file was saved successfully and displaying the path where it was stored.</w:t>
       </w:r>
     </w:p>
     <w:p>
@@ -26222,7 +25717,7 @@
         </w:rPr>
         <w:lastRenderedPageBreak/>
         <w:drawing>
-          <wp:inline distT="0" distB="0" distL="0" distR="0" wp14:anchorId="4B84BFFA" wp14:editId="3C4971F8">
+          <wp:inline distT="0" distB="0" distL="0" distR="0" wp14:anchorId="4B84BFFA" wp14:editId="4AA5B455">
             <wp:extent cx="5522026" cy="2269490"/>
             <wp:effectExtent l="0" t="0" r="2540" b="0"/>
             <wp:docPr id="934478524" name="Imagen 13"/>
@@ -26287,7 +25782,7 @@
           <w:rFonts w:ascii="Arial" w:hAnsi="Arial" w:cs="Arial"/>
         </w:rPr>
       </w:pPr>
-      <w:bookmarkStart w:id="82" w:name="_Toc238078950"/>
+      <w:bookmarkStart w:id="82" w:name="_Toc238168424"/>
       <w:r>
         <w:rPr>
           <w:rFonts w:ascii="Arial" w:hAnsi="Arial" w:cs="Arial"/>
@@ -26344,7 +25839,7 @@
           <w:rFonts w:ascii="Arial" w:hAnsi="Arial" w:cs="Arial"/>
         </w:rPr>
       </w:pPr>
-      <w:bookmarkStart w:id="83" w:name="_Toc238078951"/>
+      <w:bookmarkStart w:id="83" w:name="_Toc238168425"/>
       <w:r>
         <w:rPr>
           <w:rFonts w:ascii="Arial" w:hAnsi="Arial" w:cs="Arial"/>
@@ -26367,25 +25862,7 @@
           <w:sz w:val="20"/>
           <w:szCs w:val="20"/>
         </w:rPr>
-        <w:t xml:space="preserve">Your computer may automatically download and install from the Internet the required drivers once you connect your Tausand Tempico device to a USB port. If you </w:t>
-      </w:r>
-      <w:proofErr w:type="gramStart"/>
-      <w:r>
-        <w:rPr>
-          <w:rFonts w:ascii="Arial" w:hAnsi="Arial" w:cs="Arial"/>
-          <w:sz w:val="20"/>
-          <w:szCs w:val="20"/>
-        </w:rPr>
-        <w:t>require</w:t>
-      </w:r>
-      <w:proofErr w:type="gramEnd"/>
-      <w:r>
-        <w:rPr>
-          <w:rFonts w:ascii="Arial" w:hAnsi="Arial" w:cs="Arial"/>
-          <w:sz w:val="20"/>
-          <w:szCs w:val="20"/>
-        </w:rPr>
-        <w:t xml:space="preserve"> to install them manually, they are available at </w:t>
+        <w:t xml:space="preserve">Your computer may automatically download and install from the Internet the required drivers once you connect your Tausand Tempico device to a USB port. If you require to install them manually, they are available at </w:t>
       </w:r>
       <w:hyperlink r:id="rId163" w:history="1">
         <w:r>
@@ -26428,7 +25905,7 @@
           <w:rFonts w:ascii="Arial" w:hAnsi="Arial" w:cs="Arial"/>
         </w:rPr>
       </w:pPr>
-      <w:bookmarkStart w:id="84" w:name="_Toc238078952"/>
+      <w:bookmarkStart w:id="84" w:name="_Toc238168426"/>
       <w:r>
         <w:rPr>
           <w:rFonts w:ascii="Arial" w:hAnsi="Arial" w:cs="Arial"/>
@@ -26827,7 +26304,7 @@
       <w:lvlText w:val="%1.%2.%3.%4"/>
       <w:lvlJc w:val="left"/>
       <w:pPr>
-        <w:ind w:left="1080" w:hanging="720"/>
+        <w:ind w:left="1350" w:hanging="720"/>
       </w:pPr>
       <w:rPr>
         <w:rFonts w:hint="default"/>
@@ -27507,6 +26984,7 @@
   <w:style w:type="character" w:default="1" w:styleId="Fuentedeprrafopredeter">
     <w:name w:val="Default Paragraph Font"/>
     <w:uiPriority w:val="1"/>
+    <w:semiHidden/>
     <w:unhideWhenUsed/>
   </w:style>
   <w:style w:type="table" w:default="1" w:styleId="Tablanormal">
@@ -28155,6 +27633,7 @@
     <w:rsid w:val="00B50367"/>
     <w:rsid w:val="00B956F5"/>
     <w:rsid w:val="00BF776D"/>
+    <w:rsid w:val="00C170B9"/>
     <w:rsid w:val="00C46EDD"/>
     <w:rsid w:val="00C535B1"/>
     <w:rsid w:val="00C73D67"/>
@@ -28165,6 +27644,7 @@
     <w:rsid w:val="00E90657"/>
     <w:rsid w:val="00EB52E2"/>
     <w:rsid w:val="00F14015"/>
+    <w:rsid w:val="00F5403D"/>
     <w:rsid w:val="00F962BC"/>
     <w:rsid w:val="00FA7DF9"/>
     <w:rsid w:val="00FD0418"/>

</xml_diff>

<commit_message>
fix: apply corrections to tempcioSoftware manual
</commit_message>
<xml_diff>
--- a/docs/user/archive/Tausand Tempico Software Manual 2.1.0.docx
+++ b/docs/user/archive/Tausand Tempico Software Manual 2.1.0.docx
@@ -1,6 +1,6 @@
 
 <file path=word/document.xml><?xml version="1.0" encoding="utf-8"?>
-<w:document xmlns:wpc="http://schemas.microsoft.com/office/word/2010/wordprocessingCanvas" xmlns:cx="http://schemas.microsoft.com/office/drawing/2014/chartex" xmlns:cx1="http://schemas.microsoft.com/office/drawing/2015/9/8/chartex" xmlns:cx2="http://schemas.microsoft.com/office/drawing/2015/10/21/chartex" xmlns:cx3="http://schemas.microsoft.com/office/drawing/2016/5/9/chartex" xmlns:cx4="http://schemas.microsoft.com/office/drawing/2016/5/10/chartex" xmlns:cx5="http://schemas.microsoft.com/office/drawing/2016/5/11/chartex" xmlns:cx6="http://schemas.microsoft.com/office/drawing/2016/5/12/chartex" xmlns:cx7="http://schemas.microsoft.com/office/drawing/2016/5/13/chartex" xmlns:cx8="http://schemas.microsoft.com/office/drawing/2016/5/14/chartex" xmlns:mc="http://schemas.openxmlformats.org/markup-compatibility/2006" xmlns:aink="http://schemas.microsoft.com/office/drawing/2016/ink" xmlns:am3d="http://schemas.microsoft.com/office/drawing/2017/model3d" xmlns:o="urn:schemas-microsoft-com:office:office" xmlns:oel="http://schemas.microsoft.com/office/2019/extlst" xmlns:r="http://schemas.openxmlformats.org/officeDocument/2006/relationships" xmlns:m="http://schemas.openxmlformats.org/officeDocument/2006/math" xmlns:v="urn:schemas-microsoft-com:vml" xmlns:wp14="http://schemas.microsoft.com/office/word/2010/wordprocessingDrawing" xmlns:wp="http://schemas.openxmlformats.org/drawingml/2006/wordprocessingDrawing" xmlns:w10="urn:schemas-microsoft-com:office:word" xmlns:w="http://schemas.openxmlformats.org/wordprocessingml/2006/main" xmlns:w14="http://schemas.microsoft.com/office/word/2010/wordml" xmlns:w15="http://schemas.microsoft.com/office/word/2012/wordml" xmlns:w16cei="http://schemas.microsoft.com/office/word/2026/wordml/cei" xmlns:w16cex="http://schemas.microsoft.com/office/word/2018/wordml/cex" xmlns:w16cid="http://schemas.microsoft.com/office/word/2016/wordml/cid" xmlns:w16="http://schemas.microsoft.com/office/word/2018/wordml" xmlns:w16du="http://schemas.microsoft.com/office/word/2023/wordml/word16du" xmlns:w16sdtdh="http://schemas.microsoft.com/office/word/2020/wordml/sdtdatahash" xmlns:w16sdtfl="http://schemas.microsoft.com/office/word/2024/wordml/sdtformatlock" xmlns:w16se="http://schemas.microsoft.com/office/word/2015/wordml/symex" xmlns:wpg="http://schemas.microsoft.com/office/word/2010/wordprocessingGroup" xmlns:wpi="http://schemas.microsoft.com/office/word/2010/wordprocessingInk" xmlns:wne="http://schemas.microsoft.com/office/word/2006/wordml" xmlns:wps="http://schemas.microsoft.com/office/word/2010/wordprocessingShape" mc:Ignorable="w14 w15 w16se w16cid w16 w16cex w16sdtdh w16sdtfl w16du wp14">
+<w:document xmlns:wpc="http://schemas.microsoft.com/office/word/2010/wordprocessingCanvas" xmlns:cx="http://schemas.microsoft.com/office/drawing/2014/chartex" xmlns:cx1="http://schemas.microsoft.com/office/drawing/2015/9/8/chartex" xmlns:cx2="http://schemas.microsoft.com/office/drawing/2015/10/21/chartex" xmlns:cx3="http://schemas.microsoft.com/office/drawing/2016/5/9/chartex" xmlns:cx4="http://schemas.microsoft.com/office/drawing/2016/5/10/chartex" xmlns:cx5="http://schemas.microsoft.com/office/drawing/2016/5/11/chartex" xmlns:cx6="http://schemas.microsoft.com/office/drawing/2016/5/12/chartex" xmlns:cx7="http://schemas.microsoft.com/office/drawing/2016/5/13/chartex" xmlns:cx8="http://schemas.microsoft.com/office/drawing/2016/5/14/chartex" xmlns:mc="http://schemas.openxmlformats.org/markup-compatibility/2006" xmlns:aink="http://schemas.microsoft.com/office/drawing/2016/ink" xmlns:am3d="http://schemas.microsoft.com/office/drawing/2017/model3d" xmlns:o="urn:schemas-microsoft-com:office:office" xmlns:oel="http://schemas.microsoft.com/office/2019/extlst" xmlns:r="http://schemas.openxmlformats.org/officeDocument/2006/relationships" xmlns:m="http://schemas.openxmlformats.org/officeDocument/2006/math" xmlns:v="urn:schemas-microsoft-com:vml" xmlns:wp14="http://schemas.microsoft.com/office/word/2010/wordprocessingDrawing" xmlns:wp="http://schemas.openxmlformats.org/drawingml/2006/wordprocessingDrawing" xmlns:w10="urn:schemas-microsoft-com:office:word" xmlns:w="http://schemas.openxmlformats.org/wordprocessingml/2006/main" xmlns:w14="http://schemas.microsoft.com/office/word/2010/wordml" xmlns:w15="http://schemas.microsoft.com/office/word/2012/wordml" xmlns:w16cex="http://schemas.microsoft.com/office/word/2018/wordml/cex" xmlns:w16cid="http://schemas.microsoft.com/office/word/2016/wordml/cid" xmlns:w16="http://schemas.microsoft.com/office/word/2018/wordml" xmlns:w16du="http://schemas.microsoft.com/office/word/2023/wordml/word16du" xmlns:w16sdtdh="http://schemas.microsoft.com/office/word/2020/wordml/sdtdatahash" xmlns:w16sdtfl="http://schemas.microsoft.com/office/word/2024/wordml/sdtformatlock" xmlns:w16se="http://schemas.microsoft.com/office/word/2015/wordml/symex" xmlns:wpg="http://schemas.microsoft.com/office/word/2010/wordprocessingGroup" xmlns:wpi="http://schemas.microsoft.com/office/word/2010/wordprocessingInk" xmlns:wne="http://schemas.microsoft.com/office/word/2006/wordml" xmlns:wps="http://schemas.microsoft.com/office/word/2010/wordprocessingShape" mc:Ignorable="w14 w15 w16se w16cid w16 w16cex w16sdtdh w16sdtfl w16du wp14">
   <w:body>
     <w:p>
       <w:pPr>
@@ -9606,7 +9606,71 @@
           <w:sz w:val="20"/>
           <w:szCs w:val="20"/>
         </w:rPr>
-        <w:t xml:space="preserve">Across every measurement tab in Tempico Software, a status bar keeps the user informed about the state of the acquisition without requiring the user to interrupt or inspect the ongoing measurement in detail. Internally, the Start-stop histogram, Lifetime histograms, Time stamping, </w:t>
+        <w:t>Across every measurement tab in Tempico Software, a status bar keeps theuser informed about the state of the acquisition without requiring the</w:t>
+      </w:r>
+      <w:r>
+        <w:rPr>
+          <w:rFonts w:ascii="Arial" w:hAnsi="Arial" w:cs="Arial"/>
+          <w:sz w:val="20"/>
+          <w:szCs w:val="20"/>
+        </w:rPr>
+        <w:t xml:space="preserve"> </w:t>
+      </w:r>
+      <w:r>
+        <w:rPr>
+          <w:rFonts w:ascii="Arial" w:hAnsi="Arial" w:cs="Arial"/>
+          <w:sz w:val="20"/>
+          <w:szCs w:val="20"/>
+        </w:rPr>
+        <w:t>user to interrupt or inspect the ongoing measurement in</w:t>
+      </w:r>
+      <w:r>
+        <w:rPr>
+          <w:rFonts w:ascii="Arial" w:hAnsi="Arial" w:cs="Arial"/>
+          <w:sz w:val="20"/>
+          <w:szCs w:val="20"/>
+        </w:rPr>
+        <w:t xml:space="preserve"> </w:t>
+      </w:r>
+      <w:r>
+        <w:rPr>
+          <w:rFonts w:ascii="Arial" w:hAnsi="Arial" w:cs="Arial"/>
+          <w:sz w:val="20"/>
+          <w:szCs w:val="20"/>
+        </w:rPr>
+        <w:t>detail. In practice,</w:t>
+      </w:r>
+      <w:r>
+        <w:rPr>
+          <w:rFonts w:ascii="Arial" w:hAnsi="Arial" w:cs="Arial"/>
+          <w:sz w:val="20"/>
+          <w:szCs w:val="20"/>
+        </w:rPr>
+        <w:t xml:space="preserve"> </w:t>
+      </w:r>
+      <w:r>
+        <w:rPr>
+          <w:rFonts w:ascii="Arial" w:hAnsi="Arial" w:cs="Arial"/>
+          <w:sz w:val="20"/>
+          <w:szCs w:val="20"/>
+        </w:rPr>
+        <w:t>the Start-stop histogram, Lifetime histograms, Time stamping, Counts</w:t>
+      </w:r>
+      <w:r>
+        <w:rPr>
+          <w:rFonts w:ascii="Arial" w:hAnsi="Arial" w:cs="Arial"/>
+          <w:sz w:val="20"/>
+          <w:szCs w:val="20"/>
+        </w:rPr>
+        <w:t xml:space="preserve"> </w:t>
+      </w:r>
+      <w:r>
+        <w:rPr>
+          <w:rFonts w:ascii="Arial" w:hAnsi="Arial" w:cs="Arial"/>
+          <w:sz w:val="20"/>
+          <w:szCs w:val="20"/>
+        </w:rPr>
+        <w:t xml:space="preserve">estimation, </w:t>
       </w:r>
       <w:r>
         <w:rPr>
@@ -9615,7 +9679,70 @@
           <w:szCs w:val="20"/>
         </w:rPr>
         <w:lastRenderedPageBreak/>
-        <w:t xml:space="preserve">Counts estimation, Autocorrelation (FCS), and g(2) (HBT) tabs all drive this bar from a pair of signals emitted by their respective acquisition threads, one carrying the status text and the other carrying an integer code that selects the color of the small dot shown next to that text; the dot itself is drawn directly by each tab's interface and starts out grey </w:t>
+        <w:t xml:space="preserve">Autocorrelation (FCS), and </w:t>
+      </w:r>
+      <w:r>
+        <w:t>g</w:t>
+      </w:r>
+      <w:r>
+        <w:rPr>
+          <w:vertAlign w:val="superscript"/>
+        </w:rPr>
+        <w:t>(2</w:t>
+      </w:r>
+      <w:r>
+        <w:rPr>
+          <w:vertAlign w:val="superscript"/>
+        </w:rPr>
+        <w:t>)</w:t>
+      </w:r>
+      <w:r>
+        <w:rPr>
+          <w:rFonts w:ascii="Arial" w:hAnsi="Arial" w:cs="Arial"/>
+          <w:sz w:val="20"/>
+          <w:szCs w:val="20"/>
+        </w:rPr>
+        <w:t xml:space="preserve"> (HBT) tabs all drive</w:t>
+      </w:r>
+      <w:r>
+        <w:rPr>
+          <w:rFonts w:ascii="Arial" w:hAnsi="Arial" w:cs="Arial"/>
+          <w:sz w:val="20"/>
+          <w:szCs w:val="20"/>
+        </w:rPr>
+        <w:t xml:space="preserve"> </w:t>
+      </w:r>
+      <w:r>
+        <w:rPr>
+          <w:rFonts w:ascii="Arial" w:hAnsi="Arial" w:cs="Arial"/>
+          <w:sz w:val="20"/>
+          <w:szCs w:val="20"/>
+        </w:rPr>
+        <w:t>this bar with a short status text accompanied by a small colored dot,</w:t>
+      </w:r>
+      <w:r>
+        <w:rPr>
+          <w:rFonts w:ascii="Arial" w:hAnsi="Arial" w:cs="Arial"/>
+          <w:sz w:val="20"/>
+          <w:szCs w:val="20"/>
+        </w:rPr>
+        <w:t xml:space="preserve"> </w:t>
+      </w:r>
+      <w:r>
+        <w:rPr>
+          <w:rFonts w:ascii="Arial" w:hAnsi="Arial" w:cs="Arial"/>
+          <w:sz w:val="20"/>
+          <w:szCs w:val="20"/>
+        </w:rPr>
+        <w:t>whose color summarizes the current state: grey</w:t>
+      </w:r>
+      <w:r>
+        <w:rPr>
+          <w:rFonts w:ascii="Arial" w:hAnsi="Arial" w:cs="Arial"/>
+          <w:sz w:val="20"/>
+          <w:szCs w:val="20"/>
+        </w:rPr>
+        <w:t xml:space="preserve"> </w:t>
       </w:r>
       <w:r>
         <w:rPr>
@@ -9682,7 +9809,246 @@
           <w:sz w:val="20"/>
           <w:szCs w:val="20"/>
         </w:rPr>
-        <w:t>before any code-driven update arrives.</w:t>
+        <w:t>before the</w:t>
+      </w:r>
+      <w:r>
+        <w:rPr>
+          <w:rFonts w:ascii="Arial" w:hAnsi="Arial" w:cs="Arial"/>
+          <w:sz w:val="20"/>
+          <w:szCs w:val="20"/>
+        </w:rPr>
+        <w:t xml:space="preserve"> </w:t>
+      </w:r>
+      <w:r>
+        <w:rPr>
+          <w:rFonts w:ascii="Arial" w:hAnsi="Arial" w:cs="Arial"/>
+          <w:sz w:val="20"/>
+          <w:szCs w:val="20"/>
+        </w:rPr>
+        <w:t>measurement starts, green</w:t>
+      </w:r>
+      <w:r>
+        <w:rPr>
+          <w:rFonts w:ascii="Arial" w:hAnsi="Arial" w:cs="Arial"/>
+          <w:sz w:val="20"/>
+          <w:szCs w:val="20"/>
+        </w:rPr>
+        <w:t xml:space="preserve"> (</w:t>
+      </w:r>
+      <w:r>
+        <w:rPr>
+          <w:rFonts w:ascii="Arial" w:hAnsi="Arial" w:cs="Arial"/>
+          <w:noProof/>
+          <w:sz w:val="20"/>
+          <w:szCs w:val="20"/>
+        </w:rPr>
+        <w:drawing>
+          <wp:inline distT="0" distB="0" distL="0" distR="0" wp14:anchorId="3A0C58D4" wp14:editId="06B87ECE">
+            <wp:extent cx="104775" cy="98227"/>
+            <wp:effectExtent l="0" t="0" r="0" b="0"/>
+            <wp:docPr id="1322293350" name="Imagen 1"/>
+            <wp:cNvGraphicFramePr>
+              <a:graphicFrameLocks xmlns:a="http://schemas.openxmlformats.org/drawingml/2006/main" noChangeAspect="1"/>
+            </wp:cNvGraphicFramePr>
+            <a:graphic xmlns:a="http://schemas.openxmlformats.org/drawingml/2006/main">
+              <a:graphicData uri="http://schemas.openxmlformats.org/drawingml/2006/picture">
+                <pic:pic xmlns:pic="http://schemas.openxmlformats.org/drawingml/2006/picture">
+                  <pic:nvPicPr>
+                    <pic:cNvPr id="166172236" name=""/>
+                    <pic:cNvPicPr/>
+                  </pic:nvPicPr>
+                  <pic:blipFill>
+                    <a:blip r:embed="rId38"/>
+                    <a:stretch>
+                      <a:fillRect/>
+                    </a:stretch>
+                  </pic:blipFill>
+                  <pic:spPr>
+                    <a:xfrm>
+                      <a:off x="0" y="0"/>
+                      <a:ext cx="106673" cy="100006"/>
+                    </a:xfrm>
+                    <a:prstGeom prst="rect">
+                      <a:avLst/>
+                    </a:prstGeom>
+                  </pic:spPr>
+                </pic:pic>
+              </a:graphicData>
+            </a:graphic>
+          </wp:inline>
+        </w:drawing>
+      </w:r>
+      <w:r>
+        <w:rPr>
+          <w:rFonts w:ascii="Arial" w:hAnsi="Arial" w:cs="Arial"/>
+          <w:sz w:val="20"/>
+          <w:szCs w:val="20"/>
+        </w:rPr>
+        <w:t xml:space="preserve">) </w:t>
+      </w:r>
+      <w:r>
+        <w:rPr>
+          <w:rFonts w:ascii="Arial" w:hAnsi="Arial" w:cs="Arial"/>
+          <w:sz w:val="20"/>
+          <w:szCs w:val="20"/>
+        </w:rPr>
+        <w:t>while it is running normally, orange</w:t>
+      </w:r>
+      <w:r>
+        <w:rPr>
+          <w:rFonts w:ascii="Arial" w:hAnsi="Arial" w:cs="Arial"/>
+          <w:sz w:val="20"/>
+          <w:szCs w:val="20"/>
+        </w:rPr>
+        <w:t xml:space="preserve"> (</w:t>
+      </w:r>
+      <w:r>
+        <w:rPr>
+          <w:rFonts w:ascii="Arial" w:hAnsi="Arial" w:cs="Arial"/>
+          <w:noProof/>
+          <w:sz w:val="20"/>
+          <w:szCs w:val="20"/>
+        </w:rPr>
+        <w:drawing>
+          <wp:inline distT="0" distB="0" distL="0" distR="0" wp14:anchorId="65EC8EEB" wp14:editId="3F33AEC7">
+            <wp:extent cx="85725" cy="91848"/>
+            <wp:effectExtent l="0" t="0" r="0" b="3810"/>
+            <wp:docPr id="2146172608" name="Imagen 1"/>
+            <wp:cNvGraphicFramePr>
+              <a:graphicFrameLocks xmlns:a="http://schemas.openxmlformats.org/drawingml/2006/main" noChangeAspect="1"/>
+            </wp:cNvGraphicFramePr>
+            <a:graphic xmlns:a="http://schemas.openxmlformats.org/drawingml/2006/main">
+              <a:graphicData uri="http://schemas.openxmlformats.org/drawingml/2006/picture">
+                <pic:pic xmlns:pic="http://schemas.openxmlformats.org/drawingml/2006/picture">
+                  <pic:nvPicPr>
+                    <pic:cNvPr id="2061148232" name=""/>
+                    <pic:cNvPicPr/>
+                  </pic:nvPicPr>
+                  <pic:blipFill>
+                    <a:blip r:embed="rId39"/>
+                    <a:stretch>
+                      <a:fillRect/>
+                    </a:stretch>
+                  </pic:blipFill>
+                  <pic:spPr>
+                    <a:xfrm>
+                      <a:off x="0" y="0"/>
+                      <a:ext cx="88180" cy="94479"/>
+                    </a:xfrm>
+                    <a:prstGeom prst="rect">
+                      <a:avLst/>
+                    </a:prstGeom>
+                  </pic:spPr>
+                </pic:pic>
+              </a:graphicData>
+            </a:graphic>
+          </wp:inline>
+        </w:drawing>
+      </w:r>
+      <w:r>
+        <w:rPr>
+          <w:rFonts w:ascii="Arial" w:hAnsi="Arial" w:cs="Arial"/>
+          <w:sz w:val="20"/>
+          <w:szCs w:val="20"/>
+        </w:rPr>
+        <w:t xml:space="preserve">) </w:t>
+      </w:r>
+      <w:r>
+        <w:rPr>
+          <w:rFonts w:ascii="Arial" w:hAnsi="Arial" w:cs="Arial"/>
+          <w:sz w:val="20"/>
+          <w:szCs w:val="20"/>
+        </w:rPr>
+        <w:t>when a warning condition is detected, and yellow</w:t>
+      </w:r>
+      <w:r>
+        <w:rPr>
+          <w:rFonts w:ascii="Arial" w:hAnsi="Arial" w:cs="Arial"/>
+          <w:sz w:val="20"/>
+          <w:szCs w:val="20"/>
+        </w:rPr>
+        <w:t xml:space="preserve"> (</w:t>
+      </w:r>
+      <w:r>
+        <w:rPr>
+          <w:rFonts w:ascii="Arial" w:hAnsi="Arial" w:cs="Arial"/>
+          <w:noProof/>
+          <w:sz w:val="20"/>
+          <w:szCs w:val="20"/>
+        </w:rPr>
+        <w:drawing>
+          <wp:inline distT="0" distB="0" distL="0" distR="0" wp14:anchorId="27AF061A" wp14:editId="0089E63F">
+            <wp:extent cx="142875" cy="136072"/>
+            <wp:effectExtent l="0" t="0" r="0" b="0"/>
+            <wp:docPr id="1666702536" name="Imagen 2"/>
+            <wp:cNvGraphicFramePr>
+              <a:graphicFrameLocks xmlns:a="http://schemas.openxmlformats.org/drawingml/2006/main" noChangeAspect="1"/>
+            </wp:cNvGraphicFramePr>
+            <a:graphic xmlns:a="http://schemas.openxmlformats.org/drawingml/2006/main">
+              <a:graphicData uri="http://schemas.openxmlformats.org/drawingml/2006/picture">
+                <pic:pic xmlns:pic="http://schemas.openxmlformats.org/drawingml/2006/picture">
+                  <pic:nvPicPr>
+                    <pic:cNvPr id="838511328" name="Imagen 838511328"/>
+                    <pic:cNvPicPr/>
+                  </pic:nvPicPr>
+                  <pic:blipFill>
+                    <a:blip r:embed="rId40">
+                      <a:extLst>
+                        <a:ext uri="{28A0092B-C50C-407E-A947-70E740481C1C}">
+                          <a14:useLocalDpi xmlns:a14="http://schemas.microsoft.com/office/drawing/2010/main" val="0"/>
+                        </a:ext>
+                      </a:extLst>
+                    </a:blip>
+                    <a:stretch>
+                      <a:fillRect/>
+                    </a:stretch>
+                  </pic:blipFill>
+                  <pic:spPr>
+                    <a:xfrm>
+                      <a:off x="0" y="0"/>
+                      <a:ext cx="145314" cy="138395"/>
+                    </a:xfrm>
+                    <a:prstGeom prst="rect">
+                      <a:avLst/>
+                    </a:prstGeom>
+                  </pic:spPr>
+                </pic:pic>
+              </a:graphicData>
+            </a:graphic>
+          </wp:inline>
+        </w:drawing>
+      </w:r>
+      <w:r>
+        <w:rPr>
+          <w:rFonts w:ascii="Arial" w:hAnsi="Arial" w:cs="Arial"/>
+          <w:sz w:val="20"/>
+          <w:szCs w:val="20"/>
+        </w:rPr>
+        <w:t xml:space="preserve">) </w:t>
+      </w:r>
+      <w:r>
+        <w:rPr>
+          <w:rFonts w:ascii="Arial" w:hAnsi="Arial" w:cs="Arial"/>
+          <w:sz w:val="20"/>
+          <w:szCs w:val="20"/>
+        </w:rPr>
+        <w:t>during certain transitional, non-acquiring states. Each of these</w:t>
+      </w:r>
+      <w:r>
+        <w:rPr>
+          <w:rFonts w:ascii="Arial" w:hAnsi="Arial" w:cs="Arial"/>
+          <w:sz w:val="20"/>
+          <w:szCs w:val="20"/>
+        </w:rPr>
+        <w:t xml:space="preserve"> </w:t>
+      </w:r>
+      <w:r>
+        <w:rPr>
+          <w:rFonts w:ascii="Arial" w:hAnsi="Arial" w:cs="Arial"/>
+          <w:sz w:val="20"/>
+          <w:szCs w:val="20"/>
+        </w:rPr>
+        <w:t>is described in more detail below.</w:t>
       </w:r>
     </w:p>
     <w:p>
@@ -9715,7 +10081,23 @@
           <w:sz w:val="20"/>
           <w:szCs w:val="20"/>
         </w:rPr>
-        <w:t>In all six measurement tabs, the status dot is initialized as a grey circle</w:t>
+        <w:t>In all six measurement tabs, the status dot is initialized as a grey</w:t>
+      </w:r>
+      <w:r>
+        <w:rPr>
+          <w:rFonts w:ascii="Arial" w:hAnsi="Arial" w:cs="Arial"/>
+          <w:sz w:val="20"/>
+          <w:szCs w:val="20"/>
+        </w:rPr>
+        <w:t xml:space="preserve"> </w:t>
+      </w:r>
+      <w:r>
+        <w:rPr>
+          <w:rFonts w:ascii="Arial" w:hAnsi="Arial" w:cs="Arial"/>
+          <w:sz w:val="20"/>
+          <w:szCs w:val="20"/>
+        </w:rPr>
+        <w:t>circle</w:t>
       </w:r>
       <w:r>
         <w:rPr>
@@ -9782,16 +10164,58 @@
           <w:sz w:val="20"/>
           <w:szCs w:val="20"/>
         </w:rPr>
-        <w:t xml:space="preserve"> as soon as the tab is built, before any measurement has been started and before the acquisition thread has emitted its first status update; this grey dot</w:t>
-      </w:r>
-      <w:r>
-        <w:rPr>
-          <w:rFonts w:ascii="Arial" w:hAnsi="Arial" w:cs="Arial"/>
-          <w:sz w:val="20"/>
-          <w:szCs w:val="20"/>
-        </w:rPr>
-        <w:t xml:space="preserve"> (</w:t>
-      </w:r>
+        <w:t xml:space="preserve"> </w:t>
+      </w:r>
+      <w:r>
+        <w:rPr>
+          <w:rFonts w:ascii="Arial" w:hAnsi="Arial" w:cs="Arial"/>
+          <w:sz w:val="20"/>
+          <w:szCs w:val="20"/>
+        </w:rPr>
+        <w:t>as soon as the tab is built, before any measurement has been</w:t>
+      </w:r>
+      <w:r>
+        <w:rPr>
+          <w:rFonts w:ascii="Arial" w:hAnsi="Arial" w:cs="Arial"/>
+          <w:sz w:val="20"/>
+          <w:szCs w:val="20"/>
+        </w:rPr>
+        <w:t xml:space="preserve"> </w:t>
+      </w:r>
+      <w:r>
+        <w:rPr>
+          <w:rFonts w:ascii="Arial" w:hAnsi="Arial" w:cs="Arial"/>
+          <w:sz w:val="20"/>
+          <w:szCs w:val="20"/>
+        </w:rPr>
+        <w:t>started; this grey dot therefore represents the absence of a running</w:t>
+      </w:r>
+      <w:r>
+        <w:rPr>
+          <w:rFonts w:ascii="Arial" w:hAnsi="Arial" w:cs="Arial"/>
+          <w:sz w:val="20"/>
+          <w:szCs w:val="20"/>
+        </w:rPr>
+        <w:t xml:space="preserve"> </w:t>
+      </w:r>
+      <w:r>
+        <w:rPr>
+          <w:rFonts w:ascii="Arial" w:hAnsi="Arial" w:cs="Arial"/>
+          <w:sz w:val="20"/>
+          <w:szCs w:val="20"/>
+        </w:rPr>
+        <w:t>measurement rather than a state actively reported during acquisition.</w:t>
+      </w:r>
+    </w:p>
+    <w:p>
+      <w:pPr>
+        <w:jc w:val="center"/>
+        <w:rPr>
+          <w:rFonts w:ascii="Arial" w:hAnsi="Arial" w:cs="Arial"/>
+          <w:sz w:val="20"/>
+          <w:szCs w:val="20"/>
+        </w:rPr>
+      </w:pPr>
       <w:r>
         <w:rPr>
           <w:rFonts w:ascii="Arial" w:hAnsi="Arial" w:cs="Arial"/>
@@ -9800,10 +10224,10 @@
           <w:szCs w:val="20"/>
         </w:rPr>
         <w:drawing>
-          <wp:inline distT="0" distB="0" distL="0" distR="0" wp14:anchorId="2BF3831F" wp14:editId="37FA1787">
-            <wp:extent cx="131565" cy="123825"/>
-            <wp:effectExtent l="0" t="0" r="1905" b="0"/>
-            <wp:docPr id="1009509784" name="Imagen 1"/>
+          <wp:inline distT="0" distB="0" distL="0" distR="0" wp14:anchorId="3D8A5893" wp14:editId="41052134">
+            <wp:extent cx="5239481" cy="590632"/>
+            <wp:effectExtent l="0" t="0" r="0" b="0"/>
+            <wp:docPr id="1301153797" name="Imagen 1"/>
             <wp:cNvGraphicFramePr>
               <a:graphicFrameLocks xmlns:a="http://schemas.openxmlformats.org/drawingml/2006/main" noChangeAspect="1"/>
             </wp:cNvGraphicFramePr>
@@ -9811,11 +10235,17 @@
               <a:graphicData uri="http://schemas.openxmlformats.org/drawingml/2006/picture">
                 <pic:pic xmlns:pic="http://schemas.openxmlformats.org/drawingml/2006/picture">
                   <pic:nvPicPr>
-                    <pic:cNvPr id="805414726" name=""/>
+                    <pic:cNvPr id="1301153797" name="Imagen 1301153797"/>
                     <pic:cNvPicPr/>
                   </pic:nvPicPr>
                   <pic:blipFill>
-                    <a:blip r:embed="rId37"/>
+                    <a:blip r:embed="rId41">
+                      <a:extLst>
+                        <a:ext uri="{28A0092B-C50C-407E-A947-70E740481C1C}">
+                          <a14:useLocalDpi xmlns:a14="http://schemas.microsoft.com/office/drawing/2010/main" val="0"/>
+                        </a:ext>
+                      </a:extLst>
+                    </a:blip>
                     <a:stretch>
                       <a:fillRect/>
                     </a:stretch>
@@ -9823,72 +10253,7 @@
                   <pic:spPr>
                     <a:xfrm>
                       <a:off x="0" y="0"/>
-                      <a:ext cx="131814" cy="124060"/>
-                    </a:xfrm>
-                    <a:prstGeom prst="rect">
-                      <a:avLst/>
-                    </a:prstGeom>
-                  </pic:spPr>
-                </pic:pic>
-              </a:graphicData>
-            </a:graphic>
-          </wp:inline>
-        </w:drawing>
-      </w:r>
-      <w:r>
-        <w:rPr>
-          <w:rFonts w:ascii="Arial" w:hAnsi="Arial" w:cs="Arial"/>
-          <w:sz w:val="20"/>
-          <w:szCs w:val="20"/>
-        </w:rPr>
-        <w:t>)</w:t>
-      </w:r>
-      <w:r>
-        <w:rPr>
-          <w:rFonts w:ascii="Arial" w:hAnsi="Arial" w:cs="Arial"/>
-          <w:sz w:val="20"/>
-          <w:szCs w:val="20"/>
-        </w:rPr>
-        <w:t xml:space="preserve"> therefore represents the absence of a running measurement rather than a state actively reported during acquisition.</w:t>
-      </w:r>
-    </w:p>
-    <w:p>
-      <w:pPr>
-        <w:rPr>
-          <w:rFonts w:ascii="Arial" w:hAnsi="Arial" w:cs="Arial"/>
-          <w:sz w:val="20"/>
-          <w:szCs w:val="20"/>
-        </w:rPr>
-      </w:pPr>
-      <w:r>
-        <w:rPr>
-          <w:noProof/>
-        </w:rPr>
-        <w:drawing>
-          <wp:inline distT="0" distB="0" distL="0" distR="0" wp14:anchorId="7FED4DEC" wp14:editId="4DD350CB">
-            <wp:extent cx="5276190" cy="704762"/>
-            <wp:effectExtent l="0" t="0" r="1270" b="635"/>
-            <wp:docPr id="553257638" name="Imagen 1"/>
-            <wp:cNvGraphicFramePr>
-              <a:graphicFrameLocks xmlns:a="http://schemas.openxmlformats.org/drawingml/2006/main" noChangeAspect="1"/>
-            </wp:cNvGraphicFramePr>
-            <a:graphic xmlns:a="http://schemas.openxmlformats.org/drawingml/2006/main">
-              <a:graphicData uri="http://schemas.openxmlformats.org/drawingml/2006/picture">
-                <pic:pic xmlns:pic="http://schemas.openxmlformats.org/drawingml/2006/picture">
-                  <pic:nvPicPr>
-                    <pic:cNvPr id="553257638" name=""/>
-                    <pic:cNvPicPr/>
-                  </pic:nvPicPr>
-                  <pic:blipFill>
-                    <a:blip r:embed="rId38"/>
-                    <a:stretch>
-                      <a:fillRect/>
-                    </a:stretch>
-                  </pic:blipFill>
-                  <pic:spPr>
-                    <a:xfrm>
-                      <a:off x="0" y="0"/>
-                      <a:ext cx="5276190" cy="704762"/>
+                      <a:ext cx="5239481" cy="590632"/>
                     </a:xfrm>
                     <a:prstGeom prst="rect">
                       <a:avLst/>
@@ -9964,7 +10329,7 @@
                     <pic:cNvPicPr/>
                   </pic:nvPicPr>
                   <pic:blipFill>
-                    <a:blip r:embed="rId39"/>
+                    <a:blip r:embed="rId38"/>
                     <a:stretch>
                       <a:fillRect/>
                     </a:stretch>
@@ -9998,7 +10363,79 @@
           <w:sz w:val="20"/>
           <w:szCs w:val="20"/>
         </w:rPr>
-        <w:t>, and the accompanying text differs from tab to tab according to what each technique tracks. The Start-stop histogram tab reports simply that the measurement is running, without a numeric indicator of progress.</w:t>
+        <w:t xml:space="preserve">, </w:t>
+      </w:r>
+      <w:r>
+        <w:rPr>
+          <w:rFonts w:ascii="Arial" w:hAnsi="Arial" w:cs="Arial"/>
+          <w:sz w:val="20"/>
+          <w:szCs w:val="20"/>
+        </w:rPr>
+        <w:t>and the accompanying text reports the acquisition</w:t>
+      </w:r>
+      <w:r>
+        <w:rPr>
+          <w:rFonts w:ascii="Arial" w:hAnsi="Arial" w:cs="Arial"/>
+          <w:sz w:val="20"/>
+          <w:szCs w:val="20"/>
+        </w:rPr>
+        <w:t xml:space="preserve"> </w:t>
+      </w:r>
+      <w:r>
+        <w:rPr>
+          <w:rFonts w:ascii="Arial" w:hAnsi="Arial" w:cs="Arial"/>
+          <w:sz w:val="20"/>
+          <w:szCs w:val="20"/>
+        </w:rPr>
+        <w:t>progress in a way that matches what each technique measures. For tabs</w:t>
+      </w:r>
+      <w:r>
+        <w:rPr>
+          <w:rFonts w:ascii="Arial" w:hAnsi="Arial" w:cs="Arial"/>
+          <w:sz w:val="20"/>
+          <w:szCs w:val="20"/>
+        </w:rPr>
+        <w:t xml:space="preserve"> </w:t>
+      </w:r>
+      <w:r>
+        <w:rPr>
+          <w:rFonts w:ascii="Arial" w:hAnsi="Arial" w:cs="Arial"/>
+          <w:sz w:val="20"/>
+          <w:szCs w:val="20"/>
+        </w:rPr>
+        <w:t>with continuous measurements, like the start-stop histogram feature,</w:t>
+      </w:r>
+      <w:r>
+        <w:rPr>
+          <w:rFonts w:ascii="Arial" w:hAnsi="Arial" w:cs="Arial"/>
+          <w:sz w:val="20"/>
+          <w:szCs w:val="20"/>
+        </w:rPr>
+        <w:t xml:space="preserve"> </w:t>
+      </w:r>
+      <w:r>
+        <w:rPr>
+          <w:rFonts w:ascii="Arial" w:hAnsi="Arial" w:cs="Arial"/>
+          <w:sz w:val="20"/>
+          <w:szCs w:val="20"/>
+        </w:rPr>
+        <w:t>the status bar simply indicates that the measurement is running,</w:t>
+      </w:r>
+      <w:r>
+        <w:rPr>
+          <w:rFonts w:ascii="Arial" w:hAnsi="Arial" w:cs="Arial"/>
+          <w:sz w:val="20"/>
+          <w:szCs w:val="20"/>
+        </w:rPr>
+        <w:t xml:space="preserve"> </w:t>
+      </w:r>
+      <w:r>
+        <w:rPr>
+          <w:rFonts w:ascii="Arial" w:hAnsi="Arial" w:cs="Arial"/>
+          <w:sz w:val="20"/>
+          <w:szCs w:val="20"/>
+        </w:rPr>
+        <w:t>without a numeric indicator of progress.</w:t>
       </w:r>
     </w:p>
     <w:p>
@@ -10029,7 +10466,7 @@
                     <pic:cNvPicPr/>
                   </pic:nvPicPr>
                   <pic:blipFill>
-                    <a:blip r:embed="rId40"/>
+                    <a:blip r:embed="rId42"/>
                     <a:stretch>
                       <a:fillRect/>
                     </a:stretch>
@@ -10064,7 +10501,460 @@
           <w:sz w:val="20"/>
           <w:szCs w:val="20"/>
         </w:rPr>
-        <w:t>The Lifetime histograms tab reports the same green state</w:t>
+        <w:t>For tabs that acquire toward a defined target, such as a configured</w:t>
+      </w:r>
+      <w:r>
+        <w:rPr>
+          <w:rFonts w:ascii="Arial" w:hAnsi="Arial" w:cs="Arial"/>
+          <w:sz w:val="20"/>
+          <w:szCs w:val="20"/>
+        </w:rPr>
+        <w:t xml:space="preserve"> </w:t>
+      </w:r>
+      <w:r>
+        <w:rPr>
+          <w:rFonts w:ascii="Arial" w:hAnsi="Arial" w:cs="Arial"/>
+          <w:sz w:val="20"/>
+          <w:szCs w:val="20"/>
+        </w:rPr>
+        <w:t>number of measurements or records, the status bar additionally reports</w:t>
+      </w:r>
+      <w:r>
+        <w:rPr>
+          <w:rFonts w:ascii="Arial" w:hAnsi="Arial" w:cs="Arial"/>
+          <w:sz w:val="20"/>
+          <w:szCs w:val="20"/>
+        </w:rPr>
+        <w:t xml:space="preserve"> </w:t>
+      </w:r>
+      <w:r>
+        <w:rPr>
+          <w:rFonts w:ascii="Arial" w:hAnsi="Arial" w:cs="Arial"/>
+          <w:sz w:val="20"/>
+          <w:szCs w:val="20"/>
+        </w:rPr>
+        <w:t>the completion percentage alongside the running message; any warning</w:t>
+      </w:r>
+      <w:r>
+        <w:rPr>
+          <w:rFonts w:ascii="Arial" w:hAnsi="Arial" w:cs="Arial"/>
+          <w:sz w:val="20"/>
+          <w:szCs w:val="20"/>
+        </w:rPr>
+        <w:t xml:space="preserve"> </w:t>
+      </w:r>
+      <w:r>
+        <w:rPr>
+          <w:rFonts w:ascii="Arial" w:hAnsi="Arial" w:cs="Arial"/>
+          <w:sz w:val="20"/>
+          <w:szCs w:val="20"/>
+        </w:rPr>
+        <w:t>issued while such a target is active is annotated with that same</w:t>
+      </w:r>
+      <w:r>
+        <w:rPr>
+          <w:rFonts w:ascii="Arial" w:hAnsi="Arial" w:cs="Arial"/>
+          <w:sz w:val="20"/>
+          <w:szCs w:val="20"/>
+        </w:rPr>
+        <w:t xml:space="preserve"> </w:t>
+      </w:r>
+      <w:r>
+        <w:rPr>
+          <w:rFonts w:ascii="Arial" w:hAnsi="Arial" w:cs="Arial"/>
+          <w:sz w:val="20"/>
+          <w:szCs w:val="20"/>
+        </w:rPr>
+        <w:t>percentage. Some tabs also support scheduling a start time, in which</w:t>
+      </w:r>
+      <w:r>
+        <w:rPr>
+          <w:rFonts w:ascii="Arial" w:hAnsi="Arial" w:cs="Arial"/>
+          <w:sz w:val="20"/>
+          <w:szCs w:val="20"/>
+        </w:rPr>
+        <w:t xml:space="preserve"> </w:t>
+      </w:r>
+      <w:r>
+        <w:rPr>
+          <w:rFonts w:ascii="Arial" w:hAnsi="Arial" w:cs="Arial"/>
+          <w:sz w:val="20"/>
+          <w:szCs w:val="20"/>
+        </w:rPr>
+        <w:t>case the status bar instead shows a countdown until the configured</w:t>
+      </w:r>
+      <w:r>
+        <w:rPr>
+          <w:rFonts w:ascii="Arial" w:hAnsi="Arial" w:cs="Arial"/>
+          <w:sz w:val="20"/>
+          <w:szCs w:val="20"/>
+        </w:rPr>
+        <w:t xml:space="preserve"> </w:t>
+      </w:r>
+      <w:r>
+        <w:rPr>
+          <w:rFonts w:ascii="Arial" w:hAnsi="Arial" w:cs="Arial"/>
+          <w:sz w:val="20"/>
+          <w:szCs w:val="20"/>
+        </w:rPr>
+        <w:t>start time is reached; while this countdown is running the software</w:t>
+      </w:r>
+      <w:r>
+        <w:rPr>
+          <w:rFonts w:ascii="Arial" w:hAnsi="Arial" w:cs="Arial"/>
+          <w:sz w:val="20"/>
+          <w:szCs w:val="20"/>
+        </w:rPr>
+        <w:t xml:space="preserve"> </w:t>
+      </w:r>
+      <w:r>
+        <w:rPr>
+          <w:rFonts w:ascii="Arial" w:hAnsi="Arial" w:cs="Arial"/>
+          <w:sz w:val="20"/>
+          <w:szCs w:val="20"/>
+        </w:rPr>
+        <w:t>behaves as though the measurement were already underway, and the tab</w:t>
+      </w:r>
+      <w:r>
+        <w:rPr>
+          <w:rFonts w:ascii="Arial" w:hAnsi="Arial" w:cs="Arial"/>
+          <w:sz w:val="20"/>
+          <w:szCs w:val="20"/>
+        </w:rPr>
+        <w:t xml:space="preserve"> </w:t>
+      </w:r>
+      <w:r>
+        <w:rPr>
+          <w:rFonts w:ascii="Arial" w:hAnsi="Arial" w:cs="Arial"/>
+          <w:sz w:val="20"/>
+          <w:szCs w:val="20"/>
+        </w:rPr>
+        <w:t>and device configuration cannot be changed until either the countdown</w:t>
+      </w:r>
+      <w:r>
+        <w:rPr>
+          <w:rFonts w:ascii="Arial" w:hAnsi="Arial" w:cs="Arial"/>
+          <w:sz w:val="20"/>
+          <w:szCs w:val="20"/>
+        </w:rPr>
+        <w:t xml:space="preserve"> </w:t>
+      </w:r>
+      <w:r>
+        <w:rPr>
+          <w:rFonts w:ascii="Arial" w:hAnsi="Arial" w:cs="Arial"/>
+          <w:sz w:val="20"/>
+          <w:szCs w:val="20"/>
+        </w:rPr>
+        <w:t>finishes or the user cancels it with the stop button.</w:t>
+      </w:r>
+    </w:p>
+    <w:p>
+      <w:pPr>
+        <w:rPr>
+          <w:rFonts w:ascii="Arial" w:hAnsi="Arial" w:cs="Arial"/>
+          <w:sz w:val="20"/>
+          <w:szCs w:val="20"/>
+        </w:rPr>
+      </w:pPr>
+      <w:r>
+        <w:rPr>
+          <w:noProof/>
+        </w:rPr>
+        <w:drawing>
+          <wp:inline distT="0" distB="0" distL="0" distR="0" wp14:anchorId="7230D940" wp14:editId="2953B40A">
+            <wp:extent cx="5534025" cy="2432016"/>
+            <wp:effectExtent l="0" t="0" r="0" b="6985"/>
+            <wp:docPr id="727166040" name="Imagen 1"/>
+            <wp:cNvGraphicFramePr>
+              <a:graphicFrameLocks xmlns:a="http://schemas.openxmlformats.org/drawingml/2006/main" noChangeAspect="1"/>
+            </wp:cNvGraphicFramePr>
+            <a:graphic xmlns:a="http://schemas.openxmlformats.org/drawingml/2006/main">
+              <a:graphicData uri="http://schemas.openxmlformats.org/drawingml/2006/picture">
+                <pic:pic xmlns:pic="http://schemas.openxmlformats.org/drawingml/2006/picture">
+                  <pic:nvPicPr>
+                    <pic:cNvPr id="727166040" name=""/>
+                    <pic:cNvPicPr/>
+                  </pic:nvPicPr>
+                  <pic:blipFill>
+                    <a:blip r:embed="rId43"/>
+                    <a:stretch>
+                      <a:fillRect/>
+                    </a:stretch>
+                  </pic:blipFill>
+                  <pic:spPr>
+                    <a:xfrm>
+                      <a:off x="0" y="0"/>
+                      <a:ext cx="5538682" cy="2434063"/>
+                    </a:xfrm>
+                    <a:prstGeom prst="rect">
+                      <a:avLst/>
+                    </a:prstGeom>
+                  </pic:spPr>
+                </pic:pic>
+              </a:graphicData>
+            </a:graphic>
+          </wp:inline>
+        </w:drawing>
+      </w:r>
+    </w:p>
+    <w:p>
+      <w:pPr>
+        <w:rPr>
+          <w:rFonts w:ascii="Arial" w:hAnsi="Arial" w:cs="Arial"/>
+          <w:sz w:val="20"/>
+          <w:szCs w:val="20"/>
+        </w:rPr>
+      </w:pPr>
+      <w:r>
+        <w:rPr>
+          <w:rFonts w:ascii="Arial" w:hAnsi="Arial" w:cs="Arial"/>
+          <w:sz w:val="20"/>
+          <w:szCs w:val="20"/>
+        </w:rPr>
+        <w:lastRenderedPageBreak/>
+        <w:t>When autosave is writing accumulated data to disk during a running</w:t>
+      </w:r>
+      <w:r>
+        <w:rPr>
+          <w:rFonts w:ascii="Arial" w:hAnsi="Arial" w:cs="Arial"/>
+          <w:sz w:val="20"/>
+          <w:szCs w:val="20"/>
+        </w:rPr>
+        <w:t xml:space="preserve"> </w:t>
+      </w:r>
+      <w:r>
+        <w:rPr>
+          <w:rFonts w:ascii="Arial" w:hAnsi="Arial" w:cs="Arial"/>
+          <w:sz w:val="20"/>
+          <w:szCs w:val="20"/>
+        </w:rPr>
+        <w:t>measurement, the status bar switches to the message ``Saving data'',</w:t>
+      </w:r>
+      <w:r>
+        <w:rPr>
+          <w:rFonts w:ascii="Arial" w:hAnsi="Arial" w:cs="Arial"/>
+          <w:sz w:val="20"/>
+          <w:szCs w:val="20"/>
+        </w:rPr>
+        <w:t xml:space="preserve"> </w:t>
+      </w:r>
+      <w:r>
+        <w:rPr>
+          <w:rFonts w:ascii="Arial" w:hAnsi="Arial" w:cs="Arial"/>
+          <w:sz w:val="20"/>
+          <w:szCs w:val="20"/>
+        </w:rPr>
+        <w:t>and once the user stops the measurement, the same processing state</w:t>
+      </w:r>
+      <w:r>
+        <w:rPr>
+          <w:rFonts w:ascii="Arial" w:hAnsi="Arial" w:cs="Arial"/>
+          <w:sz w:val="20"/>
+          <w:szCs w:val="20"/>
+        </w:rPr>
+        <w:t xml:space="preserve"> </w:t>
+      </w:r>
+      <w:r>
+        <w:rPr>
+          <w:rFonts w:ascii="Arial" w:hAnsi="Arial" w:cs="Arial"/>
+          <w:sz w:val="20"/>
+          <w:szCs w:val="20"/>
+        </w:rPr>
+        <w:t>(covered in the Paused and processing states subsection below) reports</w:t>
+      </w:r>
+      <w:r>
+        <w:rPr>
+          <w:rFonts w:ascii="Arial" w:hAnsi="Arial" w:cs="Arial"/>
+          <w:sz w:val="20"/>
+          <w:szCs w:val="20"/>
+        </w:rPr>
+        <w:t xml:space="preserve"> </w:t>
+      </w:r>
+      <w:r>
+        <w:rPr>
+          <w:rFonts w:ascii="Arial" w:hAnsi="Arial" w:cs="Arial"/>
+          <w:sz w:val="20"/>
+          <w:szCs w:val="20"/>
+        </w:rPr>
+        <w:t>the percentage of records already sorted and written to their final</w:t>
+      </w:r>
+      <w:r>
+        <w:rPr>
+          <w:rFonts w:ascii="Arial" w:hAnsi="Arial" w:cs="Arial"/>
+          <w:sz w:val="20"/>
+          <w:szCs w:val="20"/>
+        </w:rPr>
+        <w:t xml:space="preserve"> </w:t>
+      </w:r>
+      <w:r>
+        <w:rPr>
+          <w:rFonts w:ascii="Arial" w:hAnsi="Arial" w:cs="Arial"/>
+          <w:sz w:val="20"/>
+          <w:szCs w:val="20"/>
+        </w:rPr>
+        <w:t>path.</w:t>
+      </w:r>
+      <w:r>
+        <w:rPr>
+          <w:noProof/>
+        </w:rPr>
+        <w:drawing>
+          <wp:inline distT="0" distB="0" distL="0" distR="0" wp14:anchorId="18910B55" wp14:editId="1C7F6159">
+            <wp:extent cx="5612130" cy="584200"/>
+            <wp:effectExtent l="0" t="0" r="7620" b="6350"/>
+            <wp:docPr id="1747680978" name="Imagen 1"/>
+            <wp:cNvGraphicFramePr>
+              <a:graphicFrameLocks xmlns:a="http://schemas.openxmlformats.org/drawingml/2006/main" noChangeAspect="1"/>
+            </wp:cNvGraphicFramePr>
+            <a:graphic xmlns:a="http://schemas.openxmlformats.org/drawingml/2006/main">
+              <a:graphicData uri="http://schemas.openxmlformats.org/drawingml/2006/picture">
+                <pic:pic xmlns:pic="http://schemas.openxmlformats.org/drawingml/2006/picture">
+                  <pic:nvPicPr>
+                    <pic:cNvPr id="1747680978" name=""/>
+                    <pic:cNvPicPr/>
+                  </pic:nvPicPr>
+                  <pic:blipFill>
+                    <a:blip r:embed="rId44"/>
+                    <a:stretch>
+                      <a:fillRect/>
+                    </a:stretch>
+                  </pic:blipFill>
+                  <pic:spPr>
+                    <a:xfrm>
+                      <a:off x="0" y="0"/>
+                      <a:ext cx="5612130" cy="584200"/>
+                    </a:xfrm>
+                    <a:prstGeom prst="rect">
+                      <a:avLst/>
+                    </a:prstGeom>
+                  </pic:spPr>
+                </pic:pic>
+              </a:graphicData>
+            </a:graphic>
+          </wp:inline>
+        </w:drawing>
+      </w:r>
+    </w:p>
+    <w:p>
+      <w:pPr>
+        <w:rPr>
+          <w:rFonts w:ascii="Arial" w:hAnsi="Arial" w:cs="Arial"/>
+          <w:sz w:val="20"/>
+          <w:szCs w:val="20"/>
+        </w:rPr>
+      </w:pPr>
+      <w:r>
+        <w:rPr>
+          <w:noProof/>
+        </w:rPr>
+        <w:drawing>
+          <wp:inline distT="0" distB="0" distL="0" distR="0" wp14:anchorId="19103A47" wp14:editId="68CD7B24">
+            <wp:extent cx="5612130" cy="581660"/>
+            <wp:effectExtent l="0" t="0" r="7620" b="8890"/>
+            <wp:docPr id="1639638621" name="Imagen 1"/>
+            <wp:cNvGraphicFramePr>
+              <a:graphicFrameLocks xmlns:a="http://schemas.openxmlformats.org/drawingml/2006/main" noChangeAspect="1"/>
+            </wp:cNvGraphicFramePr>
+            <a:graphic xmlns:a="http://schemas.openxmlformats.org/drawingml/2006/main">
+              <a:graphicData uri="http://schemas.openxmlformats.org/drawingml/2006/picture">
+                <pic:pic xmlns:pic="http://schemas.openxmlformats.org/drawingml/2006/picture">
+                  <pic:nvPicPr>
+                    <pic:cNvPr id="1639638621" name=""/>
+                    <pic:cNvPicPr/>
+                  </pic:nvPicPr>
+                  <pic:blipFill>
+                    <a:blip r:embed="rId45"/>
+                    <a:stretch>
+                      <a:fillRect/>
+                    </a:stretch>
+                  </pic:blipFill>
+                  <pic:spPr>
+                    <a:xfrm>
+                      <a:off x="0" y="0"/>
+                      <a:ext cx="5612130" cy="581660"/>
+                    </a:xfrm>
+                    <a:prstGeom prst="rect">
+                      <a:avLst/>
+                    </a:prstGeom>
+                  </pic:spPr>
+                </pic:pic>
+              </a:graphicData>
+            </a:graphic>
+          </wp:inline>
+        </w:drawing>
+      </w:r>
+    </w:p>
+    <w:p>
+      <w:pPr>
+        <w:rPr>
+          <w:rFonts w:ascii="Arial" w:hAnsi="Arial" w:cs="Arial"/>
+          <w:sz w:val="20"/>
+          <w:szCs w:val="20"/>
+        </w:rPr>
+      </w:pPr>
+      <w:r>
+        <w:rPr>
+          <w:rFonts w:ascii="Arial" w:hAnsi="Arial" w:cs="Arial"/>
+          <w:sz w:val="20"/>
+          <w:szCs w:val="20"/>
+        </w:rPr>
+        <w:t>Some tabs also report their own acquisition counters, such as the</w:t>
+      </w:r>
+      <w:r>
+        <w:rPr>
+          <w:rFonts w:ascii="Arial" w:hAnsi="Arial" w:cs="Arial"/>
+          <w:sz w:val="20"/>
+          <w:szCs w:val="20"/>
+        </w:rPr>
+        <w:t xml:space="preserve"> </w:t>
+      </w:r>
+      <w:r>
+        <w:rPr>
+          <w:rFonts w:ascii="Arial" w:hAnsi="Arial" w:cs="Arial"/>
+          <w:sz w:val="20"/>
+          <w:szCs w:val="20"/>
+        </w:rPr>
+        <w:t>number of calls, events, or the elapsed time, while a measurement is</w:t>
+      </w:r>
+      <w:r>
+        <w:rPr>
+          <w:rFonts w:ascii="Arial" w:hAnsi="Arial" w:cs="Arial"/>
+          <w:sz w:val="20"/>
+          <w:szCs w:val="20"/>
+        </w:rPr>
+        <w:t xml:space="preserve"> </w:t>
+      </w:r>
+      <w:r>
+        <w:rPr>
+          <w:rFonts w:ascii="Arial" w:hAnsi="Arial" w:cs="Arial"/>
+          <w:sz w:val="20"/>
+          <w:szCs w:val="20"/>
+        </w:rPr>
+        <w:t>running; once the configured acquisition duration has elapsed, these</w:t>
+      </w:r>
+      <w:r>
+        <w:rPr>
+          <w:rFonts w:ascii="Arial" w:hAnsi="Arial" w:cs="Arial"/>
+          <w:sz w:val="20"/>
+          <w:szCs w:val="20"/>
+        </w:rPr>
+        <w:t xml:space="preserve"> </w:t>
+      </w:r>
+      <w:r>
+        <w:rPr>
+          <w:rFonts w:ascii="Arial" w:hAnsi="Arial" w:cs="Arial"/>
+          <w:sz w:val="20"/>
+          <w:szCs w:val="20"/>
+        </w:rPr>
+        <w:t>tabs return to</w:t>
+      </w:r>
+      <w:r>
+        <w:rPr>
+          <w:rFonts w:ascii="Arial" w:hAnsi="Arial" w:cs="Arial"/>
+          <w:sz w:val="20"/>
+          <w:szCs w:val="20"/>
+        </w:rPr>
+        <w:t xml:space="preserve"> this same green state</w:t>
       </w:r>
       <w:r>
         <w:rPr>
@@ -10082,10 +10972,10 @@
           <w:szCs w:val="20"/>
         </w:rPr>
         <w:drawing>
-          <wp:inline distT="0" distB="0" distL="0" distR="0" wp14:anchorId="4EB84B03" wp14:editId="0F229CCB">
+          <wp:inline distT="0" distB="0" distL="0" distR="0" wp14:anchorId="5D83B62C" wp14:editId="20F0A9D3">
             <wp:extent cx="104775" cy="98227"/>
             <wp:effectExtent l="0" t="0" r="0" b="0"/>
-            <wp:docPr id="1788435811" name="Imagen 1"/>
+            <wp:docPr id="1580742718" name="Imagen 1"/>
             <wp:cNvGraphicFramePr>
               <a:graphicFrameLocks xmlns:a="http://schemas.openxmlformats.org/drawingml/2006/main" noChangeAspect="1"/>
             </wp:cNvGraphicFramePr>
@@ -10097,7 +10987,7 @@
                     <pic:cNvPicPr/>
                   </pic:nvPicPr>
                   <pic:blipFill>
-                    <a:blip r:embed="rId39"/>
+                    <a:blip r:embed="rId38"/>
                     <a:stretch>
                       <a:fillRect/>
                     </a:stretch>
@@ -10131,332 +11021,47 @@
           <w:sz w:val="20"/>
           <w:szCs w:val="20"/>
         </w:rPr>
-        <w:t xml:space="preserve"> together with the completion percentage toward the configured number of measurements.</w:t>
-      </w:r>
-    </w:p>
-    <w:p>
-      <w:pPr>
-        <w:jc w:val="center"/>
-        <w:rPr>
-          <w:rFonts w:ascii="Arial" w:hAnsi="Arial" w:cs="Arial"/>
-          <w:sz w:val="20"/>
-          <w:szCs w:val="20"/>
-        </w:rPr>
-      </w:pPr>
-      <w:r>
-        <w:rPr>
-          <w:noProof/>
-        </w:rPr>
-        <w:drawing>
-          <wp:inline distT="0" distB="0" distL="0" distR="0" wp14:anchorId="7230D940" wp14:editId="2953B40A">
-            <wp:extent cx="5534025" cy="2432016"/>
-            <wp:effectExtent l="0" t="0" r="0" b="6985"/>
-            <wp:docPr id="727166040" name="Imagen 1"/>
-            <wp:cNvGraphicFramePr>
-              <a:graphicFrameLocks xmlns:a="http://schemas.openxmlformats.org/drawingml/2006/main" noChangeAspect="1"/>
-            </wp:cNvGraphicFramePr>
-            <a:graphic xmlns:a="http://schemas.openxmlformats.org/drawingml/2006/main">
-              <a:graphicData uri="http://schemas.openxmlformats.org/drawingml/2006/picture">
-                <pic:pic xmlns:pic="http://schemas.openxmlformats.org/drawingml/2006/picture">
-                  <pic:nvPicPr>
-                    <pic:cNvPr id="727166040" name=""/>
-                    <pic:cNvPicPr/>
-                  </pic:nvPicPr>
-                  <pic:blipFill>
-                    <a:blip r:embed="rId41"/>
-                    <a:stretch>
-                      <a:fillRect/>
-                    </a:stretch>
-                  </pic:blipFill>
-                  <pic:spPr>
-                    <a:xfrm>
-                      <a:off x="0" y="0"/>
-                      <a:ext cx="5538682" cy="2434063"/>
-                    </a:xfrm>
-                    <a:prstGeom prst="rect">
-                      <a:avLst/>
-                    </a:prstGeom>
-                  </pic:spPr>
-                </pic:pic>
-              </a:graphicData>
-            </a:graphic>
-          </wp:inline>
-        </w:drawing>
-      </w:r>
-    </w:p>
-    <w:p>
-      <w:pPr>
-        <w:rPr>
-          <w:rFonts w:ascii="Arial" w:hAnsi="Arial" w:cs="Arial"/>
-          <w:sz w:val="20"/>
-          <w:szCs w:val="20"/>
-        </w:rPr>
-      </w:pPr>
-      <w:r>
-        <w:rPr>
-          <w:rFonts w:ascii="Arial" w:hAnsi="Arial" w:cs="Arial"/>
-          <w:sz w:val="20"/>
-          <w:szCs w:val="20"/>
-        </w:rPr>
-        <w:t xml:space="preserve">The Time stamping tab behaves differently depending on the acquisition mode selected: in manual mode it reports only that the measurement is running, while in sample-size mode it additionally appends the completion percentage relative to the configured number of records, and any warning message issued while a target sample count is active is likewise annotated with that same percentage. In scheduled mode, before the configured start time is reached, the status bar instead </w:t>
-      </w:r>
-      <w:r>
-        <w:rPr>
-          <w:rFonts w:ascii="Arial" w:hAnsi="Arial" w:cs="Arial"/>
-          <w:sz w:val="20"/>
-          <w:szCs w:val="20"/>
-        </w:rPr>
-        <w:lastRenderedPageBreak/>
-        <w:t>displays a countdown showing the remaining time until the measurement begins; while this countdown is running the software behaves as though the measurement were already underway, and the tab and device configuration cannot be changed until either the countdown finishes or the user cancels it with the stop button. When autosave is writing accumulated data to disk during a running measurement, the status bar switches to the message "Saving data", and once the user stops the measurement, the same processing state (covered in the Paused and processing states subsection below) reports the percentage of records already sorted and written to their final path.</w:t>
-      </w:r>
-    </w:p>
-    <w:p>
-      <w:pPr>
-        <w:rPr>
-          <w:rFonts w:ascii="Arial" w:hAnsi="Arial" w:cs="Arial"/>
-          <w:sz w:val="20"/>
-          <w:szCs w:val="20"/>
-        </w:rPr>
-      </w:pPr>
-      <w:r>
-        <w:rPr>
-          <w:noProof/>
-        </w:rPr>
-        <w:drawing>
-          <wp:inline distT="0" distB="0" distL="0" distR="0" wp14:anchorId="18910B55" wp14:editId="1C7F6159">
-            <wp:extent cx="5612130" cy="584200"/>
-            <wp:effectExtent l="0" t="0" r="7620" b="6350"/>
-            <wp:docPr id="1747680978" name="Imagen 1"/>
-            <wp:cNvGraphicFramePr>
-              <a:graphicFrameLocks xmlns:a="http://schemas.openxmlformats.org/drawingml/2006/main" noChangeAspect="1"/>
-            </wp:cNvGraphicFramePr>
-            <a:graphic xmlns:a="http://schemas.openxmlformats.org/drawingml/2006/main">
-              <a:graphicData uri="http://schemas.openxmlformats.org/drawingml/2006/picture">
-                <pic:pic xmlns:pic="http://schemas.openxmlformats.org/drawingml/2006/picture">
-                  <pic:nvPicPr>
-                    <pic:cNvPr id="1747680978" name=""/>
-                    <pic:cNvPicPr/>
-                  </pic:nvPicPr>
-                  <pic:blipFill>
-                    <a:blip r:embed="rId42"/>
-                    <a:stretch>
-                      <a:fillRect/>
-                    </a:stretch>
-                  </pic:blipFill>
-                  <pic:spPr>
-                    <a:xfrm>
-                      <a:off x="0" y="0"/>
-                      <a:ext cx="5612130" cy="584200"/>
-                    </a:xfrm>
-                    <a:prstGeom prst="rect">
-                      <a:avLst/>
-                    </a:prstGeom>
-                  </pic:spPr>
-                </pic:pic>
-              </a:graphicData>
-            </a:graphic>
-          </wp:inline>
-        </w:drawing>
-      </w:r>
-    </w:p>
-    <w:p>
-      <w:pPr>
-        <w:rPr>
-          <w:rFonts w:ascii="Arial" w:hAnsi="Arial" w:cs="Arial"/>
-          <w:sz w:val="20"/>
-          <w:szCs w:val="20"/>
-        </w:rPr>
-      </w:pPr>
-      <w:r>
-        <w:rPr>
-          <w:noProof/>
-        </w:rPr>
-        <w:drawing>
-          <wp:inline distT="0" distB="0" distL="0" distR="0" wp14:anchorId="19103A47" wp14:editId="68CD7B24">
-            <wp:extent cx="5612130" cy="581660"/>
-            <wp:effectExtent l="0" t="0" r="7620" b="8890"/>
-            <wp:docPr id="1639638621" name="Imagen 1"/>
-            <wp:cNvGraphicFramePr>
-              <a:graphicFrameLocks xmlns:a="http://schemas.openxmlformats.org/drawingml/2006/main" noChangeAspect="1"/>
-            </wp:cNvGraphicFramePr>
-            <a:graphic xmlns:a="http://schemas.openxmlformats.org/drawingml/2006/main">
-              <a:graphicData uri="http://schemas.openxmlformats.org/drawingml/2006/picture">
-                <pic:pic xmlns:pic="http://schemas.openxmlformats.org/drawingml/2006/picture">
-                  <pic:nvPicPr>
-                    <pic:cNvPr id="1639638621" name=""/>
-                    <pic:cNvPicPr/>
-                  </pic:nvPicPr>
-                  <pic:blipFill>
-                    <a:blip r:embed="rId43"/>
-                    <a:stretch>
-                      <a:fillRect/>
-                    </a:stretch>
-                  </pic:blipFill>
-                  <pic:spPr>
-                    <a:xfrm>
-                      <a:off x="0" y="0"/>
-                      <a:ext cx="5612130" cy="581660"/>
-                    </a:xfrm>
-                    <a:prstGeom prst="rect">
-                      <a:avLst/>
-                    </a:prstGeom>
-                  </pic:spPr>
-                </pic:pic>
-              </a:graphicData>
-            </a:graphic>
-          </wp:inline>
-        </w:drawing>
-      </w:r>
-    </w:p>
-    <w:p>
-      <w:pPr>
-        <w:rPr>
-          <w:rFonts w:ascii="Arial" w:hAnsi="Arial" w:cs="Arial"/>
-          <w:sz w:val="20"/>
-          <w:szCs w:val="20"/>
-        </w:rPr>
-      </w:pPr>
-      <w:r>
-        <w:rPr>
-          <w:rFonts w:ascii="Arial" w:hAnsi="Arial" w:cs="Arial"/>
-          <w:sz w:val="20"/>
-          <w:szCs w:val="20"/>
-        </w:rPr>
-        <w:t>The Autocorrelation (FCS) and g(2) (HBT) tabs report the green state</w:t>
-      </w:r>
-      <w:r>
-        <w:rPr>
-          <w:rFonts w:ascii="Arial" w:hAnsi="Arial" w:cs="Arial"/>
-          <w:sz w:val="20"/>
-          <w:szCs w:val="20"/>
-        </w:rPr>
-        <w:t xml:space="preserve"> (</w:t>
-      </w:r>
-      <w:r>
-        <w:rPr>
-          <w:rFonts w:ascii="Arial" w:hAnsi="Arial" w:cs="Arial"/>
-          <w:noProof/>
-          <w:sz w:val="20"/>
-          <w:szCs w:val="20"/>
-        </w:rPr>
-        <w:drawing>
-          <wp:inline distT="0" distB="0" distL="0" distR="0" wp14:anchorId="2E524D2A" wp14:editId="26670E37">
-            <wp:extent cx="104775" cy="98227"/>
-            <wp:effectExtent l="0" t="0" r="0" b="0"/>
-            <wp:docPr id="890228583" name="Imagen 1"/>
-            <wp:cNvGraphicFramePr>
-              <a:graphicFrameLocks xmlns:a="http://schemas.openxmlformats.org/drawingml/2006/main" noChangeAspect="1"/>
-            </wp:cNvGraphicFramePr>
-            <a:graphic xmlns:a="http://schemas.openxmlformats.org/drawingml/2006/main">
-              <a:graphicData uri="http://schemas.openxmlformats.org/drawingml/2006/picture">
-                <pic:pic xmlns:pic="http://schemas.openxmlformats.org/drawingml/2006/picture">
-                  <pic:nvPicPr>
-                    <pic:cNvPr id="166172236" name=""/>
-                    <pic:cNvPicPr/>
-                  </pic:nvPicPr>
-                  <pic:blipFill>
-                    <a:blip r:embed="rId39"/>
-                    <a:stretch>
-                      <a:fillRect/>
-                    </a:stretch>
-                  </pic:blipFill>
-                  <pic:spPr>
-                    <a:xfrm>
-                      <a:off x="0" y="0"/>
-                      <a:ext cx="106673" cy="100006"/>
-                    </a:xfrm>
-                    <a:prstGeom prst="rect">
-                      <a:avLst/>
-                    </a:prstGeom>
-                  </pic:spPr>
-                </pic:pic>
-              </a:graphicData>
-            </a:graphic>
-          </wp:inline>
-        </w:drawing>
-      </w:r>
-      <w:r>
-        <w:rPr>
-          <w:rFonts w:ascii="Arial" w:hAnsi="Arial" w:cs="Arial"/>
-          <w:sz w:val="20"/>
-          <w:szCs w:val="20"/>
-        </w:rPr>
-        <w:t>)</w:t>
-      </w:r>
-      <w:r>
-        <w:rPr>
-          <w:rFonts w:ascii="Arial" w:hAnsi="Arial" w:cs="Arial"/>
-          <w:sz w:val="20"/>
-          <w:szCs w:val="20"/>
-        </w:rPr>
-        <w:t xml:space="preserve"> together with their respective acquisition counters and the elapsed time: the Autocorrelation tab shows the number of calls and events, while the g(2) tab shows only the number of events, reflecting the different quantities each technique tracks; both tabs also switch back to this same green state</w:t>
-      </w:r>
-      <w:r>
-        <w:rPr>
-          <w:rFonts w:ascii="Arial" w:hAnsi="Arial" w:cs="Arial"/>
-          <w:sz w:val="20"/>
-          <w:szCs w:val="20"/>
-        </w:rPr>
-        <w:t xml:space="preserve"> (</w:t>
-      </w:r>
-      <w:r>
-        <w:rPr>
-          <w:rFonts w:ascii="Arial" w:hAnsi="Arial" w:cs="Arial"/>
-          <w:noProof/>
-          <w:sz w:val="20"/>
-          <w:szCs w:val="20"/>
-        </w:rPr>
-        <w:drawing>
-          <wp:inline distT="0" distB="0" distL="0" distR="0" wp14:anchorId="5D83B62C" wp14:editId="20F0A9D3">
-            <wp:extent cx="104775" cy="98227"/>
-            <wp:effectExtent l="0" t="0" r="0" b="0"/>
-            <wp:docPr id="1580742718" name="Imagen 1"/>
-            <wp:cNvGraphicFramePr>
-              <a:graphicFrameLocks xmlns:a="http://schemas.openxmlformats.org/drawingml/2006/main" noChangeAspect="1"/>
-            </wp:cNvGraphicFramePr>
-            <a:graphic xmlns:a="http://schemas.openxmlformats.org/drawingml/2006/main">
-              <a:graphicData uri="http://schemas.openxmlformats.org/drawingml/2006/picture">
-                <pic:pic xmlns:pic="http://schemas.openxmlformats.org/drawingml/2006/picture">
-                  <pic:nvPicPr>
-                    <pic:cNvPr id="166172236" name=""/>
-                    <pic:cNvPicPr/>
-                  </pic:nvPicPr>
-                  <pic:blipFill>
-                    <a:blip r:embed="rId39"/>
-                    <a:stretch>
-                      <a:fillRect/>
-                    </a:stretch>
-                  </pic:blipFill>
-                  <pic:spPr>
-                    <a:xfrm>
-                      <a:off x="0" y="0"/>
-                      <a:ext cx="106673" cy="100006"/>
-                    </a:xfrm>
-                    <a:prstGeom prst="rect">
-                      <a:avLst/>
-                    </a:prstGeom>
-                  </pic:spPr>
-                </pic:pic>
-              </a:graphicData>
-            </a:graphic>
-          </wp:inline>
-        </w:drawing>
-      </w:r>
-      <w:r>
-        <w:rPr>
-          <w:rFonts w:ascii="Arial" w:hAnsi="Arial" w:cs="Arial"/>
-          <w:sz w:val="20"/>
-          <w:szCs w:val="20"/>
-        </w:rPr>
-        <w:t>)</w:t>
-      </w:r>
-      <w:r>
-        <w:rPr>
-          <w:rFonts w:ascii="Arial" w:hAnsi="Arial" w:cs="Arial"/>
-          <w:sz w:val="20"/>
-          <w:szCs w:val="20"/>
-        </w:rPr>
-        <w:t>, with a finishing message instead of a counter update, once the configured acquisition duration has elapsed and the thread has restored the device settings.</w:t>
+        <w:t xml:space="preserve">, </w:t>
+      </w:r>
+      <w:r>
+        <w:rPr>
+          <w:rFonts w:ascii="Arial" w:hAnsi="Arial" w:cs="Arial"/>
+          <w:sz w:val="20"/>
+          <w:szCs w:val="20"/>
+        </w:rPr>
+        <w:t>showing a finishing message</w:t>
+      </w:r>
+      <w:r>
+        <w:rPr>
+          <w:rFonts w:ascii="Arial" w:hAnsi="Arial" w:cs="Arial"/>
+          <w:sz w:val="20"/>
+          <w:szCs w:val="20"/>
+        </w:rPr>
+        <w:t xml:space="preserve"> </w:t>
+      </w:r>
+      <w:r>
+        <w:rPr>
+          <w:rFonts w:ascii="Arial" w:hAnsi="Arial" w:cs="Arial"/>
+          <w:sz w:val="20"/>
+          <w:szCs w:val="20"/>
+        </w:rPr>
+        <w:t>instead of a counter update, once the device settings have been</w:t>
+      </w:r>
+      <w:r>
+        <w:rPr>
+          <w:rFonts w:ascii="Arial" w:hAnsi="Arial" w:cs="Arial"/>
+          <w:sz w:val="20"/>
+          <w:szCs w:val="20"/>
+        </w:rPr>
+        <w:t xml:space="preserve"> </w:t>
+      </w:r>
+      <w:r>
+        <w:rPr>
+          <w:rFonts w:ascii="Arial" w:hAnsi="Arial" w:cs="Arial"/>
+          <w:sz w:val="20"/>
+          <w:szCs w:val="20"/>
+        </w:rPr>
+        <w:t>restored.</w:t>
       </w:r>
     </w:p>
     <w:p>
@@ -10487,7 +11092,7 @@
                     <pic:cNvPicPr/>
                   </pic:nvPicPr>
                   <pic:blipFill>
-                    <a:blip r:embed="rId44"/>
+                    <a:blip r:embed="rId46"/>
                     <a:stretch>
                       <a:fillRect/>
                     </a:stretch>
@@ -10546,15 +11151,7 @@
           <w:lang w:eastAsia="ja-JP"/>
           <w14:ligatures w14:val="none"/>
         </w:rPr>
-        <w:t xml:space="preserve">When a required channel stops receiving valid pulses, the Start-stop histogram, Lifetime histograms, Time stamping, Autocorrelation (FCS), and </w:t>
-      </w:r>
-      <w:r>
-        <w:rPr>
-          <w:rFonts w:ascii="Arial" w:hAnsi="Arial" w:cs="Arial"/>
-          <w:sz w:val="20"/>
-          <w:szCs w:val="20"/>
-        </w:rPr>
-        <w:t>g(2) (HBT)</w:t>
+        <w:t>When a required channel stops receiving valid pulses, some tabs switch</w:t>
       </w:r>
       <w:r>
         <w:rPr>
@@ -10565,7 +11162,7 @@
           <w:lang w:eastAsia="ja-JP"/>
           <w14:ligatures w14:val="none"/>
         </w:rPr>
-        <w:t xml:space="preserve"> tabs all switch the status dot to its orange</w:t>
+        <w:t xml:space="preserve"> </w:t>
       </w:r>
       <w:r>
         <w:rPr>
@@ -10576,7 +11173,29 @@
           <w:lang w:eastAsia="ja-JP"/>
           <w14:ligatures w14:val="none"/>
         </w:rPr>
-        <w:t xml:space="preserve"> (</w:t>
+        <w:t>the status dot to orange</w:t>
+      </w:r>
+      <w:r>
+        <w:rPr>
+          <w:rFonts w:ascii="Arial" w:eastAsia="Times New Roman" w:hAnsi="Arial" w:cs="Arial"/>
+          <w:kern w:val="0"/>
+          <w:sz w:val="20"/>
+          <w:szCs w:val="20"/>
+          <w:lang w:eastAsia="ja-JP"/>
+          <w14:ligatures w14:val="none"/>
+        </w:rPr>
+        <w:t xml:space="preserve"> </w:t>
+      </w:r>
+      <w:r>
+        <w:rPr>
+          <w:rFonts w:ascii="Arial" w:eastAsia="Times New Roman" w:hAnsi="Arial" w:cs="Arial"/>
+          <w:kern w:val="0"/>
+          <w:sz w:val="20"/>
+          <w:szCs w:val="20"/>
+          <w:lang w:eastAsia="ja-JP"/>
+          <w14:ligatures w14:val="none"/>
+        </w:rPr>
+        <w:t>(</w:t>
       </w:r>
       <w:r>
         <w:rPr>
@@ -10601,7 +11220,7 @@
                     <pic:cNvPicPr/>
                   </pic:nvPicPr>
                   <pic:blipFill>
-                    <a:blip r:embed="rId45"/>
+                    <a:blip r:embed="rId39"/>
                     <a:stretch>
                       <a:fillRect/>
                     </a:stretch>
@@ -10641,12 +11260,9 @@
           <w:lang w:eastAsia="ja-JP"/>
           <w14:ligatures w14:val="none"/>
         </w:rPr>
-        <w:t>, or warning, code and display a status message. If the start channel itself is not producing pulses, the tabs display "No measurements in Start Channel". If the start channel is fine but one or more configured stop channels are silent, they display "No measurements in Stop Channel" (specifying the affected channel when applicable, such as "No measurements in Stop Channel A").</w:t>
-      </w:r>
-    </w:p>
-    <w:p>
-      <w:pPr>
-        <w:spacing w:after="100" w:afterAutospacing="1" w:line="240" w:lineRule="auto"/>
+        <w:t>, or warning, code and display a status message. If the start channel itself is not producing pulses, the tabs display "No measurements in Start Channel". If the start channel is fine but one or more configured stop channels are silent, they display "No measurements in Stop Channel"</w:t>
+      </w:r>
+      <w:r>
         <w:rPr>
           <w:rFonts w:ascii="Arial" w:eastAsia="Times New Roman" w:hAnsi="Arial" w:cs="Arial"/>
           <w:kern w:val="0"/>
@@ -10655,7 +11271,30 @@
           <w:lang w:eastAsia="ja-JP"/>
           <w14:ligatures w14:val="none"/>
         </w:rPr>
-      </w:pPr>
+        <w:t xml:space="preserve"> </w:t>
+      </w:r>
+      <w:r>
+        <w:rPr>
+          <w:rFonts w:ascii="Arial" w:eastAsia="Times New Roman" w:hAnsi="Arial" w:cs="Arial"/>
+          <w:kern w:val="0"/>
+          <w:sz w:val="20"/>
+          <w:szCs w:val="20"/>
+          <w:lang w:eastAsia="ja-JP"/>
+          <w14:ligatures w14:val="none"/>
+        </w:rPr>
+        <w:t>(specifying the affected channel when applicable, such as "No measurements in Stop Channel A").</w:t>
+      </w:r>
+      <w:r>
+        <w:rPr>
+          <w:rFonts w:ascii="Arial" w:eastAsia="Times New Roman" w:hAnsi="Arial" w:cs="Arial"/>
+          <w:kern w:val="0"/>
+          <w:sz w:val="20"/>
+          <w:szCs w:val="20"/>
+          <w:lang w:eastAsia="ja-JP"/>
+          <w14:ligatures w14:val="none"/>
+        </w:rPr>
+        <w:t xml:space="preserve"> </w:t>
+      </w:r>
       <w:r>
         <w:rPr>
           <w:rFonts w:ascii="Arial" w:eastAsia="Times New Roman" w:hAnsi="Arial" w:cs="Arial"/>
@@ -10708,6 +11347,184 @@
     </w:p>
     <w:p>
       <w:pPr>
+        <w:spacing w:after="100" w:afterAutospacing="1" w:line="240" w:lineRule="auto"/>
+        <w:rPr>
+          <w:rFonts w:ascii="Arial" w:eastAsia="Times New Roman" w:hAnsi="Arial" w:cs="Arial"/>
+          <w:kern w:val="0"/>
+          <w:sz w:val="20"/>
+          <w:szCs w:val="20"/>
+          <w:lang w:eastAsia="ja-JP"/>
+          <w14:ligatures w14:val="none"/>
+        </w:rPr>
+      </w:pPr>
+      <w:r>
+        <w:rPr>
+          <w:rFonts w:ascii="Arial" w:eastAsia="Times New Roman" w:hAnsi="Arial" w:cs="Arial"/>
+          <w:kern w:val="0"/>
+          <w:sz w:val="20"/>
+          <w:szCs w:val="20"/>
+          <w:lang w:eastAsia="ja-JP"/>
+          <w14:ligatures w14:val="none"/>
+        </w:rPr>
+        <w:t>In the Counts estimation tab specifically, a channel that stops</w:t>
+      </w:r>
+      <w:r>
+        <w:rPr>
+          <w:rFonts w:ascii="Arial" w:eastAsia="Times New Roman" w:hAnsi="Arial" w:cs="Arial"/>
+          <w:kern w:val="0"/>
+          <w:sz w:val="20"/>
+          <w:szCs w:val="20"/>
+          <w:lang w:eastAsia="ja-JP"/>
+          <w14:ligatures w14:val="none"/>
+        </w:rPr>
+        <w:t xml:space="preserve"> </w:t>
+      </w:r>
+      <w:r>
+        <w:rPr>
+          <w:rFonts w:ascii="Arial" w:eastAsia="Times New Roman" w:hAnsi="Arial" w:cs="Arial"/>
+          <w:kern w:val="0"/>
+          <w:sz w:val="20"/>
+          <w:szCs w:val="20"/>
+          <w:lang w:eastAsia="ja-JP"/>
+          <w14:ligatures w14:val="none"/>
+        </w:rPr>
+        <w:t>producing enough pulses is instead flagged directly in the results</w:t>
+      </w:r>
+      <w:r>
+        <w:rPr>
+          <w:rFonts w:ascii="Arial" w:eastAsia="Times New Roman" w:hAnsi="Arial" w:cs="Arial"/>
+          <w:kern w:val="0"/>
+          <w:sz w:val="20"/>
+          <w:szCs w:val="20"/>
+          <w:lang w:eastAsia="ja-JP"/>
+          <w14:ligatures w14:val="none"/>
+        </w:rPr>
+        <w:t xml:space="preserve"> </w:t>
+      </w:r>
+      <w:r>
+        <w:rPr>
+          <w:rFonts w:ascii="Arial" w:eastAsia="Times New Roman" w:hAnsi="Arial" w:cs="Arial"/>
+          <w:kern w:val="0"/>
+          <w:sz w:val="20"/>
+          <w:szCs w:val="20"/>
+          <w:lang w:eastAsia="ja-JP"/>
+          <w14:ligatures w14:val="none"/>
+        </w:rPr>
+        <w:t>table with the message Low Counts, rather than through the shared</w:t>
+      </w:r>
+      <w:r>
+        <w:rPr>
+          <w:rFonts w:ascii="Arial" w:eastAsia="Times New Roman" w:hAnsi="Arial" w:cs="Arial"/>
+          <w:kern w:val="0"/>
+          <w:sz w:val="20"/>
+          <w:szCs w:val="20"/>
+          <w:lang w:eastAsia="ja-JP"/>
+          <w14:ligatures w14:val="none"/>
+        </w:rPr>
+        <w:t xml:space="preserve"> </w:t>
+      </w:r>
+      <w:r>
+        <w:rPr>
+          <w:rFonts w:ascii="Arial" w:eastAsia="Times New Roman" w:hAnsi="Arial" w:cs="Arial"/>
+          <w:kern w:val="0"/>
+          <w:sz w:val="20"/>
+          <w:szCs w:val="20"/>
+          <w:lang w:eastAsia="ja-JP"/>
+          <w14:ligatures w14:val="none"/>
+        </w:rPr>
+        <w:t>colored-dot warning layout described above, reflecting that this tab</w:t>
+      </w:r>
+      <w:r>
+        <w:rPr>
+          <w:rFonts w:ascii="Arial" w:eastAsia="Times New Roman" w:hAnsi="Arial" w:cs="Arial"/>
+          <w:kern w:val="0"/>
+          <w:sz w:val="20"/>
+          <w:szCs w:val="20"/>
+          <w:lang w:eastAsia="ja-JP"/>
+          <w14:ligatures w14:val="none"/>
+        </w:rPr>
+        <w:t xml:space="preserve"> </w:t>
+      </w:r>
+      <w:r>
+        <w:rPr>
+          <w:rFonts w:ascii="Arial" w:eastAsia="Times New Roman" w:hAnsi="Arial" w:cs="Arial"/>
+          <w:kern w:val="0"/>
+          <w:sz w:val="20"/>
+          <w:szCs w:val="20"/>
+          <w:lang w:eastAsia="ja-JP"/>
+          <w14:ligatures w14:val="none"/>
+        </w:rPr>
+        <w:t>reasons about insufficient pulse density on an otherwise active</w:t>
+      </w:r>
+      <w:r>
+        <w:rPr>
+          <w:rFonts w:ascii="Arial" w:eastAsia="Times New Roman" w:hAnsi="Arial" w:cs="Arial"/>
+          <w:kern w:val="0"/>
+          <w:sz w:val="20"/>
+          <w:szCs w:val="20"/>
+          <w:lang w:eastAsia="ja-JP"/>
+          <w14:ligatures w14:val="none"/>
+        </w:rPr>
+        <w:t xml:space="preserve"> </w:t>
+      </w:r>
+      <w:r>
+        <w:rPr>
+          <w:rFonts w:ascii="Arial" w:eastAsia="Times New Roman" w:hAnsi="Arial" w:cs="Arial"/>
+          <w:kern w:val="0"/>
+          <w:sz w:val="20"/>
+          <w:szCs w:val="20"/>
+          <w:lang w:eastAsia="ja-JP"/>
+          <w14:ligatures w14:val="none"/>
+        </w:rPr>
+        <w:t>channel rather than a fully silent start or stop line. Once</w:t>
+      </w:r>
+      <w:r>
+        <w:rPr>
+          <w:rFonts w:ascii="Arial" w:eastAsia="Times New Roman" w:hAnsi="Arial" w:cs="Arial"/>
+          <w:kern w:val="0"/>
+          <w:sz w:val="20"/>
+          <w:szCs w:val="20"/>
+          <w:lang w:eastAsia="ja-JP"/>
+          <w14:ligatures w14:val="none"/>
+        </w:rPr>
+        <w:t xml:space="preserve"> </w:t>
+      </w:r>
+      <w:r>
+        <w:rPr>
+          <w:rFonts w:ascii="Arial" w:eastAsia="Times New Roman" w:hAnsi="Arial" w:cs="Arial"/>
+          <w:kern w:val="0"/>
+          <w:sz w:val="20"/>
+          <w:szCs w:val="20"/>
+          <w:lang w:eastAsia="ja-JP"/>
+          <w14:ligatures w14:val="none"/>
+        </w:rPr>
+        <w:t>measurements are registered again on the channel, the process resumes</w:t>
+      </w:r>
+      <w:r>
+        <w:rPr>
+          <w:rFonts w:ascii="Arial" w:eastAsia="Times New Roman" w:hAnsi="Arial" w:cs="Arial"/>
+          <w:kern w:val="0"/>
+          <w:sz w:val="20"/>
+          <w:szCs w:val="20"/>
+          <w:lang w:eastAsia="ja-JP"/>
+          <w14:ligatures w14:val="none"/>
+        </w:rPr>
+        <w:t xml:space="preserve"> </w:t>
+      </w:r>
+      <w:r>
+        <w:rPr>
+          <w:rFonts w:ascii="Arial" w:eastAsia="Times New Roman" w:hAnsi="Arial" w:cs="Arial"/>
+          <w:kern w:val="0"/>
+          <w:sz w:val="20"/>
+          <w:szCs w:val="20"/>
+          <w:lang w:eastAsia="ja-JP"/>
+          <w14:ligatures w14:val="none"/>
+        </w:rPr>
+        <w:t>normally.</w:t>
+      </w:r>
+    </w:p>
+    <w:p>
+      <w:pPr>
         <w:rPr>
           <w:rFonts w:ascii="Arial" w:hAnsi="Arial" w:cs="Arial"/>
           <w:sz w:val="20"/>
@@ -10734,7 +11551,7 @@
                     <pic:cNvPicPr/>
                   </pic:nvPicPr>
                   <pic:blipFill>
-                    <a:blip r:embed="rId46"/>
+                    <a:blip r:embed="rId47"/>
                     <a:stretch>
                       <a:fillRect/>
                     </a:stretch>
@@ -10774,7 +11591,7 @@
                     <pic:cNvPicPr/>
                   </pic:nvPicPr>
                   <pic:blipFill>
-                    <a:blip r:embed="rId47"/>
+                    <a:blip r:embed="rId48"/>
                     <a:stretch>
                       <a:fillRect/>
                     </a:stretch>
@@ -10797,47 +11614,72 @@
     </w:p>
     <w:p>
       <w:pPr>
-        <w:rPr>
-          <w:rFonts w:ascii="Arial" w:hAnsi="Arial" w:cs="Arial"/>
-          <w:sz w:val="20"/>
-          <w:szCs w:val="20"/>
-        </w:rPr>
-      </w:pPr>
-      <w:r>
-        <w:rPr>
-          <w:rFonts w:ascii="Arial" w:hAnsi="Arial" w:cs="Arial"/>
-          <w:sz w:val="20"/>
-          <w:szCs w:val="20"/>
-        </w:rPr>
-        <w:t xml:space="preserve">In the Counts estimation tab specifically, a channel that stops producing enough pulses is instead flagged directly in the results table with the message Low Counts, rather than through the shared colored-dot warning layout described above; this reflects that Counts estimation reasons about </w:t>
-      </w:r>
-      <w:r>
-        <w:rPr>
-          <w:rFonts w:ascii="Arial" w:hAnsi="Arial" w:cs="Arial"/>
-          <w:sz w:val="20"/>
-          <w:szCs w:val="20"/>
-        </w:rPr>
-        <w:lastRenderedPageBreak/>
-        <w:t>insufficient pulse density on an otherwise active channel rather than a fully silent start or stop line. Once measurements are registered again on the channel, the process resumes normally.</w:t>
-      </w:r>
-    </w:p>
-    <w:p>
-      <w:pPr>
-        <w:rPr>
-          <w:rFonts w:ascii="Arial" w:hAnsi="Arial" w:cs="Arial"/>
-          <w:sz w:val="20"/>
-          <w:szCs w:val="20"/>
-        </w:rPr>
-      </w:pPr>
-      <w:r>
-        <w:rPr>
+        <w:pStyle w:val="Ttulo3"/>
+        <w:numPr>
+          <w:ilvl w:val="2"/>
+          <w:numId w:val="1"/>
+        </w:numPr>
+      </w:pPr>
+      <w:bookmarkStart w:id="36" w:name="_Toc9505"/>
+      <w:bookmarkStart w:id="37" w:name="_Toc238168381"/>
+      <w:r>
+        <w:t>Paused and processing states</w:t>
+      </w:r>
+      <w:bookmarkEnd w:id="36"/>
+      <w:bookmarkEnd w:id="37"/>
+    </w:p>
+    <w:p>
+      <w:pPr>
+        <w:rPr>
+          <w:rFonts w:ascii="Arial" w:hAnsi="Arial" w:cs="Arial"/>
+          <w:sz w:val="20"/>
+          <w:szCs w:val="20"/>
+        </w:rPr>
+      </w:pPr>
+      <w:r>
+        <w:rPr>
+          <w:rFonts w:ascii="Arial" w:hAnsi="Arial" w:cs="Arial"/>
+          <w:sz w:val="20"/>
+          <w:szCs w:val="20"/>
+        </w:rPr>
+        <w:t>The Time stamping and Lifetime histograms tabs share a third status</w:t>
+      </w:r>
+      <w:r>
+        <w:rPr>
+          <w:rFonts w:ascii="Arial" w:hAnsi="Arial" w:cs="Arial"/>
+          <w:sz w:val="20"/>
+          <w:szCs w:val="20"/>
+        </w:rPr>
+        <w:t xml:space="preserve"> </w:t>
+      </w:r>
+      <w:r>
+        <w:rPr>
+          <w:rFonts w:ascii="Arial" w:hAnsi="Arial" w:cs="Arial"/>
+          <w:sz w:val="20"/>
+          <w:szCs w:val="20"/>
+        </w:rPr>
+        <w:t>color, yellow</w:t>
+      </w:r>
+      <w:r>
+        <w:rPr>
+          <w:rFonts w:ascii="Arial" w:hAnsi="Arial" w:cs="Arial"/>
+          <w:sz w:val="20"/>
+          <w:szCs w:val="20"/>
+        </w:rPr>
+        <w:t xml:space="preserve"> (</w:t>
+      </w:r>
+      <w:r>
+        <w:rPr>
+          <w:rFonts w:ascii="Arial" w:hAnsi="Arial" w:cs="Arial"/>
           <w:noProof/>
+          <w:sz w:val="20"/>
+          <w:szCs w:val="20"/>
         </w:rPr>
         <w:drawing>
-          <wp:inline distT="0" distB="0" distL="0" distR="0" wp14:anchorId="61946117" wp14:editId="004763E9">
-            <wp:extent cx="5612130" cy="1310640"/>
-            <wp:effectExtent l="0" t="0" r="7620" b="3810"/>
-            <wp:docPr id="407175846" name="Imagen 1"/>
+          <wp:inline distT="0" distB="0" distL="0" distR="0" wp14:anchorId="492DD246" wp14:editId="67E95693">
+            <wp:extent cx="142875" cy="136072"/>
+            <wp:effectExtent l="0" t="0" r="0" b="0"/>
+            <wp:docPr id="838511328" name="Imagen 2"/>
             <wp:cNvGraphicFramePr>
               <a:graphicFrameLocks xmlns:a="http://schemas.openxmlformats.org/drawingml/2006/main" noChangeAspect="1"/>
             </wp:cNvGraphicFramePr>
@@ -10845,11 +11687,17 @@
               <a:graphicData uri="http://schemas.openxmlformats.org/drawingml/2006/picture">
                 <pic:pic xmlns:pic="http://schemas.openxmlformats.org/drawingml/2006/picture">
                   <pic:nvPicPr>
-                    <pic:cNvPr id="407175846" name=""/>
+                    <pic:cNvPr id="838511328" name="Imagen 838511328"/>
                     <pic:cNvPicPr/>
                   </pic:nvPicPr>
                   <pic:blipFill>
-                    <a:blip r:embed="rId48"/>
+                    <a:blip r:embed="rId40">
+                      <a:extLst>
+                        <a:ext uri="{28A0092B-C50C-407E-A947-70E740481C1C}">
+                          <a14:useLocalDpi xmlns:a14="http://schemas.microsoft.com/office/drawing/2010/main" val="0"/>
+                        </a:ext>
+                      </a:extLst>
+                    </a:blip>
                     <a:stretch>
                       <a:fillRect/>
                     </a:stretch>
@@ -10857,7 +11705,7 @@
                   <pic:spPr>
                     <a:xfrm>
                       <a:off x="0" y="0"/>
-                      <a:ext cx="5612130" cy="1310640"/>
+                      <a:ext cx="145314" cy="138395"/>
                     </a:xfrm>
                     <a:prstGeom prst="rect">
                       <a:avLst/>
@@ -10869,10 +11717,242 @@
           </wp:inline>
         </w:drawing>
       </w:r>
-    </w:p>
-    <w:p>
-      <w:pPr>
-        <w:jc w:val="center"/>
+      <w:r>
+        <w:rPr>
+          <w:rFonts w:ascii="Arial" w:hAnsi="Arial" w:cs="Arial"/>
+          <w:sz w:val="20"/>
+          <w:szCs w:val="20"/>
+        </w:rPr>
+        <w:t>)</w:t>
+      </w:r>
+      <w:r>
+        <w:rPr>
+          <w:rFonts w:ascii="Arial" w:hAnsi="Arial" w:cs="Arial"/>
+          <w:sz w:val="20"/>
+          <w:szCs w:val="20"/>
+        </w:rPr>
+        <w:t>, reserved for transitional states in which the device is not</w:t>
+      </w:r>
+      <w:r>
+        <w:rPr>
+          <w:rFonts w:ascii="Arial" w:hAnsi="Arial" w:cs="Arial"/>
+          <w:sz w:val="20"/>
+          <w:szCs w:val="20"/>
+        </w:rPr>
+        <w:t xml:space="preserve"> </w:t>
+      </w:r>
+      <w:r>
+        <w:rPr>
+          <w:rFonts w:ascii="Arial" w:hAnsi="Arial" w:cs="Arial"/>
+          <w:sz w:val="20"/>
+          <w:szCs w:val="20"/>
+        </w:rPr>
+        <w:t>actively acquiring new pulses but the measurement has not finished</w:t>
+      </w:r>
+      <w:r>
+        <w:rPr>
+          <w:rFonts w:ascii="Arial" w:hAnsi="Arial" w:cs="Arial"/>
+          <w:sz w:val="20"/>
+          <w:szCs w:val="20"/>
+        </w:rPr>
+        <w:t xml:space="preserve"> </w:t>
+      </w:r>
+      <w:r>
+        <w:rPr>
+          <w:rFonts w:ascii="Arial" w:hAnsi="Arial" w:cs="Arial"/>
+          <w:sz w:val="20"/>
+          <w:szCs w:val="20"/>
+        </w:rPr>
+        <w:t>either. In the Time stamping tab, this state covers three situations: while the</w:t>
+      </w:r>
+      <w:r>
+        <w:rPr>
+          <w:rFonts w:ascii="Arial" w:hAnsi="Arial" w:cs="Arial"/>
+          <w:sz w:val="20"/>
+          <w:szCs w:val="20"/>
+        </w:rPr>
+        <w:t xml:space="preserve"> </w:t>
+      </w:r>
+      <w:r>
+        <w:rPr>
+          <w:rFonts w:ascii="Arial" w:hAnsi="Arial" w:cs="Arial"/>
+          <w:sz w:val="20"/>
+          <w:szCs w:val="20"/>
+        </w:rPr>
+        <w:t xml:space="preserve">measurement is paused by the user, the status bar shows </w:t>
+      </w:r>
+      <w:r>
+        <w:rPr>
+          <w:rFonts w:ascii="Arial" w:hAnsi="Arial" w:cs="Arial"/>
+          <w:sz w:val="20"/>
+          <w:szCs w:val="20"/>
+        </w:rPr>
+        <w:t>“</w:t>
+      </w:r>
+      <w:r>
+        <w:rPr>
+          <w:rFonts w:ascii="Arial" w:hAnsi="Arial" w:cs="Arial"/>
+          <w:sz w:val="20"/>
+          <w:szCs w:val="20"/>
+        </w:rPr>
+        <w:t>Paused</w:t>
+      </w:r>
+      <w:r>
+        <w:rPr>
+          <w:rFonts w:ascii="Arial" w:hAnsi="Arial" w:cs="Arial"/>
+          <w:sz w:val="20"/>
+          <w:szCs w:val="20"/>
+        </w:rPr>
+        <w:t xml:space="preserve"> </w:t>
+      </w:r>
+      <w:r>
+        <w:rPr>
+          <w:rFonts w:ascii="Arial" w:hAnsi="Arial" w:cs="Arial"/>
+          <w:sz w:val="20"/>
+          <w:szCs w:val="20"/>
+        </w:rPr>
+        <w:t>measurement</w:t>
+      </w:r>
+      <w:r>
+        <w:rPr>
+          <w:rFonts w:ascii="Arial" w:hAnsi="Arial" w:cs="Arial"/>
+          <w:sz w:val="20"/>
+          <w:szCs w:val="20"/>
+        </w:rPr>
+        <w:t>”</w:t>
+      </w:r>
+      <w:r>
+        <w:rPr>
+          <w:rFonts w:ascii="Arial" w:hAnsi="Arial" w:cs="Arial"/>
+          <w:sz w:val="20"/>
+          <w:szCs w:val="20"/>
+        </w:rPr>
+        <w:t xml:space="preserve">, with the </w:t>
+      </w:r>
+      <w:r>
+        <w:rPr>
+          <w:rFonts w:ascii="Arial" w:hAnsi="Arial" w:cs="Arial"/>
+          <w:sz w:val="20"/>
+          <w:szCs w:val="20"/>
+        </w:rPr>
+        <w:lastRenderedPageBreak/>
+        <w:t>completion percentage appended when the tab is</w:t>
+      </w:r>
+      <w:r>
+        <w:rPr>
+          <w:rFonts w:ascii="Arial" w:hAnsi="Arial" w:cs="Arial"/>
+          <w:sz w:val="20"/>
+          <w:szCs w:val="20"/>
+        </w:rPr>
+        <w:t xml:space="preserve"> </w:t>
+      </w:r>
+      <w:r>
+        <w:rPr>
+          <w:rFonts w:ascii="Arial" w:hAnsi="Arial" w:cs="Arial"/>
+          <w:sz w:val="20"/>
+          <w:szCs w:val="20"/>
+        </w:rPr>
+        <w:t>running in sample-size mode; while autosave is writing accumulated data</w:t>
+      </w:r>
+      <w:r>
+        <w:rPr>
+          <w:rFonts w:ascii="Arial" w:hAnsi="Arial" w:cs="Arial"/>
+          <w:sz w:val="20"/>
+          <w:szCs w:val="20"/>
+        </w:rPr>
+        <w:t xml:space="preserve"> </w:t>
+      </w:r>
+      <w:r>
+        <w:rPr>
+          <w:rFonts w:ascii="Arial" w:hAnsi="Arial" w:cs="Arial"/>
+          <w:sz w:val="20"/>
+          <w:szCs w:val="20"/>
+        </w:rPr>
+        <w:t xml:space="preserve">to disk, it shows </w:t>
+      </w:r>
+      <w:r>
+        <w:rPr>
+          <w:rFonts w:ascii="Arial" w:hAnsi="Arial" w:cs="Arial"/>
+          <w:sz w:val="20"/>
+          <w:szCs w:val="20"/>
+        </w:rPr>
+        <w:t>“</w:t>
+      </w:r>
+      <w:r>
+        <w:rPr>
+          <w:rFonts w:ascii="Arial" w:hAnsi="Arial" w:cs="Arial"/>
+          <w:sz w:val="20"/>
+          <w:szCs w:val="20"/>
+        </w:rPr>
+        <w:t>Processing dat</w:t>
+      </w:r>
+      <w:r>
+        <w:rPr>
+          <w:rFonts w:ascii="Arial" w:hAnsi="Arial" w:cs="Arial"/>
+          <w:sz w:val="20"/>
+          <w:szCs w:val="20"/>
+        </w:rPr>
+        <w:t>a”</w:t>
+      </w:r>
+      <w:r>
+        <w:rPr>
+          <w:rFonts w:ascii="Arial" w:hAnsi="Arial" w:cs="Arial"/>
+          <w:sz w:val="20"/>
+          <w:szCs w:val="20"/>
+        </w:rPr>
+        <w:t>; and once the user stops the</w:t>
+      </w:r>
+      <w:r>
+        <w:rPr>
+          <w:rFonts w:ascii="Arial" w:hAnsi="Arial" w:cs="Arial"/>
+          <w:sz w:val="20"/>
+          <w:szCs w:val="20"/>
+        </w:rPr>
+        <w:t xml:space="preserve"> </w:t>
+      </w:r>
+      <w:r>
+        <w:rPr>
+          <w:rFonts w:ascii="Arial" w:hAnsi="Arial" w:cs="Arial"/>
+          <w:sz w:val="20"/>
+          <w:szCs w:val="20"/>
+        </w:rPr>
+        <w:t>measurement, it shows the same ``Processing data'' message, followed by</w:t>
+      </w:r>
+      <w:r>
+        <w:rPr>
+          <w:rFonts w:ascii="Arial" w:hAnsi="Arial" w:cs="Arial"/>
+          <w:sz w:val="20"/>
+          <w:szCs w:val="20"/>
+        </w:rPr>
+        <w:t xml:space="preserve"> </w:t>
+      </w:r>
+      <w:r>
+        <w:rPr>
+          <w:rFonts w:ascii="Arial" w:hAnsi="Arial" w:cs="Arial"/>
+          <w:sz w:val="20"/>
+          <w:szCs w:val="20"/>
+        </w:rPr>
+        <w:t>an explicit percentage, while the recorded entries are sorted and</w:t>
+      </w:r>
+      <w:r>
+        <w:rPr>
+          <w:rFonts w:ascii="Arial" w:hAnsi="Arial" w:cs="Arial"/>
+          <w:sz w:val="20"/>
+          <w:szCs w:val="20"/>
+        </w:rPr>
+        <w:t xml:space="preserve"> </w:t>
+      </w:r>
+      <w:r>
+        <w:rPr>
+          <w:rFonts w:ascii="Arial" w:hAnsi="Arial" w:cs="Arial"/>
+          <w:sz w:val="20"/>
+          <w:szCs w:val="20"/>
+        </w:rPr>
+        <w:t>written to their final path.</w:t>
+      </w:r>
+    </w:p>
+    <w:p>
+      <w:pPr>
         <w:rPr>
           <w:rFonts w:ascii="Arial" w:hAnsi="Arial" w:cs="Arial"/>
           <w:sz w:val="20"/>
@@ -10884,10 +11964,10 @@
           <w:noProof/>
         </w:rPr>
         <w:drawing>
-          <wp:inline distT="0" distB="0" distL="0" distR="0" wp14:anchorId="500B60B1" wp14:editId="796CBD61">
-            <wp:extent cx="5372100" cy="1977307"/>
-            <wp:effectExtent l="0" t="0" r="0" b="4445"/>
-            <wp:docPr id="615568249" name="Imagen 1"/>
+          <wp:inline distT="0" distB="0" distL="0" distR="0" wp14:anchorId="73230DCC" wp14:editId="22D54B9D">
+            <wp:extent cx="5561905" cy="580952"/>
+            <wp:effectExtent l="0" t="0" r="1270" b="0"/>
+            <wp:docPr id="1277504572" name="Imagen 1"/>
             <wp:cNvGraphicFramePr>
               <a:graphicFrameLocks xmlns:a="http://schemas.openxmlformats.org/drawingml/2006/main" noChangeAspect="1"/>
             </wp:cNvGraphicFramePr>
@@ -10895,7 +11975,7 @@
               <a:graphicData uri="http://schemas.openxmlformats.org/drawingml/2006/picture">
                 <pic:pic xmlns:pic="http://schemas.openxmlformats.org/drawingml/2006/picture">
                   <pic:nvPicPr>
-                    <pic:cNvPr id="615568249" name=""/>
+                    <pic:cNvPr id="1277504572" name=""/>
                     <pic:cNvPicPr/>
                   </pic:nvPicPr>
                   <pic:blipFill>
@@ -10907,7 +11987,7 @@
                   <pic:spPr>
                     <a:xfrm>
                       <a:off x="0" y="0"/>
-                      <a:ext cx="5381204" cy="1980658"/>
+                      <a:ext cx="5561905" cy="580952"/>
                     </a:xfrm>
                     <a:prstGeom prst="rect">
                       <a:avLst/>
@@ -10922,56 +12002,21 @@
     </w:p>
     <w:p>
       <w:pPr>
-        <w:pStyle w:val="Ttulo3"/>
-        <w:numPr>
-          <w:ilvl w:val="2"/>
-          <w:numId w:val="1"/>
-        </w:numPr>
-      </w:pPr>
-      <w:bookmarkStart w:id="36" w:name="_Toc9505"/>
-      <w:bookmarkStart w:id="37" w:name="_Toc238168381"/>
-      <w:r>
-        <w:t>Paused and processing states</w:t>
-      </w:r>
-      <w:bookmarkEnd w:id="36"/>
-      <w:bookmarkEnd w:id="37"/>
-    </w:p>
-    <w:p>
-      <w:pPr>
-        <w:rPr>
-          <w:rFonts w:ascii="Arial" w:hAnsi="Arial" w:cs="Arial"/>
-          <w:sz w:val="20"/>
-          <w:szCs w:val="20"/>
-        </w:rPr>
-      </w:pPr>
-      <w:r>
-        <w:rPr>
-          <w:rFonts w:ascii="Arial" w:hAnsi="Arial" w:cs="Arial"/>
-          <w:sz w:val="20"/>
-          <w:szCs w:val="20"/>
-        </w:rPr>
-        <w:t>Beyond the green running state</w:t>
-      </w:r>
-      <w:r>
-        <w:rPr>
-          <w:rFonts w:ascii="Arial" w:hAnsi="Arial" w:cs="Arial"/>
-          <w:sz w:val="20"/>
-          <w:szCs w:val="20"/>
-        </w:rPr>
-        <w:t xml:space="preserve"> (</w:t>
-      </w:r>
-      <w:r>
-        <w:rPr>
-          <w:rFonts w:ascii="Arial" w:hAnsi="Arial" w:cs="Arial"/>
+        <w:rPr>
+          <w:rFonts w:ascii="Arial" w:hAnsi="Arial" w:cs="Arial"/>
+          <w:sz w:val="20"/>
+          <w:szCs w:val="20"/>
+        </w:rPr>
+      </w:pPr>
+      <w:r>
+        <w:rPr>
           <w:noProof/>
-          <w:sz w:val="20"/>
-          <w:szCs w:val="20"/>
         </w:rPr>
         <w:drawing>
-          <wp:inline distT="0" distB="0" distL="0" distR="0" wp14:anchorId="18D9CB99" wp14:editId="76646D8B">
-            <wp:extent cx="104775" cy="98227"/>
-            <wp:effectExtent l="0" t="0" r="0" b="0"/>
-            <wp:docPr id="2092789765" name="Imagen 1"/>
+          <wp:inline distT="0" distB="0" distL="0" distR="0" wp14:anchorId="2773372A" wp14:editId="1599D423">
+            <wp:extent cx="5612130" cy="595630"/>
+            <wp:effectExtent l="0" t="0" r="7620" b="0"/>
+            <wp:docPr id="1269074655" name="Imagen 1"/>
             <wp:cNvGraphicFramePr>
               <a:graphicFrameLocks xmlns:a="http://schemas.openxmlformats.org/drawingml/2006/main" noChangeAspect="1"/>
             </wp:cNvGraphicFramePr>
@@ -10979,11 +12024,11 @@
               <a:graphicData uri="http://schemas.openxmlformats.org/drawingml/2006/picture">
                 <pic:pic xmlns:pic="http://schemas.openxmlformats.org/drawingml/2006/picture">
                   <pic:nvPicPr>
-                    <pic:cNvPr id="166172236" name=""/>
+                    <pic:cNvPr id="1269074655" name=""/>
                     <pic:cNvPicPr/>
                   </pic:nvPicPr>
                   <pic:blipFill>
-                    <a:blip r:embed="rId39"/>
+                    <a:blip r:embed="rId50"/>
                     <a:stretch>
                       <a:fillRect/>
                     </a:stretch>
@@ -10991,7 +12036,7 @@
                   <pic:spPr>
                     <a:xfrm>
                       <a:off x="0" y="0"/>
-                      <a:ext cx="106673" cy="100006"/>
+                      <a:ext cx="5612130" cy="595630"/>
                     </a:xfrm>
                     <a:prstGeom prst="rect">
                       <a:avLst/>
@@ -11003,21 +12048,87 @@
           </wp:inline>
         </w:drawing>
       </w:r>
-      <w:r>
-        <w:rPr>
-          <w:rFonts w:ascii="Arial" w:hAnsi="Arial" w:cs="Arial"/>
-          <w:sz w:val="20"/>
-          <w:szCs w:val="20"/>
-        </w:rPr>
-        <w:t>)</w:t>
-      </w:r>
-      <w:r>
-        <w:rPr>
-          <w:rFonts w:ascii="Arial" w:hAnsi="Arial" w:cs="Arial"/>
-          <w:sz w:val="20"/>
-          <w:szCs w:val="20"/>
-        </w:rPr>
-        <w:t xml:space="preserve"> and the orange warning state</w:t>
+    </w:p>
+    <w:p>
+      <w:pPr>
+        <w:rPr>
+          <w:rFonts w:ascii="Arial" w:hAnsi="Arial" w:cs="Arial"/>
+          <w:sz w:val="20"/>
+          <w:szCs w:val="20"/>
+        </w:rPr>
+      </w:pPr>
+      <w:r>
+        <w:rPr>
+          <w:rFonts w:ascii="Arial" w:hAnsi="Arial" w:cs="Arial"/>
+          <w:sz w:val="20"/>
+          <w:szCs w:val="20"/>
+        </w:rPr>
+        <w:t xml:space="preserve">In the Lifetime histograms tab, this same third color is used only once, at the very end of the acquisition loop, when the status bar displays </w:t>
+      </w:r>
+      <w:r>
+        <w:rPr>
+          <w:rFonts w:ascii="Arial" w:hAnsi="Arial" w:cs="Arial"/>
+          <w:sz w:val="20"/>
+          <w:szCs w:val="20"/>
+        </w:rPr>
+        <w:t>“</w:t>
+      </w:r>
+      <w:r>
+        <w:rPr>
+          <w:rFonts w:ascii="Arial" w:hAnsi="Arial" w:cs="Arial"/>
+          <w:sz w:val="20"/>
+          <w:szCs w:val="20"/>
+        </w:rPr>
+        <w:t>Ending measurement</w:t>
+      </w:r>
+      <w:r>
+        <w:rPr>
+          <w:rFonts w:ascii="Arial" w:hAnsi="Arial" w:cs="Arial"/>
+          <w:sz w:val="20"/>
+          <w:szCs w:val="20"/>
+        </w:rPr>
+        <w:t>”</w:t>
+      </w:r>
+      <w:r>
+        <w:rPr>
+          <w:rFonts w:ascii="Arial" w:hAnsi="Arial" w:cs="Arial"/>
+          <w:sz w:val="20"/>
+          <w:szCs w:val="20"/>
+        </w:rPr>
+        <w:t xml:space="preserve"> while the thread finalizes the run before the measurement is marked as complete.</w:t>
+      </w:r>
+    </w:p>
+    <w:p>
+      <w:pPr>
+        <w:pStyle w:val="Ttulo3"/>
+        <w:numPr>
+          <w:ilvl w:val="2"/>
+          <w:numId w:val="1"/>
+        </w:numPr>
+      </w:pPr>
+      <w:bookmarkStart w:id="38" w:name="_Toc9506"/>
+      <w:bookmarkStart w:id="39" w:name="_Toc238168382"/>
+      <w:r>
+        <w:t>Module-specific configuration warnings</w:t>
+      </w:r>
+      <w:bookmarkEnd w:id="38"/>
+      <w:bookmarkEnd w:id="39"/>
+    </w:p>
+    <w:p>
+      <w:pPr>
+        <w:rPr>
+          <w:rFonts w:ascii="Arial" w:hAnsi="Arial" w:cs="Arial"/>
+          <w:sz w:val="20"/>
+          <w:szCs w:val="20"/>
+        </w:rPr>
+      </w:pPr>
+      <w:r>
+        <w:rPr>
+          <w:rFonts w:ascii="Arial" w:hAnsi="Arial" w:cs="Arial"/>
+          <w:sz w:val="20"/>
+          <w:szCs w:val="20"/>
+        </w:rPr>
+        <w:t>Two of the tabs raise an additional warning, shown with the same orange code</w:t>
       </w:r>
       <w:r>
         <w:rPr>
@@ -11035,10 +12146,10 @@
           <w:szCs w:val="20"/>
         </w:rPr>
         <w:drawing>
-          <wp:inline distT="0" distB="0" distL="0" distR="0" wp14:anchorId="1E3B42E8" wp14:editId="62827248">
+          <wp:inline distT="0" distB="0" distL="0" distR="0" wp14:anchorId="00E5C635" wp14:editId="6493DA63">
             <wp:extent cx="85725" cy="91848"/>
             <wp:effectExtent l="0" t="0" r="0" b="3810"/>
-            <wp:docPr id="1036346524" name="Imagen 1"/>
+            <wp:docPr id="2061148232" name="Imagen 1"/>
             <wp:cNvGraphicFramePr>
               <a:graphicFrameLocks xmlns:a="http://schemas.openxmlformats.org/drawingml/2006/main" noChangeAspect="1"/>
             </wp:cNvGraphicFramePr>
@@ -11050,7 +12161,7 @@
                     <pic:cNvPicPr/>
                   </pic:nvPicPr>
                   <pic:blipFill>
-                    <a:blip r:embed="rId45"/>
+                    <a:blip r:embed="rId39"/>
                     <a:stretch>
                       <a:fillRect/>
                     </a:stretch>
@@ -11084,222 +12195,6 @@
           <w:sz w:val="20"/>
           <w:szCs w:val="20"/>
         </w:rPr>
-        <w:t>, the Time stamping and Lifetime histograms tabs share a third, distinct status color reserved for transitional states in which the device is not actively acquiring new pulses but the measurement has not finished either. This third code does not appear in the Start-stop histogram, Counts estimation, Autocorrelation (FCS), or g(2) (HBT) tabs. In the Time stamping tab, this state covers three situations: while the measurement is paused by the user, the status bar shows "Paused measurement", with the completion percentage appended when the tab is running in sample-size mode; while autosave is writing accumulated data to disk, it shows "Processing data"; and once the user stops the measurement, it shows the same "Processing data" message, followed by an explicit percentage, while the recorded entries are sorted and written to their final path.</w:t>
-      </w:r>
-    </w:p>
-    <w:p>
-      <w:pPr>
-        <w:rPr>
-          <w:rFonts w:ascii="Arial" w:hAnsi="Arial" w:cs="Arial"/>
-          <w:sz w:val="20"/>
-          <w:szCs w:val="20"/>
-        </w:rPr>
-      </w:pPr>
-      <w:r>
-        <w:rPr>
-          <w:noProof/>
-        </w:rPr>
-        <w:drawing>
-          <wp:inline distT="0" distB="0" distL="0" distR="0" wp14:anchorId="73230DCC" wp14:editId="22D54B9D">
-            <wp:extent cx="5561905" cy="580952"/>
-            <wp:effectExtent l="0" t="0" r="1270" b="0"/>
-            <wp:docPr id="1277504572" name="Imagen 1"/>
-            <wp:cNvGraphicFramePr>
-              <a:graphicFrameLocks xmlns:a="http://schemas.openxmlformats.org/drawingml/2006/main" noChangeAspect="1"/>
-            </wp:cNvGraphicFramePr>
-            <a:graphic xmlns:a="http://schemas.openxmlformats.org/drawingml/2006/main">
-              <a:graphicData uri="http://schemas.openxmlformats.org/drawingml/2006/picture">
-                <pic:pic xmlns:pic="http://schemas.openxmlformats.org/drawingml/2006/picture">
-                  <pic:nvPicPr>
-                    <pic:cNvPr id="1277504572" name=""/>
-                    <pic:cNvPicPr/>
-                  </pic:nvPicPr>
-                  <pic:blipFill>
-                    <a:blip r:embed="rId50"/>
-                    <a:stretch>
-                      <a:fillRect/>
-                    </a:stretch>
-                  </pic:blipFill>
-                  <pic:spPr>
-                    <a:xfrm>
-                      <a:off x="0" y="0"/>
-                      <a:ext cx="5561905" cy="580952"/>
-                    </a:xfrm>
-                    <a:prstGeom prst="rect">
-                      <a:avLst/>
-                    </a:prstGeom>
-                  </pic:spPr>
-                </pic:pic>
-              </a:graphicData>
-            </a:graphic>
-          </wp:inline>
-        </w:drawing>
-      </w:r>
-    </w:p>
-    <w:p>
-      <w:pPr>
-        <w:rPr>
-          <w:rFonts w:ascii="Arial" w:hAnsi="Arial" w:cs="Arial"/>
-          <w:sz w:val="20"/>
-          <w:szCs w:val="20"/>
-        </w:rPr>
-      </w:pPr>
-      <w:r>
-        <w:rPr>
-          <w:noProof/>
-        </w:rPr>
-        <w:drawing>
-          <wp:inline distT="0" distB="0" distL="0" distR="0" wp14:anchorId="2773372A" wp14:editId="1599D423">
-            <wp:extent cx="5612130" cy="595630"/>
-            <wp:effectExtent l="0" t="0" r="7620" b="0"/>
-            <wp:docPr id="1269074655" name="Imagen 1"/>
-            <wp:cNvGraphicFramePr>
-              <a:graphicFrameLocks xmlns:a="http://schemas.openxmlformats.org/drawingml/2006/main" noChangeAspect="1"/>
-            </wp:cNvGraphicFramePr>
-            <a:graphic xmlns:a="http://schemas.openxmlformats.org/drawingml/2006/main">
-              <a:graphicData uri="http://schemas.openxmlformats.org/drawingml/2006/picture">
-                <pic:pic xmlns:pic="http://schemas.openxmlformats.org/drawingml/2006/picture">
-                  <pic:nvPicPr>
-                    <pic:cNvPr id="1269074655" name=""/>
-                    <pic:cNvPicPr/>
-                  </pic:nvPicPr>
-                  <pic:blipFill>
-                    <a:blip r:embed="rId51"/>
-                    <a:stretch>
-                      <a:fillRect/>
-                    </a:stretch>
-                  </pic:blipFill>
-                  <pic:spPr>
-                    <a:xfrm>
-                      <a:off x="0" y="0"/>
-                      <a:ext cx="5612130" cy="595630"/>
-                    </a:xfrm>
-                    <a:prstGeom prst="rect">
-                      <a:avLst/>
-                    </a:prstGeom>
-                  </pic:spPr>
-                </pic:pic>
-              </a:graphicData>
-            </a:graphic>
-          </wp:inline>
-        </w:drawing>
-      </w:r>
-    </w:p>
-    <w:p>
-      <w:pPr>
-        <w:rPr>
-          <w:rFonts w:ascii="Arial" w:hAnsi="Arial" w:cs="Arial"/>
-          <w:sz w:val="20"/>
-          <w:szCs w:val="20"/>
-        </w:rPr>
-      </w:pPr>
-      <w:r>
-        <w:rPr>
-          <w:rFonts w:ascii="Arial" w:hAnsi="Arial" w:cs="Arial"/>
-          <w:sz w:val="20"/>
-          <w:szCs w:val="20"/>
-        </w:rPr>
-        <w:t>In the Lifetime histograms tab, this same third color is used only once, at the very end of the acquisition loop, when the status bar displays "Ending measurement" while the thread finalizes the run before the measurement is marked as complete.</w:t>
-      </w:r>
-    </w:p>
-    <w:p>
-      <w:pPr>
-        <w:pStyle w:val="Ttulo3"/>
-        <w:numPr>
-          <w:ilvl w:val="2"/>
-          <w:numId w:val="1"/>
-        </w:numPr>
-      </w:pPr>
-      <w:bookmarkStart w:id="38" w:name="_Toc9506"/>
-      <w:bookmarkStart w:id="39" w:name="_Toc238168382"/>
-      <w:r>
-        <w:lastRenderedPageBreak/>
-        <w:t>Module-specific configuration warnings</w:t>
-      </w:r>
-      <w:bookmarkEnd w:id="38"/>
-      <w:bookmarkEnd w:id="39"/>
-    </w:p>
-    <w:p>
-      <w:pPr>
-        <w:rPr>
-          <w:rFonts w:ascii="Arial" w:hAnsi="Arial" w:cs="Arial"/>
-          <w:sz w:val="20"/>
-          <w:szCs w:val="20"/>
-        </w:rPr>
-      </w:pPr>
-      <w:r>
-        <w:rPr>
-          <w:rFonts w:ascii="Arial" w:hAnsi="Arial" w:cs="Arial"/>
-          <w:sz w:val="20"/>
-          <w:szCs w:val="20"/>
-        </w:rPr>
-        <w:t>Two of the tabs raise an additional warning, shown with the same orange code</w:t>
-      </w:r>
-      <w:r>
-        <w:rPr>
-          <w:rFonts w:ascii="Arial" w:hAnsi="Arial" w:cs="Arial"/>
-          <w:sz w:val="20"/>
-          <w:szCs w:val="20"/>
-        </w:rPr>
-        <w:t xml:space="preserve"> (</w:t>
-      </w:r>
-      <w:r>
-        <w:rPr>
-          <w:rFonts w:ascii="Arial" w:hAnsi="Arial" w:cs="Arial"/>
-          <w:noProof/>
-          <w:sz w:val="20"/>
-          <w:szCs w:val="20"/>
-        </w:rPr>
-        <w:drawing>
-          <wp:inline distT="0" distB="0" distL="0" distR="0" wp14:anchorId="00E5C635" wp14:editId="6493DA63">
-            <wp:extent cx="85725" cy="91848"/>
-            <wp:effectExtent l="0" t="0" r="0" b="3810"/>
-            <wp:docPr id="2061148232" name="Imagen 1"/>
-            <wp:cNvGraphicFramePr>
-              <a:graphicFrameLocks xmlns:a="http://schemas.openxmlformats.org/drawingml/2006/main" noChangeAspect="1"/>
-            </wp:cNvGraphicFramePr>
-            <a:graphic xmlns:a="http://schemas.openxmlformats.org/drawingml/2006/main">
-              <a:graphicData uri="http://schemas.openxmlformats.org/drawingml/2006/picture">
-                <pic:pic xmlns:pic="http://schemas.openxmlformats.org/drawingml/2006/picture">
-                  <pic:nvPicPr>
-                    <pic:cNvPr id="2061148232" name=""/>
-                    <pic:cNvPicPr/>
-                  </pic:nvPicPr>
-                  <pic:blipFill>
-                    <a:blip r:embed="rId45"/>
-                    <a:stretch>
-                      <a:fillRect/>
-                    </a:stretch>
-                  </pic:blipFill>
-                  <pic:spPr>
-                    <a:xfrm>
-                      <a:off x="0" y="0"/>
-                      <a:ext cx="88180" cy="94479"/>
-                    </a:xfrm>
-                    <a:prstGeom prst="rect">
-                      <a:avLst/>
-                    </a:prstGeom>
-                  </pic:spPr>
-                </pic:pic>
-              </a:graphicData>
-            </a:graphic>
-          </wp:inline>
-        </w:drawing>
-      </w:r>
-      <w:r>
-        <w:rPr>
-          <w:rFonts w:ascii="Arial" w:hAnsi="Arial" w:cs="Arial"/>
-          <w:sz w:val="20"/>
-          <w:szCs w:val="20"/>
-        </w:rPr>
-        <w:t>)</w:t>
-      </w:r>
-      <w:r>
-        <w:rPr>
-          <w:rFonts w:ascii="Arial" w:hAnsi="Arial" w:cs="Arial"/>
-          <w:sz w:val="20"/>
-          <w:szCs w:val="20"/>
-        </w:rPr>
         <w:t>used for missing pulses, that is tied to a configuration check particular to that functionality rather than to a silent channel. In the Start-stop histogram tab, when a channel repeatedly produces out-of-range values and the user has been prompted to change that channel's mode without doing so, the status bar replaces the running message with "Consider changing mode of the channels: ", followed by the letter of every affected channel; this message is exclusive to the Start-stop histogram tab and does not appear in any other module. In the Counts estimation tab, before the actual measurement begins, the status bar displays "Estimating number stops in channel", followed by the channel letter and a completion percentage, while the software automatically determines how many stops each channel can reliably register; this calibration message is likewise exclusive to Counts estimation and precedes, rather than replaces, the Low Counts reporting described above.</w:t>
       </w:r>
     </w:p>
@@ -11327,7 +12222,7 @@
                     <pic:cNvPicPr/>
                   </pic:nvPicPr>
                   <pic:blipFill>
-                    <a:blip r:embed="rId52"/>
+                    <a:blip r:embed="rId51"/>
                     <a:stretch>
                       <a:fillRect/>
                     </a:stretch>
@@ -11465,6 +12360,7 @@
         <w:rPr>
           <w:noProof/>
         </w:rPr>
+        <w:lastRenderedPageBreak/>
         <w:drawing>
           <wp:inline distT="0" distB="0" distL="0" distR="0" wp14:anchorId="45034534" wp14:editId="11135443">
             <wp:extent cx="2245084" cy="3562350"/>
@@ -11481,7 +12377,7 @@
                     <pic:cNvPicPr/>
                   </pic:nvPicPr>
                   <pic:blipFill>
-                    <a:blip r:embed="rId53"/>
+                    <a:blip r:embed="rId52"/>
                     <a:stretch>
                       <a:fillRect/>
                     </a:stretch>
@@ -11516,7 +12412,6 @@
           <w:sz w:val="20"/>
           <w:szCs w:val="20"/>
         </w:rPr>
-        <w:lastRenderedPageBreak/>
         <w:t xml:space="preserve">Afterward, click on "Begin Measurement" </w:t>
       </w:r>
       <w:r>
@@ -11550,7 +12445,7 @@
                     <pic:cNvPicPr/>
                   </pic:nvPicPr>
                   <pic:blipFill>
-                    <a:blip r:embed="rId54"/>
+                    <a:blip r:embed="rId53"/>
                     <a:stretch>
                       <a:fillRect/>
                     </a:stretch>
@@ -11613,7 +12508,7 @@
                     <pic:cNvPicPr/>
                   </pic:nvPicPr>
                   <pic:blipFill>
-                    <a:blip r:embed="rId55"/>
+                    <a:blip r:embed="rId54"/>
                     <a:stretch>
                       <a:fillRect/>
                     </a:stretch>
@@ -11648,6 +12543,7 @@
           <w:sz w:val="20"/>
           <w:szCs w:val="20"/>
         </w:rPr>
+        <w:lastRenderedPageBreak/>
         <w:t>It is possible to interact with the graphs generated for each channel, either by dragging the range or adjusting the zoom with the mouse wheel. The histogram is generated according to the zoom level of the plot. Therefore, by zooming in and examining the range in more detail, more precise points will be obtained, indicating where each data point falls.</w:t>
       </w:r>
     </w:p>
@@ -11675,7 +12571,7 @@
                     <pic:cNvPicPr/>
                   </pic:nvPicPr>
                   <pic:blipFill rotWithShape="1">
-                    <a:blip r:embed="rId56"/>
+                    <a:blip r:embed="rId55"/>
                     <a:srcRect l="40925" t="16622" r="1" b="14523"/>
                     <a:stretch/>
                   </pic:blipFill>
@@ -11745,7 +12641,7 @@
                     <pic:cNvPicPr/>
                   </pic:nvPicPr>
                   <pic:blipFill>
-                    <a:blip r:embed="rId57"/>
+                    <a:blip r:embed="rId56"/>
                     <a:stretch>
                       <a:fillRect/>
                     </a:stretch>
@@ -11792,6 +12688,7 @@
         <w:rPr>
           <w:noProof/>
         </w:rPr>
+        <w:lastRenderedPageBreak/>
         <w:drawing>
           <wp:inline distT="0" distB="0" distL="0" distR="0" wp14:anchorId="7E51E284" wp14:editId="57673A4D">
             <wp:extent cx="2614239" cy="2438196"/>
@@ -11808,7 +12705,7 @@
                     <pic:cNvPicPr/>
                   </pic:nvPicPr>
                   <pic:blipFill>
-                    <a:blip r:embed="rId58"/>
+                    <a:blip r:embed="rId57"/>
                     <a:stretch>
                       <a:fillRect/>
                     </a:stretch>
@@ -11920,7 +12817,7 @@
                     <pic:cNvPicPr/>
                   </pic:nvPicPr>
                   <pic:blipFill>
-                    <a:blip r:embed="rId59"/>
+                    <a:blip r:embed="rId58"/>
                     <a:stretch>
                       <a:fillRect/>
                     </a:stretch>
@@ -11946,16 +12843,7 @@
           <w:sz w:val="20"/>
           <w:szCs w:val="20"/>
         </w:rPr>
-        <w:t xml:space="preserve">) to stop data collection. If you wish to clear the data during the experiment, there's no need to stop the measurement. At the bottom of the left menu, there are "Clear" buttons to erase both the data and current graphs. Four </w:t>
-      </w:r>
-      <w:r>
-        <w:rPr>
-          <w:rFonts w:ascii="Arial" w:hAnsi="Arial" w:cs="Arial"/>
-          <w:sz w:val="20"/>
-          <w:szCs w:val="20"/>
-        </w:rPr>
-        <w:lastRenderedPageBreak/>
-        <w:t xml:space="preserve">buttons are available to clear data for each channel independently ( </w:t>
+        <w:t xml:space="preserve">) to stop data collection. If you wish to clear the data during the experiment, there's no need to stop the measurement. At the bottom of the left menu, there are "Clear" buttons to erase both the data and current graphs. Four buttons are available to clear data for each channel independently ( </w:t>
       </w:r>
       <w:r>
         <w:rPr>
@@ -11980,7 +12868,7 @@
                     <pic:cNvPicPr/>
                   </pic:nvPicPr>
                   <pic:blipFill>
-                    <a:blip r:embed="rId60"/>
+                    <a:blip r:embed="rId59"/>
                     <a:stretch>
                       <a:fillRect/>
                     </a:stretch>
@@ -12031,7 +12919,7 @@
                     <pic:cNvPicPr/>
                   </pic:nvPicPr>
                   <pic:blipFill>
-                    <a:blip r:embed="rId61"/>
+                    <a:blip r:embed="rId60"/>
                     <a:stretch>
                       <a:fillRect/>
                     </a:stretch>
@@ -12082,7 +12970,7 @@
                     <pic:cNvPicPr/>
                   </pic:nvPicPr>
                   <pic:blipFill>
-                    <a:blip r:embed="rId62"/>
+                    <a:blip r:embed="rId61"/>
                     <a:stretch>
                       <a:fillRect/>
                     </a:stretch>
@@ -12133,7 +13021,7 @@
                     <pic:cNvPicPr/>
                   </pic:nvPicPr>
                   <pic:blipFill>
-                    <a:blip r:embed="rId63"/>
+                    <a:blip r:embed="rId62"/>
                     <a:stretch>
                       <a:fillRect/>
                     </a:stretch>
@@ -12210,6 +13098,7 @@
           <w:sz w:val="20"/>
           <w:szCs w:val="20"/>
         </w:rPr>
+        <w:lastRenderedPageBreak/>
         <w:drawing>
           <wp:inline distT="0" distB="0" distL="0" distR="0" wp14:anchorId="0624388F" wp14:editId="4FF96D9E">
             <wp:extent cx="5612130" cy="4074160"/>
@@ -12226,7 +13115,7 @@
                     <pic:cNvPicPr/>
                   </pic:nvPicPr>
                   <pic:blipFill>
-                    <a:blip r:embed="rId64"/>
+                    <a:blip r:embed="rId63"/>
                     <a:stretch>
                       <a:fillRect/>
                     </a:stretch>
@@ -12300,7 +13189,7 @@
                     <pic:cNvPicPr/>
                   </pic:nvPicPr>
                   <pic:blipFill>
-                    <a:blip r:embed="rId65"/>
+                    <a:blip r:embed="rId64"/>
                     <a:stretch>
                       <a:fillRect/>
                     </a:stretch>
@@ -12353,7 +13242,7 @@
                     <pic:cNvPicPr/>
                   </pic:nvPicPr>
                   <pic:blipFill>
-                    <a:blip r:embed="rId66"/>
+                    <a:blip r:embed="rId65"/>
                     <a:stretch>
                       <a:fillRect/>
                     </a:stretch>
@@ -12413,7 +13302,7 @@
                     <pic:cNvPicPr/>
                   </pic:nvPicPr>
                   <pic:blipFill>
-                    <a:blip r:embed="rId67"/>
+                    <a:blip r:embed="rId66"/>
                     <a:stretch>
                       <a:fillRect/>
                     </a:stretch>
@@ -12450,7 +13339,6 @@
         <w:rPr>
           <w:noProof/>
         </w:rPr>
-        <w:lastRenderedPageBreak/>
         <w:drawing>
           <wp:inline distT="0" distB="0" distL="0" distR="0" wp14:anchorId="5407C301" wp14:editId="4F823554">
             <wp:extent cx="2155466" cy="1221848"/>
@@ -12467,7 +13355,7 @@
                     <pic:cNvPicPr/>
                   </pic:nvPicPr>
                   <pic:blipFill>
-                    <a:blip r:embed="rId68"/>
+                    <a:blip r:embed="rId67"/>
                     <a:stretch>
                       <a:fillRect/>
                     </a:stretch>
@@ -12502,6 +13390,7 @@
           <w:sz w:val="20"/>
           <w:szCs w:val="20"/>
         </w:rPr>
+        <w:lastRenderedPageBreak/>
         <w:t>Files are saved in all operating systems in the "TempicoSoftwareData" folder within "Documents." By default, this folder is automatically created when the program is opened for the first time.</w:t>
       </w:r>
     </w:p>
@@ -12546,7 +13435,7 @@
                     <pic:cNvPicPr/>
                   </pic:nvPicPr>
                   <pic:blipFill>
-                    <a:blip r:embed="rId69"/>
+                    <a:blip r:embed="rId68"/>
                     <a:stretch>
                       <a:fillRect/>
                     </a:stretch>
@@ -12606,7 +13495,7 @@
                     <pic:cNvPicPr/>
                   </pic:nvPicPr>
                   <pic:blipFill>
-                    <a:blip r:embed="rId70"/>
+                    <a:blip r:embed="rId69"/>
                     <a:stretch>
                       <a:fillRect/>
                     </a:stretch>
@@ -12669,7 +13558,7 @@
                     <pic:cNvPicPr/>
                   </pic:nvPicPr>
                   <pic:blipFill>
-                    <a:blip r:embed="rId71"/>
+                    <a:blip r:embed="rId70"/>
                     <a:stretch>
                       <a:fillRect/>
                     </a:stretch>
@@ -12704,7 +13593,6 @@
           <w:sz w:val="20"/>
           <w:szCs w:val="20"/>
         </w:rPr>
-        <w:lastRenderedPageBreak/>
         <w:t xml:space="preserve">After selecting the format, click the "Accept" button ( </w:t>
       </w:r>
       <w:r>
@@ -12730,7 +13618,7 @@
                     <pic:cNvPicPr/>
                   </pic:nvPicPr>
                   <pic:blipFill>
-                    <a:blip r:embed="rId67"/>
+                    <a:blip r:embed="rId66"/>
                     <a:stretch>
                       <a:fillRect/>
                     </a:stretch>
@@ -12767,6 +13655,7 @@
         <w:rPr>
           <w:noProof/>
         </w:rPr>
+        <w:lastRenderedPageBreak/>
         <w:drawing>
           <wp:inline distT="0" distB="0" distL="0" distR="0" wp14:anchorId="07AEDE86" wp14:editId="2EE571CB">
             <wp:extent cx="3267531" cy="1486107"/>
@@ -12783,7 +13672,7 @@
                     <pic:cNvPicPr/>
                   </pic:nvPicPr>
                   <pic:blipFill>
-                    <a:blip r:embed="rId72"/>
+                    <a:blip r:embed="rId71"/>
                     <a:stretch>
                       <a:fillRect/>
                     </a:stretch>
@@ -12845,7 +13734,7 @@
                     <pic:cNvPicPr/>
                   </pic:nvPicPr>
                   <pic:blipFill>
-                    <a:blip r:embed="rId73"/>
+                    <a:blip r:embed="rId72"/>
                     <a:stretch>
                       <a:fillRect/>
                     </a:stretch>
@@ -12969,26 +13858,18 @@
           <w:sz w:val="20"/>
           <w:szCs w:val="20"/>
         </w:rPr>
-        <w:t xml:space="preserve">After selecting the channel, the bin width must be chosen, representing the histogram's bar width. For example, with a bin width of 12 ns, if there are two measurements at 1 ns and 5 ns, both will contribute to the same histogram bar's frequency. The number of bins prevents histogram saturation and usually limits the time axis range. For instance, selecting a bin width of 480 ps and 50 bins results in a 24 ns range. Unlike start-stop histograms, lifetime measurements are designed with a </w:t>
-      </w:r>
-      <w:r>
-        <w:rPr>
-          <w:rFonts w:ascii="Arial" w:hAnsi="Arial" w:cs="Arial"/>
-          <w:sz w:val="20"/>
-          <w:szCs w:val="20"/>
+        <w:t>After selecting the channel, the bin width must be chosen, representing the histogram's bar width. For example, with a bin width of 12 ns, if there are two measurements at 1 ns and 5 ns, both will contribute to the same histogram bar's frequency. The number of bins prevents histogram saturation and usually limits the time axis range. For instance, selecting a bin width of 480 ps and 50 bins results in a 24 ns range. Unlike start-stop histograms, lifetime measurements are designed with a limit, allowing the number of measurements to be specified. A measurement is counted when both start and stop channels record a value.</w:t>
+      </w:r>
+    </w:p>
+    <w:p>
+      <w:pPr>
+        <w:jc w:val="center"/>
+      </w:pPr>
+      <w:r>
+        <w:rPr>
+          <w:noProof/>
         </w:rPr>
         <w:lastRenderedPageBreak/>
-        <w:t>limit, allowing the number of measurements to be specified. A measurement is counted when both start and stop channels record a value.</w:t>
-      </w:r>
-    </w:p>
-    <w:p>
-      <w:pPr>
-        <w:jc w:val="center"/>
-      </w:pPr>
-      <w:r>
-        <w:rPr>
-          <w:noProof/>
-        </w:rPr>
         <w:drawing>
           <wp:inline distT="0" distB="0" distL="0" distR="0" wp14:anchorId="7DD77BA7" wp14:editId="5C716423">
             <wp:extent cx="2826937" cy="3584310"/>
@@ -13005,7 +13886,7 @@
                     <pic:cNvPicPr/>
                   </pic:nvPicPr>
                   <pic:blipFill>
-                    <a:blip r:embed="rId74"/>
+                    <a:blip r:embed="rId73"/>
                     <a:stretch>
                       <a:fillRect/>
                     </a:stretch>
@@ -13096,7 +13977,7 @@
                     <pic:cNvPicPr/>
                   </pic:nvPicPr>
                   <pic:blipFill>
-                    <a:blip r:embed="rId75"/>
+                    <a:blip r:embed="rId74"/>
                     <a:stretch>
                       <a:fillRect/>
                     </a:stretch>
@@ -13194,7 +14075,7 @@
                     <pic:cNvPicPr/>
                   </pic:nvPicPr>
                   <pic:blipFill>
-                    <a:blip r:embed="rId76"/>
+                    <a:blip r:embed="rId75"/>
                     <a:stretch>
                       <a:fillRect/>
                     </a:stretch>
@@ -13246,13 +14127,7 @@
         <w:t>To obtain more information about a measurement, the user can make a fit on the graph. When performing a fit, you get more detailed information about the parameters of the equation to be adjusted in the table in the upper right corner. It obtains their values, their standard deviation and their respective units.</w:t>
       </w:r>
     </w:p>
-    <w:p>
-      <w:pPr>
-        <w:rPr>
-          <w:lang w:val="es-CO"/>
-        </w:rPr>
-      </w:pPr>
-    </w:p>
+    <w:p/>
     <w:p>
       <w:pPr>
         <w:jc w:val="center"/>
@@ -13277,7 +14152,7 @@
                     <pic:cNvPicPr/>
                   </pic:nvPicPr>
                   <pic:blipFill>
-                    <a:blip r:embed="rId77"/>
+                    <a:blip r:embed="rId76"/>
                     <a:stretch>
                       <a:fillRect/>
                     </a:stretch>
@@ -13323,7 +14198,7 @@
                     <pic:cNvPicPr/>
                   </pic:nvPicPr>
                   <pic:blipFill>
-                    <a:blip r:embed="rId78"/>
+                    <a:blip r:embed="rId77"/>
                     <a:stretch>
                       <a:fillRect/>
                     </a:stretch>
@@ -13386,7 +14261,7 @@
                     <pic:cNvPicPr/>
                   </pic:nvPicPr>
                   <pic:blipFill>
-                    <a:blip r:embed="rId79"/>
+                    <a:blip r:embed="rId78"/>
                     <a:stretch>
                       <a:fillRect/>
                     </a:stretch>
@@ -14773,7 +15648,7 @@
                     <pic:cNvPicPr/>
                   </pic:nvPicPr>
                   <pic:blipFill>
-                    <a:blip r:embed="rId80"/>
+                    <a:blip r:embed="rId79"/>
                     <a:stretch>
                       <a:fillRect/>
                     </a:stretch>
@@ -14826,7 +15701,7 @@
                     <pic:cNvPicPr/>
                   </pic:nvPicPr>
                   <pic:blipFill rotWithShape="1">
-                    <a:blip r:embed="rId81"/>
+                    <a:blip r:embed="rId80"/>
                     <a:srcRect t="1869" b="1"/>
                     <a:stretch/>
                   </pic:blipFill>
@@ -14911,7 +15786,7 @@
                     <pic:cNvPicPr/>
                   </pic:nvPicPr>
                   <pic:blipFill>
-                    <a:blip r:embed="rId82"/>
+                    <a:blip r:embed="rId81"/>
                     <a:stretch>
                       <a:fillRect/>
                     </a:stretch>
@@ -14964,7 +15839,7 @@
                     <pic:cNvPicPr/>
                   </pic:nvPicPr>
                   <pic:blipFill>
-                    <a:blip r:embed="rId83"/>
+                    <a:blip r:embed="rId82"/>
                     <a:stretch>
                       <a:fillRect/>
                     </a:stretch>
@@ -15043,7 +15918,7 @@
                     <pic:cNvPicPr/>
                   </pic:nvPicPr>
                   <pic:blipFill>
-                    <a:blip r:embed="rId84"/>
+                    <a:blip r:embed="rId83"/>
                     <a:stretch>
                       <a:fillRect/>
                     </a:stretch>
@@ -15114,7 +15989,7 @@
                     <pic:cNvPicPr/>
                   </pic:nvPicPr>
                   <pic:blipFill>
-                    <a:blip r:embed="rId85"/>
+                    <a:blip r:embed="rId84"/>
                     <a:stretch>
                       <a:fillRect/>
                     </a:stretch>
@@ -15177,7 +16052,7 @@
                     <pic:cNvPicPr/>
                   </pic:nvPicPr>
                   <pic:blipFill>
-                    <a:blip r:embed="rId86"/>
+                    <a:blip r:embed="rId85"/>
                     <a:stretch>
                       <a:fillRect/>
                     </a:stretch>
@@ -15222,7 +16097,7 @@
                     <pic:cNvPicPr/>
                   </pic:nvPicPr>
                   <pic:blipFill>
-                    <a:blip r:embed="rId87"/>
+                    <a:blip r:embed="rId86"/>
                     <a:stretch>
                       <a:fillRect/>
                     </a:stretch>
@@ -15332,7 +16207,7 @@
                     </pic:cNvPicPr>
                   </pic:nvPicPr>
                   <pic:blipFill>
-                    <a:blip r:embed="rId88">
+                    <a:blip r:embed="rId87">
                       <a:extLst>
                         <a:ext uri="{28A0092B-C50C-407E-A947-70E740481C1C}">
                           <a14:useLocalDpi xmlns:a14="http://schemas.microsoft.com/office/drawing/2010/main" val="0"/>
@@ -15429,7 +16304,7 @@
                     <pic:cNvPicPr/>
                   </pic:nvPicPr>
                   <pic:blipFill>
-                    <a:blip r:embed="rId89"/>
+                    <a:blip r:embed="rId88"/>
                     <a:stretch>
                       <a:fillRect/>
                     </a:stretch>
@@ -15499,7 +16374,7 @@
                     <pic:cNvPicPr/>
                   </pic:nvPicPr>
                   <pic:blipFill>
-                    <a:blip r:embed="rId90"/>
+                    <a:blip r:embed="rId89"/>
                     <a:stretch>
                       <a:fillRect/>
                     </a:stretch>
@@ -15550,7 +16425,7 @@
                     <pic:cNvPicPr/>
                   </pic:nvPicPr>
                   <pic:blipFill>
-                    <a:blip r:embed="rId91"/>
+                    <a:blip r:embed="rId90"/>
                     <a:stretch>
                       <a:fillRect/>
                     </a:stretch>
@@ -15616,7 +16491,7 @@
                     <pic:cNvPicPr/>
                   </pic:nvPicPr>
                   <pic:blipFill>
-                    <a:blip r:embed="rId92"/>
+                    <a:blip r:embed="rId91"/>
                     <a:stretch>
                       <a:fillRect/>
                     </a:stretch>
@@ -15664,7 +16539,7 @@
                     <pic:cNvPicPr/>
                   </pic:nvPicPr>
                   <pic:blipFill>
-                    <a:blip r:embed="rId93"/>
+                    <a:blip r:embed="rId92"/>
                     <a:stretch>
                       <a:fillRect/>
                     </a:stretch>
@@ -15709,7 +16584,7 @@
                     <pic:cNvPicPr/>
                   </pic:nvPicPr>
                   <pic:blipFill>
-                    <a:blip r:embed="rId94"/>
+                    <a:blip r:embed="rId93"/>
                     <a:stretch>
                       <a:fillRect/>
                     </a:stretch>
@@ -15754,7 +16629,7 @@
                     <pic:cNvPicPr/>
                   </pic:nvPicPr>
                   <pic:blipFill>
-                    <a:blip r:embed="rId95"/>
+                    <a:blip r:embed="rId94"/>
                     <a:stretch>
                       <a:fillRect/>
                     </a:stretch>
@@ -15800,7 +16675,7 @@
                     <pic:cNvPicPr/>
                   </pic:nvPicPr>
                   <pic:blipFill>
-                    <a:blip r:embed="rId96"/>
+                    <a:blip r:embed="rId95"/>
                     <a:stretch>
                       <a:fillRect/>
                     </a:stretch>
@@ -15846,7 +16721,7 @@
                     <pic:cNvPicPr/>
                   </pic:nvPicPr>
                   <pic:blipFill>
-                    <a:blip r:embed="rId97"/>
+                    <a:blip r:embed="rId96"/>
                     <a:stretch>
                       <a:fillRect/>
                     </a:stretch>
@@ -15891,7 +16766,7 @@
                     <pic:cNvPicPr/>
                   </pic:nvPicPr>
                   <pic:blipFill>
-                    <a:blip r:embed="rId98"/>
+                    <a:blip r:embed="rId97"/>
                     <a:stretch>
                       <a:fillRect/>
                     </a:stretch>
@@ -15941,7 +16816,7 @@
                     <pic:cNvPicPr/>
                   </pic:nvPicPr>
                   <pic:blipFill rotWithShape="1">
-                    <a:blip r:embed="rId99"/>
+                    <a:blip r:embed="rId98"/>
                     <a:srcRect l="1604"/>
                     <a:stretch>
                       <a:fillRect/>
@@ -15995,7 +16870,7 @@
                     <pic:cNvPicPr/>
                   </pic:nvPicPr>
                   <pic:blipFill>
-                    <a:blip r:embed="rId100"/>
+                    <a:blip r:embed="rId99"/>
                     <a:stretch>
                       <a:fillRect/>
                     </a:stretch>
@@ -16043,7 +16918,7 @@
                     <pic:cNvPicPr/>
                   </pic:nvPicPr>
                   <pic:blipFill>
-                    <a:blip r:embed="rId101"/>
+                    <a:blip r:embed="rId100"/>
                     <a:stretch>
                       <a:fillRect/>
                     </a:stretch>
@@ -16103,7 +16978,7 @@
                     <pic:cNvPicPr/>
                   </pic:nvPicPr>
                   <pic:blipFill>
-                    <a:blip r:embed="rId102"/>
+                    <a:blip r:embed="rId101"/>
                     <a:stretch>
                       <a:fillRect/>
                     </a:stretch>
@@ -16148,7 +17023,7 @@
                     <pic:cNvPicPr/>
                   </pic:nvPicPr>
                   <pic:blipFill>
-                    <a:blip r:embed="rId103"/>
+                    <a:blip r:embed="rId102"/>
                     <a:stretch>
                       <a:fillRect/>
                     </a:stretch>
@@ -16199,7 +17074,7 @@
                     <pic:cNvPicPr/>
                   </pic:nvPicPr>
                   <pic:blipFill>
-                    <a:blip r:embed="rId104"/>
+                    <a:blip r:embed="rId103"/>
                     <a:stretch>
                       <a:fillRect/>
                     </a:stretch>
@@ -16244,7 +17119,7 @@
                     <pic:cNvPicPr/>
                   </pic:nvPicPr>
                   <pic:blipFill>
-                    <a:blip r:embed="rId105"/>
+                    <a:blip r:embed="rId104"/>
                     <a:stretch>
                       <a:fillRect/>
                     </a:stretch>
@@ -16295,7 +17170,7 @@
                     <pic:cNvPicPr/>
                   </pic:nvPicPr>
                   <pic:blipFill rotWithShape="1">
-                    <a:blip r:embed="rId106"/>
+                    <a:blip r:embed="rId105"/>
                     <a:srcRect t="901" b="-1"/>
                     <a:stretch>
                       <a:fillRect/>
@@ -16383,7 +17258,7 @@
                     <pic:cNvPicPr/>
                   </pic:nvPicPr>
                   <pic:blipFill>
-                    <a:blip r:embed="rId107"/>
+                    <a:blip r:embed="rId106"/>
                     <a:stretch>
                       <a:fillRect/>
                     </a:stretch>
@@ -16426,7 +17301,7 @@
                     <pic:cNvPicPr/>
                   </pic:nvPicPr>
                   <pic:blipFill>
-                    <a:blip r:embed="rId108"/>
+                    <a:blip r:embed="rId107"/>
                     <a:stretch>
                       <a:fillRect/>
                     </a:stretch>
@@ -16474,7 +17349,7 @@
                     <pic:cNvPicPr/>
                   </pic:nvPicPr>
                   <pic:blipFill>
-                    <a:blip r:embed="rId109"/>
+                    <a:blip r:embed="rId108"/>
                     <a:stretch>
                       <a:fillRect/>
                     </a:stretch>
@@ -16524,7 +17399,7 @@
                     <pic:cNvPicPr/>
                   </pic:nvPicPr>
                   <pic:blipFill>
-                    <a:blip r:embed="rId110"/>
+                    <a:blip r:embed="rId109"/>
                     <a:stretch>
                       <a:fillRect/>
                     </a:stretch>
@@ -16574,7 +17449,7 @@
                     <pic:cNvPicPr/>
                   </pic:nvPicPr>
                   <pic:blipFill>
-                    <a:blip r:embed="rId111"/>
+                    <a:blip r:embed="rId110"/>
                     <a:stretch>
                       <a:fillRect/>
                     </a:stretch>
@@ -16634,7 +17509,7 @@
                     <pic:cNvPicPr/>
                   </pic:nvPicPr>
                   <pic:blipFill>
-                    <a:blip r:embed="rId112"/>
+                    <a:blip r:embed="rId111"/>
                     <a:stretch>
                       <a:fillRect/>
                     </a:stretch>
@@ -16682,7 +17557,7 @@
                     <pic:cNvPicPr/>
                   </pic:nvPicPr>
                   <pic:blipFill>
-                    <a:blip r:embed="rId113"/>
+                    <a:blip r:embed="rId112"/>
                     <a:stretch>
                       <a:fillRect/>
                     </a:stretch>
@@ -16732,7 +17607,7 @@
                     <pic:cNvPicPr/>
                   </pic:nvPicPr>
                   <pic:blipFill>
-                    <a:blip r:embed="rId114"/>
+                    <a:blip r:embed="rId113"/>
                     <a:stretch>
                       <a:fillRect/>
                     </a:stretch>
@@ -16782,7 +17657,7 @@
                     <pic:cNvPicPr/>
                   </pic:nvPicPr>
                   <pic:blipFill>
-                    <a:blip r:embed="rId115"/>
+                    <a:blip r:embed="rId114"/>
                     <a:stretch>
                       <a:fillRect/>
                     </a:stretch>
@@ -16817,8 +17692,8 @@
           <w:szCs w:val="28"/>
         </w:rPr>
       </w:pPr>
-      <w:bookmarkStart w:id="54" w:name="_Toc186930452"/>
-      <w:bookmarkStart w:id="55" w:name="_Toc238168397"/>
+      <w:bookmarkStart w:id="54" w:name="_Toc238168397"/>
+      <w:bookmarkStart w:id="55" w:name="_Toc186930452"/>
       <w:r>
         <w:rPr>
           <w:rFonts w:ascii="Arial" w:hAnsi="Arial" w:cs="Arial"/>
@@ -16828,7 +17703,7 @@
         <w:lastRenderedPageBreak/>
         <w:t>Time stamping</w:t>
       </w:r>
-      <w:bookmarkEnd w:id="55"/>
+      <w:bookmarkEnd w:id="54"/>
     </w:p>
     <w:p>
       <w:pPr>
@@ -16943,7 +17818,7 @@
                     <pic:cNvPicPr/>
                   </pic:nvPicPr>
                   <pic:blipFill>
-                    <a:blip r:embed="rId116"/>
+                    <a:blip r:embed="rId115"/>
                     <a:stretch>
                       <a:fillRect/>
                     </a:stretch>
@@ -17005,7 +17880,7 @@
                     <pic:cNvPicPr/>
                   </pic:nvPicPr>
                   <pic:blipFill>
-                    <a:blip r:embed="rId117"/>
+                    <a:blip r:embed="rId116"/>
                     <a:stretch>
                       <a:fillRect/>
                     </a:stretch>
@@ -17094,7 +17969,7 @@
                     <pic:cNvPicPr/>
                   </pic:nvPicPr>
                   <pic:blipFill>
-                    <a:blip r:embed="rId118"/>
+                    <a:blip r:embed="rId117"/>
                     <a:stretch>
                       <a:fillRect/>
                     </a:stretch>
@@ -17177,7 +18052,7 @@
                     <pic:cNvPicPr/>
                   </pic:nvPicPr>
                   <pic:blipFill>
-                    <a:blip r:embed="rId119"/>
+                    <a:blip r:embed="rId118"/>
                     <a:stretch>
                       <a:fillRect/>
                     </a:stretch>
@@ -17280,7 +18155,7 @@
                     <pic:cNvPicPr/>
                   </pic:nvPicPr>
                   <pic:blipFill>
-                    <a:blip r:embed="rId120"/>
+                    <a:blip r:embed="rId119"/>
                     <a:stretch>
                       <a:fillRect/>
                     </a:stretch>
@@ -17412,7 +18287,7 @@
                     <pic:cNvPicPr/>
                   </pic:nvPicPr>
                   <pic:blipFill>
-                    <a:blip r:embed="rId121"/>
+                    <a:blip r:embed="rId120"/>
                     <a:stretch>
                       <a:fillRect/>
                     </a:stretch>
@@ -17499,7 +18374,7 @@
                     <pic:cNvPicPr/>
                   </pic:nvPicPr>
                   <pic:blipFill>
-                    <a:blip r:embed="rId122"/>
+                    <a:blip r:embed="rId121"/>
                     <a:stretch>
                       <a:fillRect/>
                     </a:stretch>
@@ -17619,7 +18494,7 @@
                     <pic:cNvPicPr/>
                   </pic:nvPicPr>
                   <pic:blipFill>
-                    <a:blip r:embed="rId123"/>
+                    <a:blip r:embed="rId122"/>
                     <a:stretch>
                       <a:fillRect/>
                     </a:stretch>
@@ -17672,7 +18547,7 @@
                     <pic:cNvPicPr/>
                   </pic:nvPicPr>
                   <pic:blipFill>
-                    <a:blip r:embed="rId124"/>
+                    <a:blip r:embed="rId123"/>
                     <a:stretch>
                       <a:fillRect/>
                     </a:stretch>
@@ -17756,7 +18631,7 @@
                     <pic:cNvPicPr/>
                   </pic:nvPicPr>
                   <pic:blipFill>
-                    <a:blip r:embed="rId125"/>
+                    <a:blip r:embed="rId124"/>
                     <a:stretch>
                       <a:fillRect/>
                     </a:stretch>
@@ -17829,7 +18704,7 @@
                     <pic:cNvPicPr/>
                   </pic:nvPicPr>
                   <pic:blipFill>
-                    <a:blip r:embed="rId126"/>
+                    <a:blip r:embed="rId125"/>
                     <a:stretch>
                       <a:fillRect/>
                     </a:stretch>
@@ -17960,7 +18835,7 @@
                     <pic:cNvPicPr/>
                   </pic:nvPicPr>
                   <pic:blipFill>
-                    <a:blip r:embed="rId127"/>
+                    <a:blip r:embed="rId126"/>
                     <a:stretch>
                       <a:fillRect/>
                     </a:stretch>
@@ -18062,7 +18937,7 @@
                     <pic:cNvPicPr/>
                   </pic:nvPicPr>
                   <pic:blipFill>
-                    <a:blip r:embed="rId128"/>
+                    <a:blip r:embed="rId127"/>
                     <a:stretch>
                       <a:fillRect/>
                     </a:stretch>
@@ -18171,7 +19046,7 @@
                     <pic:cNvPicPr/>
                   </pic:nvPicPr>
                   <pic:blipFill>
-                    <a:blip r:embed="rId129"/>
+                    <a:blip r:embed="rId128"/>
                     <a:stretch>
                       <a:fillRect/>
                     </a:stretch>
@@ -18257,7 +19132,7 @@
                     <pic:cNvPicPr/>
                   </pic:nvPicPr>
                   <pic:blipFill>
-                    <a:blip r:embed="rId130"/>
+                    <a:blip r:embed="rId129"/>
                     <a:stretch>
                       <a:fillRect/>
                     </a:stretch>
@@ -18321,7 +19196,7 @@
                     <pic:cNvPicPr/>
                   </pic:nvPicPr>
                   <pic:blipFill>
-                    <a:blip r:embed="rId131"/>
+                    <a:blip r:embed="rId130"/>
                     <a:stretch>
                       <a:fillRect/>
                     </a:stretch>
@@ -18374,7 +19249,7 @@
                     <pic:cNvPicPr/>
                   </pic:nvPicPr>
                   <pic:blipFill>
-                    <a:blip r:embed="rId132"/>
+                    <a:blip r:embed="rId131"/>
                     <a:stretch>
                       <a:fillRect/>
                     </a:stretch>
@@ -18477,7 +19352,7 @@
                     <pic:cNvPicPr/>
                   </pic:nvPicPr>
                   <pic:blipFill>
-                    <a:blip r:embed="rId133"/>
+                    <a:blip r:embed="rId132"/>
                     <a:stretch>
                       <a:fillRect/>
                     </a:stretch>
@@ -18530,7 +19405,7 @@
                     <pic:cNvPicPr/>
                   </pic:nvPicPr>
                   <pic:blipFill>
-                    <a:blip r:embed="rId127"/>
+                    <a:blip r:embed="rId126"/>
                     <a:stretch>
                       <a:fillRect/>
                     </a:stretch>
@@ -18608,7 +19483,7 @@
                     <pic:cNvPicPr/>
                   </pic:nvPicPr>
                   <pic:blipFill>
-                    <a:blip r:embed="rId134"/>
+                    <a:blip r:embed="rId133"/>
                     <a:stretch>
                       <a:fillRect/>
                     </a:stretch>
@@ -18697,7 +19572,7 @@
                     <pic:cNvPicPr/>
                   </pic:nvPicPr>
                   <pic:blipFill>
-                    <a:blip r:embed="rId135"/>
+                    <a:blip r:embed="rId134"/>
                     <a:stretch>
                       <a:fillRect/>
                     </a:stretch>
@@ -18776,7 +19651,7 @@
                     <pic:cNvPicPr/>
                   </pic:nvPicPr>
                   <pic:blipFill>
-                    <a:blip r:embed="rId136"/>
+                    <a:blip r:embed="rId135"/>
                     <a:stretch>
                       <a:fillRect/>
                     </a:stretch>
@@ -18856,7 +19731,7 @@
                     <pic:cNvPicPr/>
                   </pic:nvPicPr>
                   <pic:blipFill>
-                    <a:blip r:embed="rId137"/>
+                    <a:blip r:embed="rId136"/>
                     <a:stretch>
                       <a:fillRect/>
                     </a:stretch>
@@ -18926,7 +19801,7 @@
                     <pic:cNvPicPr/>
                   </pic:nvPicPr>
                   <pic:blipFill>
-                    <a:blip r:embed="rId138"/>
+                    <a:blip r:embed="rId137"/>
                     <a:stretch>
                       <a:fillRect/>
                     </a:stretch>
@@ -19077,7 +19952,7 @@
                     <pic:cNvPicPr/>
                   </pic:nvPicPr>
                   <pic:blipFill>
-                    <a:blip r:embed="rId139"/>
+                    <a:blip r:embed="rId138"/>
                     <a:stretch>
                       <a:fillRect/>
                     </a:stretch>
@@ -19178,7 +20053,7 @@
                     <pic:cNvPicPr/>
                   </pic:nvPicPr>
                   <pic:blipFill>
-                    <a:blip r:embed="rId140">
+                    <a:blip r:embed="rId139">
                       <a:extLst>
                         <a:ext uri="{28A0092B-C50C-407E-A947-70E740481C1C}">
                           <a14:useLocalDpi xmlns:a14="http://schemas.microsoft.com/office/drawing/2010/main" val="0"/>
@@ -19259,7 +20134,7 @@
                     <pic:cNvPicPr/>
                   </pic:nvPicPr>
                   <pic:blipFill>
-                    <a:blip r:embed="rId141"/>
+                    <a:blip r:embed="rId140"/>
                     <a:stretch>
                       <a:fillRect/>
                     </a:stretch>
@@ -19371,7 +20246,7 @@
                     </pic:cNvPicPr>
                   </pic:nvPicPr>
                   <pic:blipFill>
-                    <a:blip r:embed="rId142">
+                    <a:blip r:embed="rId141">
                       <a:extLst>
                         <a:ext uri="{28A0092B-C50C-407E-A947-70E740481C1C}">
                           <a14:useLocalDpi xmlns:a14="http://schemas.microsoft.com/office/drawing/2010/main" val="0"/>
@@ -19466,7 +20341,7 @@
                     </pic:cNvPicPr>
                   </pic:nvPicPr>
                   <pic:blipFill>
-                    <a:blip r:embed="rId143">
+                    <a:blip r:embed="rId142">
                       <a:extLst>
                         <a:ext uri="{28A0092B-C50C-407E-A947-70E740481C1C}">
                           <a14:useLocalDpi xmlns:a14="http://schemas.microsoft.com/office/drawing/2010/main" val="0"/>
@@ -19592,7 +20467,7 @@
                     <pic:cNvPicPr/>
                   </pic:nvPicPr>
                   <pic:blipFill>
-                    <a:blip r:embed="rId144"/>
+                    <a:blip r:embed="rId143"/>
                     <a:stretch>
                       <a:fillRect/>
                     </a:stretch>
@@ -22220,7 +23095,7 @@
                       <w:rPr>
                         <w:rFonts w:ascii="Cambria Math" w:hAnsi="Cambria Math"/>
                       </w:rPr>
-                      <m:t>a</m:t>
+                      <m:t>α</m:t>
                     </m:r>
                   </m:e>
                   <m:sub>
@@ -22527,7 +23402,7 @@
                       <w:rPr>
                         <w:rFonts w:ascii="Cambria Math" w:hAnsi="Cambria Math"/>
                       </w:rPr>
-                      <m:t>a</m:t>
+                      <m:t>α</m:t>
                     </m:r>
                   </m:e>
                   <m:sub>
@@ -22822,6 +23697,12 @@
       </w:r>
     </w:p>
     <w:p>
+      <w:pPr>
+        <w:rPr>
+          <w:rFonts w:eastAsiaTheme="minorEastAsia"/>
+          <w:iCs/>
+        </w:rPr>
+      </w:pPr>
       <w:r>
         <w:t xml:space="preserve">Models two diffusing species with different mobilities, such as free dye and dye bound to a larger complex. The fitted parameters are N, the diffusion times of each species </w:t>
       </w:r>
@@ -22874,7 +23755,151 @@
         <w:rPr>
           <w:iCs/>
         </w:rPr>
-        <w:t>, and the structure parameter a.</w:t>
+        <w:t>,</w:t>
+      </w:r>
+      <w:r>
+        <w:rPr>
+          <w:iCs/>
+        </w:rPr>
+        <w:t xml:space="preserve"> </w:t>
+      </w:r>
+      <w:r>
+        <w:rPr>
+          <w:iCs/>
+        </w:rPr>
+        <w:t>the amplitude fraction of the second species</w:t>
+      </w:r>
+      <w:r>
+        <w:rPr>
+          <w:iCs/>
+        </w:rPr>
+        <w:t xml:space="preserve"> </w:t>
+      </w:r>
+      <m:oMath>
+        <m:sSub>
+          <m:sSubPr>
+            <m:ctrlPr>
+              <w:rPr>
+                <w:rFonts w:ascii="Cambria Math" w:hAnsi="Cambria Math"/>
+                <w:i/>
+                <w:iCs/>
+                <w:vertAlign w:val="subscript"/>
+              </w:rPr>
+            </m:ctrlPr>
+          </m:sSubPr>
+          <m:e>
+            <m:r>
+              <w:rPr>
+                <w:rFonts w:ascii="Cambria Math" w:hAnsi="Cambria Math"/>
+              </w:rPr>
+              <m:t>α</m:t>
+            </m:r>
+            <m:ctrlPr>
+              <w:rPr>
+                <w:rFonts w:ascii="Cambria Math" w:hAnsi="Cambria Math"/>
+                <w:i/>
+                <w:iCs/>
+              </w:rPr>
+            </m:ctrlPr>
+          </m:e>
+          <m:sub>
+            <m:r>
+              <w:rPr>
+                <w:rFonts w:ascii="Cambria Math" w:hAnsi="Cambria Math"/>
+                <w:vertAlign w:val="subscript"/>
+              </w:rPr>
+              <m:t>1</m:t>
+            </m:r>
+          </m:sub>
+        </m:sSub>
+      </m:oMath>
+      <w:r>
+        <w:rPr>
+          <w:iCs/>
+        </w:rPr>
+        <w:t xml:space="preserve">, calculated as </w:t>
+      </w:r>
+      <m:oMath>
+        <m:sSub>
+          <m:sSubPr>
+            <m:ctrlPr>
+              <w:rPr>
+                <w:rFonts w:ascii="Cambria Math" w:hAnsi="Cambria Math"/>
+                <w:i/>
+                <w:iCs/>
+              </w:rPr>
+            </m:ctrlPr>
+          </m:sSubPr>
+          <m:e>
+            <m:r>
+              <w:rPr>
+                <w:rFonts w:ascii="Cambria Math" w:hAnsi="Cambria Math"/>
+              </w:rPr>
+              <m:t>α</m:t>
+            </m:r>
+          </m:e>
+          <m:sub>
+            <m:r>
+              <w:rPr>
+                <w:rFonts w:ascii="Cambria Math" w:hAnsi="Cambria Math"/>
+                <w:vertAlign w:val="subscript"/>
+              </w:rPr>
+              <m:t>2</m:t>
+            </m:r>
+          </m:sub>
+        </m:sSub>
+        <m:r>
+          <w:rPr>
+            <w:rFonts w:ascii="Cambria Math" w:hAnsi="Cambria Math"/>
+          </w:rPr>
+          <m:t xml:space="preserve">=1- </m:t>
+        </m:r>
+        <m:sSub>
+          <m:sSubPr>
+            <m:ctrlPr>
+              <w:rPr>
+                <w:rFonts w:ascii="Cambria Math" w:hAnsi="Cambria Math"/>
+                <w:i/>
+                <w:iCs/>
+              </w:rPr>
+            </m:ctrlPr>
+          </m:sSubPr>
+          <m:e>
+            <m:r>
+              <w:rPr>
+                <w:rFonts w:ascii="Cambria Math" w:hAnsi="Cambria Math"/>
+              </w:rPr>
+              <m:t>α</m:t>
+            </m:r>
+          </m:e>
+          <m:sub>
+            <m:r>
+              <w:rPr>
+                <w:rFonts w:ascii="Cambria Math" w:hAnsi="Cambria Math"/>
+                <w:vertAlign w:val="subscript"/>
+              </w:rPr>
+              <m:t>1</m:t>
+            </m:r>
+          </m:sub>
+        </m:sSub>
+      </m:oMath>
+      <w:r>
+        <w:rPr>
+          <w:iCs/>
+        </w:rPr>
+        <w:t>,</w:t>
+      </w:r>
+      <w:r>
+        <w:rPr>
+          <w:iCs/>
+        </w:rPr>
+        <w:t xml:space="preserve"> </w:t>
+      </w:r>
+      <w:r>
+        <w:rPr>
+          <w:iCs/>
+        </w:rPr>
+        <w:t>and the structure parameter a.</w:t>
       </w:r>
     </w:p>
     <w:p>
@@ -22902,7 +23927,11 @@
         <w:t>Once the measurement finishes, the Save Data File button is enabled. Clicking it opens a dialog window where the user</w:t>
       </w:r>
       <w:r>
-        <w:t xml:space="preserve"> selects the file format: .txt, .csv, or .dat.  Two files are generated: one containing the </w:t>
+        <w:t xml:space="preserve"> selects the file format: .txt, .csv, or .dat.  Two files are </w:t>
+      </w:r>
+      <w:r>
+        <w:lastRenderedPageBreak/>
+        <w:t xml:space="preserve">generated: one containing the </w:t>
       </w:r>
       <w:r>
         <w:rPr>
@@ -22926,14 +23955,7 @@
         <w:rPr>
           <w:iCs/>
         </w:rPr>
-        <w:t xml:space="preserve">) pairs of the autocorrelation curve, and another with the </w:t>
-      </w:r>
-      <w:r>
-        <w:rPr>
-          <w:iCs/>
-        </w:rPr>
-        <w:lastRenderedPageBreak/>
-        <w:t>measurement window, the device model, the correlator parameters, and the selected stop channel; if a fit was performed, the fit model, its equation, and the resulting parameters values are also included in the leader.</w:t>
+        <w:t>) pairs of the autocorrelation curve, and another with the measurement window, the device model, the correlator parameters, and the selected stop channel; if a fit was performed, the fit model, its equation, and the resulting parameters values are also included in the leader.</w:t>
       </w:r>
     </w:p>
     <w:p>
@@ -22964,7 +23986,7 @@
                     <pic:cNvPicPr/>
                   </pic:nvPicPr>
                   <pic:blipFill>
-                    <a:blip r:embed="rId145"/>
+                    <a:blip r:embed="rId144"/>
                     <a:stretch>
                       <a:fillRect/>
                     </a:stretch>
@@ -23021,7 +24043,7 @@
                     <pic:cNvPicPr/>
                   </pic:nvPicPr>
                   <pic:blipFill>
-                    <a:blip r:embed="rId146"/>
+                    <a:blip r:embed="rId145"/>
                     <a:stretch>
                       <a:fillRect/>
                     </a:stretch>
@@ -23070,7 +24092,7 @@
                     <pic:cNvPicPr/>
                   </pic:nvPicPr>
                   <pic:blipFill>
-                    <a:blip r:embed="rId147"/>
+                    <a:blip r:embed="rId146"/>
                     <a:stretch>
                       <a:fillRect/>
                     </a:stretch>
@@ -23127,7 +24149,7 @@
                     <pic:cNvPicPr/>
                   </pic:nvPicPr>
                   <pic:blipFill>
-                    <a:blip r:embed="rId148"/>
+                    <a:blip r:embed="rId147"/>
                     <a:stretch>
                       <a:fillRect/>
                     </a:stretch>
@@ -23195,7 +24217,7 @@
                     <pic:cNvPicPr/>
                   </pic:nvPicPr>
                   <pic:blipFill>
-                    <a:blip r:embed="rId149"/>
+                    <a:blip r:embed="rId148"/>
                     <a:stretch>
                       <a:fillRect/>
                     </a:stretch>
@@ -23252,7 +24274,7 @@
                     <pic:cNvPicPr/>
                   </pic:nvPicPr>
                   <pic:blipFill>
-                    <a:blip r:embed="rId150"/>
+                    <a:blip r:embed="rId149"/>
                     <a:stretch>
                       <a:fillRect/>
                     </a:stretch>
@@ -23310,7 +24332,7 @@
                     <pic:cNvPicPr/>
                   </pic:nvPicPr>
                   <pic:blipFill rotWithShape="1">
-                    <a:blip r:embed="rId151"/>
+                    <a:blip r:embed="rId150"/>
                     <a:srcRect t="13762" b="11264"/>
                     <a:stretch>
                       <a:fillRect/>
@@ -23458,6 +24480,12 @@
         <w:t>(2)</w:t>
       </w:r>
       <w:r>
+        <w:rPr>
+          <w:vertAlign w:val="superscript"/>
+        </w:rPr>
+        <w:t xml:space="preserve"> </w:t>
+      </w:r>
+      <w:r>
         <w:t>(HBT) tab allows the user to compute the second-order intensity correlation function g</w:t>
       </w:r>
       <w:r>
@@ -23537,7 +24565,7 @@
                     <pic:cNvPicPr/>
                   </pic:nvPicPr>
                   <pic:blipFill>
-                    <a:blip r:embed="rId152">
+                    <a:blip r:embed="rId151">
                       <a:extLst>
                         <a:ext uri="{28A0092B-C50C-407E-A947-70E740481C1C}">
                           <a14:useLocalDpi xmlns:a14="http://schemas.microsoft.com/office/drawing/2010/main" val="0"/>
@@ -23612,7 +24640,7 @@
                     <pic:cNvPicPr/>
                   </pic:nvPicPr>
                   <pic:blipFill>
-                    <a:blip r:embed="rId153"/>
+                    <a:blip r:embed="rId152"/>
                     <a:stretch>
                       <a:fillRect/>
                     </a:stretch>
@@ -23697,7 +24725,7 @@
                     </pic:cNvPicPr>
                   </pic:nvPicPr>
                   <pic:blipFill>
-                    <a:blip r:embed="rId154">
+                    <a:blip r:embed="rId153">
                       <a:extLst>
                         <a:ext uri="{28A0092B-C50C-407E-A947-70E740481C1C}">
                           <a14:useLocalDpi xmlns:a14="http://schemas.microsoft.com/office/drawing/2010/main" val="0"/>
@@ -23775,7 +24803,7 @@
                     </pic:cNvPicPr>
                   </pic:nvPicPr>
                   <pic:blipFill>
-                    <a:blip r:embed="rId155">
+                    <a:blip r:embed="rId154">
                       <a:extLst>
                         <a:ext uri="{28A0092B-C50C-407E-A947-70E740481C1C}">
                           <a14:useLocalDpi xmlns:a14="http://schemas.microsoft.com/office/drawing/2010/main" val="0"/>
@@ -23885,7 +24913,7 @@
                     </pic:cNvPicPr>
                   </pic:nvPicPr>
                   <pic:blipFill>
-                    <a:blip r:embed="rId156">
+                    <a:blip r:embed="rId155">
                       <a:extLst>
                         <a:ext uri="{28A0092B-C50C-407E-A947-70E740481C1C}">
                           <a14:useLocalDpi xmlns:a14="http://schemas.microsoft.com/office/drawing/2010/main" val="0"/>
@@ -25441,7 +26469,7 @@
                     <pic:cNvPicPr/>
                   </pic:nvPicPr>
                   <pic:blipFill>
-                    <a:blip r:embed="rId145"/>
+                    <a:blip r:embed="rId144"/>
                     <a:stretch>
                       <a:fillRect/>
                     </a:stretch>
@@ -25486,7 +26514,7 @@
                     <pic:cNvPicPr/>
                   </pic:nvPicPr>
                   <pic:blipFill>
-                    <a:blip r:embed="rId157"/>
+                    <a:blip r:embed="rId156"/>
                     <a:stretch>
                       <a:fillRect/>
                     </a:stretch>
@@ -25532,7 +26560,7 @@
                     <pic:cNvPicPr/>
                   </pic:nvPicPr>
                   <pic:blipFill>
-                    <a:blip r:embed="rId158"/>
+                    <a:blip r:embed="rId157"/>
                     <a:stretch>
                       <a:fillRect/>
                     </a:stretch>
@@ -25578,7 +26606,7 @@
                     <pic:cNvPicPr/>
                   </pic:nvPicPr>
                   <pic:blipFill>
-                    <a:blip r:embed="rId159"/>
+                    <a:blip r:embed="rId158"/>
                     <a:stretch>
                       <a:fillRect/>
                     </a:stretch>
@@ -25628,7 +26656,7 @@
                     <pic:cNvPicPr/>
                   </pic:nvPicPr>
                   <pic:blipFill>
-                    <a:blip r:embed="rId149"/>
+                    <a:blip r:embed="rId148"/>
                     <a:stretch>
                       <a:fillRect/>
                     </a:stretch>
@@ -25675,7 +26703,7 @@
                     </pic:cNvPicPr>
                   </pic:nvPicPr>
                   <pic:blipFill>
-                    <a:blip r:embed="rId160">
+                    <a:blip r:embed="rId159">
                       <a:extLst>
                         <a:ext uri="{28A0092B-C50C-407E-A947-70E740481C1C}">
                           <a14:useLocalDpi xmlns:a14="http://schemas.microsoft.com/office/drawing/2010/main" val="0"/>
@@ -25717,7 +26745,7 @@
         </w:rPr>
         <w:lastRenderedPageBreak/>
         <w:drawing>
-          <wp:inline distT="0" distB="0" distL="0" distR="0" wp14:anchorId="4B84BFFA" wp14:editId="4AA5B455">
+          <wp:inline distT="0" distB="0" distL="0" distR="0" wp14:anchorId="4B84BFFA" wp14:editId="28B5204F">
             <wp:extent cx="5522026" cy="2269490"/>
             <wp:effectExtent l="0" t="0" r="2540" b="0"/>
             <wp:docPr id="934478524" name="Imagen 13"/>
@@ -25734,7 +26762,7 @@
                     </pic:cNvPicPr>
                   </pic:nvPicPr>
                   <pic:blipFill rotWithShape="1">
-                    <a:blip r:embed="rId161" cstate="print">
+                    <a:blip r:embed="rId160" cstate="print">
                       <a:extLst>
                         <a:ext uri="{28A0092B-C50C-407E-A947-70E740481C1C}">
                           <a14:useLocalDpi xmlns:a14="http://schemas.microsoft.com/office/drawing/2010/main" val="0"/>
@@ -25816,7 +26844,7 @@
           <w:szCs w:val="20"/>
         </w:rPr>
       </w:pPr>
-      <w:hyperlink r:id="rId162" w:history="1">
+      <w:hyperlink r:id="rId161" w:history="1">
         <w:r>
           <w:rPr>
             <w:rStyle w:val="Hipervnculo"/>
@@ -25864,7 +26892,7 @@
         </w:rPr>
         <w:t xml:space="preserve">Your computer may automatically download and install from the Internet the required drivers once you connect your Tausand Tempico device to a USB port. If you require to install them manually, they are available at </w:t>
       </w:r>
-      <w:hyperlink r:id="rId163" w:history="1">
+      <w:hyperlink r:id="rId162" w:history="1">
         <w:r>
           <w:rPr>
             <w:rStyle w:val="Hipervnculo"/>
@@ -25912,7 +26940,7 @@
         </w:rPr>
         <w:t>Technical support</w:t>
       </w:r>
-      <w:bookmarkEnd w:id="54"/>
+      <w:bookmarkEnd w:id="55"/>
       <w:bookmarkEnd w:id="84"/>
     </w:p>
     <w:p>
@@ -25931,7 +26959,7 @@
         </w:rPr>
         <w:t xml:space="preserve">For technical support, contact us at </w:t>
       </w:r>
-      <w:hyperlink r:id="rId164" w:history="1">
+      <w:hyperlink r:id="rId163" w:history="1">
         <w:r>
           <w:rPr>
             <w:rStyle w:val="Hipervnculo"/>
@@ -25976,7 +27004,7 @@
           <w:szCs w:val="20"/>
         </w:rPr>
       </w:pPr>
-      <w:hyperlink r:id="rId165" w:history="1">
+      <w:hyperlink r:id="rId164" w:history="1">
         <w:r>
           <w:rPr>
             <w:rStyle w:val="Hipervnculo"/>
@@ -26004,7 +27032,7 @@
       </w:pPr>
     </w:p>
     <w:sectPr>
-      <w:headerReference w:type="default" r:id="rId166"/>
+      <w:headerReference w:type="default" r:id="rId165"/>
       <w:pgSz w:w="12240" w:h="15840"/>
       <w:pgMar w:top="1417" w:right="1701" w:bottom="1417" w:left="1701" w:header="708" w:footer="708" w:gutter="0"/>
       <w:cols w:space="708"/>
@@ -26016,7 +27044,7 @@
 </file>
 
 <file path=word/endnotes.xml><?xml version="1.0" encoding="utf-8"?>
-<w:endnotes xmlns:wpc="http://schemas.microsoft.com/office/word/2010/wordprocessingCanvas" xmlns:cx="http://schemas.microsoft.com/office/drawing/2014/chartex" xmlns:cx1="http://schemas.microsoft.com/office/drawing/2015/9/8/chartex" xmlns:cx2="http://schemas.microsoft.com/office/drawing/2015/10/21/chartex" xmlns:cx3="http://schemas.microsoft.com/office/drawing/2016/5/9/chartex" xmlns:cx4="http://schemas.microsoft.com/office/drawing/2016/5/10/chartex" xmlns:cx5="http://schemas.microsoft.com/office/drawing/2016/5/11/chartex" xmlns:cx6="http://schemas.microsoft.com/office/drawing/2016/5/12/chartex" xmlns:cx7="http://schemas.microsoft.com/office/drawing/2016/5/13/chartex" xmlns:cx8="http://schemas.microsoft.com/office/drawing/2016/5/14/chartex" xmlns:mc="http://schemas.openxmlformats.org/markup-compatibility/2006" xmlns:aink="http://schemas.microsoft.com/office/drawing/2016/ink" xmlns:am3d="http://schemas.microsoft.com/office/drawing/2017/model3d" xmlns:o="urn:schemas-microsoft-com:office:office" xmlns:oel="http://schemas.microsoft.com/office/2019/extlst" xmlns:r="http://schemas.openxmlformats.org/officeDocument/2006/relationships" xmlns:m="http://schemas.openxmlformats.org/officeDocument/2006/math" xmlns:v="urn:schemas-microsoft-com:vml" xmlns:wp14="http://schemas.microsoft.com/office/word/2010/wordprocessingDrawing" xmlns:wp="http://schemas.openxmlformats.org/drawingml/2006/wordprocessingDrawing" xmlns:w10="urn:schemas-microsoft-com:office:word" xmlns:w="http://schemas.openxmlformats.org/wordprocessingml/2006/main" xmlns:w14="http://schemas.microsoft.com/office/word/2010/wordml" xmlns:w15="http://schemas.microsoft.com/office/word/2012/wordml" xmlns:w16cei="http://schemas.microsoft.com/office/word/2026/wordml/cei" xmlns:w16cex="http://schemas.microsoft.com/office/word/2018/wordml/cex" xmlns:w16cid="http://schemas.microsoft.com/office/word/2016/wordml/cid" xmlns:w16="http://schemas.microsoft.com/office/word/2018/wordml" xmlns:w16du="http://schemas.microsoft.com/office/word/2023/wordml/word16du" xmlns:w16sdtdh="http://schemas.microsoft.com/office/word/2020/wordml/sdtdatahash" xmlns:w16sdtfl="http://schemas.microsoft.com/office/word/2024/wordml/sdtformatlock" xmlns:w16se="http://schemas.microsoft.com/office/word/2015/wordml/symex" xmlns:wpg="http://schemas.microsoft.com/office/word/2010/wordprocessingGroup" xmlns:wpi="http://schemas.microsoft.com/office/word/2010/wordprocessingInk" xmlns:wne="http://schemas.microsoft.com/office/word/2006/wordml" xmlns:wps="http://schemas.microsoft.com/office/word/2010/wordprocessingShape" mc:Ignorable="w14 w15 w16se w16cid w16 w16cex w16sdtdh w16sdtfl w16du wp14">
+<w:endnotes xmlns:wpc="http://schemas.microsoft.com/office/word/2010/wordprocessingCanvas" xmlns:cx="http://schemas.microsoft.com/office/drawing/2014/chartex" xmlns:cx1="http://schemas.microsoft.com/office/drawing/2015/9/8/chartex" xmlns:cx2="http://schemas.microsoft.com/office/drawing/2015/10/21/chartex" xmlns:cx3="http://schemas.microsoft.com/office/drawing/2016/5/9/chartex" xmlns:cx4="http://schemas.microsoft.com/office/drawing/2016/5/10/chartex" xmlns:cx5="http://schemas.microsoft.com/office/drawing/2016/5/11/chartex" xmlns:cx6="http://schemas.microsoft.com/office/drawing/2016/5/12/chartex" xmlns:cx7="http://schemas.microsoft.com/office/drawing/2016/5/13/chartex" xmlns:cx8="http://schemas.microsoft.com/office/drawing/2016/5/14/chartex" xmlns:mc="http://schemas.openxmlformats.org/markup-compatibility/2006" xmlns:aink="http://schemas.microsoft.com/office/drawing/2016/ink" xmlns:am3d="http://schemas.microsoft.com/office/drawing/2017/model3d" xmlns:o="urn:schemas-microsoft-com:office:office" xmlns:oel="http://schemas.microsoft.com/office/2019/extlst" xmlns:r="http://schemas.openxmlformats.org/officeDocument/2006/relationships" xmlns:m="http://schemas.openxmlformats.org/officeDocument/2006/math" xmlns:v="urn:schemas-microsoft-com:vml" xmlns:wp14="http://schemas.microsoft.com/office/word/2010/wordprocessingDrawing" xmlns:wp="http://schemas.openxmlformats.org/drawingml/2006/wordprocessingDrawing" xmlns:w10="urn:schemas-microsoft-com:office:word" xmlns:w="http://schemas.openxmlformats.org/wordprocessingml/2006/main" xmlns:w14="http://schemas.microsoft.com/office/word/2010/wordml" xmlns:w15="http://schemas.microsoft.com/office/word/2012/wordml" xmlns:w16cex="http://schemas.microsoft.com/office/word/2018/wordml/cex" xmlns:w16cid="http://schemas.microsoft.com/office/word/2016/wordml/cid" xmlns:w16="http://schemas.microsoft.com/office/word/2018/wordml" xmlns:w16du="http://schemas.microsoft.com/office/word/2023/wordml/word16du" xmlns:w16sdtdh="http://schemas.microsoft.com/office/word/2020/wordml/sdtdatahash" xmlns:w16sdtfl="http://schemas.microsoft.com/office/word/2024/wordml/sdtformatlock" xmlns:w16se="http://schemas.microsoft.com/office/word/2015/wordml/symex" xmlns:wpg="http://schemas.microsoft.com/office/word/2010/wordprocessingGroup" xmlns:wpi="http://schemas.microsoft.com/office/word/2010/wordprocessingInk" xmlns:wne="http://schemas.microsoft.com/office/word/2006/wordml" xmlns:wps="http://schemas.microsoft.com/office/word/2010/wordprocessingShape" mc:Ignorable="w14 w15 w16se w16cid w16 w16cex w16sdtdh w16sdtfl w16du wp14">
   <w:endnote w:type="separator" w:id="-1">
     <w:p>
       <w:pPr>
@@ -26041,7 +27069,7 @@
 </file>
 
 <file path=word/footnotes.xml><?xml version="1.0" encoding="utf-8"?>
-<w:footnotes xmlns:wpc="http://schemas.microsoft.com/office/word/2010/wordprocessingCanvas" xmlns:cx="http://schemas.microsoft.com/office/drawing/2014/chartex" xmlns:cx1="http://schemas.microsoft.com/office/drawing/2015/9/8/chartex" xmlns:cx2="http://schemas.microsoft.com/office/drawing/2015/10/21/chartex" xmlns:cx3="http://schemas.microsoft.com/office/drawing/2016/5/9/chartex" xmlns:cx4="http://schemas.microsoft.com/office/drawing/2016/5/10/chartex" xmlns:cx5="http://schemas.microsoft.com/office/drawing/2016/5/11/chartex" xmlns:cx6="http://schemas.microsoft.com/office/drawing/2016/5/12/chartex" xmlns:cx7="http://schemas.microsoft.com/office/drawing/2016/5/13/chartex" xmlns:cx8="http://schemas.microsoft.com/office/drawing/2016/5/14/chartex" xmlns:mc="http://schemas.openxmlformats.org/markup-compatibility/2006" xmlns:aink="http://schemas.microsoft.com/office/drawing/2016/ink" xmlns:am3d="http://schemas.microsoft.com/office/drawing/2017/model3d" xmlns:o="urn:schemas-microsoft-com:office:office" xmlns:oel="http://schemas.microsoft.com/office/2019/extlst" xmlns:r="http://schemas.openxmlformats.org/officeDocument/2006/relationships" xmlns:m="http://schemas.openxmlformats.org/officeDocument/2006/math" xmlns:v="urn:schemas-microsoft-com:vml" xmlns:wp14="http://schemas.microsoft.com/office/word/2010/wordprocessingDrawing" xmlns:wp="http://schemas.openxmlformats.org/drawingml/2006/wordprocessingDrawing" xmlns:w10="urn:schemas-microsoft-com:office:word" xmlns:w="http://schemas.openxmlformats.org/wordprocessingml/2006/main" xmlns:w14="http://schemas.microsoft.com/office/word/2010/wordml" xmlns:w15="http://schemas.microsoft.com/office/word/2012/wordml" xmlns:w16cei="http://schemas.microsoft.com/office/word/2026/wordml/cei" xmlns:w16cex="http://schemas.microsoft.com/office/word/2018/wordml/cex" xmlns:w16cid="http://schemas.microsoft.com/office/word/2016/wordml/cid" xmlns:w16="http://schemas.microsoft.com/office/word/2018/wordml" xmlns:w16du="http://schemas.microsoft.com/office/word/2023/wordml/word16du" xmlns:w16sdtdh="http://schemas.microsoft.com/office/word/2020/wordml/sdtdatahash" xmlns:w16sdtfl="http://schemas.microsoft.com/office/word/2024/wordml/sdtformatlock" xmlns:w16se="http://schemas.microsoft.com/office/word/2015/wordml/symex" xmlns:wpg="http://schemas.microsoft.com/office/word/2010/wordprocessingGroup" xmlns:wpi="http://schemas.microsoft.com/office/word/2010/wordprocessingInk" xmlns:wne="http://schemas.microsoft.com/office/word/2006/wordml" xmlns:wps="http://schemas.microsoft.com/office/word/2010/wordprocessingShape" mc:Ignorable="w14 w15 w16se w16cid w16 w16cex w16sdtdh w16sdtfl w16du wp14">
+<w:footnotes xmlns:wpc="http://schemas.microsoft.com/office/word/2010/wordprocessingCanvas" xmlns:cx="http://schemas.microsoft.com/office/drawing/2014/chartex" xmlns:cx1="http://schemas.microsoft.com/office/drawing/2015/9/8/chartex" xmlns:cx2="http://schemas.microsoft.com/office/drawing/2015/10/21/chartex" xmlns:cx3="http://schemas.microsoft.com/office/drawing/2016/5/9/chartex" xmlns:cx4="http://schemas.microsoft.com/office/drawing/2016/5/10/chartex" xmlns:cx5="http://schemas.microsoft.com/office/drawing/2016/5/11/chartex" xmlns:cx6="http://schemas.microsoft.com/office/drawing/2016/5/12/chartex" xmlns:cx7="http://schemas.microsoft.com/office/drawing/2016/5/13/chartex" xmlns:cx8="http://schemas.microsoft.com/office/drawing/2016/5/14/chartex" xmlns:mc="http://schemas.openxmlformats.org/markup-compatibility/2006" xmlns:aink="http://schemas.microsoft.com/office/drawing/2016/ink" xmlns:am3d="http://schemas.microsoft.com/office/drawing/2017/model3d" xmlns:o="urn:schemas-microsoft-com:office:office" xmlns:oel="http://schemas.microsoft.com/office/2019/extlst" xmlns:r="http://schemas.openxmlformats.org/officeDocument/2006/relationships" xmlns:m="http://schemas.openxmlformats.org/officeDocument/2006/math" xmlns:v="urn:schemas-microsoft-com:vml" xmlns:wp14="http://schemas.microsoft.com/office/word/2010/wordprocessingDrawing" xmlns:wp="http://schemas.openxmlformats.org/drawingml/2006/wordprocessingDrawing" xmlns:w10="urn:schemas-microsoft-com:office:word" xmlns:w="http://schemas.openxmlformats.org/wordprocessingml/2006/main" xmlns:w14="http://schemas.microsoft.com/office/word/2010/wordml" xmlns:w15="http://schemas.microsoft.com/office/word/2012/wordml" xmlns:w16cex="http://schemas.microsoft.com/office/word/2018/wordml/cex" xmlns:w16cid="http://schemas.microsoft.com/office/word/2016/wordml/cid" xmlns:w16="http://schemas.microsoft.com/office/word/2018/wordml" xmlns:w16du="http://schemas.microsoft.com/office/word/2023/wordml/word16du" xmlns:w16sdtdh="http://schemas.microsoft.com/office/word/2020/wordml/sdtdatahash" xmlns:w16sdtfl="http://schemas.microsoft.com/office/word/2024/wordml/sdtformatlock" xmlns:w16se="http://schemas.microsoft.com/office/word/2015/wordml/symex" xmlns:wpg="http://schemas.microsoft.com/office/word/2010/wordprocessingGroup" xmlns:wpi="http://schemas.microsoft.com/office/word/2010/wordprocessingInk" xmlns:wne="http://schemas.microsoft.com/office/word/2006/wordml" xmlns:wps="http://schemas.microsoft.com/office/word/2010/wordprocessingShape" mc:Ignorable="w14 w15 w16se w16cid w16 w16cex w16sdtdh w16sdtfl w16du wp14">
   <w:footnote w:type="separator" w:id="-1">
     <w:p>
       <w:pPr>
@@ -26066,7 +27094,7 @@
 </file>
 
 <file path=word/header1.xml><?xml version="1.0" encoding="utf-8"?>
-<w:hdr xmlns:wpc="http://schemas.microsoft.com/office/word/2010/wordprocessingCanvas" xmlns:cx="http://schemas.microsoft.com/office/drawing/2014/chartex" xmlns:cx1="http://schemas.microsoft.com/office/drawing/2015/9/8/chartex" xmlns:cx2="http://schemas.microsoft.com/office/drawing/2015/10/21/chartex" xmlns:cx3="http://schemas.microsoft.com/office/drawing/2016/5/9/chartex" xmlns:cx4="http://schemas.microsoft.com/office/drawing/2016/5/10/chartex" xmlns:cx5="http://schemas.microsoft.com/office/drawing/2016/5/11/chartex" xmlns:cx6="http://schemas.microsoft.com/office/drawing/2016/5/12/chartex" xmlns:cx7="http://schemas.microsoft.com/office/drawing/2016/5/13/chartex" xmlns:cx8="http://schemas.microsoft.com/office/drawing/2016/5/14/chartex" xmlns:mc="http://schemas.openxmlformats.org/markup-compatibility/2006" xmlns:aink="http://schemas.microsoft.com/office/drawing/2016/ink" xmlns:am3d="http://schemas.microsoft.com/office/drawing/2017/model3d" xmlns:o="urn:schemas-microsoft-com:office:office" xmlns:oel="http://schemas.microsoft.com/office/2019/extlst" xmlns:r="http://schemas.openxmlformats.org/officeDocument/2006/relationships" xmlns:m="http://schemas.openxmlformats.org/officeDocument/2006/math" xmlns:v="urn:schemas-microsoft-com:vml" xmlns:wp14="http://schemas.microsoft.com/office/word/2010/wordprocessingDrawing" xmlns:wp="http://schemas.openxmlformats.org/drawingml/2006/wordprocessingDrawing" xmlns:w10="urn:schemas-microsoft-com:office:word" xmlns:w="http://schemas.openxmlformats.org/wordprocessingml/2006/main" xmlns:w14="http://schemas.microsoft.com/office/word/2010/wordml" xmlns:w15="http://schemas.microsoft.com/office/word/2012/wordml" xmlns:w16cei="http://schemas.microsoft.com/office/word/2026/wordml/cei" xmlns:w16cex="http://schemas.microsoft.com/office/word/2018/wordml/cex" xmlns:w16cid="http://schemas.microsoft.com/office/word/2016/wordml/cid" xmlns:w16="http://schemas.microsoft.com/office/word/2018/wordml" xmlns:w16du="http://schemas.microsoft.com/office/word/2023/wordml/word16du" xmlns:w16sdtdh="http://schemas.microsoft.com/office/word/2020/wordml/sdtdatahash" xmlns:w16sdtfl="http://schemas.microsoft.com/office/word/2024/wordml/sdtformatlock" xmlns:w16se="http://schemas.microsoft.com/office/word/2015/wordml/symex" xmlns:wpg="http://schemas.microsoft.com/office/word/2010/wordprocessingGroup" xmlns:wpi="http://schemas.microsoft.com/office/word/2010/wordprocessingInk" xmlns:wne="http://schemas.microsoft.com/office/word/2006/wordml" xmlns:wps="http://schemas.microsoft.com/office/word/2010/wordprocessingShape" mc:Ignorable="w14 w15 w16se w16cid w16 w16cex w16sdtdh w16sdtfl w16du wp14">
+<w:hdr xmlns:wpc="http://schemas.microsoft.com/office/word/2010/wordprocessingCanvas" xmlns:cx="http://schemas.microsoft.com/office/drawing/2014/chartex" xmlns:cx1="http://schemas.microsoft.com/office/drawing/2015/9/8/chartex" xmlns:cx2="http://schemas.microsoft.com/office/drawing/2015/10/21/chartex" xmlns:cx3="http://schemas.microsoft.com/office/drawing/2016/5/9/chartex" xmlns:cx4="http://schemas.microsoft.com/office/drawing/2016/5/10/chartex" xmlns:cx5="http://schemas.microsoft.com/office/drawing/2016/5/11/chartex" xmlns:cx6="http://schemas.microsoft.com/office/drawing/2016/5/12/chartex" xmlns:cx7="http://schemas.microsoft.com/office/drawing/2016/5/13/chartex" xmlns:cx8="http://schemas.microsoft.com/office/drawing/2016/5/14/chartex" xmlns:mc="http://schemas.openxmlformats.org/markup-compatibility/2006" xmlns:aink="http://schemas.microsoft.com/office/drawing/2016/ink" xmlns:am3d="http://schemas.microsoft.com/office/drawing/2017/model3d" xmlns:o="urn:schemas-microsoft-com:office:office" xmlns:oel="http://schemas.microsoft.com/office/2019/extlst" xmlns:r="http://schemas.openxmlformats.org/officeDocument/2006/relationships" xmlns:m="http://schemas.openxmlformats.org/officeDocument/2006/math" xmlns:v="urn:schemas-microsoft-com:vml" xmlns:wp14="http://schemas.microsoft.com/office/word/2010/wordprocessingDrawing" xmlns:wp="http://schemas.openxmlformats.org/drawingml/2006/wordprocessingDrawing" xmlns:w10="urn:schemas-microsoft-com:office:word" xmlns:w="http://schemas.openxmlformats.org/wordprocessingml/2006/main" xmlns:w14="http://schemas.microsoft.com/office/word/2010/wordml" xmlns:w15="http://schemas.microsoft.com/office/word/2012/wordml" xmlns:w16cex="http://schemas.microsoft.com/office/word/2018/wordml/cex" xmlns:w16cid="http://schemas.microsoft.com/office/word/2016/wordml/cid" xmlns:w16="http://schemas.microsoft.com/office/word/2018/wordml" xmlns:w16du="http://schemas.microsoft.com/office/word/2023/wordml/word16du" xmlns:w16sdtdh="http://schemas.microsoft.com/office/word/2020/wordml/sdtdatahash" xmlns:w16sdtfl="http://schemas.microsoft.com/office/word/2024/wordml/sdtformatlock" xmlns:w16se="http://schemas.microsoft.com/office/word/2015/wordml/symex" xmlns:wpg="http://schemas.microsoft.com/office/word/2010/wordprocessingGroup" xmlns:wpi="http://schemas.microsoft.com/office/word/2010/wordprocessingInk" xmlns:wne="http://schemas.microsoft.com/office/word/2006/wordml" xmlns:wps="http://schemas.microsoft.com/office/word/2010/wordprocessingShape" mc:Ignorable="w14 w15 w16se w16cid w16 w16cex w16sdtdh w16sdtfl w16du wp14">
   <w:sdt>
     <w:sdtPr>
       <w:rPr>
@@ -26108,7 +27136,7 @@
 </file>
 
 <file path=word/numbering.xml><?xml version="1.0" encoding="utf-8"?>
-<w:numbering xmlns:wpc="http://schemas.microsoft.com/office/word/2010/wordprocessingCanvas" xmlns:cx="http://schemas.microsoft.com/office/drawing/2014/chartex" xmlns:cx1="http://schemas.microsoft.com/office/drawing/2015/9/8/chartex" xmlns:cx2="http://schemas.microsoft.com/office/drawing/2015/10/21/chartex" xmlns:cx3="http://schemas.microsoft.com/office/drawing/2016/5/9/chartex" xmlns:cx4="http://schemas.microsoft.com/office/drawing/2016/5/10/chartex" xmlns:cx5="http://schemas.microsoft.com/office/drawing/2016/5/11/chartex" xmlns:cx6="http://schemas.microsoft.com/office/drawing/2016/5/12/chartex" xmlns:cx7="http://schemas.microsoft.com/office/drawing/2016/5/13/chartex" xmlns:cx8="http://schemas.microsoft.com/office/drawing/2016/5/14/chartex" xmlns:mc="http://schemas.openxmlformats.org/markup-compatibility/2006" xmlns:aink="http://schemas.microsoft.com/office/drawing/2016/ink" xmlns:am3d="http://schemas.microsoft.com/office/drawing/2017/model3d" xmlns:o="urn:schemas-microsoft-com:office:office" xmlns:oel="http://schemas.microsoft.com/office/2019/extlst" xmlns:r="http://schemas.openxmlformats.org/officeDocument/2006/relationships" xmlns:m="http://schemas.openxmlformats.org/officeDocument/2006/math" xmlns:v="urn:schemas-microsoft-com:vml" xmlns:wp14="http://schemas.microsoft.com/office/word/2010/wordprocessingDrawing" xmlns:wp="http://schemas.openxmlformats.org/drawingml/2006/wordprocessingDrawing" xmlns:w10="urn:schemas-microsoft-com:office:word" xmlns:w="http://schemas.openxmlformats.org/wordprocessingml/2006/main" xmlns:w14="http://schemas.microsoft.com/office/word/2010/wordml" xmlns:w15="http://schemas.microsoft.com/office/word/2012/wordml" xmlns:w16cei="http://schemas.microsoft.com/office/word/2026/wordml/cei" xmlns:w16cex="http://schemas.microsoft.com/office/word/2018/wordml/cex" xmlns:w16cid="http://schemas.microsoft.com/office/word/2016/wordml/cid" xmlns:w16="http://schemas.microsoft.com/office/word/2018/wordml" xmlns:w16du="http://schemas.microsoft.com/office/word/2023/wordml/word16du" xmlns:w16sdtdh="http://schemas.microsoft.com/office/word/2020/wordml/sdtdatahash" xmlns:w16sdtfl="http://schemas.microsoft.com/office/word/2024/wordml/sdtformatlock" xmlns:w16se="http://schemas.microsoft.com/office/word/2015/wordml/symex" xmlns:wpg="http://schemas.microsoft.com/office/word/2010/wordprocessingGroup" xmlns:wpi="http://schemas.microsoft.com/office/word/2010/wordprocessingInk" xmlns:wne="http://schemas.microsoft.com/office/word/2006/wordml" xmlns:wps="http://schemas.microsoft.com/office/word/2010/wordprocessingShape" mc:Ignorable="w14 w15 w16se w16cid w16 w16cex w16sdtdh w16sdtfl w16du wp14">
+<w:numbering xmlns:wpc="http://schemas.microsoft.com/office/word/2010/wordprocessingCanvas" xmlns:cx="http://schemas.microsoft.com/office/drawing/2014/chartex" xmlns:cx1="http://schemas.microsoft.com/office/drawing/2015/9/8/chartex" xmlns:cx2="http://schemas.microsoft.com/office/drawing/2015/10/21/chartex" xmlns:cx3="http://schemas.microsoft.com/office/drawing/2016/5/9/chartex" xmlns:cx4="http://schemas.microsoft.com/office/drawing/2016/5/10/chartex" xmlns:cx5="http://schemas.microsoft.com/office/drawing/2016/5/11/chartex" xmlns:cx6="http://schemas.microsoft.com/office/drawing/2016/5/12/chartex" xmlns:cx7="http://schemas.microsoft.com/office/drawing/2016/5/13/chartex" xmlns:cx8="http://schemas.microsoft.com/office/drawing/2016/5/14/chartex" xmlns:mc="http://schemas.openxmlformats.org/markup-compatibility/2006" xmlns:aink="http://schemas.microsoft.com/office/drawing/2016/ink" xmlns:am3d="http://schemas.microsoft.com/office/drawing/2017/model3d" xmlns:o="urn:schemas-microsoft-com:office:office" xmlns:oel="http://schemas.microsoft.com/office/2019/extlst" xmlns:r="http://schemas.openxmlformats.org/officeDocument/2006/relationships" xmlns:m="http://schemas.openxmlformats.org/officeDocument/2006/math" xmlns:v="urn:schemas-microsoft-com:vml" xmlns:wp14="http://schemas.microsoft.com/office/word/2010/wordprocessingDrawing" xmlns:wp="http://schemas.openxmlformats.org/drawingml/2006/wordprocessingDrawing" xmlns:w10="urn:schemas-microsoft-com:office:word" xmlns:w="http://schemas.openxmlformats.org/wordprocessingml/2006/main" xmlns:w14="http://schemas.microsoft.com/office/word/2010/wordml" xmlns:w15="http://schemas.microsoft.com/office/word/2012/wordml" xmlns:w16cex="http://schemas.microsoft.com/office/word/2018/wordml/cex" xmlns:w16cid="http://schemas.microsoft.com/office/word/2016/wordml/cid" xmlns:w16="http://schemas.microsoft.com/office/word/2018/wordml" xmlns:w16du="http://schemas.microsoft.com/office/word/2023/wordml/word16du" xmlns:w16sdtdh="http://schemas.microsoft.com/office/word/2020/wordml/sdtdatahash" xmlns:w16sdtfl="http://schemas.microsoft.com/office/word/2024/wordml/sdtformatlock" xmlns:w16se="http://schemas.microsoft.com/office/word/2015/wordml/symex" xmlns:wpg="http://schemas.microsoft.com/office/word/2010/wordprocessingGroup" xmlns:wpi="http://schemas.microsoft.com/office/word/2010/wordprocessingInk" xmlns:wne="http://schemas.microsoft.com/office/word/2006/wordml" xmlns:wps="http://schemas.microsoft.com/office/word/2010/wordprocessingShape" mc:Ignorable="w14 w15 w16se w16cid w16 w16cex w16sdtdh w16sdtfl w16du wp14">
   <w:abstractNum w:abstractNumId="0" w15:restartNumberingAfterBreak="0">
     <w:nsid w:val="1CDD779D"/>
     <w:multiLevelType w:val="multilevel"/>
@@ -26984,7 +28012,6 @@
   <w:style w:type="character" w:default="1" w:styleId="Fuentedeprrafopredeter">
     <w:name w:val="Default Paragraph Font"/>
     <w:uiPriority w:val="1"/>
-    <w:semiHidden/>
     <w:unhideWhenUsed/>
   </w:style>
   <w:style w:type="table" w:default="1" w:styleId="Tablanormal">
@@ -27447,7 +28474,7 @@
 </file>
 
 <file path=word/glossary/document.xml><?xml version="1.0" encoding="utf-8"?>
-<w:glossaryDocument xmlns:wpc="http://schemas.microsoft.com/office/word/2010/wordprocessingCanvas" xmlns:cx="http://schemas.microsoft.com/office/drawing/2014/chartex" xmlns:cx1="http://schemas.microsoft.com/office/drawing/2015/9/8/chartex" xmlns:cx2="http://schemas.microsoft.com/office/drawing/2015/10/21/chartex" xmlns:cx3="http://schemas.microsoft.com/office/drawing/2016/5/9/chartex" xmlns:cx4="http://schemas.microsoft.com/office/drawing/2016/5/10/chartex" xmlns:cx5="http://schemas.microsoft.com/office/drawing/2016/5/11/chartex" xmlns:cx6="http://schemas.microsoft.com/office/drawing/2016/5/12/chartex" xmlns:cx7="http://schemas.microsoft.com/office/drawing/2016/5/13/chartex" xmlns:cx8="http://schemas.microsoft.com/office/drawing/2016/5/14/chartex" xmlns:mc="http://schemas.openxmlformats.org/markup-compatibility/2006" xmlns:aink="http://schemas.microsoft.com/office/drawing/2016/ink" xmlns:am3d="http://schemas.microsoft.com/office/drawing/2017/model3d" xmlns:o="urn:schemas-microsoft-com:office:office" xmlns:oel="http://schemas.microsoft.com/office/2019/extlst" xmlns:r="http://schemas.openxmlformats.org/officeDocument/2006/relationships" xmlns:m="http://schemas.openxmlformats.org/officeDocument/2006/math" xmlns:v="urn:schemas-microsoft-com:vml" xmlns:wp14="http://schemas.microsoft.com/office/word/2010/wordprocessingDrawing" xmlns:wp="http://schemas.openxmlformats.org/drawingml/2006/wordprocessingDrawing" xmlns:w10="urn:schemas-microsoft-com:office:word" xmlns:w="http://schemas.openxmlformats.org/wordprocessingml/2006/main" xmlns:w14="http://schemas.microsoft.com/office/word/2010/wordml" xmlns:w15="http://schemas.microsoft.com/office/word/2012/wordml" xmlns:w16cei="http://schemas.microsoft.com/office/word/2026/wordml/cei" xmlns:w16cex="http://schemas.microsoft.com/office/word/2018/wordml/cex" xmlns:w16cid="http://schemas.microsoft.com/office/word/2016/wordml/cid" xmlns:w16="http://schemas.microsoft.com/office/word/2018/wordml" xmlns:w16du="http://schemas.microsoft.com/office/word/2023/wordml/word16du" xmlns:w16sdtdh="http://schemas.microsoft.com/office/word/2020/wordml/sdtdatahash" xmlns:w16sdtfl="http://schemas.microsoft.com/office/word/2024/wordml/sdtformatlock" xmlns:w16se="http://schemas.microsoft.com/office/word/2015/wordml/symex" xmlns:wpg="http://schemas.microsoft.com/office/word/2010/wordprocessingGroup" xmlns:wpi="http://schemas.microsoft.com/office/word/2010/wordprocessingInk" xmlns:wne="http://schemas.microsoft.com/office/word/2006/wordml" xmlns:wps="http://schemas.microsoft.com/office/word/2010/wordprocessingShape" mc:Ignorable="w14 w15 w16se w16cid w16 w16cex w16sdtdh w16sdtfl w16du wp14">
+<w:glossaryDocument xmlns:wpc="http://schemas.microsoft.com/office/word/2010/wordprocessingCanvas" xmlns:cx="http://schemas.microsoft.com/office/drawing/2014/chartex" xmlns:cx1="http://schemas.microsoft.com/office/drawing/2015/9/8/chartex" xmlns:cx2="http://schemas.microsoft.com/office/drawing/2015/10/21/chartex" xmlns:cx3="http://schemas.microsoft.com/office/drawing/2016/5/9/chartex" xmlns:cx4="http://schemas.microsoft.com/office/drawing/2016/5/10/chartex" xmlns:cx5="http://schemas.microsoft.com/office/drawing/2016/5/11/chartex" xmlns:cx6="http://schemas.microsoft.com/office/drawing/2016/5/12/chartex" xmlns:cx7="http://schemas.microsoft.com/office/drawing/2016/5/13/chartex" xmlns:cx8="http://schemas.microsoft.com/office/drawing/2016/5/14/chartex" xmlns:mc="http://schemas.openxmlformats.org/markup-compatibility/2006" xmlns:aink="http://schemas.microsoft.com/office/drawing/2016/ink" xmlns:am3d="http://schemas.microsoft.com/office/drawing/2017/model3d" xmlns:o="urn:schemas-microsoft-com:office:office" xmlns:oel="http://schemas.microsoft.com/office/2019/extlst" xmlns:r="http://schemas.openxmlformats.org/officeDocument/2006/relationships" xmlns:m="http://schemas.openxmlformats.org/officeDocument/2006/math" xmlns:v="urn:schemas-microsoft-com:vml" xmlns:wp14="http://schemas.microsoft.com/office/word/2010/wordprocessingDrawing" xmlns:wp="http://schemas.openxmlformats.org/drawingml/2006/wordprocessingDrawing" xmlns:w10="urn:schemas-microsoft-com:office:word" xmlns:w="http://schemas.openxmlformats.org/wordprocessingml/2006/main" xmlns:w14="http://schemas.microsoft.com/office/word/2010/wordml" xmlns:w15="http://schemas.microsoft.com/office/word/2012/wordml" xmlns:w16cex="http://schemas.microsoft.com/office/word/2018/wordml/cex" xmlns:w16cid="http://schemas.microsoft.com/office/word/2016/wordml/cid" xmlns:w16="http://schemas.microsoft.com/office/word/2018/wordml" xmlns:w16du="http://schemas.microsoft.com/office/word/2023/wordml/word16du" xmlns:w16sdtdh="http://schemas.microsoft.com/office/word/2020/wordml/sdtdatahash" xmlns:w16sdtfl="http://schemas.microsoft.com/office/word/2024/wordml/sdtformatlock" xmlns:w16se="http://schemas.microsoft.com/office/word/2015/wordml/symex" xmlns:wpg="http://schemas.microsoft.com/office/word/2010/wordprocessingGroup" xmlns:wpi="http://schemas.microsoft.com/office/word/2010/wordprocessingInk" xmlns:wne="http://schemas.microsoft.com/office/word/2006/wordml" xmlns:wps="http://schemas.microsoft.com/office/word/2010/wordprocessingShape" mc:Ignorable="w14 w15 w16se w16cid w16 w16cex w16sdtdh w16sdtfl w16du wp14">
   <w:docParts>
     <w:docPart>
       <w:docPartPr>
@@ -27600,6 +28627,7 @@
     <w:rsid w:val="000D2A6A"/>
     <w:rsid w:val="00125951"/>
     <w:rsid w:val="00141F35"/>
+    <w:rsid w:val="00176E5B"/>
     <w:rsid w:val="0019347C"/>
     <w:rsid w:val="001C11CA"/>
     <w:rsid w:val="002F3B76"/>
@@ -27615,6 +28643,7 @@
     <w:rsid w:val="006952F2"/>
     <w:rsid w:val="006B54D3"/>
     <w:rsid w:val="006B7CB9"/>
+    <w:rsid w:val="006F0D82"/>
     <w:rsid w:val="006F4741"/>
     <w:rsid w:val="007759F4"/>
     <w:rsid w:val="00790198"/>
@@ -27629,6 +28658,7 @@
     <w:rsid w:val="009D632D"/>
     <w:rsid w:val="00A15EFF"/>
     <w:rsid w:val="00A522CA"/>
+    <w:rsid w:val="00A95C79"/>
     <w:rsid w:val="00AA3CBE"/>
     <w:rsid w:val="00B50367"/>
     <w:rsid w:val="00B956F5"/>
@@ -27641,6 +28671,7 @@
     <w:rsid w:val="00DC00DE"/>
     <w:rsid w:val="00DC5912"/>
     <w:rsid w:val="00DC6016"/>
+    <w:rsid w:val="00E349F6"/>
     <w:rsid w:val="00E90657"/>
     <w:rsid w:val="00EB52E2"/>
     <w:rsid w:val="00F14015"/>

</xml_diff>

<commit_message>
docs: update Tempico Software 2.1.0 manual with status bar images
</commit_message>
<xml_diff>
--- a/docs/user/archive/Tausand Tempico Software Manual 2.1.0.docx
+++ b/docs/user/archive/Tausand Tempico Software Manual 2.1.0.docx
@@ -9271,15 +9271,12 @@
         <w:jc w:val="center"/>
       </w:pPr>
       <w:r>
-        <w:rPr>
-          <w:noProof/>
-        </w:rPr>
         <w:lastRenderedPageBreak/>
         <w:drawing>
-          <wp:inline distT="0" distB="0" distL="0" distR="0" wp14:anchorId="6028BBC3" wp14:editId="090A639C">
-            <wp:extent cx="2981325" cy="2649069"/>
-            <wp:effectExtent l="0" t="0" r="0" b="0"/>
-            <wp:docPr id="265563085" name="Imagen 1" descr="Interfaz de usuario gráfica, Aplicación&#10;&#10;El contenido generado por IA puede ser incorrecto."/>
+          <wp:inline distT="0" distB="0" distL="0" distR="0" wp14:anchorId="3AFB52F5" wp14:editId="56AA5B5E">
+            <wp:extent cx="3172268" cy="2819794"/>
+            <wp:effectExtent l="0" t="0" r="9525" b="0"/>
+            <wp:docPr id="262177452" name="Imagen 1"/>
             <wp:cNvGraphicFramePr>
               <a:graphicFrameLocks xmlns:a="http://schemas.openxmlformats.org/drawingml/2006/main" noChangeAspect="1"/>
             </wp:cNvGraphicFramePr>
@@ -9287,7 +9284,7 @@
               <a:graphicData uri="http://schemas.openxmlformats.org/drawingml/2006/picture">
                 <pic:pic xmlns:pic="http://schemas.openxmlformats.org/drawingml/2006/picture">
                   <pic:nvPicPr>
-                    <pic:cNvPr id="265563085" name="Imagen 1" descr="Interfaz de usuario gráfica, Aplicación&#10;&#10;El contenido generado por IA puede ser incorrecto."/>
+                    <pic:cNvPr id="262177452" name=""/>
                     <pic:cNvPicPr/>
                   </pic:nvPicPr>
                   <pic:blipFill>
@@ -9299,7 +9296,7 @@
                   <pic:spPr>
                     <a:xfrm>
                       <a:off x="0" y="0"/>
-                      <a:ext cx="2984970" cy="2652308"/>
+                      <a:ext cx="3172268" cy="2819794"/>
                     </a:xfrm>
                     <a:prstGeom prst="rect">
                       <a:avLst/>
@@ -9638,6 +9635,7 @@
           <w:sz w:val="20"/>
           <w:szCs w:val="20"/>
         </w:rPr>
+        <w:lastRenderedPageBreak/>
         <w:t>detail. In practice,</w:t>
       </w:r>
       <w:r>
@@ -9670,16 +9668,7 @@
           <w:sz w:val="20"/>
           <w:szCs w:val="20"/>
         </w:rPr>
-        <w:t xml:space="preserve">estimation, </w:t>
-      </w:r>
-      <w:r>
-        <w:rPr>
-          <w:rFonts w:ascii="Arial" w:hAnsi="Arial" w:cs="Arial"/>
-          <w:sz w:val="20"/>
-          <w:szCs w:val="20"/>
-        </w:rPr>
-        <w:lastRenderedPageBreak/>
-        <w:t xml:space="preserve">Autocorrelation (FCS), and </w:t>
+        <w:t xml:space="preserve">estimation, Autocorrelation (FCS), and </w:t>
       </w:r>
       <w:r>
         <w:t>g</w:t>
@@ -9688,13 +9677,7 @@
         <w:rPr>
           <w:vertAlign w:val="superscript"/>
         </w:rPr>
-        <w:t>(2</w:t>
-      </w:r>
-      <w:r>
-        <w:rPr>
-          <w:vertAlign w:val="superscript"/>
-        </w:rPr>
-        <w:t>)</w:t>
+        <w:t>(2)</w:t>
       </w:r>
       <w:r>
         <w:rPr>
@@ -10224,8 +10207,8 @@
           <w:szCs w:val="20"/>
         </w:rPr>
         <w:drawing>
-          <wp:inline distT="0" distB="0" distL="0" distR="0" wp14:anchorId="3D8A5893" wp14:editId="41052134">
-            <wp:extent cx="5239481" cy="590632"/>
+          <wp:inline distT="0" distB="0" distL="0" distR="0" wp14:anchorId="3D8A5893" wp14:editId="39A1FFF5">
+            <wp:extent cx="5181600" cy="552450"/>
             <wp:effectExtent l="0" t="0" r="0" b="0"/>
             <wp:docPr id="1301153797" name="Imagen 1"/>
             <wp:cNvGraphicFramePr>
@@ -10238,7 +10221,7 @@
                     <pic:cNvPr id="1301153797" name="Imagen 1301153797"/>
                     <pic:cNvPicPr/>
                   </pic:nvPicPr>
-                  <pic:blipFill>
+                  <pic:blipFill rotWithShape="1">
                     <a:blip r:embed="rId41">
                       <a:extLst>
                         <a:ext uri="{28A0092B-C50C-407E-A947-70E740481C1C}">
@@ -10246,18 +10229,27 @@
                         </a:ext>
                       </a:extLst>
                     </a:blip>
+                    <a:srcRect t="6451" r="1090" b="1"/>
                     <a:stretch>
                       <a:fillRect/>
                     </a:stretch>
                   </pic:blipFill>
-                  <pic:spPr>
+                  <pic:spPr bwMode="auto">
                     <a:xfrm>
                       <a:off x="0" y="0"/>
-                      <a:ext cx="5239481" cy="590632"/>
+                      <a:ext cx="5182323" cy="552527"/>
                     </a:xfrm>
                     <a:prstGeom prst="rect">
                       <a:avLst/>
                     </a:prstGeom>
+                    <a:ln>
+                      <a:noFill/>
+                    </a:ln>
+                    <a:extLst>
+                      <a:ext uri="{53640926-AAD7-44D8-BBD7-CCE9431645EC}">
+                        <a14:shadowObscured xmlns:a14="http://schemas.microsoft.com/office/drawing/2010/main"/>
+                      </a:ext>
+                    </a:extLst>
                   </pic:spPr>
                 </pic:pic>
               </a:graphicData>
@@ -10440,6 +10432,7 @@
     </w:p>
     <w:p>
       <w:pPr>
+        <w:jc w:val="center"/>
         <w:rPr>
           <w:rFonts w:ascii="Arial" w:hAnsi="Arial" w:cs="Arial"/>
           <w:sz w:val="20"/>
@@ -10451,10 +10444,10 @@
           <w:noProof/>
         </w:rPr>
         <w:drawing>
-          <wp:inline distT="0" distB="0" distL="0" distR="0" wp14:anchorId="7E352891" wp14:editId="7E8BFA2E">
-            <wp:extent cx="5612130" cy="560070"/>
-            <wp:effectExtent l="0" t="0" r="7620" b="0"/>
-            <wp:docPr id="2002867331" name="Imagen 1"/>
+          <wp:inline distT="0" distB="0" distL="0" distR="0" wp14:anchorId="10DF0CFA" wp14:editId="5801835F">
+            <wp:extent cx="5180952" cy="542857"/>
+            <wp:effectExtent l="0" t="0" r="1270" b="0"/>
+            <wp:docPr id="260096625" name="Imagen 1"/>
             <wp:cNvGraphicFramePr>
               <a:graphicFrameLocks xmlns:a="http://schemas.openxmlformats.org/drawingml/2006/main" noChangeAspect="1"/>
             </wp:cNvGraphicFramePr>
@@ -10462,7 +10455,7 @@
               <a:graphicData uri="http://schemas.openxmlformats.org/drawingml/2006/picture">
                 <pic:pic xmlns:pic="http://schemas.openxmlformats.org/drawingml/2006/picture">
                   <pic:nvPicPr>
-                    <pic:cNvPr id="2002867331" name=""/>
+                    <pic:cNvPr id="260096625" name=""/>
                     <pic:cNvPicPr/>
                   </pic:nvPicPr>
                   <pic:blipFill>
@@ -10474,7 +10467,7 @@
                   <pic:spPr>
                     <a:xfrm>
                       <a:off x="0" y="0"/>
-                      <a:ext cx="5612130" cy="560070"/>
+                      <a:ext cx="5180952" cy="542857"/>
                     </a:xfrm>
                     <a:prstGeom prst="rect">
                       <a:avLst/>
@@ -10700,9 +10693,7 @@
     <w:p>
       <w:pPr>
         <w:rPr>
-          <w:rFonts w:ascii="Arial" w:hAnsi="Arial" w:cs="Arial"/>
-          <w:sz w:val="20"/>
-          <w:szCs w:val="20"/>
+          <w:noProof/>
         </w:rPr>
       </w:pPr>
       <w:r>
@@ -10794,15 +10785,27 @@
         </w:rPr>
         <w:t>path.</w:t>
       </w:r>
-      <w:r>
-        <w:rPr>
-          <w:noProof/>
+    </w:p>
+    <w:p>
+      <w:pPr>
+        <w:jc w:val="center"/>
+        <w:rPr>
+          <w:rFonts w:ascii="Arial" w:hAnsi="Arial" w:cs="Arial"/>
+          <w:sz w:val="20"/>
+          <w:szCs w:val="20"/>
+        </w:rPr>
+      </w:pPr>
+      <w:r>
+        <w:rPr>
+          <w:rFonts w:ascii="Arial" w:hAnsi="Arial" w:cs="Arial"/>
+          <w:sz w:val="20"/>
+          <w:szCs w:val="20"/>
         </w:rPr>
         <w:drawing>
-          <wp:inline distT="0" distB="0" distL="0" distR="0" wp14:anchorId="18910B55" wp14:editId="1C7F6159">
-            <wp:extent cx="5612130" cy="584200"/>
-            <wp:effectExtent l="0" t="0" r="7620" b="6350"/>
-            <wp:docPr id="1747680978" name="Imagen 1"/>
+          <wp:inline distT="0" distB="0" distL="0" distR="0" wp14:anchorId="41CEF886" wp14:editId="3C211488">
+            <wp:extent cx="5268060" cy="590632"/>
+            <wp:effectExtent l="0" t="0" r="8890" b="0"/>
+            <wp:docPr id="1419852824" name="Imagen 1"/>
             <wp:cNvGraphicFramePr>
               <a:graphicFrameLocks xmlns:a="http://schemas.openxmlformats.org/drawingml/2006/main" noChangeAspect="1"/>
             </wp:cNvGraphicFramePr>
@@ -10810,7 +10813,7 @@
               <a:graphicData uri="http://schemas.openxmlformats.org/drawingml/2006/picture">
                 <pic:pic xmlns:pic="http://schemas.openxmlformats.org/drawingml/2006/picture">
                   <pic:nvPicPr>
-                    <pic:cNvPr id="1747680978" name=""/>
+                    <pic:cNvPr id="1419852824" name=""/>
                     <pic:cNvPicPr/>
                   </pic:nvPicPr>
                   <pic:blipFill>
@@ -10822,7 +10825,7 @@
                   <pic:spPr>
                     <a:xfrm>
                       <a:off x="0" y="0"/>
-                      <a:ext cx="5612130" cy="584200"/>
+                      <a:ext cx="5268060" cy="590632"/>
                     </a:xfrm>
                     <a:prstGeom prst="rect">
                       <a:avLst/>
@@ -10837,21 +10840,24 @@
     </w:p>
     <w:p>
       <w:pPr>
-        <w:rPr>
-          <w:rFonts w:ascii="Arial" w:hAnsi="Arial" w:cs="Arial"/>
-          <w:sz w:val="20"/>
-          <w:szCs w:val="20"/>
-        </w:rPr>
-      </w:pPr>
-      <w:r>
-        <w:rPr>
-          <w:noProof/>
+        <w:jc w:val="center"/>
+        <w:rPr>
+          <w:rFonts w:ascii="Arial" w:hAnsi="Arial" w:cs="Arial"/>
+          <w:sz w:val="20"/>
+          <w:szCs w:val="20"/>
+        </w:rPr>
+      </w:pPr>
+      <w:r>
+        <w:rPr>
+          <w:rFonts w:ascii="Arial" w:hAnsi="Arial" w:cs="Arial"/>
+          <w:sz w:val="20"/>
+          <w:szCs w:val="20"/>
         </w:rPr>
         <w:drawing>
-          <wp:inline distT="0" distB="0" distL="0" distR="0" wp14:anchorId="19103A47" wp14:editId="68CD7B24">
-            <wp:extent cx="5612130" cy="581660"/>
-            <wp:effectExtent l="0" t="0" r="7620" b="8890"/>
-            <wp:docPr id="1639638621" name="Imagen 1"/>
+          <wp:inline distT="0" distB="0" distL="0" distR="0" wp14:anchorId="68891B6C" wp14:editId="6EEDFAB0">
+            <wp:extent cx="5277587" cy="590632"/>
+            <wp:effectExtent l="0" t="0" r="0" b="0"/>
+            <wp:docPr id="1939369815" name="Imagen 1"/>
             <wp:cNvGraphicFramePr>
               <a:graphicFrameLocks xmlns:a="http://schemas.openxmlformats.org/drawingml/2006/main" noChangeAspect="1"/>
             </wp:cNvGraphicFramePr>
@@ -10859,7 +10865,7 @@
               <a:graphicData uri="http://schemas.openxmlformats.org/drawingml/2006/picture">
                 <pic:pic xmlns:pic="http://schemas.openxmlformats.org/drawingml/2006/picture">
                   <pic:nvPicPr>
-                    <pic:cNvPr id="1639638621" name=""/>
+                    <pic:cNvPr id="1939369815" name=""/>
                     <pic:cNvPicPr/>
                   </pic:nvPicPr>
                   <pic:blipFill>
@@ -10871,7 +10877,7 @@
                   <pic:spPr>
                     <a:xfrm>
                       <a:off x="0" y="0"/>
-                      <a:ext cx="5612130" cy="581660"/>
+                      <a:ext cx="5277587" cy="590632"/>
                     </a:xfrm>
                     <a:prstGeom prst="rect">
                       <a:avLst/>
@@ -11066,55 +11072,6 @@
     </w:p>
     <w:p>
       <w:pPr>
-        <w:rPr>
-          <w:rFonts w:ascii="Arial" w:hAnsi="Arial" w:cs="Arial"/>
-          <w:sz w:val="20"/>
-          <w:szCs w:val="20"/>
-        </w:rPr>
-      </w:pPr>
-      <w:r>
-        <w:rPr>
-          <w:noProof/>
-        </w:rPr>
-        <w:drawing>
-          <wp:inline distT="0" distB="0" distL="0" distR="0" wp14:anchorId="23F17E1C" wp14:editId="441922F9">
-            <wp:extent cx="5612130" cy="506730"/>
-            <wp:effectExtent l="0" t="0" r="7620" b="7620"/>
-            <wp:docPr id="1693760892" name="Imagen 1"/>
-            <wp:cNvGraphicFramePr>
-              <a:graphicFrameLocks xmlns:a="http://schemas.openxmlformats.org/drawingml/2006/main" noChangeAspect="1"/>
-            </wp:cNvGraphicFramePr>
-            <a:graphic xmlns:a="http://schemas.openxmlformats.org/drawingml/2006/main">
-              <a:graphicData uri="http://schemas.openxmlformats.org/drawingml/2006/picture">
-                <pic:pic xmlns:pic="http://schemas.openxmlformats.org/drawingml/2006/picture">
-                  <pic:nvPicPr>
-                    <pic:cNvPr id="1693760892" name=""/>
-                    <pic:cNvPicPr/>
-                  </pic:nvPicPr>
-                  <pic:blipFill>
-                    <a:blip r:embed="rId46"/>
-                    <a:stretch>
-                      <a:fillRect/>
-                    </a:stretch>
-                  </pic:blipFill>
-                  <pic:spPr>
-                    <a:xfrm>
-                      <a:off x="0" y="0"/>
-                      <a:ext cx="5612130" cy="506730"/>
-                    </a:xfrm>
-                    <a:prstGeom prst="rect">
-                      <a:avLst/>
-                    </a:prstGeom>
-                  </pic:spPr>
-                </pic:pic>
-              </a:graphicData>
-            </a:graphic>
-          </wp:inline>
-        </w:drawing>
-      </w:r>
-    </w:p>
-    <w:p>
-      <w:pPr>
         <w:pStyle w:val="Ttulo3"/>
         <w:numPr>
           <w:ilvl w:val="2"/>
@@ -11173,18 +11130,7 @@
           <w:lang w:eastAsia="ja-JP"/>
           <w14:ligatures w14:val="none"/>
         </w:rPr>
-        <w:t>the status dot to orange</w:t>
-      </w:r>
-      <w:r>
-        <w:rPr>
-          <w:rFonts w:ascii="Arial" w:eastAsia="Times New Roman" w:hAnsi="Arial" w:cs="Arial"/>
-          <w:kern w:val="0"/>
-          <w:sz w:val="20"/>
-          <w:szCs w:val="20"/>
-          <w:lang w:eastAsia="ja-JP"/>
-          <w14:ligatures w14:val="none"/>
-        </w:rPr>
-        <w:t xml:space="preserve"> </w:t>
+        <w:t xml:space="preserve">the status dot to orange </w:t>
       </w:r>
       <w:r>
         <w:rPr>
@@ -11525,21 +11471,31 @@
     </w:p>
     <w:p>
       <w:pPr>
-        <w:rPr>
-          <w:rFonts w:ascii="Arial" w:hAnsi="Arial" w:cs="Arial"/>
-          <w:sz w:val="20"/>
-          <w:szCs w:val="20"/>
-        </w:rPr>
-      </w:pPr>
-      <w:r>
-        <w:rPr>
-          <w:noProof/>
+        <w:spacing w:after="100" w:afterAutospacing="1" w:line="240" w:lineRule="auto"/>
+        <w:jc w:val="center"/>
+        <w:rPr>
+          <w:rFonts w:ascii="Arial" w:eastAsia="Times New Roman" w:hAnsi="Arial" w:cs="Arial"/>
+          <w:kern w:val="0"/>
+          <w:sz w:val="20"/>
+          <w:szCs w:val="20"/>
+          <w:lang w:eastAsia="ja-JP"/>
+          <w14:ligatures w14:val="none"/>
+        </w:rPr>
+      </w:pPr>
+      <w:r>
+        <w:rPr>
+          <w:rFonts w:ascii="Arial" w:eastAsia="Times New Roman" w:hAnsi="Arial" w:cs="Arial"/>
+          <w:kern w:val="0"/>
+          <w:sz w:val="20"/>
+          <w:szCs w:val="20"/>
+          <w:lang w:eastAsia="ja-JP"/>
+          <w14:ligatures w14:val="none"/>
         </w:rPr>
         <w:drawing>
-          <wp:inline distT="0" distB="0" distL="0" distR="0" wp14:anchorId="5507B746" wp14:editId="62365E26">
-            <wp:extent cx="5612130" cy="525145"/>
-            <wp:effectExtent l="0" t="0" r="7620" b="8255"/>
-            <wp:docPr id="1341612743" name="Imagen 1"/>
+          <wp:inline distT="0" distB="0" distL="0" distR="0" wp14:anchorId="56C4809B" wp14:editId="4B86944C">
+            <wp:extent cx="5172797" cy="533474"/>
+            <wp:effectExtent l="0" t="0" r="8890" b="0"/>
+            <wp:docPr id="233751749" name="Imagen 1"/>
             <wp:cNvGraphicFramePr>
               <a:graphicFrameLocks xmlns:a="http://schemas.openxmlformats.org/drawingml/2006/main" noChangeAspect="1"/>
             </wp:cNvGraphicFramePr>
@@ -11547,7 +11503,57 @@
               <a:graphicData uri="http://schemas.openxmlformats.org/drawingml/2006/picture">
                 <pic:pic xmlns:pic="http://schemas.openxmlformats.org/drawingml/2006/picture">
                   <pic:nvPicPr>
-                    <pic:cNvPr id="1341612743" name=""/>
+                    <pic:cNvPr id="233751749" name=""/>
+                    <pic:cNvPicPr/>
+                  </pic:nvPicPr>
+                  <pic:blipFill>
+                    <a:blip r:embed="rId46"/>
+                    <a:stretch>
+                      <a:fillRect/>
+                    </a:stretch>
+                  </pic:blipFill>
+                  <pic:spPr>
+                    <a:xfrm>
+                      <a:off x="0" y="0"/>
+                      <a:ext cx="5172797" cy="533474"/>
+                    </a:xfrm>
+                    <a:prstGeom prst="rect">
+                      <a:avLst/>
+                    </a:prstGeom>
+                  </pic:spPr>
+                </pic:pic>
+              </a:graphicData>
+            </a:graphic>
+          </wp:inline>
+        </w:drawing>
+      </w:r>
+    </w:p>
+    <w:p>
+      <w:pPr>
+        <w:jc w:val="center"/>
+        <w:rPr>
+          <w:rFonts w:ascii="Arial" w:hAnsi="Arial" w:cs="Arial"/>
+          <w:sz w:val="20"/>
+          <w:szCs w:val="20"/>
+        </w:rPr>
+      </w:pPr>
+      <w:r>
+        <w:rPr>
+          <w:noProof/>
+        </w:rPr>
+        <w:drawing>
+          <wp:inline distT="0" distB="0" distL="0" distR="0" wp14:anchorId="6497F4E1" wp14:editId="349A4EC1">
+            <wp:extent cx="5182323" cy="552527"/>
+            <wp:effectExtent l="0" t="0" r="0" b="0"/>
+            <wp:docPr id="816054741" name="Imagen 1"/>
+            <wp:cNvGraphicFramePr>
+              <a:graphicFrameLocks xmlns:a="http://schemas.openxmlformats.org/drawingml/2006/main" noChangeAspect="1"/>
+            </wp:cNvGraphicFramePr>
+            <a:graphic xmlns:a="http://schemas.openxmlformats.org/drawingml/2006/main">
+              <a:graphicData uri="http://schemas.openxmlformats.org/drawingml/2006/picture">
+                <pic:pic xmlns:pic="http://schemas.openxmlformats.org/drawingml/2006/picture">
+                  <pic:nvPicPr>
+                    <pic:cNvPr id="816054741" name=""/>
                     <pic:cNvPicPr/>
                   </pic:nvPicPr>
                   <pic:blipFill>
@@ -11559,47 +11565,7 @@
                   <pic:spPr>
                     <a:xfrm>
                       <a:off x="0" y="0"/>
-                      <a:ext cx="5612130" cy="525145"/>
-                    </a:xfrm>
-                    <a:prstGeom prst="rect">
-                      <a:avLst/>
-                    </a:prstGeom>
-                  </pic:spPr>
-                </pic:pic>
-              </a:graphicData>
-            </a:graphic>
-          </wp:inline>
-        </w:drawing>
-      </w:r>
-      <w:r>
-        <w:rPr>
-          <w:noProof/>
-        </w:rPr>
-        <w:drawing>
-          <wp:inline distT="0" distB="0" distL="0" distR="0" wp14:anchorId="78188BF8" wp14:editId="11FD9204">
-            <wp:extent cx="5612130" cy="485140"/>
-            <wp:effectExtent l="0" t="0" r="7620" b="0"/>
-            <wp:docPr id="1495081927" name="Imagen 1"/>
-            <wp:cNvGraphicFramePr>
-              <a:graphicFrameLocks xmlns:a="http://schemas.openxmlformats.org/drawingml/2006/main" noChangeAspect="1"/>
-            </wp:cNvGraphicFramePr>
-            <a:graphic xmlns:a="http://schemas.openxmlformats.org/drawingml/2006/main">
-              <a:graphicData uri="http://schemas.openxmlformats.org/drawingml/2006/picture">
-                <pic:pic xmlns:pic="http://schemas.openxmlformats.org/drawingml/2006/picture">
-                  <pic:nvPicPr>
-                    <pic:cNvPr id="1495081927" name=""/>
-                    <pic:cNvPicPr/>
-                  </pic:nvPicPr>
-                  <pic:blipFill>
-                    <a:blip r:embed="rId48"/>
-                    <a:stretch>
-                      <a:fillRect/>
-                    </a:stretch>
-                  </pic:blipFill>
-                  <pic:spPr>
-                    <a:xfrm>
-                      <a:off x="0" y="0"/>
-                      <a:ext cx="5612130" cy="485140"/>
+                      <a:ext cx="5182323" cy="552527"/>
                     </a:xfrm>
                     <a:prstGeom prst="rect">
                       <a:avLst/>
@@ -11827,7 +11793,79 @@
           <w:sz w:val="20"/>
           <w:szCs w:val="20"/>
         </w:rPr>
-        <w:t xml:space="preserve">, with the </w:t>
+        <w:t>, with the completion percentage appended when the tab is</w:t>
+      </w:r>
+      <w:r>
+        <w:rPr>
+          <w:rFonts w:ascii="Arial" w:hAnsi="Arial" w:cs="Arial"/>
+          <w:sz w:val="20"/>
+          <w:szCs w:val="20"/>
+        </w:rPr>
+        <w:t xml:space="preserve"> </w:t>
+      </w:r>
+      <w:r>
+        <w:rPr>
+          <w:rFonts w:ascii="Arial" w:hAnsi="Arial" w:cs="Arial"/>
+          <w:sz w:val="20"/>
+          <w:szCs w:val="20"/>
+        </w:rPr>
+        <w:t>running in sample-size mode; while autosave is writing accumulated data</w:t>
+      </w:r>
+      <w:r>
+        <w:rPr>
+          <w:rFonts w:ascii="Arial" w:hAnsi="Arial" w:cs="Arial"/>
+          <w:sz w:val="20"/>
+          <w:szCs w:val="20"/>
+        </w:rPr>
+        <w:t xml:space="preserve"> </w:t>
+      </w:r>
+      <w:r>
+        <w:rPr>
+          <w:rFonts w:ascii="Arial" w:hAnsi="Arial" w:cs="Arial"/>
+          <w:sz w:val="20"/>
+          <w:szCs w:val="20"/>
+        </w:rPr>
+        <w:t xml:space="preserve">to disk, it shows </w:t>
+      </w:r>
+      <w:r>
+        <w:rPr>
+          <w:rFonts w:ascii="Arial" w:hAnsi="Arial" w:cs="Arial"/>
+          <w:sz w:val="20"/>
+          <w:szCs w:val="20"/>
+        </w:rPr>
+        <w:t>“</w:t>
+      </w:r>
+      <w:r>
+        <w:rPr>
+          <w:rFonts w:ascii="Arial" w:hAnsi="Arial" w:cs="Arial"/>
+          <w:sz w:val="20"/>
+          <w:szCs w:val="20"/>
+        </w:rPr>
+        <w:t>Processing dat</w:t>
+      </w:r>
+      <w:r>
+        <w:rPr>
+          <w:rFonts w:ascii="Arial" w:hAnsi="Arial" w:cs="Arial"/>
+          <w:sz w:val="20"/>
+          <w:szCs w:val="20"/>
+        </w:rPr>
+        <w:t>a”</w:t>
+      </w:r>
+      <w:r>
+        <w:rPr>
+          <w:rFonts w:ascii="Arial" w:hAnsi="Arial" w:cs="Arial"/>
+          <w:sz w:val="20"/>
+          <w:szCs w:val="20"/>
+        </w:rPr>
+        <w:t>; and once the user stops the</w:t>
+      </w:r>
+      <w:r>
+        <w:rPr>
+          <w:rFonts w:ascii="Arial" w:hAnsi="Arial" w:cs="Arial"/>
+          <w:sz w:val="20"/>
+          <w:szCs w:val="20"/>
+        </w:rPr>
+        <w:t xml:space="preserve"> </w:t>
       </w:r>
       <w:r>
         <w:rPr>
@@ -11836,7 +11874,39 @@
           <w:szCs w:val="20"/>
         </w:rPr>
         <w:lastRenderedPageBreak/>
-        <w:t>completion percentage appended when the tab is</w:t>
+        <w:t xml:space="preserve">measurement, it shows the same </w:t>
+      </w:r>
+      <w:r>
+        <w:rPr>
+          <w:rFonts w:ascii="Arial" w:hAnsi="Arial" w:cs="Arial"/>
+          <w:sz w:val="20"/>
+          <w:szCs w:val="20"/>
+        </w:rPr>
+        <w:t>“</w:t>
+      </w:r>
+      <w:r>
+        <w:rPr>
+          <w:rFonts w:ascii="Arial" w:hAnsi="Arial" w:cs="Arial"/>
+          <w:sz w:val="20"/>
+          <w:szCs w:val="20"/>
+        </w:rPr>
+        <w:t>Processing data</w:t>
+      </w:r>
+      <w:r>
+        <w:rPr>
+          <w:rFonts w:ascii="Arial" w:hAnsi="Arial" w:cs="Arial"/>
+          <w:sz w:val="20"/>
+          <w:szCs w:val="20"/>
+        </w:rPr>
+        <w:t>”</w:t>
+      </w:r>
+      <w:r>
+        <w:rPr>
+          <w:rFonts w:ascii="Arial" w:hAnsi="Arial" w:cs="Arial"/>
+          <w:sz w:val="20"/>
+          <w:szCs w:val="20"/>
+        </w:rPr>
+        <w:t xml:space="preserve"> message, followed by</w:t>
       </w:r>
       <w:r>
         <w:rPr>
@@ -11852,7 +11922,7 @@
           <w:sz w:val="20"/>
           <w:szCs w:val="20"/>
         </w:rPr>
-        <w:t>running in sample-size mode; while autosave is writing accumulated data</w:t>
+        <w:t>an explicit percentage, while the recorded entries are sorted and</w:t>
       </w:r>
       <w:r>
         <w:rPr>
@@ -11868,106 +11938,29 @@
           <w:sz w:val="20"/>
           <w:szCs w:val="20"/>
         </w:rPr>
-        <w:t xml:space="preserve">to disk, it shows </w:t>
-      </w:r>
-      <w:r>
-        <w:rPr>
-          <w:rFonts w:ascii="Arial" w:hAnsi="Arial" w:cs="Arial"/>
-          <w:sz w:val="20"/>
-          <w:szCs w:val="20"/>
-        </w:rPr>
-        <w:t>“</w:t>
-      </w:r>
-      <w:r>
-        <w:rPr>
-          <w:rFonts w:ascii="Arial" w:hAnsi="Arial" w:cs="Arial"/>
-          <w:sz w:val="20"/>
-          <w:szCs w:val="20"/>
-        </w:rPr>
-        <w:t>Processing dat</w:t>
-      </w:r>
-      <w:r>
-        <w:rPr>
-          <w:rFonts w:ascii="Arial" w:hAnsi="Arial" w:cs="Arial"/>
-          <w:sz w:val="20"/>
-          <w:szCs w:val="20"/>
-        </w:rPr>
-        <w:t>a”</w:t>
-      </w:r>
-      <w:r>
-        <w:rPr>
-          <w:rFonts w:ascii="Arial" w:hAnsi="Arial" w:cs="Arial"/>
-          <w:sz w:val="20"/>
-          <w:szCs w:val="20"/>
-        </w:rPr>
-        <w:t>; and once the user stops the</w:t>
-      </w:r>
-      <w:r>
-        <w:rPr>
-          <w:rFonts w:ascii="Arial" w:hAnsi="Arial" w:cs="Arial"/>
-          <w:sz w:val="20"/>
-          <w:szCs w:val="20"/>
-        </w:rPr>
-        <w:t xml:space="preserve"> </w:t>
-      </w:r>
-      <w:r>
-        <w:rPr>
-          <w:rFonts w:ascii="Arial" w:hAnsi="Arial" w:cs="Arial"/>
-          <w:sz w:val="20"/>
-          <w:szCs w:val="20"/>
-        </w:rPr>
-        <w:t>measurement, it shows the same ``Processing data'' message, followed by</w:t>
-      </w:r>
-      <w:r>
-        <w:rPr>
-          <w:rFonts w:ascii="Arial" w:hAnsi="Arial" w:cs="Arial"/>
-          <w:sz w:val="20"/>
-          <w:szCs w:val="20"/>
-        </w:rPr>
-        <w:t xml:space="preserve"> </w:t>
-      </w:r>
-      <w:r>
-        <w:rPr>
-          <w:rFonts w:ascii="Arial" w:hAnsi="Arial" w:cs="Arial"/>
-          <w:sz w:val="20"/>
-          <w:szCs w:val="20"/>
-        </w:rPr>
-        <w:t>an explicit percentage, while the recorded entries are sorted and</w:t>
-      </w:r>
-      <w:r>
-        <w:rPr>
-          <w:rFonts w:ascii="Arial" w:hAnsi="Arial" w:cs="Arial"/>
-          <w:sz w:val="20"/>
-          <w:szCs w:val="20"/>
-        </w:rPr>
-        <w:t xml:space="preserve"> </w:t>
-      </w:r>
-      <w:r>
-        <w:rPr>
-          <w:rFonts w:ascii="Arial" w:hAnsi="Arial" w:cs="Arial"/>
-          <w:sz w:val="20"/>
-          <w:szCs w:val="20"/>
-        </w:rPr>
         <w:t>written to their final path.</w:t>
       </w:r>
     </w:p>
     <w:p>
       <w:pPr>
-        <w:rPr>
-          <w:rFonts w:ascii="Arial" w:hAnsi="Arial" w:cs="Arial"/>
-          <w:sz w:val="20"/>
-          <w:szCs w:val="20"/>
-        </w:rPr>
-      </w:pPr>
-      <w:r>
-        <w:rPr>
-          <w:noProof/>
+        <w:jc w:val="center"/>
+        <w:rPr>
+          <w:rFonts w:ascii="Arial" w:hAnsi="Arial" w:cs="Arial"/>
+          <w:sz w:val="20"/>
+          <w:szCs w:val="20"/>
+        </w:rPr>
+      </w:pPr>
+      <w:r>
+        <w:rPr>
+          <w:rFonts w:ascii="Arial" w:hAnsi="Arial" w:cs="Arial"/>
+          <w:sz w:val="20"/>
+          <w:szCs w:val="20"/>
         </w:rPr>
         <w:drawing>
-          <wp:inline distT="0" distB="0" distL="0" distR="0" wp14:anchorId="73230DCC" wp14:editId="22D54B9D">
-            <wp:extent cx="5561905" cy="580952"/>
-            <wp:effectExtent l="0" t="0" r="1270" b="0"/>
-            <wp:docPr id="1277504572" name="Imagen 1"/>
+          <wp:inline distT="0" distB="0" distL="0" distR="0" wp14:anchorId="46EFD8DB" wp14:editId="7A5F2C63">
+            <wp:extent cx="5268060" cy="581106"/>
+            <wp:effectExtent l="0" t="0" r="8890" b="9525"/>
+            <wp:docPr id="1472585388" name="Imagen 1"/>
             <wp:cNvGraphicFramePr>
               <a:graphicFrameLocks xmlns:a="http://schemas.openxmlformats.org/drawingml/2006/main" noChangeAspect="1"/>
             </wp:cNvGraphicFramePr>
@@ -11975,7 +11968,57 @@
               <a:graphicData uri="http://schemas.openxmlformats.org/drawingml/2006/picture">
                 <pic:pic xmlns:pic="http://schemas.openxmlformats.org/drawingml/2006/picture">
                   <pic:nvPicPr>
-                    <pic:cNvPr id="1277504572" name=""/>
+                    <pic:cNvPr id="1472585388" name=""/>
+                    <pic:cNvPicPr/>
+                  </pic:nvPicPr>
+                  <pic:blipFill>
+                    <a:blip r:embed="rId48"/>
+                    <a:stretch>
+                      <a:fillRect/>
+                    </a:stretch>
+                  </pic:blipFill>
+                  <pic:spPr>
+                    <a:xfrm>
+                      <a:off x="0" y="0"/>
+                      <a:ext cx="5268060" cy="581106"/>
+                    </a:xfrm>
+                    <a:prstGeom prst="rect">
+                      <a:avLst/>
+                    </a:prstGeom>
+                  </pic:spPr>
+                </pic:pic>
+              </a:graphicData>
+            </a:graphic>
+          </wp:inline>
+        </w:drawing>
+      </w:r>
+    </w:p>
+    <w:p>
+      <w:pPr>
+        <w:jc w:val="center"/>
+        <w:rPr>
+          <w:rFonts w:ascii="Arial" w:hAnsi="Arial" w:cs="Arial"/>
+          <w:sz w:val="20"/>
+          <w:szCs w:val="20"/>
+        </w:rPr>
+      </w:pPr>
+      <w:r>
+        <w:rPr>
+          <w:noProof/>
+        </w:rPr>
+        <w:drawing>
+          <wp:inline distT="0" distB="0" distL="0" distR="0" wp14:anchorId="77507B81" wp14:editId="659EF8D3">
+            <wp:extent cx="5277587" cy="590632"/>
+            <wp:effectExtent l="0" t="0" r="0" b="0"/>
+            <wp:docPr id="168488638" name="Imagen 1"/>
+            <wp:cNvGraphicFramePr>
+              <a:graphicFrameLocks xmlns:a="http://schemas.openxmlformats.org/drawingml/2006/main" noChangeAspect="1"/>
+            </wp:cNvGraphicFramePr>
+            <a:graphic xmlns:a="http://schemas.openxmlformats.org/drawingml/2006/main">
+              <a:graphicData uri="http://schemas.openxmlformats.org/drawingml/2006/picture">
+                <pic:pic xmlns:pic="http://schemas.openxmlformats.org/drawingml/2006/picture">
+                  <pic:nvPicPr>
+                    <pic:cNvPr id="168488638" name=""/>
                     <pic:cNvPicPr/>
                   </pic:nvPicPr>
                   <pic:blipFill>
@@ -11987,56 +12030,7 @@
                   <pic:spPr>
                     <a:xfrm>
                       <a:off x="0" y="0"/>
-                      <a:ext cx="5561905" cy="580952"/>
-                    </a:xfrm>
-                    <a:prstGeom prst="rect">
-                      <a:avLst/>
-                    </a:prstGeom>
-                  </pic:spPr>
-                </pic:pic>
-              </a:graphicData>
-            </a:graphic>
-          </wp:inline>
-        </w:drawing>
-      </w:r>
-    </w:p>
-    <w:p>
-      <w:pPr>
-        <w:rPr>
-          <w:rFonts w:ascii="Arial" w:hAnsi="Arial" w:cs="Arial"/>
-          <w:sz w:val="20"/>
-          <w:szCs w:val="20"/>
-        </w:rPr>
-      </w:pPr>
-      <w:r>
-        <w:rPr>
-          <w:noProof/>
-        </w:rPr>
-        <w:drawing>
-          <wp:inline distT="0" distB="0" distL="0" distR="0" wp14:anchorId="2773372A" wp14:editId="1599D423">
-            <wp:extent cx="5612130" cy="595630"/>
-            <wp:effectExtent l="0" t="0" r="7620" b="0"/>
-            <wp:docPr id="1269074655" name="Imagen 1"/>
-            <wp:cNvGraphicFramePr>
-              <a:graphicFrameLocks xmlns:a="http://schemas.openxmlformats.org/drawingml/2006/main" noChangeAspect="1"/>
-            </wp:cNvGraphicFramePr>
-            <a:graphic xmlns:a="http://schemas.openxmlformats.org/drawingml/2006/main">
-              <a:graphicData uri="http://schemas.openxmlformats.org/drawingml/2006/picture">
-                <pic:pic xmlns:pic="http://schemas.openxmlformats.org/drawingml/2006/picture">
-                  <pic:nvPicPr>
-                    <pic:cNvPr id="1269074655" name=""/>
-                    <pic:cNvPicPr/>
-                  </pic:nvPicPr>
-                  <pic:blipFill>
-                    <a:blip r:embed="rId50"/>
-                    <a:stretch>
-                      <a:fillRect/>
-                    </a:stretch>
-                  </pic:blipFill>
-                  <pic:spPr>
-                    <a:xfrm>
-                      <a:off x="0" y="0"/>
-                      <a:ext cx="5612130" cy="595630"/>
+                      <a:ext cx="5277587" cy="590632"/>
                     </a:xfrm>
                     <a:prstGeom prst="rect">
                       <a:avLst/>
@@ -12203,14 +12197,11 @@
         <w:jc w:val="center"/>
       </w:pPr>
       <w:r>
-        <w:rPr>
-          <w:noProof/>
-        </w:rPr>
         <w:drawing>
-          <wp:inline distT="0" distB="0" distL="0" distR="0" wp14:anchorId="05848B28" wp14:editId="20C4CFAC">
-            <wp:extent cx="5612130" cy="597535"/>
-            <wp:effectExtent l="0" t="0" r="7620" b="0"/>
-            <wp:docPr id="1124288191" name="Imagen 1"/>
+          <wp:inline distT="0" distB="0" distL="0" distR="0" wp14:anchorId="4CB52F55" wp14:editId="355CBB75">
+            <wp:extent cx="5537293" cy="570015"/>
+            <wp:effectExtent l="0" t="0" r="0" b="1905"/>
+            <wp:docPr id="1070071594" name="Imagen 1"/>
             <wp:cNvGraphicFramePr>
               <a:graphicFrameLocks xmlns:a="http://schemas.openxmlformats.org/drawingml/2006/main" noChangeAspect="1"/>
             </wp:cNvGraphicFramePr>
@@ -12218,11 +12209,11 @@
               <a:graphicData uri="http://schemas.openxmlformats.org/drawingml/2006/picture">
                 <pic:pic xmlns:pic="http://schemas.openxmlformats.org/drawingml/2006/picture">
                   <pic:nvPicPr>
-                    <pic:cNvPr id="1124288191" name=""/>
+                    <pic:cNvPr id="1070071594" name=""/>
                     <pic:cNvPicPr/>
                   </pic:nvPicPr>
                   <pic:blipFill>
-                    <a:blip r:embed="rId51"/>
+                    <a:blip r:embed="rId50"/>
                     <a:stretch>
                       <a:fillRect/>
                     </a:stretch>
@@ -12230,7 +12221,7 @@
                   <pic:spPr>
                     <a:xfrm>
                       <a:off x="0" y="0"/>
-                      <a:ext cx="5612130" cy="597535"/>
+                      <a:ext cx="5537293" cy="570015"/>
                     </a:xfrm>
                     <a:prstGeom prst="rect">
                       <a:avLst/>
@@ -12242,11 +12233,6 @@
           </wp:inline>
         </w:drawing>
       </w:r>
-    </w:p>
-    <w:p>
-      <w:pPr>
-        <w:jc w:val="center"/>
-      </w:pPr>
     </w:p>
     <w:p>
       <w:pPr>
@@ -12377,7 +12363,7 @@
                     <pic:cNvPicPr/>
                   </pic:nvPicPr>
                   <pic:blipFill>
-                    <a:blip r:embed="rId52"/>
+                    <a:blip r:embed="rId51"/>
                     <a:stretch>
                       <a:fillRect/>
                     </a:stretch>
@@ -12445,7 +12431,7 @@
                     <pic:cNvPicPr/>
                   </pic:nvPicPr>
                   <pic:blipFill>
-                    <a:blip r:embed="rId53"/>
+                    <a:blip r:embed="rId52"/>
                     <a:stretch>
                       <a:fillRect/>
                     </a:stretch>
@@ -12508,7 +12494,7 @@
                     <pic:cNvPicPr/>
                   </pic:nvPicPr>
                   <pic:blipFill>
-                    <a:blip r:embed="rId54"/>
+                    <a:blip r:embed="rId53"/>
                     <a:stretch>
                       <a:fillRect/>
                     </a:stretch>
@@ -12571,7 +12557,7 @@
                     <pic:cNvPicPr/>
                   </pic:nvPicPr>
                   <pic:blipFill rotWithShape="1">
-                    <a:blip r:embed="rId55"/>
+                    <a:blip r:embed="rId54"/>
                     <a:srcRect l="40925" t="16622" r="1" b="14523"/>
                     <a:stretch/>
                   </pic:blipFill>
@@ -12641,7 +12627,7 @@
                     <pic:cNvPicPr/>
                   </pic:nvPicPr>
                   <pic:blipFill>
-                    <a:blip r:embed="rId56"/>
+                    <a:blip r:embed="rId55"/>
                     <a:stretch>
                       <a:fillRect/>
                     </a:stretch>
@@ -12690,8 +12676,8 @@
         </w:rPr>
         <w:lastRenderedPageBreak/>
         <w:drawing>
-          <wp:inline distT="0" distB="0" distL="0" distR="0" wp14:anchorId="7E51E284" wp14:editId="57673A4D">
-            <wp:extent cx="2614239" cy="2438196"/>
+          <wp:inline distT="0" distB="0" distL="0" distR="0" wp14:anchorId="7E51E284" wp14:editId="6676EF7B">
+            <wp:extent cx="2266950" cy="2114292"/>
             <wp:effectExtent l="0" t="0" r="0" b="635"/>
             <wp:docPr id="1955852356" name="Imagen 1" descr="Gráfico&#10;&#10;Descripción generada automáticamente"/>
             <wp:cNvGraphicFramePr>
@@ -12705,7 +12691,7 @@
                     <pic:cNvPicPr/>
                   </pic:nvPicPr>
                   <pic:blipFill>
-                    <a:blip r:embed="rId57"/>
+                    <a:blip r:embed="rId56"/>
                     <a:stretch>
                       <a:fillRect/>
                     </a:stretch>
@@ -12713,7 +12699,7 @@
                   <pic:spPr>
                     <a:xfrm>
                       <a:off x="0" y="0"/>
-                      <a:ext cx="2615727" cy="2439584"/>
+                      <a:ext cx="2275062" cy="2121857"/>
                     </a:xfrm>
                     <a:prstGeom prst="rect">
                       <a:avLst/>
@@ -12817,7 +12803,7 @@
                     <pic:cNvPicPr/>
                   </pic:nvPicPr>
                   <pic:blipFill>
-                    <a:blip r:embed="rId58"/>
+                    <a:blip r:embed="rId57"/>
                     <a:stretch>
                       <a:fillRect/>
                     </a:stretch>
@@ -12868,7 +12854,7 @@
                     <pic:cNvPicPr/>
                   </pic:nvPicPr>
                   <pic:blipFill>
-                    <a:blip r:embed="rId59"/>
+                    <a:blip r:embed="rId58"/>
                     <a:stretch>
                       <a:fillRect/>
                     </a:stretch>
@@ -12919,7 +12905,7 @@
                     <pic:cNvPicPr/>
                   </pic:nvPicPr>
                   <pic:blipFill>
-                    <a:blip r:embed="rId60"/>
+                    <a:blip r:embed="rId59"/>
                     <a:stretch>
                       <a:fillRect/>
                     </a:stretch>
@@ -12970,7 +12956,7 @@
                     <pic:cNvPicPr/>
                   </pic:nvPicPr>
                   <pic:blipFill>
-                    <a:blip r:embed="rId61"/>
+                    <a:blip r:embed="rId60"/>
                     <a:stretch>
                       <a:fillRect/>
                     </a:stretch>
@@ -13021,7 +13007,7 @@
                     <pic:cNvPicPr/>
                   </pic:nvPicPr>
                   <pic:blipFill>
-                    <a:blip r:embed="rId62"/>
+                    <a:blip r:embed="rId61"/>
                     <a:stretch>
                       <a:fillRect/>
                     </a:stretch>
@@ -13085,6 +13071,7 @@
     </w:p>
     <w:p>
       <w:pPr>
+        <w:jc w:val="center"/>
         <w:rPr>
           <w:rFonts w:ascii="Arial" w:hAnsi="Arial" w:cs="Arial"/>
           <w:sz w:val="20"/>
@@ -13098,11 +13085,10 @@
           <w:sz w:val="20"/>
           <w:szCs w:val="20"/>
         </w:rPr>
-        <w:lastRenderedPageBreak/>
         <w:drawing>
-          <wp:inline distT="0" distB="0" distL="0" distR="0" wp14:anchorId="0624388F" wp14:editId="4FF96D9E">
-            <wp:extent cx="5612130" cy="4074160"/>
-            <wp:effectExtent l="0" t="0" r="7620" b="2540"/>
+          <wp:inline distT="0" distB="0" distL="0" distR="0" wp14:anchorId="0624388F" wp14:editId="3BC0B6B9">
+            <wp:extent cx="5238750" cy="3803100"/>
+            <wp:effectExtent l="0" t="0" r="0" b="6985"/>
             <wp:docPr id="1339096993" name="Imagen 1" descr="Interfaz de usuario gráfica, Gráfico&#10;&#10;El contenido generado por IA puede ser incorrecto."/>
             <wp:cNvGraphicFramePr>
               <a:graphicFrameLocks xmlns:a="http://schemas.openxmlformats.org/drawingml/2006/main" noChangeAspect="1"/>
@@ -13115,7 +13101,7 @@
                     <pic:cNvPicPr/>
                   </pic:nvPicPr>
                   <pic:blipFill>
-                    <a:blip r:embed="rId63"/>
+                    <a:blip r:embed="rId62"/>
                     <a:stretch>
                       <a:fillRect/>
                     </a:stretch>
@@ -13123,7 +13109,7 @@
                   <pic:spPr>
                     <a:xfrm>
                       <a:off x="0" y="0"/>
-                      <a:ext cx="5612130" cy="4074160"/>
+                      <a:ext cx="5277807" cy="3831454"/>
                     </a:xfrm>
                     <a:prstGeom prst="rect">
                       <a:avLst/>
@@ -13146,6 +13132,7 @@
       </w:pPr>
       <w:bookmarkStart w:id="42" w:name="_Toc238168385"/>
       <w:r>
+        <w:lastRenderedPageBreak/>
         <w:t>Save data and plots</w:t>
       </w:r>
       <w:bookmarkEnd w:id="42"/>
@@ -13189,7 +13176,7 @@
                     <pic:cNvPicPr/>
                   </pic:nvPicPr>
                   <pic:blipFill>
-                    <a:blip r:embed="rId64"/>
+                    <a:blip r:embed="rId63"/>
                     <a:stretch>
                       <a:fillRect/>
                     </a:stretch>
@@ -13242,7 +13229,7 @@
                     <pic:cNvPicPr/>
                   </pic:nvPicPr>
                   <pic:blipFill>
-                    <a:blip r:embed="rId65"/>
+                    <a:blip r:embed="rId64"/>
                     <a:stretch>
                       <a:fillRect/>
                     </a:stretch>
@@ -13302,7 +13289,7 @@
                     <pic:cNvPicPr/>
                   </pic:nvPicPr>
                   <pic:blipFill>
-                    <a:blip r:embed="rId66"/>
+                    <a:blip r:embed="rId65"/>
                     <a:stretch>
                       <a:fillRect/>
                     </a:stretch>
@@ -13355,7 +13342,7 @@
                     <pic:cNvPicPr/>
                   </pic:nvPicPr>
                   <pic:blipFill>
-                    <a:blip r:embed="rId67"/>
+                    <a:blip r:embed="rId66"/>
                     <a:stretch>
                       <a:fillRect/>
                     </a:stretch>
@@ -13390,35 +13377,35 @@
           <w:sz w:val="20"/>
           <w:szCs w:val="20"/>
         </w:rPr>
+        <w:t>Files are saved in all operating systems in the "TempicoSoftwareData" folder within "Documents." By default, this folder is automatically created when the program is opened for the first time.</w:t>
+      </w:r>
+    </w:p>
+    <w:p>
+      <w:pPr>
+        <w:rPr>
+          <w:rFonts w:ascii="Arial" w:hAnsi="Arial" w:cs="Arial"/>
+          <w:sz w:val="20"/>
+          <w:szCs w:val="20"/>
+        </w:rPr>
+      </w:pPr>
+      <w:r>
+        <w:rPr>
+          <w:rFonts w:ascii="Arial" w:hAnsi="Arial" w:cs="Arial"/>
+          <w:sz w:val="20"/>
+          <w:szCs w:val="20"/>
+        </w:rPr>
+        <w:t>The data is saved in the same format. First, it includes the configuration applied when the data was collected, followed by the raw histogram information. This allows the user, if desired, to later manipulate the data according to their needs.</w:t>
+      </w:r>
+    </w:p>
+    <w:p>
+      <w:pPr>
+        <w:jc w:val="center"/>
+      </w:pPr>
+      <w:r>
+        <w:rPr>
+          <w:noProof/>
+        </w:rPr>
         <w:lastRenderedPageBreak/>
-        <w:t>Files are saved in all operating systems in the "TempicoSoftwareData" folder within "Documents." By default, this folder is automatically created when the program is opened for the first time.</w:t>
-      </w:r>
-    </w:p>
-    <w:p>
-      <w:pPr>
-        <w:rPr>
-          <w:rFonts w:ascii="Arial" w:hAnsi="Arial" w:cs="Arial"/>
-          <w:sz w:val="20"/>
-          <w:szCs w:val="20"/>
-        </w:rPr>
-      </w:pPr>
-      <w:r>
-        <w:rPr>
-          <w:rFonts w:ascii="Arial" w:hAnsi="Arial" w:cs="Arial"/>
-          <w:sz w:val="20"/>
-          <w:szCs w:val="20"/>
-        </w:rPr>
-        <w:t>The data is saved in the same format. First, it includes the configuration applied when the data was collected, followed by the raw histogram information. This allows the user, if desired, to later manipulate the data according to their needs.</w:t>
-      </w:r>
-    </w:p>
-    <w:p>
-      <w:pPr>
-        <w:jc w:val="center"/>
-      </w:pPr>
-      <w:r>
-        <w:rPr>
-          <w:noProof/>
-        </w:rPr>
         <w:drawing>
           <wp:inline distT="0" distB="0" distL="0" distR="0" wp14:anchorId="3C971126" wp14:editId="49DBA55A">
             <wp:extent cx="1862484" cy="3530380"/>
@@ -13435,7 +13422,7 @@
                     <pic:cNvPicPr/>
                   </pic:nvPicPr>
                   <pic:blipFill>
-                    <a:blip r:embed="rId68"/>
+                    <a:blip r:embed="rId67"/>
                     <a:stretch>
                       <a:fillRect/>
                     </a:stretch>
@@ -13495,7 +13482,7 @@
                     <pic:cNvPicPr/>
                   </pic:nvPicPr>
                   <pic:blipFill>
-                    <a:blip r:embed="rId69"/>
+                    <a:blip r:embed="rId68"/>
                     <a:stretch>
                       <a:fillRect/>
                     </a:stretch>
@@ -13558,7 +13545,7 @@
                     <pic:cNvPicPr/>
                   </pic:nvPicPr>
                   <pic:blipFill>
-                    <a:blip r:embed="rId70"/>
+                    <a:blip r:embed="rId69"/>
                     <a:stretch>
                       <a:fillRect/>
                     </a:stretch>
@@ -13618,7 +13605,7 @@
                     <pic:cNvPicPr/>
                   </pic:nvPicPr>
                   <pic:blipFill>
-                    <a:blip r:embed="rId66"/>
+                    <a:blip r:embed="rId65"/>
                     <a:stretch>
                       <a:fillRect/>
                     </a:stretch>
@@ -13655,7 +13642,6 @@
         <w:rPr>
           <w:noProof/>
         </w:rPr>
-        <w:lastRenderedPageBreak/>
         <w:drawing>
           <wp:inline distT="0" distB="0" distL="0" distR="0" wp14:anchorId="07AEDE86" wp14:editId="2EE571CB">
             <wp:extent cx="3267531" cy="1486107"/>
@@ -13672,7 +13658,7 @@
                     <pic:cNvPicPr/>
                   </pic:nvPicPr>
                   <pic:blipFill>
-                    <a:blip r:embed="rId71"/>
+                    <a:blip r:embed="rId70"/>
                     <a:stretch>
                       <a:fillRect/>
                     </a:stretch>
@@ -13707,6 +13693,7 @@
           <w:sz w:val="20"/>
           <w:szCs w:val="20"/>
         </w:rPr>
+        <w:lastRenderedPageBreak/>
         <w:t>The saved image is the one displayed in the software at the moment of clicking "Accept." Therefore, the zoom applied to the graph will also be reflected when saving the image. If multiple channels are selected for measurement, the 4 images will be saved separately.</w:t>
       </w:r>
     </w:p>
@@ -13734,7 +13721,7 @@
                     <pic:cNvPicPr/>
                   </pic:nvPicPr>
                   <pic:blipFill>
-                    <a:blip r:embed="rId72"/>
+                    <a:blip r:embed="rId71"/>
                     <a:stretch>
                       <a:fillRect/>
                     </a:stretch>
@@ -13886,7 +13873,7 @@
                     <pic:cNvPicPr/>
                   </pic:nvPicPr>
                   <pic:blipFill>
-                    <a:blip r:embed="rId73"/>
+                    <a:blip r:embed="rId72"/>
                     <a:stretch>
                       <a:fillRect/>
                     </a:stretch>
@@ -13977,7 +13964,7 @@
                     <pic:cNvPicPr/>
                   </pic:nvPicPr>
                   <pic:blipFill>
-                    <a:blip r:embed="rId74"/>
+                    <a:blip r:embed="rId73"/>
                     <a:stretch>
                       <a:fillRect/>
                     </a:stretch>
@@ -14075,7 +14062,7 @@
                     <pic:cNvPicPr/>
                   </pic:nvPicPr>
                   <pic:blipFill>
-                    <a:blip r:embed="rId75"/>
+                    <a:blip r:embed="rId74"/>
                     <a:stretch>
                       <a:fillRect/>
                     </a:stretch>
@@ -14152,7 +14139,7 @@
                     <pic:cNvPicPr/>
                   </pic:nvPicPr>
                   <pic:blipFill>
-                    <a:blip r:embed="rId76"/>
+                    <a:blip r:embed="rId75"/>
                     <a:stretch>
                       <a:fillRect/>
                     </a:stretch>
@@ -14198,7 +14185,7 @@
                     <pic:cNvPicPr/>
                   </pic:nvPicPr>
                   <pic:blipFill>
-                    <a:blip r:embed="rId77"/>
+                    <a:blip r:embed="rId76"/>
                     <a:stretch>
                       <a:fillRect/>
                     </a:stretch>
@@ -14261,7 +14248,7 @@
                     <pic:cNvPicPr/>
                   </pic:nvPicPr>
                   <pic:blipFill>
-                    <a:blip r:embed="rId78"/>
+                    <a:blip r:embed="rId77"/>
                     <a:stretch>
                       <a:fillRect/>
                     </a:stretch>
@@ -15648,7 +15635,7 @@
                     <pic:cNvPicPr/>
                   </pic:nvPicPr>
                   <pic:blipFill>
-                    <a:blip r:embed="rId79"/>
+                    <a:blip r:embed="rId78"/>
                     <a:stretch>
                       <a:fillRect/>
                     </a:stretch>
@@ -15701,7 +15688,7 @@
                     <pic:cNvPicPr/>
                   </pic:nvPicPr>
                   <pic:blipFill rotWithShape="1">
-                    <a:blip r:embed="rId80"/>
+                    <a:blip r:embed="rId79"/>
                     <a:srcRect t="1869" b="1"/>
                     <a:stretch/>
                   </pic:blipFill>
@@ -15786,7 +15773,7 @@
                     <pic:cNvPicPr/>
                   </pic:nvPicPr>
                   <pic:blipFill>
-                    <a:blip r:embed="rId81"/>
+                    <a:blip r:embed="rId80"/>
                     <a:stretch>
                       <a:fillRect/>
                     </a:stretch>
@@ -15839,7 +15826,7 @@
                     <pic:cNvPicPr/>
                   </pic:nvPicPr>
                   <pic:blipFill>
-                    <a:blip r:embed="rId82"/>
+                    <a:blip r:embed="rId81"/>
                     <a:stretch>
                       <a:fillRect/>
                     </a:stretch>
@@ -15918,7 +15905,7 @@
                     <pic:cNvPicPr/>
                   </pic:nvPicPr>
                   <pic:blipFill>
-                    <a:blip r:embed="rId83"/>
+                    <a:blip r:embed="rId82"/>
                     <a:stretch>
                       <a:fillRect/>
                     </a:stretch>
@@ -15989,7 +15976,7 @@
                     <pic:cNvPicPr/>
                   </pic:nvPicPr>
                   <pic:blipFill>
-                    <a:blip r:embed="rId84"/>
+                    <a:blip r:embed="rId83"/>
                     <a:stretch>
                       <a:fillRect/>
                     </a:stretch>
@@ -16052,7 +16039,7 @@
                     <pic:cNvPicPr/>
                   </pic:nvPicPr>
                   <pic:blipFill>
-                    <a:blip r:embed="rId85"/>
+                    <a:blip r:embed="rId84"/>
                     <a:stretch>
                       <a:fillRect/>
                     </a:stretch>
@@ -16097,7 +16084,7 @@
                     <pic:cNvPicPr/>
                   </pic:nvPicPr>
                   <pic:blipFill>
-                    <a:blip r:embed="rId86"/>
+                    <a:blip r:embed="rId85"/>
                     <a:stretch>
                       <a:fillRect/>
                     </a:stretch>
@@ -16207,7 +16194,7 @@
                     </pic:cNvPicPr>
                   </pic:nvPicPr>
                   <pic:blipFill>
-                    <a:blip r:embed="rId87">
+                    <a:blip r:embed="rId86">
                       <a:extLst>
                         <a:ext uri="{28A0092B-C50C-407E-A947-70E740481C1C}">
                           <a14:useLocalDpi xmlns:a14="http://schemas.microsoft.com/office/drawing/2010/main" val="0"/>
@@ -16304,7 +16291,7 @@
                     <pic:cNvPicPr/>
                   </pic:nvPicPr>
                   <pic:blipFill>
-                    <a:blip r:embed="rId88"/>
+                    <a:blip r:embed="rId87"/>
                     <a:stretch>
                       <a:fillRect/>
                     </a:stretch>
@@ -16374,7 +16361,7 @@
                     <pic:cNvPicPr/>
                   </pic:nvPicPr>
                   <pic:blipFill>
-                    <a:blip r:embed="rId89"/>
+                    <a:blip r:embed="rId88"/>
                     <a:stretch>
                       <a:fillRect/>
                     </a:stretch>
@@ -16425,7 +16412,7 @@
                     <pic:cNvPicPr/>
                   </pic:nvPicPr>
                   <pic:blipFill>
-                    <a:blip r:embed="rId90"/>
+                    <a:blip r:embed="rId89"/>
                     <a:stretch>
                       <a:fillRect/>
                     </a:stretch>
@@ -16491,7 +16478,7 @@
                     <pic:cNvPicPr/>
                   </pic:nvPicPr>
                   <pic:blipFill>
-                    <a:blip r:embed="rId91"/>
+                    <a:blip r:embed="rId90"/>
                     <a:stretch>
                       <a:fillRect/>
                     </a:stretch>
@@ -16539,7 +16526,7 @@
                     <pic:cNvPicPr/>
                   </pic:nvPicPr>
                   <pic:blipFill>
-                    <a:blip r:embed="rId92"/>
+                    <a:blip r:embed="rId91"/>
                     <a:stretch>
                       <a:fillRect/>
                     </a:stretch>
@@ -16584,7 +16571,7 @@
                     <pic:cNvPicPr/>
                   </pic:nvPicPr>
                   <pic:blipFill>
-                    <a:blip r:embed="rId93"/>
+                    <a:blip r:embed="rId92"/>
                     <a:stretch>
                       <a:fillRect/>
                     </a:stretch>
@@ -16629,7 +16616,7 @@
                     <pic:cNvPicPr/>
                   </pic:nvPicPr>
                   <pic:blipFill>
-                    <a:blip r:embed="rId94"/>
+                    <a:blip r:embed="rId93"/>
                     <a:stretch>
                       <a:fillRect/>
                     </a:stretch>
@@ -16675,7 +16662,7 @@
                     <pic:cNvPicPr/>
                   </pic:nvPicPr>
                   <pic:blipFill>
-                    <a:blip r:embed="rId95"/>
+                    <a:blip r:embed="rId94"/>
                     <a:stretch>
                       <a:fillRect/>
                     </a:stretch>
@@ -16721,7 +16708,7 @@
                     <pic:cNvPicPr/>
                   </pic:nvPicPr>
                   <pic:blipFill>
-                    <a:blip r:embed="rId96"/>
+                    <a:blip r:embed="rId95"/>
                     <a:stretch>
                       <a:fillRect/>
                     </a:stretch>
@@ -16766,7 +16753,7 @@
                     <pic:cNvPicPr/>
                   </pic:nvPicPr>
                   <pic:blipFill>
-                    <a:blip r:embed="rId97"/>
+                    <a:blip r:embed="rId96"/>
                     <a:stretch>
                       <a:fillRect/>
                     </a:stretch>
@@ -16816,7 +16803,7 @@
                     <pic:cNvPicPr/>
                   </pic:nvPicPr>
                   <pic:blipFill rotWithShape="1">
-                    <a:blip r:embed="rId98"/>
+                    <a:blip r:embed="rId97"/>
                     <a:srcRect l="1604"/>
                     <a:stretch>
                       <a:fillRect/>
@@ -16870,7 +16857,7 @@
                     <pic:cNvPicPr/>
                   </pic:nvPicPr>
                   <pic:blipFill>
-                    <a:blip r:embed="rId99"/>
+                    <a:blip r:embed="rId98"/>
                     <a:stretch>
                       <a:fillRect/>
                     </a:stretch>
@@ -16918,7 +16905,7 @@
                     <pic:cNvPicPr/>
                   </pic:nvPicPr>
                   <pic:blipFill>
-                    <a:blip r:embed="rId100"/>
+                    <a:blip r:embed="rId99"/>
                     <a:stretch>
                       <a:fillRect/>
                     </a:stretch>
@@ -16978,7 +16965,7 @@
                     <pic:cNvPicPr/>
                   </pic:nvPicPr>
                   <pic:blipFill>
-                    <a:blip r:embed="rId101"/>
+                    <a:blip r:embed="rId100"/>
                     <a:stretch>
                       <a:fillRect/>
                     </a:stretch>
@@ -17023,7 +17010,7 @@
                     <pic:cNvPicPr/>
                   </pic:nvPicPr>
                   <pic:blipFill>
-                    <a:blip r:embed="rId102"/>
+                    <a:blip r:embed="rId101"/>
                     <a:stretch>
                       <a:fillRect/>
                     </a:stretch>
@@ -17074,7 +17061,7 @@
                     <pic:cNvPicPr/>
                   </pic:nvPicPr>
                   <pic:blipFill>
-                    <a:blip r:embed="rId103"/>
+                    <a:blip r:embed="rId102"/>
                     <a:stretch>
                       <a:fillRect/>
                     </a:stretch>
@@ -17119,7 +17106,7 @@
                     <pic:cNvPicPr/>
                   </pic:nvPicPr>
                   <pic:blipFill>
-                    <a:blip r:embed="rId104"/>
+                    <a:blip r:embed="rId103"/>
                     <a:stretch>
                       <a:fillRect/>
                     </a:stretch>
@@ -17170,7 +17157,7 @@
                     <pic:cNvPicPr/>
                   </pic:nvPicPr>
                   <pic:blipFill rotWithShape="1">
-                    <a:blip r:embed="rId105"/>
+                    <a:blip r:embed="rId104"/>
                     <a:srcRect t="901" b="-1"/>
                     <a:stretch>
                       <a:fillRect/>
@@ -17258,7 +17245,7 @@
                     <pic:cNvPicPr/>
                   </pic:nvPicPr>
                   <pic:blipFill>
-                    <a:blip r:embed="rId106"/>
+                    <a:blip r:embed="rId105"/>
                     <a:stretch>
                       <a:fillRect/>
                     </a:stretch>
@@ -17301,7 +17288,7 @@
                     <pic:cNvPicPr/>
                   </pic:nvPicPr>
                   <pic:blipFill>
-                    <a:blip r:embed="rId107"/>
+                    <a:blip r:embed="rId106"/>
                     <a:stretch>
                       <a:fillRect/>
                     </a:stretch>
@@ -17349,7 +17336,7 @@
                     <pic:cNvPicPr/>
                   </pic:nvPicPr>
                   <pic:blipFill>
-                    <a:blip r:embed="rId108"/>
+                    <a:blip r:embed="rId107"/>
                     <a:stretch>
                       <a:fillRect/>
                     </a:stretch>
@@ -17399,7 +17386,7 @@
                     <pic:cNvPicPr/>
                   </pic:nvPicPr>
                   <pic:blipFill>
-                    <a:blip r:embed="rId109"/>
+                    <a:blip r:embed="rId108"/>
                     <a:stretch>
                       <a:fillRect/>
                     </a:stretch>
@@ -17449,7 +17436,7 @@
                     <pic:cNvPicPr/>
                   </pic:nvPicPr>
                   <pic:blipFill>
-                    <a:blip r:embed="rId110"/>
+                    <a:blip r:embed="rId109"/>
                     <a:stretch>
                       <a:fillRect/>
                     </a:stretch>
@@ -17509,7 +17496,7 @@
                     <pic:cNvPicPr/>
                   </pic:nvPicPr>
                   <pic:blipFill>
-                    <a:blip r:embed="rId111"/>
+                    <a:blip r:embed="rId110"/>
                     <a:stretch>
                       <a:fillRect/>
                     </a:stretch>
@@ -17557,7 +17544,7 @@
                     <pic:cNvPicPr/>
                   </pic:nvPicPr>
                   <pic:blipFill>
-                    <a:blip r:embed="rId112"/>
+                    <a:blip r:embed="rId111"/>
                     <a:stretch>
                       <a:fillRect/>
                     </a:stretch>
@@ -17607,7 +17594,7 @@
                     <pic:cNvPicPr/>
                   </pic:nvPicPr>
                   <pic:blipFill>
-                    <a:blip r:embed="rId113"/>
+                    <a:blip r:embed="rId112"/>
                     <a:stretch>
                       <a:fillRect/>
                     </a:stretch>
@@ -17657,7 +17644,7 @@
                     <pic:cNvPicPr/>
                   </pic:nvPicPr>
                   <pic:blipFill>
-                    <a:blip r:embed="rId114"/>
+                    <a:blip r:embed="rId113"/>
                     <a:stretch>
                       <a:fillRect/>
                     </a:stretch>
@@ -17818,7 +17805,7 @@
                     <pic:cNvPicPr/>
                   </pic:nvPicPr>
                   <pic:blipFill>
-                    <a:blip r:embed="rId115"/>
+                    <a:blip r:embed="rId114"/>
                     <a:stretch>
                       <a:fillRect/>
                     </a:stretch>
@@ -17880,7 +17867,7 @@
                     <pic:cNvPicPr/>
                   </pic:nvPicPr>
                   <pic:blipFill>
-                    <a:blip r:embed="rId116"/>
+                    <a:blip r:embed="rId115"/>
                     <a:stretch>
                       <a:fillRect/>
                     </a:stretch>
@@ -17969,7 +17956,7 @@
                     <pic:cNvPicPr/>
                   </pic:nvPicPr>
                   <pic:blipFill>
-                    <a:blip r:embed="rId117"/>
+                    <a:blip r:embed="rId116"/>
                     <a:stretch>
                       <a:fillRect/>
                     </a:stretch>
@@ -18052,7 +18039,7 @@
                     <pic:cNvPicPr/>
                   </pic:nvPicPr>
                   <pic:blipFill>
-                    <a:blip r:embed="rId118"/>
+                    <a:blip r:embed="rId117"/>
                     <a:stretch>
                       <a:fillRect/>
                     </a:stretch>
@@ -18155,7 +18142,7 @@
                     <pic:cNvPicPr/>
                   </pic:nvPicPr>
                   <pic:blipFill>
-                    <a:blip r:embed="rId119"/>
+                    <a:blip r:embed="rId118"/>
                     <a:stretch>
                       <a:fillRect/>
                     </a:stretch>
@@ -18287,7 +18274,7 @@
                     <pic:cNvPicPr/>
                   </pic:nvPicPr>
                   <pic:blipFill>
-                    <a:blip r:embed="rId120"/>
+                    <a:blip r:embed="rId119"/>
                     <a:stretch>
                       <a:fillRect/>
                     </a:stretch>
@@ -18374,7 +18361,7 @@
                     <pic:cNvPicPr/>
                   </pic:nvPicPr>
                   <pic:blipFill>
-                    <a:blip r:embed="rId121"/>
+                    <a:blip r:embed="rId120"/>
                     <a:stretch>
                       <a:fillRect/>
                     </a:stretch>
@@ -18494,7 +18481,7 @@
                     <pic:cNvPicPr/>
                   </pic:nvPicPr>
                   <pic:blipFill>
-                    <a:blip r:embed="rId122"/>
+                    <a:blip r:embed="rId121"/>
                     <a:stretch>
                       <a:fillRect/>
                     </a:stretch>
@@ -18547,7 +18534,7 @@
                     <pic:cNvPicPr/>
                   </pic:nvPicPr>
                   <pic:blipFill>
-                    <a:blip r:embed="rId123"/>
+                    <a:blip r:embed="rId122"/>
                     <a:stretch>
                       <a:fillRect/>
                     </a:stretch>
@@ -18631,7 +18618,7 @@
                     <pic:cNvPicPr/>
                   </pic:nvPicPr>
                   <pic:blipFill>
-                    <a:blip r:embed="rId124"/>
+                    <a:blip r:embed="rId123"/>
                     <a:stretch>
                       <a:fillRect/>
                     </a:stretch>
@@ -18704,7 +18691,7 @@
                     <pic:cNvPicPr/>
                   </pic:nvPicPr>
                   <pic:blipFill>
-                    <a:blip r:embed="rId125"/>
+                    <a:blip r:embed="rId124"/>
                     <a:stretch>
                       <a:fillRect/>
                     </a:stretch>
@@ -18835,7 +18822,7 @@
                     <pic:cNvPicPr/>
                   </pic:nvPicPr>
                   <pic:blipFill>
-                    <a:blip r:embed="rId126"/>
+                    <a:blip r:embed="rId125"/>
                     <a:stretch>
                       <a:fillRect/>
                     </a:stretch>
@@ -18937,7 +18924,7 @@
                     <pic:cNvPicPr/>
                   </pic:nvPicPr>
                   <pic:blipFill>
-                    <a:blip r:embed="rId127"/>
+                    <a:blip r:embed="rId126"/>
                     <a:stretch>
                       <a:fillRect/>
                     </a:stretch>
@@ -19046,7 +19033,7 @@
                     <pic:cNvPicPr/>
                   </pic:nvPicPr>
                   <pic:blipFill>
-                    <a:blip r:embed="rId128"/>
+                    <a:blip r:embed="rId127"/>
                     <a:stretch>
                       <a:fillRect/>
                     </a:stretch>
@@ -19132,7 +19119,7 @@
                     <pic:cNvPicPr/>
                   </pic:nvPicPr>
                   <pic:blipFill>
-                    <a:blip r:embed="rId129"/>
+                    <a:blip r:embed="rId128"/>
                     <a:stretch>
                       <a:fillRect/>
                     </a:stretch>
@@ -19196,7 +19183,7 @@
                     <pic:cNvPicPr/>
                   </pic:nvPicPr>
                   <pic:blipFill>
-                    <a:blip r:embed="rId130"/>
+                    <a:blip r:embed="rId129"/>
                     <a:stretch>
                       <a:fillRect/>
                     </a:stretch>
@@ -19249,7 +19236,7 @@
                     <pic:cNvPicPr/>
                   </pic:nvPicPr>
                   <pic:blipFill>
-                    <a:blip r:embed="rId131"/>
+                    <a:blip r:embed="rId130"/>
                     <a:stretch>
                       <a:fillRect/>
                     </a:stretch>
@@ -19352,7 +19339,7 @@
                     <pic:cNvPicPr/>
                   </pic:nvPicPr>
                   <pic:blipFill>
-                    <a:blip r:embed="rId132"/>
+                    <a:blip r:embed="rId131"/>
                     <a:stretch>
                       <a:fillRect/>
                     </a:stretch>
@@ -19405,7 +19392,7 @@
                     <pic:cNvPicPr/>
                   </pic:nvPicPr>
                   <pic:blipFill>
-                    <a:blip r:embed="rId126"/>
+                    <a:blip r:embed="rId125"/>
                     <a:stretch>
                       <a:fillRect/>
                     </a:stretch>
@@ -19483,7 +19470,7 @@
                     <pic:cNvPicPr/>
                   </pic:nvPicPr>
                   <pic:blipFill>
-                    <a:blip r:embed="rId133"/>
+                    <a:blip r:embed="rId132"/>
                     <a:stretch>
                       <a:fillRect/>
                     </a:stretch>
@@ -19572,7 +19559,7 @@
                     <pic:cNvPicPr/>
                   </pic:nvPicPr>
                   <pic:blipFill>
-                    <a:blip r:embed="rId134"/>
+                    <a:blip r:embed="rId133"/>
                     <a:stretch>
                       <a:fillRect/>
                     </a:stretch>
@@ -19651,7 +19638,7 @@
                     <pic:cNvPicPr/>
                   </pic:nvPicPr>
                   <pic:blipFill>
-                    <a:blip r:embed="rId135"/>
+                    <a:blip r:embed="rId134"/>
                     <a:stretch>
                       <a:fillRect/>
                     </a:stretch>
@@ -19731,7 +19718,7 @@
                     <pic:cNvPicPr/>
                   </pic:nvPicPr>
                   <pic:blipFill>
-                    <a:blip r:embed="rId136"/>
+                    <a:blip r:embed="rId135"/>
                     <a:stretch>
                       <a:fillRect/>
                     </a:stretch>
@@ -19801,7 +19788,7 @@
                     <pic:cNvPicPr/>
                   </pic:nvPicPr>
                   <pic:blipFill>
-                    <a:blip r:embed="rId137"/>
+                    <a:blip r:embed="rId136"/>
                     <a:stretch>
                       <a:fillRect/>
                     </a:stretch>
@@ -19952,7 +19939,7 @@
                     <pic:cNvPicPr/>
                   </pic:nvPicPr>
                   <pic:blipFill>
-                    <a:blip r:embed="rId138"/>
+                    <a:blip r:embed="rId137"/>
                     <a:stretch>
                       <a:fillRect/>
                     </a:stretch>
@@ -20053,7 +20040,7 @@
                     <pic:cNvPicPr/>
                   </pic:nvPicPr>
                   <pic:blipFill>
-                    <a:blip r:embed="rId139">
+                    <a:blip r:embed="rId138">
                       <a:extLst>
                         <a:ext uri="{28A0092B-C50C-407E-A947-70E740481C1C}">
                           <a14:useLocalDpi xmlns:a14="http://schemas.microsoft.com/office/drawing/2010/main" val="0"/>
@@ -20134,7 +20121,7 @@
                     <pic:cNvPicPr/>
                   </pic:nvPicPr>
                   <pic:blipFill>
-                    <a:blip r:embed="rId140"/>
+                    <a:blip r:embed="rId139"/>
                     <a:stretch>
                       <a:fillRect/>
                     </a:stretch>
@@ -20246,7 +20233,7 @@
                     </pic:cNvPicPr>
                   </pic:nvPicPr>
                   <pic:blipFill>
-                    <a:blip r:embed="rId141">
+                    <a:blip r:embed="rId140">
                       <a:extLst>
                         <a:ext uri="{28A0092B-C50C-407E-A947-70E740481C1C}">
                           <a14:useLocalDpi xmlns:a14="http://schemas.microsoft.com/office/drawing/2010/main" val="0"/>
@@ -20341,7 +20328,7 @@
                     </pic:cNvPicPr>
                   </pic:nvPicPr>
                   <pic:blipFill>
-                    <a:blip r:embed="rId142">
+                    <a:blip r:embed="rId141">
                       <a:extLst>
                         <a:ext uri="{28A0092B-C50C-407E-A947-70E740481C1C}">
                           <a14:useLocalDpi xmlns:a14="http://schemas.microsoft.com/office/drawing/2010/main" val="0"/>
@@ -20467,7 +20454,7 @@
                     <pic:cNvPicPr/>
                   </pic:nvPicPr>
                   <pic:blipFill>
-                    <a:blip r:embed="rId143"/>
+                    <a:blip r:embed="rId142"/>
                     <a:stretch>
                       <a:fillRect/>
                     </a:stretch>
@@ -23986,7 +23973,7 @@
                     <pic:cNvPicPr/>
                   </pic:nvPicPr>
                   <pic:blipFill>
-                    <a:blip r:embed="rId144"/>
+                    <a:blip r:embed="rId143"/>
                     <a:stretch>
                       <a:fillRect/>
                     </a:stretch>
@@ -24043,7 +24030,7 @@
                     <pic:cNvPicPr/>
                   </pic:nvPicPr>
                   <pic:blipFill>
-                    <a:blip r:embed="rId145"/>
+                    <a:blip r:embed="rId144"/>
                     <a:stretch>
                       <a:fillRect/>
                     </a:stretch>
@@ -24092,7 +24079,7 @@
                     <pic:cNvPicPr/>
                   </pic:nvPicPr>
                   <pic:blipFill>
-                    <a:blip r:embed="rId146"/>
+                    <a:blip r:embed="rId145"/>
                     <a:stretch>
                       <a:fillRect/>
                     </a:stretch>
@@ -24149,7 +24136,7 @@
                     <pic:cNvPicPr/>
                   </pic:nvPicPr>
                   <pic:blipFill>
-                    <a:blip r:embed="rId147"/>
+                    <a:blip r:embed="rId146"/>
                     <a:stretch>
                       <a:fillRect/>
                     </a:stretch>
@@ -24217,7 +24204,7 @@
                     <pic:cNvPicPr/>
                   </pic:nvPicPr>
                   <pic:blipFill>
-                    <a:blip r:embed="rId148"/>
+                    <a:blip r:embed="rId147"/>
                     <a:stretch>
                       <a:fillRect/>
                     </a:stretch>
@@ -24274,7 +24261,7 @@
                     <pic:cNvPicPr/>
                   </pic:nvPicPr>
                   <pic:blipFill>
-                    <a:blip r:embed="rId149"/>
+                    <a:blip r:embed="rId148"/>
                     <a:stretch>
                       <a:fillRect/>
                     </a:stretch>
@@ -24332,7 +24319,7 @@
                     <pic:cNvPicPr/>
                   </pic:nvPicPr>
                   <pic:blipFill rotWithShape="1">
-                    <a:blip r:embed="rId150"/>
+                    <a:blip r:embed="rId149"/>
                     <a:srcRect t="13762" b="11264"/>
                     <a:stretch>
                       <a:fillRect/>
@@ -24565,7 +24552,7 @@
                     <pic:cNvPicPr/>
                   </pic:nvPicPr>
                   <pic:blipFill>
-                    <a:blip r:embed="rId151">
+                    <a:blip r:embed="rId150">
                       <a:extLst>
                         <a:ext uri="{28A0092B-C50C-407E-A947-70E740481C1C}">
                           <a14:useLocalDpi xmlns:a14="http://schemas.microsoft.com/office/drawing/2010/main" val="0"/>
@@ -24640,7 +24627,7 @@
                     <pic:cNvPicPr/>
                   </pic:nvPicPr>
                   <pic:blipFill>
-                    <a:blip r:embed="rId152"/>
+                    <a:blip r:embed="rId151"/>
                     <a:stretch>
                       <a:fillRect/>
                     </a:stretch>
@@ -24725,7 +24712,7 @@
                     </pic:cNvPicPr>
                   </pic:nvPicPr>
                   <pic:blipFill>
-                    <a:blip r:embed="rId153">
+                    <a:blip r:embed="rId152">
                       <a:extLst>
                         <a:ext uri="{28A0092B-C50C-407E-A947-70E740481C1C}">
                           <a14:useLocalDpi xmlns:a14="http://schemas.microsoft.com/office/drawing/2010/main" val="0"/>
@@ -24803,7 +24790,7 @@
                     </pic:cNvPicPr>
                   </pic:nvPicPr>
                   <pic:blipFill>
-                    <a:blip r:embed="rId154">
+                    <a:blip r:embed="rId153">
                       <a:extLst>
                         <a:ext uri="{28A0092B-C50C-407E-A947-70E740481C1C}">
                           <a14:useLocalDpi xmlns:a14="http://schemas.microsoft.com/office/drawing/2010/main" val="0"/>
@@ -24913,7 +24900,7 @@
                     </pic:cNvPicPr>
                   </pic:nvPicPr>
                   <pic:blipFill>
-                    <a:blip r:embed="rId155">
+                    <a:blip r:embed="rId154">
                       <a:extLst>
                         <a:ext uri="{28A0092B-C50C-407E-A947-70E740481C1C}">
                           <a14:useLocalDpi xmlns:a14="http://schemas.microsoft.com/office/drawing/2010/main" val="0"/>
@@ -26469,7 +26456,7 @@
                     <pic:cNvPicPr/>
                   </pic:nvPicPr>
                   <pic:blipFill>
-                    <a:blip r:embed="rId144"/>
+                    <a:blip r:embed="rId143"/>
                     <a:stretch>
                       <a:fillRect/>
                     </a:stretch>
@@ -26514,7 +26501,7 @@
                     <pic:cNvPicPr/>
                   </pic:nvPicPr>
                   <pic:blipFill>
-                    <a:blip r:embed="rId156"/>
+                    <a:blip r:embed="rId155"/>
                     <a:stretch>
                       <a:fillRect/>
                     </a:stretch>
@@ -26560,7 +26547,7 @@
                     <pic:cNvPicPr/>
                   </pic:nvPicPr>
                   <pic:blipFill>
-                    <a:blip r:embed="rId157"/>
+                    <a:blip r:embed="rId156"/>
                     <a:stretch>
                       <a:fillRect/>
                     </a:stretch>
@@ -26606,7 +26593,7 @@
                     <pic:cNvPicPr/>
                   </pic:nvPicPr>
                   <pic:blipFill>
-                    <a:blip r:embed="rId158"/>
+                    <a:blip r:embed="rId157"/>
                     <a:stretch>
                       <a:fillRect/>
                     </a:stretch>
@@ -26656,7 +26643,7 @@
                     <pic:cNvPicPr/>
                   </pic:nvPicPr>
                   <pic:blipFill>
-                    <a:blip r:embed="rId148"/>
+                    <a:blip r:embed="rId147"/>
                     <a:stretch>
                       <a:fillRect/>
                     </a:stretch>
@@ -26703,7 +26690,7 @@
                     </pic:cNvPicPr>
                   </pic:nvPicPr>
                   <pic:blipFill>
-                    <a:blip r:embed="rId159">
+                    <a:blip r:embed="rId158">
                       <a:extLst>
                         <a:ext uri="{28A0092B-C50C-407E-A947-70E740481C1C}">
                           <a14:useLocalDpi xmlns:a14="http://schemas.microsoft.com/office/drawing/2010/main" val="0"/>
@@ -26745,7 +26732,7 @@
         </w:rPr>
         <w:lastRenderedPageBreak/>
         <w:drawing>
-          <wp:inline distT="0" distB="0" distL="0" distR="0" wp14:anchorId="4B84BFFA" wp14:editId="28B5204F">
+          <wp:inline distT="0" distB="0" distL="0" distR="0" wp14:anchorId="4B84BFFA" wp14:editId="16E5314C">
             <wp:extent cx="5522026" cy="2269490"/>
             <wp:effectExtent l="0" t="0" r="2540" b="0"/>
             <wp:docPr id="934478524" name="Imagen 13"/>
@@ -26762,7 +26749,7 @@
                     </pic:cNvPicPr>
                   </pic:nvPicPr>
                   <pic:blipFill rotWithShape="1">
-                    <a:blip r:embed="rId160" cstate="print">
+                    <a:blip r:embed="rId159" cstate="print">
                       <a:extLst>
                         <a:ext uri="{28A0092B-C50C-407E-A947-70E740481C1C}">
                           <a14:useLocalDpi xmlns:a14="http://schemas.microsoft.com/office/drawing/2010/main" val="0"/>
@@ -26844,7 +26831,7 @@
           <w:szCs w:val="20"/>
         </w:rPr>
       </w:pPr>
-      <w:hyperlink r:id="rId161" w:history="1">
+      <w:hyperlink r:id="rId160" w:history="1">
         <w:r>
           <w:rPr>
             <w:rStyle w:val="Hipervnculo"/>
@@ -26892,7 +26879,7 @@
         </w:rPr>
         <w:t xml:space="preserve">Your computer may automatically download and install from the Internet the required drivers once you connect your Tausand Tempico device to a USB port. If you require to install them manually, they are available at </w:t>
       </w:r>
-      <w:hyperlink r:id="rId162" w:history="1">
+      <w:hyperlink r:id="rId161" w:history="1">
         <w:r>
           <w:rPr>
             <w:rStyle w:val="Hipervnculo"/>
@@ -26959,7 +26946,7 @@
         </w:rPr>
         <w:t xml:space="preserve">For technical support, contact us at </w:t>
       </w:r>
-      <w:hyperlink r:id="rId163" w:history="1">
+      <w:hyperlink r:id="rId162" w:history="1">
         <w:r>
           <w:rPr>
             <w:rStyle w:val="Hipervnculo"/>
@@ -27004,7 +26991,7 @@
           <w:szCs w:val="20"/>
         </w:rPr>
       </w:pPr>
-      <w:hyperlink r:id="rId164" w:history="1">
+      <w:hyperlink r:id="rId163" w:history="1">
         <w:r>
           <w:rPr>
             <w:rStyle w:val="Hipervnculo"/>
@@ -27032,7 +27019,7 @@
       </w:pPr>
     </w:p>
     <w:sectPr>
-      <w:headerReference w:type="default" r:id="rId165"/>
+      <w:headerReference w:type="default" r:id="rId164"/>
       <w:pgSz w:w="12240" w:h="15840"/>
       <w:pgMar w:top="1417" w:right="1701" w:bottom="1417" w:left="1701" w:header="708" w:footer="708" w:gutter="0"/>
       <w:cols w:space="708"/>
@@ -28632,11 +28619,13 @@
     <w:rsid w:val="001C11CA"/>
     <w:rsid w:val="002F3B76"/>
     <w:rsid w:val="00353A65"/>
+    <w:rsid w:val="00395213"/>
     <w:rsid w:val="003B2994"/>
     <w:rsid w:val="004021C1"/>
     <w:rsid w:val="00475F57"/>
     <w:rsid w:val="004B6BE0"/>
     <w:rsid w:val="005655B3"/>
+    <w:rsid w:val="0057597E"/>
     <w:rsid w:val="00582394"/>
     <w:rsid w:val="0059660F"/>
     <w:rsid w:val="006900EA"/>

</xml_diff>